<commit_message>
data_prep --keep-split-from: earlier training documents never become validation when a dataset is rebuilt; run_pipeline continue uses it
</commit_message>
<xml_diff>
--- a/tinyGPT_learning_guide.docx
+++ b/tinyGPT_learning_guide.docx
@@ -35,7 +35,7 @@
           <w:sz w:val="21"/>
           <w:szCs w:val="24"/>
         </w:rPr>
-        <w:id w:val="828167971"/>
+        <w:id w:val="259802819"/>
         <w:docPartObj>
           <w:docPartGallery w:val="Table of Contents"/>
           <w:docPartUnique/>
@@ -77,7 +77,7 @@
           <w:r>
             <w:fldChar w:fldCharType="separate"/>
           </w:r>
-          <w:hyperlink w:anchor="_Toc241660005" w:history="1">
+          <w:hyperlink w:anchor="_Toc241660823" w:history="1">
             <w:r>
               <w:rPr>
                 <w:rStyle w:val="Hyperlink"/>
@@ -123,7 +123,7 @@
                 <w:noProof/>
                 <w:webHidden/>
               </w:rPr>
-              <w:instrText xml:space="preserve"> PAGEREF _Toc241660005 \h </w:instrText>
+              <w:instrText xml:space="preserve"> PAGEREF _Toc241660823 \h </w:instrText>
             </w:r>
             <w:r>
               <w:rPr>
@@ -171,7 +171,7 @@
               <w14:ligatures w14:val="standardContextual"/>
             </w:rPr>
           </w:pPr>
-          <w:hyperlink w:anchor="_Toc241660006" w:history="1">
+          <w:hyperlink w:anchor="_Toc241660824" w:history="1">
             <w:r>
               <w:rPr>
                 <w:rStyle w:val="Hyperlink"/>
@@ -217,7 +217,7 @@
                 <w:noProof/>
                 <w:webHidden/>
               </w:rPr>
-              <w:instrText xml:space="preserve"> PAGEREF _Toc241660006 \h </w:instrText>
+              <w:instrText xml:space="preserve"> PAGEREF _Toc241660824 \h </w:instrText>
             </w:r>
             <w:r>
               <w:rPr>
@@ -265,7 +265,7 @@
               <w14:ligatures w14:val="standardContextual"/>
             </w:rPr>
           </w:pPr>
-          <w:hyperlink w:anchor="_Toc241660007" w:history="1">
+          <w:hyperlink w:anchor="_Toc241660825" w:history="1">
             <w:r>
               <w:rPr>
                 <w:rStyle w:val="Hyperlink"/>
@@ -311,7 +311,7 @@
                 <w:noProof/>
                 <w:webHidden/>
               </w:rPr>
-              <w:instrText xml:space="preserve"> PAGEREF _Toc241660007 \h </w:instrText>
+              <w:instrText xml:space="preserve"> PAGEREF _Toc241660825 \h </w:instrText>
             </w:r>
             <w:r>
               <w:rPr>
@@ -359,7 +359,7 @@
               <w14:ligatures w14:val="standardContextual"/>
             </w:rPr>
           </w:pPr>
-          <w:hyperlink w:anchor="_Toc241660008" w:history="1">
+          <w:hyperlink w:anchor="_Toc241660826" w:history="1">
             <w:r>
               <w:rPr>
                 <w:rStyle w:val="Hyperlink"/>
@@ -405,7 +405,7 @@
                 <w:noProof/>
                 <w:webHidden/>
               </w:rPr>
-              <w:instrText xml:space="preserve"> PAGEREF _Toc241660008 \h </w:instrText>
+              <w:instrText xml:space="preserve"> PAGEREF _Toc241660826 \h </w:instrText>
             </w:r>
             <w:r>
               <w:rPr>
@@ -453,7 +453,7 @@
               <w14:ligatures w14:val="standardContextual"/>
             </w:rPr>
           </w:pPr>
-          <w:hyperlink w:anchor="_Toc241660009" w:history="1">
+          <w:hyperlink w:anchor="_Toc241660827" w:history="1">
             <w:r>
               <w:rPr>
                 <w:rStyle w:val="Hyperlink"/>
@@ -499,7 +499,7 @@
                 <w:noProof/>
                 <w:webHidden/>
               </w:rPr>
-              <w:instrText xml:space="preserve"> PAGEREF _Toc241660009 \h </w:instrText>
+              <w:instrText xml:space="preserve"> PAGEREF _Toc241660827 \h </w:instrText>
             </w:r>
             <w:r>
               <w:rPr>
@@ -547,7 +547,7 @@
               <w14:ligatures w14:val="standardContextual"/>
             </w:rPr>
           </w:pPr>
-          <w:hyperlink w:anchor="_Toc241660010" w:history="1">
+          <w:hyperlink w:anchor="_Toc241660828" w:history="1">
             <w:r>
               <w:rPr>
                 <w:rStyle w:val="Hyperlink"/>
@@ -593,7 +593,7 @@
                 <w:noProof/>
                 <w:webHidden/>
               </w:rPr>
-              <w:instrText xml:space="preserve"> PAGEREF _Toc241660010 \h </w:instrText>
+              <w:instrText xml:space="preserve"> PAGEREF _Toc241660828 \h </w:instrText>
             </w:r>
             <w:r>
               <w:rPr>
@@ -641,7 +641,7 @@
               <w14:ligatures w14:val="standardContextual"/>
             </w:rPr>
           </w:pPr>
-          <w:hyperlink w:anchor="_Toc241660011" w:history="1">
+          <w:hyperlink w:anchor="_Toc241660829" w:history="1">
             <w:r>
               <w:rPr>
                 <w:rStyle w:val="Hyperlink"/>
@@ -687,7 +687,7 @@
                 <w:noProof/>
                 <w:webHidden/>
               </w:rPr>
-              <w:instrText xml:space="preserve"> PAGEREF _Toc241660011 \h </w:instrText>
+              <w:instrText xml:space="preserve"> PAGEREF _Toc241660829 \h </w:instrText>
             </w:r>
             <w:r>
               <w:rPr>
@@ -735,7 +735,7 @@
               <w14:ligatures w14:val="standardContextual"/>
             </w:rPr>
           </w:pPr>
-          <w:hyperlink w:anchor="_Toc241660012" w:history="1">
+          <w:hyperlink w:anchor="_Toc241660830" w:history="1">
             <w:r>
               <w:rPr>
                 <w:rStyle w:val="Hyperlink"/>
@@ -781,7 +781,7 @@
                 <w:noProof/>
                 <w:webHidden/>
               </w:rPr>
-              <w:instrText xml:space="preserve"> PAGEREF _Toc241660012 \h </w:instrText>
+              <w:instrText xml:space="preserve"> PAGEREF _Toc241660830 \h </w:instrText>
             </w:r>
             <w:r>
               <w:rPr>
@@ -829,7 +829,7 @@
               <w14:ligatures w14:val="standardContextual"/>
             </w:rPr>
           </w:pPr>
-          <w:hyperlink w:anchor="_Toc241660013" w:history="1">
+          <w:hyperlink w:anchor="_Toc241660831" w:history="1">
             <w:r>
               <w:rPr>
                 <w:rStyle w:val="Hyperlink"/>
@@ -875,7 +875,7 @@
                 <w:noProof/>
                 <w:webHidden/>
               </w:rPr>
-              <w:instrText xml:space="preserve"> PAGEREF _Toc241660013 \h </w:instrText>
+              <w:instrText xml:space="preserve"> PAGEREF _Toc241660831 \h </w:instrText>
             </w:r>
             <w:r>
               <w:rPr>
@@ -923,7 +923,7 @@
               <w14:ligatures w14:val="standardContextual"/>
             </w:rPr>
           </w:pPr>
-          <w:hyperlink w:anchor="_Toc241660014" w:history="1">
+          <w:hyperlink w:anchor="_Toc241660832" w:history="1">
             <w:r>
               <w:rPr>
                 <w:rStyle w:val="Hyperlink"/>
@@ -969,7 +969,7 @@
                 <w:noProof/>
                 <w:webHidden/>
               </w:rPr>
-              <w:instrText xml:space="preserve"> PAGEREF _Toc241660014 \h </w:instrText>
+              <w:instrText xml:space="preserve"> PAGEREF _Toc241660832 \h </w:instrText>
             </w:r>
             <w:r>
               <w:rPr>
@@ -1017,7 +1017,7 @@
               <w14:ligatures w14:val="standardContextual"/>
             </w:rPr>
           </w:pPr>
-          <w:hyperlink w:anchor="_Toc241660015" w:history="1">
+          <w:hyperlink w:anchor="_Toc241660833" w:history="1">
             <w:r>
               <w:rPr>
                 <w:rStyle w:val="Hyperlink"/>
@@ -1063,7 +1063,7 @@
                 <w:noProof/>
                 <w:webHidden/>
               </w:rPr>
-              <w:instrText xml:space="preserve"> PAGEREF _Toc241660015 \h </w:instrText>
+              <w:instrText xml:space="preserve"> PAGEREF _Toc241660833 \h </w:instrText>
             </w:r>
             <w:r>
               <w:rPr>
@@ -1111,7 +1111,7 @@
               <w14:ligatures w14:val="standardContextual"/>
             </w:rPr>
           </w:pPr>
-          <w:hyperlink w:anchor="_Toc241660016" w:history="1">
+          <w:hyperlink w:anchor="_Toc241660834" w:history="1">
             <w:r>
               <w:rPr>
                 <w:rStyle w:val="Hyperlink"/>
@@ -1157,7 +1157,7 @@
                 <w:noProof/>
                 <w:webHidden/>
               </w:rPr>
-              <w:instrText xml:space="preserve"> PAGEREF _Toc241660016 \h </w:instrText>
+              <w:instrText xml:space="preserve"> PAGEREF _Toc241660834 \h </w:instrText>
             </w:r>
             <w:r>
               <w:rPr>
@@ -1205,7 +1205,7 @@
               <w14:ligatures w14:val="standardContextual"/>
             </w:rPr>
           </w:pPr>
-          <w:hyperlink w:anchor="_Toc241660017" w:history="1">
+          <w:hyperlink w:anchor="_Toc241660835" w:history="1">
             <w:r>
               <w:rPr>
                 <w:rStyle w:val="Hyperlink"/>
@@ -1251,7 +1251,7 @@
                 <w:noProof/>
                 <w:webHidden/>
               </w:rPr>
-              <w:instrText xml:space="preserve"> PAGEREF _Toc241660017 \h </w:instrText>
+              <w:instrText xml:space="preserve"> PAGEREF _Toc241660835 \h </w:instrText>
             </w:r>
             <w:r>
               <w:rPr>
@@ -1299,7 +1299,7 @@
               <w14:ligatures w14:val="standardContextual"/>
             </w:rPr>
           </w:pPr>
-          <w:hyperlink w:anchor="_Toc241660018" w:history="1">
+          <w:hyperlink w:anchor="_Toc241660836" w:history="1">
             <w:r>
               <w:rPr>
                 <w:rStyle w:val="Hyperlink"/>
@@ -1345,7 +1345,7 @@
                 <w:noProof/>
                 <w:webHidden/>
               </w:rPr>
-              <w:instrText xml:space="preserve"> PAGEREF _Toc241660018 \h </w:instrText>
+              <w:instrText xml:space="preserve"> PAGEREF _Toc241660836 \h </w:instrText>
             </w:r>
             <w:r>
               <w:rPr>
@@ -1393,7 +1393,7 @@
               <w14:ligatures w14:val="standardContextual"/>
             </w:rPr>
           </w:pPr>
-          <w:hyperlink w:anchor="_Toc241660019" w:history="1">
+          <w:hyperlink w:anchor="_Toc241660837" w:history="1">
             <w:r>
               <w:rPr>
                 <w:rStyle w:val="Hyperlink"/>
@@ -1439,7 +1439,7 @@
                 <w:noProof/>
                 <w:webHidden/>
               </w:rPr>
-              <w:instrText xml:space="preserve"> PAGEREF _Toc241660019 \h </w:instrText>
+              <w:instrText xml:space="preserve"> PAGEREF _Toc241660837 \h </w:instrText>
             </w:r>
             <w:r>
               <w:rPr>
@@ -1487,7 +1487,7 @@
               <w14:ligatures w14:val="standardContextual"/>
             </w:rPr>
           </w:pPr>
-          <w:hyperlink w:anchor="_Toc241660020" w:history="1">
+          <w:hyperlink w:anchor="_Toc241660838" w:history="1">
             <w:r>
               <w:rPr>
                 <w:rStyle w:val="Hyperlink"/>
@@ -1533,7 +1533,7 @@
                 <w:noProof/>
                 <w:webHidden/>
               </w:rPr>
-              <w:instrText xml:space="preserve"> PAGEREF _Toc241660020 \h </w:instrText>
+              <w:instrText xml:space="preserve"> PAGEREF _Toc241660838 \h </w:instrText>
             </w:r>
             <w:r>
               <w:rPr>
@@ -1581,7 +1581,7 @@
               <w14:ligatures w14:val="standardContextual"/>
             </w:rPr>
           </w:pPr>
-          <w:hyperlink w:anchor="_Toc241660021" w:history="1">
+          <w:hyperlink w:anchor="_Toc241660839" w:history="1">
             <w:r>
               <w:rPr>
                 <w:rStyle w:val="Hyperlink"/>
@@ -1627,7 +1627,7 @@
                 <w:noProof/>
                 <w:webHidden/>
               </w:rPr>
-              <w:instrText xml:space="preserve"> PAGEREF _Toc241660021 \h </w:instrText>
+              <w:instrText xml:space="preserve"> PAGEREF _Toc241660839 \h </w:instrText>
             </w:r>
             <w:r>
               <w:rPr>
@@ -1675,7 +1675,7 @@
               <w14:ligatures w14:val="standardContextual"/>
             </w:rPr>
           </w:pPr>
-          <w:hyperlink w:anchor="_Toc241660022" w:history="1">
+          <w:hyperlink w:anchor="_Toc241660840" w:history="1">
             <w:r>
               <w:rPr>
                 <w:rStyle w:val="Hyperlink"/>
@@ -1721,7 +1721,7 @@
                 <w:noProof/>
                 <w:webHidden/>
               </w:rPr>
-              <w:instrText xml:space="preserve"> PAGEREF _Toc241660022 \h </w:instrText>
+              <w:instrText xml:space="preserve"> PAGEREF _Toc241660840 \h </w:instrText>
             </w:r>
             <w:r>
               <w:rPr>
@@ -1769,7 +1769,7 @@
               <w14:ligatures w14:val="standardContextual"/>
             </w:rPr>
           </w:pPr>
-          <w:hyperlink w:anchor="_Toc241660023" w:history="1">
+          <w:hyperlink w:anchor="_Toc241660841" w:history="1">
             <w:r>
               <w:rPr>
                 <w:rStyle w:val="Hyperlink"/>
@@ -1815,7 +1815,7 @@
                 <w:noProof/>
                 <w:webHidden/>
               </w:rPr>
-              <w:instrText xml:space="preserve"> PAGEREF _Toc241660023 \h </w:instrText>
+              <w:instrText xml:space="preserve"> PAGEREF _Toc241660841 \h </w:instrText>
             </w:r>
             <w:r>
               <w:rPr>
@@ -1863,7 +1863,7 @@
               <w14:ligatures w14:val="standardContextual"/>
             </w:rPr>
           </w:pPr>
-          <w:hyperlink w:anchor="_Toc241660024" w:history="1">
+          <w:hyperlink w:anchor="_Toc241660842" w:history="1">
             <w:r>
               <w:rPr>
                 <w:rStyle w:val="Hyperlink"/>
@@ -1909,7 +1909,7 @@
                 <w:noProof/>
                 <w:webHidden/>
               </w:rPr>
-              <w:instrText xml:space="preserve"> PAGEREF _Toc241660024 \h </w:instrText>
+              <w:instrText xml:space="preserve"> PAGEREF _Toc241660842 \h </w:instrText>
             </w:r>
             <w:r>
               <w:rPr>
@@ -1957,7 +1957,7 @@
               <w14:ligatures w14:val="standardContextual"/>
             </w:rPr>
           </w:pPr>
-          <w:hyperlink w:anchor="_Toc241660025" w:history="1">
+          <w:hyperlink w:anchor="_Toc241660843" w:history="1">
             <w:r>
               <w:rPr>
                 <w:rStyle w:val="Hyperlink"/>
@@ -2003,7 +2003,7 @@
                 <w:noProof/>
                 <w:webHidden/>
               </w:rPr>
-              <w:instrText xml:space="preserve"> PAGEREF _Toc241660025 \h </w:instrText>
+              <w:instrText xml:space="preserve"> PAGEREF _Toc241660843 \h </w:instrText>
             </w:r>
             <w:r>
               <w:rPr>
@@ -2051,7 +2051,7 @@
               <w14:ligatures w14:val="standardContextual"/>
             </w:rPr>
           </w:pPr>
-          <w:hyperlink w:anchor="_Toc241660026" w:history="1">
+          <w:hyperlink w:anchor="_Toc241660844" w:history="1">
             <w:r>
               <w:rPr>
                 <w:rStyle w:val="Hyperlink"/>
@@ -2097,7 +2097,7 @@
                 <w:noProof/>
                 <w:webHidden/>
               </w:rPr>
-              <w:instrText xml:space="preserve"> PAGEREF _Toc241660026 \h </w:instrText>
+              <w:instrText xml:space="preserve"> PAGEREF _Toc241660844 \h </w:instrText>
             </w:r>
             <w:r>
               <w:rPr>
@@ -2145,7 +2145,7 @@
               <w14:ligatures w14:val="standardContextual"/>
             </w:rPr>
           </w:pPr>
-          <w:hyperlink w:anchor="_Toc241660027" w:history="1">
+          <w:hyperlink w:anchor="_Toc241660845" w:history="1">
             <w:r>
               <w:rPr>
                 <w:rStyle w:val="Hyperlink"/>
@@ -2191,7 +2191,7 @@
                 <w:noProof/>
                 <w:webHidden/>
               </w:rPr>
-              <w:instrText xml:space="preserve"> PAGEREF _Toc241660027 \h </w:instrText>
+              <w:instrText xml:space="preserve"> PAGEREF _Toc241660845 \h </w:instrText>
             </w:r>
             <w:r>
               <w:rPr>
@@ -2239,7 +2239,7 @@
               <w14:ligatures w14:val="standardContextual"/>
             </w:rPr>
           </w:pPr>
-          <w:hyperlink w:anchor="_Toc241660028" w:history="1">
+          <w:hyperlink w:anchor="_Toc241660846" w:history="1">
             <w:r>
               <w:rPr>
                 <w:rStyle w:val="Hyperlink"/>
@@ -2285,7 +2285,7 @@
                 <w:noProof/>
                 <w:webHidden/>
               </w:rPr>
-              <w:instrText xml:space="preserve"> PAGEREF _Toc241660028 \h </w:instrText>
+              <w:instrText xml:space="preserve"> PAGEREF _Toc241660846 \h </w:instrText>
             </w:r>
             <w:r>
               <w:rPr>
@@ -2333,7 +2333,7 @@
               <w14:ligatures w14:val="standardContextual"/>
             </w:rPr>
           </w:pPr>
-          <w:hyperlink w:anchor="_Toc241660029" w:history="1">
+          <w:hyperlink w:anchor="_Toc241660847" w:history="1">
             <w:r>
               <w:rPr>
                 <w:rStyle w:val="Hyperlink"/>
@@ -2379,7 +2379,7 @@
                 <w:noProof/>
                 <w:webHidden/>
               </w:rPr>
-              <w:instrText xml:space="preserve"> PAGEREF _Toc241660029 \h </w:instrText>
+              <w:instrText xml:space="preserve"> PAGEREF _Toc241660847 \h </w:instrText>
             </w:r>
             <w:r>
               <w:rPr>
@@ -2427,7 +2427,7 @@
               <w14:ligatures w14:val="standardContextual"/>
             </w:rPr>
           </w:pPr>
-          <w:hyperlink w:anchor="_Toc241660030" w:history="1">
+          <w:hyperlink w:anchor="_Toc241660848" w:history="1">
             <w:r>
               <w:rPr>
                 <w:rStyle w:val="Hyperlink"/>
@@ -2473,7 +2473,7 @@
                 <w:noProof/>
                 <w:webHidden/>
               </w:rPr>
-              <w:instrText xml:space="preserve"> PAGEREF _Toc241660030 \h </w:instrText>
+              <w:instrText xml:space="preserve"> PAGEREF _Toc241660848 \h </w:instrText>
             </w:r>
             <w:r>
               <w:rPr>
@@ -2521,7 +2521,7 @@
               <w14:ligatures w14:val="standardContextual"/>
             </w:rPr>
           </w:pPr>
-          <w:hyperlink w:anchor="_Toc241660031" w:history="1">
+          <w:hyperlink w:anchor="_Toc241660849" w:history="1">
             <w:r>
               <w:rPr>
                 <w:rStyle w:val="Hyperlink"/>
@@ -2567,7 +2567,7 @@
                 <w:noProof/>
                 <w:webHidden/>
               </w:rPr>
-              <w:instrText xml:space="preserve"> PAGEREF _Toc241660031 \h </w:instrText>
+              <w:instrText xml:space="preserve"> PAGEREF _Toc241660849 \h </w:instrText>
             </w:r>
             <w:r>
               <w:rPr>
@@ -2615,7 +2615,7 @@
               <w14:ligatures w14:val="standardContextual"/>
             </w:rPr>
           </w:pPr>
-          <w:hyperlink w:anchor="_Toc241660032" w:history="1">
+          <w:hyperlink w:anchor="_Toc241660850" w:history="1">
             <w:r>
               <w:rPr>
                 <w:rStyle w:val="Hyperlink"/>
@@ -2661,7 +2661,7 @@
                 <w:noProof/>
                 <w:webHidden/>
               </w:rPr>
-              <w:instrText xml:space="preserve"> PAGEREF _Toc241660032 \h </w:instrText>
+              <w:instrText xml:space="preserve"> PAGEREF _Toc241660850 \h </w:instrText>
             </w:r>
             <w:r>
               <w:rPr>
@@ -2709,7 +2709,7 @@
               <w14:ligatures w14:val="standardContextual"/>
             </w:rPr>
           </w:pPr>
-          <w:hyperlink w:anchor="_Toc241660033" w:history="1">
+          <w:hyperlink w:anchor="_Toc241660851" w:history="1">
             <w:r>
               <w:rPr>
                 <w:rStyle w:val="Hyperlink"/>
@@ -2755,7 +2755,7 @@
                 <w:noProof/>
                 <w:webHidden/>
               </w:rPr>
-              <w:instrText xml:space="preserve"> PAGEREF _Toc241660033 \h </w:instrText>
+              <w:instrText xml:space="preserve"> PAGEREF _Toc241660851 \h </w:instrText>
             </w:r>
             <w:r>
               <w:rPr>
@@ -2803,7 +2803,7 @@
               <w14:ligatures w14:val="standardContextual"/>
             </w:rPr>
           </w:pPr>
-          <w:hyperlink w:anchor="_Toc241660034" w:history="1">
+          <w:hyperlink w:anchor="_Toc241660852" w:history="1">
             <w:r>
               <w:rPr>
                 <w:rStyle w:val="Hyperlink"/>
@@ -2849,7 +2849,7 @@
                 <w:noProof/>
                 <w:webHidden/>
               </w:rPr>
-              <w:instrText xml:space="preserve"> PAGEREF _Toc241660034 \h </w:instrText>
+              <w:instrText xml:space="preserve"> PAGEREF _Toc241660852 \h </w:instrText>
             </w:r>
             <w:r>
               <w:rPr>
@@ -2897,7 +2897,7 @@
               <w14:ligatures w14:val="standardContextual"/>
             </w:rPr>
           </w:pPr>
-          <w:hyperlink w:anchor="_Toc241660035" w:history="1">
+          <w:hyperlink w:anchor="_Toc241660853" w:history="1">
             <w:r>
               <w:rPr>
                 <w:rStyle w:val="Hyperlink"/>
@@ -2943,7 +2943,7 @@
                 <w:noProof/>
                 <w:webHidden/>
               </w:rPr>
-              <w:instrText xml:space="preserve"> PAGEREF _Toc241660035 \h </w:instrText>
+              <w:instrText xml:space="preserve"> PAGEREF _Toc241660853 \h </w:instrText>
             </w:r>
             <w:r>
               <w:rPr>
@@ -2991,7 +2991,7 @@
               <w14:ligatures w14:val="standardContextual"/>
             </w:rPr>
           </w:pPr>
-          <w:hyperlink w:anchor="_Toc241660036" w:history="1">
+          <w:hyperlink w:anchor="_Toc241660854" w:history="1">
             <w:r>
               <w:rPr>
                 <w:rStyle w:val="Hyperlink"/>
@@ -3037,7 +3037,7 @@
                 <w:noProof/>
                 <w:webHidden/>
               </w:rPr>
-              <w:instrText xml:space="preserve"> PAGEREF _Toc241660036 \h </w:instrText>
+              <w:instrText xml:space="preserve"> PAGEREF _Toc241660854 \h </w:instrText>
             </w:r>
             <w:r>
               <w:rPr>
@@ -3085,7 +3085,7 @@
               <w14:ligatures w14:val="standardContextual"/>
             </w:rPr>
           </w:pPr>
-          <w:hyperlink w:anchor="_Toc241660037" w:history="1">
+          <w:hyperlink w:anchor="_Toc241660855" w:history="1">
             <w:r>
               <w:rPr>
                 <w:rStyle w:val="Hyperlink"/>
@@ -3131,7 +3131,7 @@
                 <w:noProof/>
                 <w:webHidden/>
               </w:rPr>
-              <w:instrText xml:space="preserve"> PAGEREF _Toc241660037 \h </w:instrText>
+              <w:instrText xml:space="preserve"> PAGEREF _Toc241660855 \h </w:instrText>
             </w:r>
             <w:r>
               <w:rPr>
@@ -3179,7 +3179,7 @@
               <w14:ligatures w14:val="standardContextual"/>
             </w:rPr>
           </w:pPr>
-          <w:hyperlink w:anchor="_Toc241660038" w:history="1">
+          <w:hyperlink w:anchor="_Toc241660856" w:history="1">
             <w:r>
               <w:rPr>
                 <w:rStyle w:val="Hyperlink"/>
@@ -3225,7 +3225,7 @@
                 <w:noProof/>
                 <w:webHidden/>
               </w:rPr>
-              <w:instrText xml:space="preserve"> PAGEREF _Toc241660038 \h </w:instrText>
+              <w:instrText xml:space="preserve"> PAGEREF _Toc241660856 \h </w:instrText>
             </w:r>
             <w:r>
               <w:rPr>
@@ -3273,7 +3273,7 @@
               <w14:ligatures w14:val="standardContextual"/>
             </w:rPr>
           </w:pPr>
-          <w:hyperlink w:anchor="_Toc241660039" w:history="1">
+          <w:hyperlink w:anchor="_Toc241660857" w:history="1">
             <w:r>
               <w:rPr>
                 <w:rStyle w:val="Hyperlink"/>
@@ -3319,7 +3319,7 @@
                 <w:noProof/>
                 <w:webHidden/>
               </w:rPr>
-              <w:instrText xml:space="preserve"> PAGEREF _Toc241660039 \h </w:instrText>
+              <w:instrText xml:space="preserve"> PAGEREF _Toc241660857 \h </w:instrText>
             </w:r>
             <w:r>
               <w:rPr>
@@ -3367,7 +3367,7 @@
               <w14:ligatures w14:val="standardContextual"/>
             </w:rPr>
           </w:pPr>
-          <w:hyperlink w:anchor="_Toc241660040" w:history="1">
+          <w:hyperlink w:anchor="_Toc241660858" w:history="1">
             <w:r>
               <w:rPr>
                 <w:rStyle w:val="Hyperlink"/>
@@ -3413,7 +3413,7 @@
                 <w:noProof/>
                 <w:webHidden/>
               </w:rPr>
-              <w:instrText xml:space="preserve"> PAGEREF _Toc241660040 \h </w:instrText>
+              <w:instrText xml:space="preserve"> PAGEREF _Toc241660858 \h </w:instrText>
             </w:r>
             <w:r>
               <w:rPr>
@@ -3461,7 +3461,7 @@
               <w14:ligatures w14:val="standardContextual"/>
             </w:rPr>
           </w:pPr>
-          <w:hyperlink w:anchor="_Toc241660041" w:history="1">
+          <w:hyperlink w:anchor="_Toc241660859" w:history="1">
             <w:r>
               <w:rPr>
                 <w:rStyle w:val="Hyperlink"/>
@@ -3507,7 +3507,7 @@
                 <w:noProof/>
                 <w:webHidden/>
               </w:rPr>
-              <w:instrText xml:space="preserve"> PAGEREF _Toc241660041 \h </w:instrText>
+              <w:instrText xml:space="preserve"> PAGEREF _Toc241660859 \h </w:instrText>
             </w:r>
             <w:r>
               <w:rPr>
@@ -3555,7 +3555,7 @@
               <w14:ligatures w14:val="standardContextual"/>
             </w:rPr>
           </w:pPr>
-          <w:hyperlink w:anchor="_Toc241660042" w:history="1">
+          <w:hyperlink w:anchor="_Toc241660860" w:history="1">
             <w:r>
               <w:rPr>
                 <w:rStyle w:val="Hyperlink"/>
@@ -3601,7 +3601,7 @@
                 <w:noProof/>
                 <w:webHidden/>
               </w:rPr>
-              <w:instrText xml:space="preserve"> PAGEREF _Toc241660042 \h </w:instrText>
+              <w:instrText xml:space="preserve"> PAGEREF _Toc241660860 \h </w:instrText>
             </w:r>
             <w:r>
               <w:rPr>
@@ -3649,7 +3649,7 @@
               <w14:ligatures w14:val="standardContextual"/>
             </w:rPr>
           </w:pPr>
-          <w:hyperlink w:anchor="_Toc241660043" w:history="1">
+          <w:hyperlink w:anchor="_Toc241660861" w:history="1">
             <w:r>
               <w:rPr>
                 <w:rStyle w:val="Hyperlink"/>
@@ -3695,7 +3695,7 @@
                 <w:noProof/>
                 <w:webHidden/>
               </w:rPr>
-              <w:instrText xml:space="preserve"> PAGEREF _Toc241660043 \h </w:instrText>
+              <w:instrText xml:space="preserve"> PAGEREF _Toc241660861 \h </w:instrText>
             </w:r>
             <w:r>
               <w:rPr>
@@ -3743,7 +3743,7 @@
               <w14:ligatures w14:val="standardContextual"/>
             </w:rPr>
           </w:pPr>
-          <w:hyperlink w:anchor="_Toc241660044" w:history="1">
+          <w:hyperlink w:anchor="_Toc241660862" w:history="1">
             <w:r>
               <w:rPr>
                 <w:rStyle w:val="Hyperlink"/>
@@ -3789,7 +3789,7 @@
                 <w:noProof/>
                 <w:webHidden/>
               </w:rPr>
-              <w:instrText xml:space="preserve"> PAGEREF _Toc241660044 \h </w:instrText>
+              <w:instrText xml:space="preserve"> PAGEREF _Toc241660862 \h </w:instrText>
             </w:r>
             <w:r>
               <w:rPr>
@@ -3837,7 +3837,7 @@
               <w14:ligatures w14:val="standardContextual"/>
             </w:rPr>
           </w:pPr>
-          <w:hyperlink w:anchor="_Toc241660045" w:history="1">
+          <w:hyperlink w:anchor="_Toc241660863" w:history="1">
             <w:r>
               <w:rPr>
                 <w:rStyle w:val="Hyperlink"/>
@@ -3883,7 +3883,7 @@
                 <w:noProof/>
                 <w:webHidden/>
               </w:rPr>
-              <w:instrText xml:space="preserve"> PAGEREF _Toc241660045 \h </w:instrText>
+              <w:instrText xml:space="preserve"> PAGEREF _Toc241660863 \h </w:instrText>
             </w:r>
             <w:r>
               <w:rPr>
@@ -3931,7 +3931,7 @@
               <w14:ligatures w14:val="standardContextual"/>
             </w:rPr>
           </w:pPr>
-          <w:hyperlink w:anchor="_Toc241660046" w:history="1">
+          <w:hyperlink w:anchor="_Toc241660864" w:history="1">
             <w:r>
               <w:rPr>
                 <w:rStyle w:val="Hyperlink"/>
@@ -3977,7 +3977,7 @@
                 <w:noProof/>
                 <w:webHidden/>
               </w:rPr>
-              <w:instrText xml:space="preserve"> PAGEREF _Toc241660046 \h </w:instrText>
+              <w:instrText xml:space="preserve"> PAGEREF _Toc241660864 \h </w:instrText>
             </w:r>
             <w:r>
               <w:rPr>
@@ -4025,7 +4025,7 @@
               <w14:ligatures w14:val="standardContextual"/>
             </w:rPr>
           </w:pPr>
-          <w:hyperlink w:anchor="_Toc241660047" w:history="1">
+          <w:hyperlink w:anchor="_Toc241660865" w:history="1">
             <w:r>
               <w:rPr>
                 <w:rStyle w:val="Hyperlink"/>
@@ -4071,7 +4071,7 @@
                 <w:noProof/>
                 <w:webHidden/>
               </w:rPr>
-              <w:instrText xml:space="preserve"> PAGEREF _Toc241660047 \h </w:instrText>
+              <w:instrText xml:space="preserve"> PAGEREF _Toc241660865 \h </w:instrText>
             </w:r>
             <w:r>
               <w:rPr>
@@ -4119,7 +4119,7 @@
               <w14:ligatures w14:val="standardContextual"/>
             </w:rPr>
           </w:pPr>
-          <w:hyperlink w:anchor="_Toc241660048" w:history="1">
+          <w:hyperlink w:anchor="_Toc241660866" w:history="1">
             <w:r>
               <w:rPr>
                 <w:rStyle w:val="Hyperlink"/>
@@ -4165,7 +4165,7 @@
                 <w:noProof/>
                 <w:webHidden/>
               </w:rPr>
-              <w:instrText xml:space="preserve"> PAGEREF _Toc241660048 \h </w:instrText>
+              <w:instrText xml:space="preserve"> PAGEREF _Toc241660866 \h </w:instrText>
             </w:r>
             <w:r>
               <w:rPr>
@@ -4213,7 +4213,7 @@
               <w14:ligatures w14:val="standardContextual"/>
             </w:rPr>
           </w:pPr>
-          <w:hyperlink w:anchor="_Toc241660049" w:history="1">
+          <w:hyperlink w:anchor="_Toc241660867" w:history="1">
             <w:r>
               <w:rPr>
                 <w:rStyle w:val="Hyperlink"/>
@@ -4259,7 +4259,7 @@
                 <w:noProof/>
                 <w:webHidden/>
               </w:rPr>
-              <w:instrText xml:space="preserve"> PAGEREF _Toc241660049 \h </w:instrText>
+              <w:instrText xml:space="preserve"> PAGEREF _Toc241660867 \h </w:instrText>
             </w:r>
             <w:r>
               <w:rPr>
@@ -4307,7 +4307,7 @@
               <w14:ligatures w14:val="standardContextual"/>
             </w:rPr>
           </w:pPr>
-          <w:hyperlink w:anchor="_Toc241660050" w:history="1">
+          <w:hyperlink w:anchor="_Toc241660868" w:history="1">
             <w:r>
               <w:rPr>
                 <w:rStyle w:val="Hyperlink"/>
@@ -4353,7 +4353,7 @@
                 <w:noProof/>
                 <w:webHidden/>
               </w:rPr>
-              <w:instrText xml:space="preserve"> PAGEREF _Toc241660050 \h </w:instrText>
+              <w:instrText xml:space="preserve"> PAGEREF _Toc241660868 \h </w:instrText>
             </w:r>
             <w:r>
               <w:rPr>
@@ -4401,7 +4401,7 @@
               <w14:ligatures w14:val="standardContextual"/>
             </w:rPr>
           </w:pPr>
-          <w:hyperlink w:anchor="_Toc241660051" w:history="1">
+          <w:hyperlink w:anchor="_Toc241660869" w:history="1">
             <w:r>
               <w:rPr>
                 <w:rStyle w:val="Hyperlink"/>
@@ -4447,7 +4447,7 @@
                 <w:noProof/>
                 <w:webHidden/>
               </w:rPr>
-              <w:instrText xml:space="preserve"> PAGEREF _Toc241660051 \h </w:instrText>
+              <w:instrText xml:space="preserve"> PAGEREF _Toc241660869 \h </w:instrText>
             </w:r>
             <w:r>
               <w:rPr>
@@ -4495,7 +4495,7 @@
               <w14:ligatures w14:val="standardContextual"/>
             </w:rPr>
           </w:pPr>
-          <w:hyperlink w:anchor="_Toc241660052" w:history="1">
+          <w:hyperlink w:anchor="_Toc241660870" w:history="1">
             <w:r>
               <w:rPr>
                 <w:rStyle w:val="Hyperlink"/>
@@ -4541,7 +4541,7 @@
                 <w:noProof/>
                 <w:webHidden/>
               </w:rPr>
-              <w:instrText xml:space="preserve"> PAGEREF _Toc241660052 \h </w:instrText>
+              <w:instrText xml:space="preserve"> PAGEREF _Toc241660870 \h </w:instrText>
             </w:r>
             <w:r>
               <w:rPr>
@@ -4589,7 +4589,7 @@
               <w14:ligatures w14:val="standardContextual"/>
             </w:rPr>
           </w:pPr>
-          <w:hyperlink w:anchor="_Toc241660053" w:history="1">
+          <w:hyperlink w:anchor="_Toc241660871" w:history="1">
             <w:r>
               <w:rPr>
                 <w:rStyle w:val="Hyperlink"/>
@@ -4635,7 +4635,7 @@
                 <w:noProof/>
                 <w:webHidden/>
               </w:rPr>
-              <w:instrText xml:space="preserve"> PAGEREF _Toc241660053 \h </w:instrText>
+              <w:instrText xml:space="preserve"> PAGEREF _Toc241660871 \h </w:instrText>
             </w:r>
             <w:r>
               <w:rPr>
@@ -4683,7 +4683,7 @@
               <w14:ligatures w14:val="standardContextual"/>
             </w:rPr>
           </w:pPr>
-          <w:hyperlink w:anchor="_Toc241660054" w:history="1">
+          <w:hyperlink w:anchor="_Toc241660872" w:history="1">
             <w:r>
               <w:rPr>
                 <w:rStyle w:val="Hyperlink"/>
@@ -4729,7 +4729,7 @@
                 <w:noProof/>
                 <w:webHidden/>
               </w:rPr>
-              <w:instrText xml:space="preserve"> PAGEREF _Toc241660054 \h </w:instrText>
+              <w:instrText xml:space="preserve"> PAGEREF _Toc241660872 \h </w:instrText>
             </w:r>
             <w:r>
               <w:rPr>
@@ -4777,7 +4777,7 @@
               <w14:ligatures w14:val="standardContextual"/>
             </w:rPr>
           </w:pPr>
-          <w:hyperlink w:anchor="_Toc241660055" w:history="1">
+          <w:hyperlink w:anchor="_Toc241660873" w:history="1">
             <w:r>
               <w:rPr>
                 <w:rStyle w:val="Hyperlink"/>
@@ -4823,7 +4823,7 @@
                 <w:noProof/>
                 <w:webHidden/>
               </w:rPr>
-              <w:instrText xml:space="preserve"> PAGEREF _Toc241660055 \h </w:instrText>
+              <w:instrText xml:space="preserve"> PAGEREF _Toc241660873 \h </w:instrText>
             </w:r>
             <w:r>
               <w:rPr>
@@ -4871,7 +4871,7 @@
               <w14:ligatures w14:val="standardContextual"/>
             </w:rPr>
           </w:pPr>
-          <w:hyperlink w:anchor="_Toc241660056" w:history="1">
+          <w:hyperlink w:anchor="_Toc241660874" w:history="1">
             <w:r>
               <w:rPr>
                 <w:rStyle w:val="Hyperlink"/>
@@ -4917,7 +4917,7 @@
                 <w:noProof/>
                 <w:webHidden/>
               </w:rPr>
-              <w:instrText xml:space="preserve"> PAGEREF _Toc241660056 \h </w:instrText>
+              <w:instrText xml:space="preserve"> PAGEREF _Toc241660874 \h </w:instrText>
             </w:r>
             <w:r>
               <w:rPr>
@@ -4965,7 +4965,7 @@
               <w14:ligatures w14:val="standardContextual"/>
             </w:rPr>
           </w:pPr>
-          <w:hyperlink w:anchor="_Toc241660057" w:history="1">
+          <w:hyperlink w:anchor="_Toc241660875" w:history="1">
             <w:r>
               <w:rPr>
                 <w:rStyle w:val="Hyperlink"/>
@@ -5011,7 +5011,7 @@
                 <w:noProof/>
                 <w:webHidden/>
               </w:rPr>
-              <w:instrText xml:space="preserve"> PAGEREF _Toc241660057 \h </w:instrText>
+              <w:instrText xml:space="preserve"> PAGEREF _Toc241660875 \h </w:instrText>
             </w:r>
             <w:r>
               <w:rPr>
@@ -5059,7 +5059,7 @@
               <w14:ligatures w14:val="standardContextual"/>
             </w:rPr>
           </w:pPr>
-          <w:hyperlink w:anchor="_Toc241660058" w:history="1">
+          <w:hyperlink w:anchor="_Toc241660876" w:history="1">
             <w:r>
               <w:rPr>
                 <w:rStyle w:val="Hyperlink"/>
@@ -5105,7 +5105,7 @@
                 <w:noProof/>
                 <w:webHidden/>
               </w:rPr>
-              <w:instrText xml:space="preserve"> PAGEREF _Toc241660058 \h </w:instrText>
+              <w:instrText xml:space="preserve"> PAGEREF _Toc241660876 \h </w:instrText>
             </w:r>
             <w:r>
               <w:rPr>
@@ -5153,7 +5153,7 @@
               <w14:ligatures w14:val="standardContextual"/>
             </w:rPr>
           </w:pPr>
-          <w:hyperlink w:anchor="_Toc241660059" w:history="1">
+          <w:hyperlink w:anchor="_Toc241660877" w:history="1">
             <w:r>
               <w:rPr>
                 <w:rStyle w:val="Hyperlink"/>
@@ -5199,7 +5199,7 @@
                 <w:noProof/>
                 <w:webHidden/>
               </w:rPr>
-              <w:instrText xml:space="preserve"> PAGEREF _Toc241660059 \h </w:instrText>
+              <w:instrText xml:space="preserve"> PAGEREF _Toc241660877 \h </w:instrText>
             </w:r>
             <w:r>
               <w:rPr>
@@ -5247,7 +5247,7 @@
               <w14:ligatures w14:val="standardContextual"/>
             </w:rPr>
           </w:pPr>
-          <w:hyperlink w:anchor="_Toc241660060" w:history="1">
+          <w:hyperlink w:anchor="_Toc241660878" w:history="1">
             <w:r>
               <w:rPr>
                 <w:rStyle w:val="Hyperlink"/>
@@ -5293,7 +5293,7 @@
                 <w:noProof/>
                 <w:webHidden/>
               </w:rPr>
-              <w:instrText xml:space="preserve"> PAGEREF _Toc241660060 \h </w:instrText>
+              <w:instrText xml:space="preserve"> PAGEREF _Toc241660878 \h </w:instrText>
             </w:r>
             <w:r>
               <w:rPr>
@@ -5341,7 +5341,7 @@
               <w14:ligatures w14:val="standardContextual"/>
             </w:rPr>
           </w:pPr>
-          <w:hyperlink w:anchor="_Toc241660061" w:history="1">
+          <w:hyperlink w:anchor="_Toc241660879" w:history="1">
             <w:r>
               <w:rPr>
                 <w:rStyle w:val="Hyperlink"/>
@@ -5387,7 +5387,7 @@
                 <w:noProof/>
                 <w:webHidden/>
               </w:rPr>
-              <w:instrText xml:space="preserve"> PAGEREF _Toc241660061 \h </w:instrText>
+              <w:instrText xml:space="preserve"> PAGEREF _Toc241660879 \h </w:instrText>
             </w:r>
             <w:r>
               <w:rPr>
@@ -5435,7 +5435,7 @@
               <w14:ligatures w14:val="standardContextual"/>
             </w:rPr>
           </w:pPr>
-          <w:hyperlink w:anchor="_Toc241660062" w:history="1">
+          <w:hyperlink w:anchor="_Toc241660880" w:history="1">
             <w:r>
               <w:rPr>
                 <w:rStyle w:val="Hyperlink"/>
@@ -5481,7 +5481,7 @@
                 <w:noProof/>
                 <w:webHidden/>
               </w:rPr>
-              <w:instrText xml:space="preserve"> PAGEREF _Toc241660062 \h </w:instrText>
+              <w:instrText xml:space="preserve"> PAGEREF _Toc241660880 \h </w:instrText>
             </w:r>
             <w:r>
               <w:rPr>
@@ -5529,7 +5529,7 @@
               <w14:ligatures w14:val="standardContextual"/>
             </w:rPr>
           </w:pPr>
-          <w:hyperlink w:anchor="_Toc241660063" w:history="1">
+          <w:hyperlink w:anchor="_Toc241660881" w:history="1">
             <w:r>
               <w:rPr>
                 <w:rStyle w:val="Hyperlink"/>
@@ -5575,7 +5575,7 @@
                 <w:noProof/>
                 <w:webHidden/>
               </w:rPr>
-              <w:instrText xml:space="preserve"> PAGEREF _Toc241660063 \h </w:instrText>
+              <w:instrText xml:space="preserve"> PAGEREF _Toc241660881 \h </w:instrText>
             </w:r>
             <w:r>
               <w:rPr>
@@ -5623,7 +5623,7 @@
               <w14:ligatures w14:val="standardContextual"/>
             </w:rPr>
           </w:pPr>
-          <w:hyperlink w:anchor="_Toc241660064" w:history="1">
+          <w:hyperlink w:anchor="_Toc241660882" w:history="1">
             <w:r>
               <w:rPr>
                 <w:rStyle w:val="Hyperlink"/>
@@ -5669,7 +5669,7 @@
                 <w:noProof/>
                 <w:webHidden/>
               </w:rPr>
-              <w:instrText xml:space="preserve"> PAGEREF _Toc241660064 \h </w:instrText>
+              <w:instrText xml:space="preserve"> PAGEREF _Toc241660882 \h </w:instrText>
             </w:r>
             <w:r>
               <w:rPr>
@@ -5717,7 +5717,7 @@
               <w14:ligatures w14:val="standardContextual"/>
             </w:rPr>
           </w:pPr>
-          <w:hyperlink w:anchor="_Toc241660065" w:history="1">
+          <w:hyperlink w:anchor="_Toc241660883" w:history="1">
             <w:r>
               <w:rPr>
                 <w:rStyle w:val="Hyperlink"/>
@@ -5763,7 +5763,7 @@
                 <w:noProof/>
                 <w:webHidden/>
               </w:rPr>
-              <w:instrText xml:space="preserve"> PAGEREF _Toc241660065 \h </w:instrText>
+              <w:instrText xml:space="preserve"> PAGEREF _Toc241660883 \h </w:instrText>
             </w:r>
             <w:r>
               <w:rPr>
@@ -5811,7 +5811,7 @@
               <w14:ligatures w14:val="standardContextual"/>
             </w:rPr>
           </w:pPr>
-          <w:hyperlink w:anchor="_Toc241660066" w:history="1">
+          <w:hyperlink w:anchor="_Toc241660884" w:history="1">
             <w:r>
               <w:rPr>
                 <w:rStyle w:val="Hyperlink"/>
@@ -5857,7 +5857,7 @@
                 <w:noProof/>
                 <w:webHidden/>
               </w:rPr>
-              <w:instrText xml:space="preserve"> PAGEREF _Toc241660066 \h </w:instrText>
+              <w:instrText xml:space="preserve"> PAGEREF _Toc241660884 \h </w:instrText>
             </w:r>
             <w:r>
               <w:rPr>
@@ -5905,7 +5905,7 @@
               <w14:ligatures w14:val="standardContextual"/>
             </w:rPr>
           </w:pPr>
-          <w:hyperlink w:anchor="_Toc241660067" w:history="1">
+          <w:hyperlink w:anchor="_Toc241660885" w:history="1">
             <w:r>
               <w:rPr>
                 <w:rStyle w:val="Hyperlink"/>
@@ -5951,7 +5951,7 @@
                 <w:noProof/>
                 <w:webHidden/>
               </w:rPr>
-              <w:instrText xml:space="preserve"> PAGEREF _Toc241660067 \h </w:instrText>
+              <w:instrText xml:space="preserve"> PAGEREF _Toc241660885 \h </w:instrText>
             </w:r>
             <w:r>
               <w:rPr>
@@ -5999,7 +5999,7 @@
               <w14:ligatures w14:val="standardContextual"/>
             </w:rPr>
           </w:pPr>
-          <w:hyperlink w:anchor="_Toc241660068" w:history="1">
+          <w:hyperlink w:anchor="_Toc241660886" w:history="1">
             <w:r>
               <w:rPr>
                 <w:rStyle w:val="Hyperlink"/>
@@ -6045,7 +6045,7 @@
                 <w:noProof/>
                 <w:webHidden/>
               </w:rPr>
-              <w:instrText xml:space="preserve"> PAGEREF _Toc241660068 \h </w:instrText>
+              <w:instrText xml:space="preserve"> PAGEREF _Toc241660886 \h </w:instrText>
             </w:r>
             <w:r>
               <w:rPr>
@@ -6093,7 +6093,7 @@
               <w14:ligatures w14:val="standardContextual"/>
             </w:rPr>
           </w:pPr>
-          <w:hyperlink w:anchor="_Toc241660069" w:history="1">
+          <w:hyperlink w:anchor="_Toc241660887" w:history="1">
             <w:r>
               <w:rPr>
                 <w:rStyle w:val="Hyperlink"/>
@@ -6139,7 +6139,7 @@
                 <w:noProof/>
                 <w:webHidden/>
               </w:rPr>
-              <w:instrText xml:space="preserve"> PAGEREF _Toc241660069 \h </w:instrText>
+              <w:instrText xml:space="preserve"> PAGEREF _Toc241660887 \h </w:instrText>
             </w:r>
             <w:r>
               <w:rPr>
@@ -6187,7 +6187,7 @@
               <w14:ligatures w14:val="standardContextual"/>
             </w:rPr>
           </w:pPr>
-          <w:hyperlink w:anchor="_Toc241660070" w:history="1">
+          <w:hyperlink w:anchor="_Toc241660888" w:history="1">
             <w:r>
               <w:rPr>
                 <w:rStyle w:val="Hyperlink"/>
@@ -6233,7 +6233,7 @@
                 <w:noProof/>
                 <w:webHidden/>
               </w:rPr>
-              <w:instrText xml:space="preserve"> PAGEREF _Toc241660070 \h </w:instrText>
+              <w:instrText xml:space="preserve"> PAGEREF _Toc241660888 \h </w:instrText>
             </w:r>
             <w:r>
               <w:rPr>
@@ -6281,7 +6281,7 @@
               <w14:ligatures w14:val="standardContextual"/>
             </w:rPr>
           </w:pPr>
-          <w:hyperlink w:anchor="_Toc241660071" w:history="1">
+          <w:hyperlink w:anchor="_Toc241660889" w:history="1">
             <w:r>
               <w:rPr>
                 <w:rStyle w:val="Hyperlink"/>
@@ -6327,7 +6327,7 @@
                 <w:noProof/>
                 <w:webHidden/>
               </w:rPr>
-              <w:instrText xml:space="preserve"> PAGEREF _Toc241660071 \h </w:instrText>
+              <w:instrText xml:space="preserve"> PAGEREF _Toc241660889 \h </w:instrText>
             </w:r>
             <w:r>
               <w:rPr>
@@ -6375,7 +6375,7 @@
               <w14:ligatures w14:val="standardContextual"/>
             </w:rPr>
           </w:pPr>
-          <w:hyperlink w:anchor="_Toc241660072" w:history="1">
+          <w:hyperlink w:anchor="_Toc241660890" w:history="1">
             <w:r>
               <w:rPr>
                 <w:rStyle w:val="Hyperlink"/>
@@ -6421,7 +6421,7 @@
                 <w:noProof/>
                 <w:webHidden/>
               </w:rPr>
-              <w:instrText xml:space="preserve"> PAGEREF _Toc241660072 \h </w:instrText>
+              <w:instrText xml:space="preserve"> PAGEREF _Toc241660890 \h </w:instrText>
             </w:r>
             <w:r>
               <w:rPr>
@@ -6469,7 +6469,7 @@
               <w14:ligatures w14:val="standardContextual"/>
             </w:rPr>
           </w:pPr>
-          <w:hyperlink w:anchor="_Toc241660073" w:history="1">
+          <w:hyperlink w:anchor="_Toc241660891" w:history="1">
             <w:r>
               <w:rPr>
                 <w:rStyle w:val="Hyperlink"/>
@@ -6515,7 +6515,7 @@
                 <w:noProof/>
                 <w:webHidden/>
               </w:rPr>
-              <w:instrText xml:space="preserve"> PAGEREF _Toc241660073 \h </w:instrText>
+              <w:instrText xml:space="preserve"> PAGEREF _Toc241660891 \h </w:instrText>
             </w:r>
             <w:r>
               <w:rPr>
@@ -6563,7 +6563,7 @@
               <w14:ligatures w14:val="standardContextual"/>
             </w:rPr>
           </w:pPr>
-          <w:hyperlink w:anchor="_Toc241660074" w:history="1">
+          <w:hyperlink w:anchor="_Toc241660892" w:history="1">
             <w:r>
               <w:rPr>
                 <w:rStyle w:val="Hyperlink"/>
@@ -6609,7 +6609,7 @@
                 <w:noProof/>
                 <w:webHidden/>
               </w:rPr>
-              <w:instrText xml:space="preserve"> PAGEREF _Toc241660074 \h </w:instrText>
+              <w:instrText xml:space="preserve"> PAGEREF _Toc241660892 \h </w:instrText>
             </w:r>
             <w:r>
               <w:rPr>
@@ -6657,7 +6657,7 @@
               <w14:ligatures w14:val="standardContextual"/>
             </w:rPr>
           </w:pPr>
-          <w:hyperlink w:anchor="_Toc241660075" w:history="1">
+          <w:hyperlink w:anchor="_Toc241660893" w:history="1">
             <w:r>
               <w:rPr>
                 <w:rStyle w:val="Hyperlink"/>
@@ -6703,7 +6703,7 @@
                 <w:noProof/>
                 <w:webHidden/>
               </w:rPr>
-              <w:instrText xml:space="preserve"> PAGEREF _Toc241660075 \h </w:instrText>
+              <w:instrText xml:space="preserve"> PAGEREF _Toc241660893 \h </w:instrText>
             </w:r>
             <w:r>
               <w:rPr>
@@ -6751,7 +6751,7 @@
               <w14:ligatures w14:val="standardContextual"/>
             </w:rPr>
           </w:pPr>
-          <w:hyperlink w:anchor="_Toc241660076" w:history="1">
+          <w:hyperlink w:anchor="_Toc241660894" w:history="1">
             <w:r>
               <w:rPr>
                 <w:rStyle w:val="Hyperlink"/>
@@ -6797,7 +6797,7 @@
                 <w:noProof/>
                 <w:webHidden/>
               </w:rPr>
-              <w:instrText xml:space="preserve"> PAGEREF _Toc241660076 \h </w:instrText>
+              <w:instrText xml:space="preserve"> PAGEREF _Toc241660894 \h </w:instrText>
             </w:r>
             <w:r>
               <w:rPr>
@@ -6845,7 +6845,7 @@
               <w14:ligatures w14:val="standardContextual"/>
             </w:rPr>
           </w:pPr>
-          <w:hyperlink w:anchor="_Toc241660077" w:history="1">
+          <w:hyperlink w:anchor="_Toc241660895" w:history="1">
             <w:r>
               <w:rPr>
                 <w:rStyle w:val="Hyperlink"/>
@@ -6891,7 +6891,7 @@
                 <w:noProof/>
                 <w:webHidden/>
               </w:rPr>
-              <w:instrText xml:space="preserve"> PAGEREF _Toc241660077 \h </w:instrText>
+              <w:instrText xml:space="preserve"> PAGEREF _Toc241660895 \h </w:instrText>
             </w:r>
             <w:r>
               <w:rPr>
@@ -6939,7 +6939,7 @@
               <w14:ligatures w14:val="standardContextual"/>
             </w:rPr>
           </w:pPr>
-          <w:hyperlink w:anchor="_Toc241660078" w:history="1">
+          <w:hyperlink w:anchor="_Toc241660896" w:history="1">
             <w:r>
               <w:rPr>
                 <w:rStyle w:val="Hyperlink"/>
@@ -6985,7 +6985,7 @@
                 <w:noProof/>
                 <w:webHidden/>
               </w:rPr>
-              <w:instrText xml:space="preserve"> PAGEREF _Toc241660078 \h </w:instrText>
+              <w:instrText xml:space="preserve"> PAGEREF _Toc241660896 \h </w:instrText>
             </w:r>
             <w:r>
               <w:rPr>
@@ -7033,7 +7033,7 @@
               <w14:ligatures w14:val="standardContextual"/>
             </w:rPr>
           </w:pPr>
-          <w:hyperlink w:anchor="_Toc241660079" w:history="1">
+          <w:hyperlink w:anchor="_Toc241660897" w:history="1">
             <w:r>
               <w:rPr>
                 <w:rStyle w:val="Hyperlink"/>
@@ -7079,7 +7079,7 @@
                 <w:noProof/>
                 <w:webHidden/>
               </w:rPr>
-              <w:instrText xml:space="preserve"> PAGEREF _Toc241660079 \h </w:instrText>
+              <w:instrText xml:space="preserve"> PAGEREF _Toc241660897 \h </w:instrText>
             </w:r>
             <w:r>
               <w:rPr>
@@ -7127,7 +7127,7 @@
               <w14:ligatures w14:val="standardContextual"/>
             </w:rPr>
           </w:pPr>
-          <w:hyperlink w:anchor="_Toc241660080" w:history="1">
+          <w:hyperlink w:anchor="_Toc241660898" w:history="1">
             <w:r>
               <w:rPr>
                 <w:rStyle w:val="Hyperlink"/>
@@ -7173,7 +7173,7 @@
                 <w:noProof/>
                 <w:webHidden/>
               </w:rPr>
-              <w:instrText xml:space="preserve"> PAGEREF _Toc241660080 \h </w:instrText>
+              <w:instrText xml:space="preserve"> PAGEREF _Toc241660898 \h </w:instrText>
             </w:r>
             <w:r>
               <w:rPr>
@@ -7221,7 +7221,7 @@
               <w14:ligatures w14:val="standardContextual"/>
             </w:rPr>
           </w:pPr>
-          <w:hyperlink w:anchor="_Toc241660081" w:history="1">
+          <w:hyperlink w:anchor="_Toc241660899" w:history="1">
             <w:r>
               <w:rPr>
                 <w:rStyle w:val="Hyperlink"/>
@@ -7267,7 +7267,7 @@
                 <w:noProof/>
                 <w:webHidden/>
               </w:rPr>
-              <w:instrText xml:space="preserve"> PAGEREF _Toc241660081 \h </w:instrText>
+              <w:instrText xml:space="preserve"> PAGEREF _Toc241660899 \h </w:instrText>
             </w:r>
             <w:r>
               <w:rPr>
@@ -7315,7 +7315,7 @@
               <w14:ligatures w14:val="standardContextual"/>
             </w:rPr>
           </w:pPr>
-          <w:hyperlink w:anchor="_Toc241660082" w:history="1">
+          <w:hyperlink w:anchor="_Toc241660900" w:history="1">
             <w:r>
               <w:rPr>
                 <w:rStyle w:val="Hyperlink"/>
@@ -7361,7 +7361,7 @@
                 <w:noProof/>
                 <w:webHidden/>
               </w:rPr>
-              <w:instrText xml:space="preserve"> PAGEREF _Toc241660082 \h </w:instrText>
+              <w:instrText xml:space="preserve"> PAGEREF _Toc241660900 \h </w:instrText>
             </w:r>
             <w:r>
               <w:rPr>
@@ -7409,7 +7409,7 @@
               <w14:ligatures w14:val="standardContextual"/>
             </w:rPr>
           </w:pPr>
-          <w:hyperlink w:anchor="_Toc241660083" w:history="1">
+          <w:hyperlink w:anchor="_Toc241660901" w:history="1">
             <w:r>
               <w:rPr>
                 <w:rStyle w:val="Hyperlink"/>
@@ -7455,7 +7455,7 @@
                 <w:noProof/>
                 <w:webHidden/>
               </w:rPr>
-              <w:instrText xml:space="preserve"> PAGEREF _Toc241660083 \h </w:instrText>
+              <w:instrText xml:space="preserve"> PAGEREF _Toc241660901 \h </w:instrText>
             </w:r>
             <w:r>
               <w:rPr>
@@ -7503,7 +7503,7 @@
               <w14:ligatures w14:val="standardContextual"/>
             </w:rPr>
           </w:pPr>
-          <w:hyperlink w:anchor="_Toc241660084" w:history="1">
+          <w:hyperlink w:anchor="_Toc241660902" w:history="1">
             <w:r>
               <w:rPr>
                 <w:rStyle w:val="Hyperlink"/>
@@ -7549,7 +7549,7 @@
                 <w:noProof/>
                 <w:webHidden/>
               </w:rPr>
-              <w:instrText xml:space="preserve"> PAGEREF _Toc241660084 \h </w:instrText>
+              <w:instrText xml:space="preserve"> PAGEREF _Toc241660902 \h </w:instrText>
             </w:r>
             <w:r>
               <w:rPr>
@@ -7597,7 +7597,7 @@
               <w14:ligatures w14:val="standardContextual"/>
             </w:rPr>
           </w:pPr>
-          <w:hyperlink w:anchor="_Toc241660085" w:history="1">
+          <w:hyperlink w:anchor="_Toc241660903" w:history="1">
             <w:r>
               <w:rPr>
                 <w:rStyle w:val="Hyperlink"/>
@@ -7643,7 +7643,7 @@
                 <w:noProof/>
                 <w:webHidden/>
               </w:rPr>
-              <w:instrText xml:space="preserve"> PAGEREF _Toc241660085 \h </w:instrText>
+              <w:instrText xml:space="preserve"> PAGEREF _Toc241660903 \h </w:instrText>
             </w:r>
             <w:r>
               <w:rPr>
@@ -7691,7 +7691,7 @@
               <w14:ligatures w14:val="standardContextual"/>
             </w:rPr>
           </w:pPr>
-          <w:hyperlink w:anchor="_Toc241660086" w:history="1">
+          <w:hyperlink w:anchor="_Toc241660904" w:history="1">
             <w:r>
               <w:rPr>
                 <w:rStyle w:val="Hyperlink"/>
@@ -7737,7 +7737,7 @@
                 <w:noProof/>
                 <w:webHidden/>
               </w:rPr>
-              <w:instrText xml:space="preserve"> PAGEREF _Toc241660086 \h </w:instrText>
+              <w:instrText xml:space="preserve"> PAGEREF _Toc241660904 \h </w:instrText>
             </w:r>
             <w:r>
               <w:rPr>
@@ -7785,7 +7785,7 @@
               <w14:ligatures w14:val="standardContextual"/>
             </w:rPr>
           </w:pPr>
-          <w:hyperlink w:anchor="_Toc241660087" w:history="1">
+          <w:hyperlink w:anchor="_Toc241660905" w:history="1">
             <w:r>
               <w:rPr>
                 <w:rStyle w:val="Hyperlink"/>
@@ -7831,7 +7831,7 @@
                 <w:noProof/>
                 <w:webHidden/>
               </w:rPr>
-              <w:instrText xml:space="preserve"> PAGEREF _Toc241660087 \h </w:instrText>
+              <w:instrText xml:space="preserve"> PAGEREF _Toc241660905 \h </w:instrText>
             </w:r>
             <w:r>
               <w:rPr>
@@ -7879,7 +7879,7 @@
               <w14:ligatures w14:val="standardContextual"/>
             </w:rPr>
           </w:pPr>
-          <w:hyperlink w:anchor="_Toc241660088" w:history="1">
+          <w:hyperlink w:anchor="_Toc241660906" w:history="1">
             <w:r>
               <w:rPr>
                 <w:rStyle w:val="Hyperlink"/>
@@ -7925,7 +7925,7 @@
                 <w:noProof/>
                 <w:webHidden/>
               </w:rPr>
-              <w:instrText xml:space="preserve"> PAGEREF _Toc241660088 \h </w:instrText>
+              <w:instrText xml:space="preserve"> PAGEREF _Toc241660906 \h </w:instrText>
             </w:r>
             <w:r>
               <w:rPr>
@@ -7973,7 +7973,7 @@
               <w14:ligatures w14:val="standardContextual"/>
             </w:rPr>
           </w:pPr>
-          <w:hyperlink w:anchor="_Toc241660089" w:history="1">
+          <w:hyperlink w:anchor="_Toc241660907" w:history="1">
             <w:r>
               <w:rPr>
                 <w:rStyle w:val="Hyperlink"/>
@@ -8019,7 +8019,7 @@
                 <w:noProof/>
                 <w:webHidden/>
               </w:rPr>
-              <w:instrText xml:space="preserve"> PAGEREF _Toc241660089 \h </w:instrText>
+              <w:instrText xml:space="preserve"> PAGEREF _Toc241660907 \h </w:instrText>
             </w:r>
             <w:r>
               <w:rPr>
@@ -8067,7 +8067,7 @@
               <w14:ligatures w14:val="standardContextual"/>
             </w:rPr>
           </w:pPr>
-          <w:hyperlink w:anchor="_Toc241660090" w:history="1">
+          <w:hyperlink w:anchor="_Toc241660908" w:history="1">
             <w:r>
               <w:rPr>
                 <w:rStyle w:val="Hyperlink"/>
@@ -8113,7 +8113,7 @@
                 <w:noProof/>
                 <w:webHidden/>
               </w:rPr>
-              <w:instrText xml:space="preserve"> PAGEREF _Toc241660090 \h </w:instrText>
+              <w:instrText xml:space="preserve"> PAGEREF _Toc241660908 \h </w:instrText>
             </w:r>
             <w:r>
               <w:rPr>
@@ -8160,7 +8160,7 @@
               <w14:ligatures w14:val="standardContextual"/>
             </w:rPr>
           </w:pPr>
-          <w:hyperlink w:anchor="_Toc241660091" w:history="1">
+          <w:hyperlink w:anchor="_Toc241660909" w:history="1">
             <w:r>
               <w:rPr>
                 <w:rStyle w:val="Hyperlink"/>
@@ -8187,7 +8187,7 @@
                 <w:noProof/>
                 <w:webHidden/>
               </w:rPr>
-              <w:instrText xml:space="preserve"> PAGEREF _Toc241660091 \h </w:instrText>
+              <w:instrText xml:space="preserve"> PAGEREF _Toc241660909 \h </w:instrText>
             </w:r>
             <w:r>
               <w:rPr>
@@ -8234,7 +8234,7 @@
               <w14:ligatures w14:val="standardContextual"/>
             </w:rPr>
           </w:pPr>
-          <w:hyperlink w:anchor="_Toc241660092" w:history="1">
+          <w:hyperlink w:anchor="_Toc241660910" w:history="1">
             <w:r>
               <w:rPr>
                 <w:rStyle w:val="Hyperlink"/>
@@ -8261,7 +8261,7 @@
                 <w:noProof/>
                 <w:webHidden/>
               </w:rPr>
-              <w:instrText xml:space="preserve"> PAGEREF _Toc241660092 \h </w:instrText>
+              <w:instrText xml:space="preserve"> PAGEREF _Toc241660910 \h </w:instrText>
             </w:r>
             <w:r>
               <w:rPr>
@@ -8304,7 +8304,7 @@
         <w:pStyle w:val="Heading1"/>
       </w:pPr>
       <w:bookmarkStart w:id="0" w:name="start-here"/>
-      <w:bookmarkStart w:id="1" w:name="_Toc241660005"/>
+      <w:bookmarkStart w:id="1" w:name="_Toc241660823"/>
       <w:r>
         <w:rPr>
           <w:rStyle w:val="SectionNumber"/>
@@ -8322,7 +8322,7 @@
         <w:pStyle w:val="Heading2"/>
       </w:pPr>
       <w:bookmarkStart w:id="2" w:name="what-tinygpt-is"/>
-      <w:bookmarkStart w:id="3" w:name="_Toc241660006"/>
+      <w:bookmarkStart w:id="3" w:name="_Toc241660824"/>
       <w:r>
         <w:rPr>
           <w:rStyle w:val="SectionNumber"/>
@@ -8465,7 +8465,7 @@
           <w:noProof/>
         </w:rPr>
         <w:drawing>
-          <wp:inline distT="0" distB="0" distL="0" distR="0" wp14:anchorId="1023A365" wp14:editId="424015DC">
+          <wp:inline distT="0" distB="0" distL="0" distR="0" wp14:anchorId="5D059B72" wp14:editId="3B2958C7">
             <wp:extent cx="5939999" cy="4517746"/>
             <wp:effectExtent l="0" t="0" r="0" b="0"/>
             <wp:docPr id="10" name="Picture" descr="The tinyGPT pipeline. a, text sources. b, data preparation turns raw text into clean, deduplicated, English, on-topic token shards, split by document. c, pre-training repeats a four-step loop (forward pass, loss, gradients, update) and evaluates every 200 steps. d, post-training turns the base model into a question answerer. e, tools to inspect, compare, export and use checkpoints."/>
@@ -8577,7 +8577,7 @@
         <w:pStyle w:val="Heading2"/>
       </w:pPr>
       <w:bookmarkStart w:id="4" w:name="the-files"/>
-      <w:bookmarkStart w:id="5" w:name="_Toc241660007"/>
+      <w:bookmarkStart w:id="5" w:name="_Toc241660825"/>
       <w:bookmarkEnd w:id="2"/>
       <w:r>
         <w:rPr>
@@ -9358,7 +9358,7 @@
         <w:pStyle w:val="Heading2"/>
       </w:pPr>
       <w:bookmarkStart w:id="6" w:name="everyday-commands"/>
-      <w:bookmarkStart w:id="7" w:name="_Toc241660008"/>
+      <w:bookmarkStart w:id="7" w:name="_Toc241660826"/>
       <w:bookmarkEnd w:id="4"/>
       <w:r>
         <w:rPr>
@@ -9590,7 +9590,7 @@
         <w:pStyle w:val="Heading2"/>
       </w:pPr>
       <w:bookmarkStart w:id="8" w:name="what-changed-on-29-september-2026"/>
-      <w:bookmarkStart w:id="9" w:name="_Toc241660009"/>
+      <w:bookmarkStart w:id="9" w:name="_Toc241660827"/>
       <w:bookmarkEnd w:id="6"/>
       <w:r>
         <w:rPr>
@@ -9900,7 +9900,7 @@
         <w:pStyle w:val="Heading2"/>
       </w:pPr>
       <w:bookmarkStart w:id="10" w:name="X87477c0b04dc5b0a9bcce666f011b24acd90ac6"/>
-      <w:bookmarkStart w:id="11" w:name="_Toc241660010"/>
+      <w:bookmarkStart w:id="11" w:name="_Toc241660828"/>
       <w:bookmarkEnd w:id="8"/>
       <w:r>
         <w:rPr>
@@ -10399,7 +10399,7 @@
         <w:pStyle w:val="Heading1"/>
       </w:pPr>
       <w:bookmarkStart w:id="12" w:name="how-language-models-are-trained"/>
-      <w:bookmarkStart w:id="13" w:name="_Toc241660011"/>
+      <w:bookmarkStart w:id="13" w:name="_Toc241660829"/>
       <w:bookmarkEnd w:id="0"/>
       <w:bookmarkEnd w:id="10"/>
       <w:r>
@@ -10469,7 +10469,7 @@
           <w:noProof/>
         </w:rPr>
         <w:drawing>
-          <wp:inline distT="0" distB="0" distL="0" distR="0" wp14:anchorId="2F936D4B" wp14:editId="45D49DF4">
+          <wp:inline distT="0" distB="0" distL="0" distR="0" wp14:anchorId="3C3FA781" wp14:editId="7109D833">
             <wp:extent cx="5759999" cy="2028169"/>
             <wp:effectExtent l="0" t="0" r="0" b="0"/>
             <wp:docPr id="19" name="Picture" descr="The four training stages. Pre-training costs most of the compute. The later stages decide most of how useful the model is."/>
@@ -10534,7 +10534,7 @@
         <w:pStyle w:val="Heading2"/>
       </w:pPr>
       <w:bookmarkStart w:id="14" w:name="tokens-text-becomes-numbers"/>
-      <w:bookmarkStart w:id="15" w:name="_Toc241660012"/>
+      <w:bookmarkStart w:id="15" w:name="_Toc241660830"/>
       <w:r>
         <w:rPr>
           <w:rStyle w:val="SectionNumber"/>
@@ -10839,7 +10839,7 @@
         <w:pStyle w:val="Heading2"/>
       </w:pPr>
       <w:bookmarkStart w:id="16" w:name="the-transformer"/>
-      <w:bookmarkStart w:id="17" w:name="_Toc241660013"/>
+      <w:bookmarkStart w:id="17" w:name="_Toc241660831"/>
       <w:bookmarkEnd w:id="14"/>
       <w:r>
         <w:rPr>
@@ -11190,7 +11190,7 @@
         <w:pStyle w:val="Heading2"/>
       </w:pPr>
       <w:bookmarkStart w:id="18" w:name="what-it-learns-predict-the-next-token"/>
-      <w:bookmarkStart w:id="19" w:name="_Toc241660014"/>
+      <w:bookmarkStart w:id="19" w:name="_Toc241660832"/>
       <w:bookmarkEnd w:id="16"/>
       <w:r>
         <w:rPr>
@@ -11542,7 +11542,7 @@
         <w:pStyle w:val="Heading2"/>
       </w:pPr>
       <w:bookmarkStart w:id="20" w:name="how-it-learns-gradient-descent"/>
-      <w:bookmarkStart w:id="21" w:name="_Toc241660015"/>
+      <w:bookmarkStart w:id="21" w:name="_Toc241660833"/>
       <w:bookmarkEnd w:id="18"/>
       <w:r>
         <w:rPr>
@@ -11989,7 +11989,7 @@
         <w:pStyle w:val="Heading2"/>
       </w:pPr>
       <w:bookmarkStart w:id="22" w:name="how-it-writes-generation"/>
-      <w:bookmarkStart w:id="23" w:name="_Toc241660016"/>
+      <w:bookmarkStart w:id="23" w:name="_Toc241660834"/>
       <w:bookmarkEnd w:id="20"/>
       <w:r>
         <w:rPr>
@@ -12140,7 +12140,7 @@
         <w:pStyle w:val="Heading2"/>
       </w:pPr>
       <w:bookmarkStart w:id="24" w:name="the-four-training-stages"/>
-      <w:bookmarkStart w:id="25" w:name="_Toc241660017"/>
+      <w:bookmarkStart w:id="25" w:name="_Toc241660835"/>
       <w:bookmarkEnd w:id="22"/>
       <w:r>
         <w:rPr>
@@ -12696,7 +12696,7 @@
         <w:pStyle w:val="Heading2"/>
       </w:pPr>
       <w:bookmarkStart w:id="26" w:name="X7de0b60ad97266c320e3b2fb58a9b5aca304cdc"/>
-      <w:bookmarkStart w:id="27" w:name="_Toc241660018"/>
+      <w:bookmarkStart w:id="27" w:name="_Toc241660836"/>
       <w:bookmarkEnd w:id="24"/>
       <w:r>
         <w:rPr>
@@ -12843,7 +12843,7 @@
         <w:pStyle w:val="Heading2"/>
       </w:pPr>
       <w:bookmarkStart w:id="28" w:name="making-models-smaller-and-cheaper"/>
-      <w:bookmarkStart w:id="29" w:name="_Toc241660019"/>
+      <w:bookmarkStart w:id="29" w:name="_Toc241660837"/>
       <w:bookmarkEnd w:id="26"/>
       <w:r>
         <w:rPr>
@@ -12943,7 +12943,7 @@
         <w:pStyle w:val="Heading2"/>
       </w:pPr>
       <w:bookmarkStart w:id="30" w:name="fine-tuning-at-home-lora-and-qlora"/>
-      <w:bookmarkStart w:id="31" w:name="_Toc241660020"/>
+      <w:bookmarkStart w:id="31" w:name="_Toc241660838"/>
       <w:bookmarkEnd w:id="28"/>
       <w:r>
         <w:rPr>
@@ -13284,7 +13284,7 @@
         <w:pStyle w:val="Heading2"/>
       </w:pPr>
       <w:bookmarkStart w:id="32" w:name="why-the-top-closed-models-lead"/>
-      <w:bookmarkStart w:id="33" w:name="_Toc241660021"/>
+      <w:bookmarkStart w:id="33" w:name="_Toc241660839"/>
       <w:bookmarkEnd w:id="30"/>
       <w:r>
         <w:rPr>
@@ -13405,7 +13405,7 @@
         <w:pStyle w:val="Heading1"/>
       </w:pPr>
       <w:bookmarkStart w:id="34" w:name="the-tinygpt-model"/>
-      <w:bookmarkStart w:id="35" w:name="_Toc241660022"/>
+      <w:bookmarkStart w:id="35" w:name="_Toc241660840"/>
       <w:bookmarkEnd w:id="12"/>
       <w:bookmarkEnd w:id="32"/>
       <w:r>
@@ -13429,7 +13429,7 @@
           <w:noProof/>
         </w:rPr>
         <w:drawing>
-          <wp:inline distT="0" distB="0" distL="0" distR="0" wp14:anchorId="08BC6CF7" wp14:editId="3FACF29B">
+          <wp:inline distT="0" distB="0" distL="0" distR="0" wp14:anchorId="21B822A7" wp14:editId="3016198A">
             <wp:extent cx="5939999" cy="3848450"/>
             <wp:effectExtent l="0" t="0" r="0" b="0"/>
             <wp:docPr id="33" name="Picture" descr="The tinyGPT architecture. a, one forward pass: embedding, L identical blocks (each with two residual additions), final normalisation and the tied output layer. b, causal attention in one head. c, where the 17,308,032 parameters of your run sit."/>
@@ -13532,7 +13532,7 @@
         <w:pStyle w:val="Heading2"/>
       </w:pPr>
       <w:bookmarkStart w:id="36" w:name="design-choices-and-why"/>
-      <w:bookmarkStart w:id="37" w:name="_Toc241660023"/>
+      <w:bookmarkStart w:id="37" w:name="_Toc241660841"/>
       <w:r>
         <w:rPr>
           <w:rStyle w:val="SectionNumber"/>
@@ -14130,7 +14130,7 @@
         <w:pStyle w:val="Heading2"/>
       </w:pPr>
       <w:bookmarkStart w:id="38" w:name="why-decoder-only-and-not-encoder-decoder"/>
-      <w:bookmarkStart w:id="39" w:name="_Toc241660024"/>
+      <w:bookmarkStart w:id="39" w:name="_Toc241660842"/>
       <w:bookmarkEnd w:id="36"/>
       <w:r>
         <w:rPr>
@@ -14759,7 +14759,7 @@
         <w:pStyle w:val="Heading2"/>
       </w:pPr>
       <w:bookmarkStart w:id="40" w:name="your-runs-settings-explained"/>
-      <w:bookmarkStart w:id="41" w:name="_Toc241660025"/>
+      <w:bookmarkStart w:id="41" w:name="_Toc241660843"/>
       <w:bookmarkEnd w:id="38"/>
       <w:r>
         <w:rPr>
@@ -17459,7 +17459,7 @@
         <w:pStyle w:val="Heading2"/>
       </w:pPr>
       <w:bookmarkStart w:id="42" w:name="how-the-planner-chooses-a-model"/>
-      <w:bookmarkStart w:id="43" w:name="_Toc241660026"/>
+      <w:bookmarkStart w:id="43" w:name="_Toc241660844"/>
       <w:bookmarkEnd w:id="40"/>
       <w:r>
         <w:rPr>
@@ -17734,7 +17734,7 @@
         <w:pStyle w:val="Heading2"/>
       </w:pPr>
       <w:bookmarkStart w:id="44" w:name="hands-on-exercises"/>
-      <w:bookmarkStart w:id="45" w:name="_Toc241660027"/>
+      <w:bookmarkStart w:id="45" w:name="_Toc241660845"/>
       <w:bookmarkEnd w:id="42"/>
       <w:r>
         <w:rPr>
@@ -17996,7 +17996,7 @@
         <w:pStyle w:val="Heading1"/>
       </w:pPr>
       <w:bookmarkStart w:id="46" w:name="your-training-data"/>
-      <w:bookmarkStart w:id="47" w:name="_Toc241660028"/>
+      <w:bookmarkStart w:id="47" w:name="_Toc241660846"/>
       <w:bookmarkEnd w:id="34"/>
       <w:bookmarkEnd w:id="44"/>
       <w:r>
@@ -18016,7 +18016,7 @@
         <w:pStyle w:val="Heading2"/>
       </w:pPr>
       <w:bookmarkStart w:id="48" w:name="folder-layout"/>
-      <w:bookmarkStart w:id="49" w:name="_Toc241660029"/>
+      <w:bookmarkStart w:id="49" w:name="_Toc241660847"/>
       <w:r>
         <w:rPr>
           <w:rStyle w:val="SectionNumber"/>
@@ -18914,7 +18914,7 @@
         <w:pStyle w:val="Heading2"/>
       </w:pPr>
       <w:bookmarkStart w:id="50" w:name="converting-documents"/>
-      <w:bookmarkStart w:id="51" w:name="_Toc241660030"/>
+      <w:bookmarkStart w:id="51" w:name="_Toc241660848"/>
       <w:bookmarkEnd w:id="48"/>
       <w:r>
         <w:rPr>
@@ -19462,7 +19462,7 @@
         <w:pStyle w:val="Heading2"/>
       </w:pPr>
       <w:bookmarkStart w:id="52" w:name="english-only"/>
-      <w:bookmarkStart w:id="53" w:name="_Toc241660031"/>
+      <w:bookmarkStart w:id="53" w:name="_Toc241660849"/>
       <w:bookmarkEnd w:id="50"/>
       <w:r>
         <w:rPr>
@@ -19661,7 +19661,7 @@
         <w:pStyle w:val="Heading2"/>
       </w:pPr>
       <w:bookmarkStart w:id="54" w:name="keyword-selection"/>
-      <w:bookmarkStart w:id="55" w:name="_Toc241660032"/>
+      <w:bookmarkStart w:id="55" w:name="_Toc241660850"/>
       <w:bookmarkEnd w:id="52"/>
       <w:r>
         <w:rPr>
@@ -20219,7 +20219,7 @@
         <w:pStyle w:val="Heading2"/>
       </w:pPr>
       <w:bookmarkStart w:id="56" w:name="X94ef1ff796aac1cc9e44d72727e00c60c26242e"/>
-      <w:bookmarkStart w:id="57" w:name="_Toc241660033"/>
+      <w:bookmarkStart w:id="57" w:name="_Toc241660851"/>
       <w:bookmarkEnd w:id="54"/>
       <w:r>
         <w:rPr>
@@ -20558,7 +20558,7 @@
         <w:pStyle w:val="Heading2"/>
       </w:pPr>
       <w:bookmarkStart w:id="58" w:name="cleaning-deduplication-split-and-audit"/>
-      <w:bookmarkStart w:id="59" w:name="_Toc241660034"/>
+      <w:bookmarkStart w:id="59" w:name="_Toc241660852"/>
       <w:bookmarkEnd w:id="56"/>
       <w:r>
         <w:rPr>
@@ -20730,7 +20730,7 @@
         <w:pStyle w:val="Heading2"/>
       </w:pPr>
       <w:bookmarkStart w:id="60" w:name="X9bdd5544e1f332161ce69c21b8c82062f563dfc"/>
-      <w:bookmarkStart w:id="61" w:name="_Toc241660035"/>
+      <w:bookmarkStart w:id="61" w:name="_Toc241660853"/>
       <w:bookmarkEnd w:id="58"/>
       <w:r>
         <w:rPr>
@@ -21160,7 +21160,7 @@
         <w:pStyle w:val="Heading2"/>
       </w:pPr>
       <w:bookmarkStart w:id="62" w:name="Xc4591382f4fd028a28f1b17bee47be5b816a3b4"/>
-      <w:bookmarkStart w:id="63" w:name="_Toc241660036"/>
+      <w:bookmarkStart w:id="63" w:name="_Toc241660854"/>
       <w:bookmarkEnd w:id="60"/>
       <w:r>
         <w:rPr>
@@ -21404,7 +21404,7 @@
         <w:pStyle w:val="Heading2"/>
       </w:pPr>
       <w:bookmarkStart w:id="64" w:name="Xfc3d086a28d050a6fd537126ae8e168cdb8bdcc"/>
-      <w:bookmarkStart w:id="65" w:name="_Toc241660037"/>
+      <w:bookmarkStart w:id="65" w:name="_Toc241660855"/>
       <w:bookmarkEnd w:id="62"/>
       <w:r>
         <w:rPr>
@@ -21725,7 +21725,7 @@
         <w:pStyle w:val="Heading2"/>
       </w:pPr>
       <w:bookmarkStart w:id="66" w:name="more-data-worth-getting"/>
-      <w:bookmarkStart w:id="67" w:name="_Toc241660038"/>
+      <w:bookmarkStart w:id="67" w:name="_Toc241660856"/>
       <w:bookmarkEnd w:id="64"/>
       <w:r>
         <w:rPr>
@@ -22692,7 +22692,7 @@
         <w:pStyle w:val="Heading2"/>
       </w:pPr>
       <w:bookmarkStart w:id="68" w:name="gwas-summary-statistics"/>
-      <w:bookmarkStart w:id="69" w:name="_Toc241660039"/>
+      <w:bookmarkStart w:id="69" w:name="_Toc241660857"/>
       <w:bookmarkEnd w:id="66"/>
       <w:r>
         <w:rPr>
@@ -22962,7 +22962,7 @@
         <w:pStyle w:val="Heading2"/>
       </w:pPr>
       <w:bookmarkStart w:id="70" w:name="pictures-png-in-the-future"/>
-      <w:bookmarkStart w:id="71" w:name="_Toc241660040"/>
+      <w:bookmarkStart w:id="71" w:name="_Toc241660858"/>
       <w:bookmarkEnd w:id="68"/>
       <w:r>
         <w:rPr>
@@ -23082,7 +23082,7 @@
         <w:pStyle w:val="Heading1"/>
       </w:pPr>
       <w:bookmarkStart w:id="72" w:name="training-a-run"/>
-      <w:bookmarkStart w:id="73" w:name="_Toc241660041"/>
+      <w:bookmarkStart w:id="73" w:name="_Toc241660859"/>
       <w:bookmarkEnd w:id="46"/>
       <w:bookmarkEnd w:id="70"/>
       <w:r>
@@ -23102,7 +23102,7 @@
         <w:pStyle w:val="Heading2"/>
       </w:pPr>
       <w:bookmarkStart w:id="74" w:name="reading-the-log"/>
-      <w:bookmarkStart w:id="75" w:name="_Toc241660042"/>
+      <w:bookmarkStart w:id="75" w:name="_Toc241660860"/>
       <w:r>
         <w:rPr>
           <w:rStyle w:val="SectionNumber"/>
@@ -23623,7 +23623,7 @@
         <w:pStyle w:val="Heading2"/>
       </w:pPr>
       <w:bookmarkStart w:id="76" w:name="checkpoints-pausing-and-resuming"/>
-      <w:bookmarkStart w:id="77" w:name="_Toc241660043"/>
+      <w:bookmarkStart w:id="77" w:name="_Toc241660861"/>
       <w:bookmarkEnd w:id="74"/>
       <w:r>
         <w:rPr>
@@ -23861,7 +23861,7 @@
         <w:pStyle w:val="Heading2"/>
       </w:pPr>
       <w:bookmarkStart w:id="78" w:name="Xce23c4353a139fefc25bd39ebff21fc6eef92b5"/>
-      <w:bookmarkStart w:id="79" w:name="_Toc241660044"/>
+      <w:bookmarkStart w:id="79" w:name="_Toc241660862"/>
       <w:bookmarkEnd w:id="76"/>
       <w:r>
         <w:rPr>
@@ -23972,7 +23972,19 @@
         <w:t>data_prep.py --tokenizer-from datasets\bio_v4</w:t>
       </w:r>
       <w:r>
-        <w:t>). The same tokenizer is essential: the model’s weights belong to its vocabulary, and a new tokenizer would give every token a different meaning. Keeping the old text in stops the model from forgetting it while it learns the new.</w:t>
+        <w:t>). The same tokenizer is essential: the model’s weights belong to its vocabulary, and a new tokenizer would give every token a different meaning. Keeping the old text in stops the model from forgetting it while it learns the new, and the old train/validation split is kept too (</w:t>
+      </w:r>
+      <w:r>
+        <w:rPr>
+          <w:rStyle w:val="VerbatimChar"/>
+        </w:rPr>
+        <w:t>--keep-split-from datasets\bio_v4</w:t>
+      </w:r>
+      <w:r>
+        <w:t xml:space="preserve">): a document the first model trained on </w:t>
+      </w:r>
+      <w:r>
+        <w:t>never becomes a validation document, where its loss would look better than the model really is.</w:t>
       </w:r>
     </w:p>
     <w:p>
@@ -24008,7 +24020,10 @@
         <w:pStyle w:val="FirstParagraph"/>
       </w:pPr>
       <w:r>
-        <w:t>Why not LoRA? LoRA freezes the model and trains small add-on matrices. It saves memory when the model has billions of parameters (it is the plan for fine-tuning large open models on the Mac Studio), but it limits how much new knowledge a model can take in. tinyGPT is small enough to keep training all of its weights, which learns more.</w:t>
+        <w:t xml:space="preserve">Why not LoRA? LoRA freezes the model and trains small add-on matrices. It saves memory when the model has billions </w:t>
+      </w:r>
+      <w:r>
+        <w:t>of parameters (it is the plan for fine-tuning large open models on the Mac Studio), but it limits how much new knowledge a model can take in. tinyGPT is small enough to keep training all of its weights, which learns more.</w:t>
       </w:r>
     </w:p>
     <w:p>
@@ -24016,6 +24031,26 @@
         <w:pStyle w:val="BodyText"/>
       </w:pPr>
       <w:r>
+        <w:t xml:space="preserve">Reusing the same text is fine and intended. What matters is how often each text is read in total, over both runs: keep it to about 4 passes. For example, if the first run read the old text 0.4 times and the second reads the </w:t>
+      </w:r>
+      <w:r>
+        <w:t xml:space="preserve">combined data 0.8 times, the old text has been read 1.2 times. Duplicated documents count several times, which is why </w:t>
+      </w:r>
+      <w:r>
+        <w:rPr>
+          <w:rStyle w:val="VerbatimChar"/>
+        </w:rPr>
+        <w:t>--near-dup drop</w:t>
+      </w:r>
+      <w:r>
+        <w:t xml:space="preserve"> matters.</w:t>
+      </w:r>
+    </w:p>
+    <w:p>
+      <w:pPr>
+        <w:pStyle w:val="BodyText"/>
+      </w:pPr>
+      <w:r>
         <w:t>Two limits: the model size stays that of the first run (a bigger model starts from zero), and a tokenizer from the first data splits new-field words into more pieces (slightly less efficient, still correct).</w:t>
       </w:r>
     </w:p>
@@ -24024,7 +24059,7 @@
         <w:pStyle w:val="Heading2"/>
       </w:pPr>
       <w:bookmarkStart w:id="80" w:name="the-experiments-table"/>
-      <w:bookmarkStart w:id="81" w:name="_Toc241660045"/>
+      <w:bookmarkStart w:id="81" w:name="_Toc241660863"/>
       <w:bookmarkEnd w:id="78"/>
       <w:r>
         <w:rPr>
@@ -24049,7 +24084,10 @@
         <w:t>experiments.csv</w:t>
       </w:r>
       <w:r>
-        <w:t>, next to the checkpoints, gets one row for every training run (when it ends or is stopped), benchmark, comparison and fine-tune.</w:t>
+        <w:t xml:space="preserve">, next to the checkpoints, gets one row for every training run (when it ends or is stopped), </w:t>
+      </w:r>
+      <w:r>
+        <w:t>benchmark, comparison and fine-tune.</w:t>
       </w:r>
     </w:p>
     <w:p>
@@ -24068,10 +24106,7 @@
         <w:t>Columns include:</w:t>
       </w:r>
       <w:r>
-        <w:t xml:space="preserve"> time, event, name, status, step, parameters, shape, context, vocabulary, tokens seen, learning </w:t>
-      </w:r>
-      <w:r>
-        <w:t>rate, z-loss, dataset, best and last validation loss, bits per byte, perplexity, benchmark accuracy, throughput, hours and checkpoint.</w:t>
+        <w:t xml:space="preserve"> time, event, name, status, step, parameters, shape, context, vocabulary, tokens seen, learning rate, z-loss, dataset, best and last validation loss, bits per byte, perplexity, benchmark accuracy, throughput, hours and checkpoint.</w:t>
       </w:r>
     </w:p>
     <w:p>
@@ -24109,7 +24144,10 @@
         <w:t>Why keep it:</w:t>
       </w:r>
       <w:r>
-        <w:t xml:space="preserve"> yes, storing the parameters in a table is useful. It is the only reliable way to know, months later, which settings gave which result. Add your own comments in the </w:t>
+        <w:t xml:space="preserve"> yes, storing the parameters in a table is useful. It is the only reliable way to know, months </w:t>
+      </w:r>
+      <w:r>
+        <w:t xml:space="preserve">later, which settings gave which result. Add your own comments in the </w:t>
       </w:r>
       <w:r>
         <w:rPr>
@@ -24127,7 +24165,7 @@
         <w:pStyle w:val="Heading2"/>
       </w:pPr>
       <w:bookmarkStart w:id="82" w:name="energy-carbon-and-cost"/>
-      <w:bookmarkStart w:id="83" w:name="_Toc241660046"/>
+      <w:bookmarkStart w:id="83" w:name="_Toc241660864"/>
       <w:bookmarkEnd w:id="80"/>
       <w:r>
         <w:rPr>
@@ -24210,7 +24248,10 @@
         <w:t>GPU: measured.</w:t>
       </w:r>
       <w:r>
-        <w:t xml:space="preserve"> nvidia-smi reports the graphics card’s power draw every 5 seconds, and the energy is the area under that curve.</w:t>
+        <w:t xml:space="preserve"> </w:t>
+      </w:r>
+      <w:r>
+        <w:t>nvidia-smi reports the graphics card’s power draw every 5 seconds, and the energy is the area under that curve.</w:t>
       </w:r>
     </w:p>
     <w:p>
@@ -24229,10 +24270,7 @@
         <w:t>CPU and memory: estimated.</w:t>
       </w:r>
       <w:r>
-        <w:t xml:space="preserve"> </w:t>
-      </w:r>
-      <w:r>
-        <w:t>The CPU’s rated power (</w:t>
+        <w:t xml:space="preserve"> The CPU’s rated power (</w:t>
       </w:r>
       <w:r>
         <w:rPr>
@@ -24269,7 +24307,10 @@
         <w:t>--grid-intensity</w:t>
       </w:r>
       <w:r>
-        <w:t>, grams CO2e per kWh). The default, 125, is the British grid’s average from October 2025 to September 2026 (National Grid ESO Carbon Intensity API). Monthly averages ranged from 97 to 152, and the grid is cleaner on windy nights than on still winter evenings.</w:t>
+        <w:t xml:space="preserve">, grams CO2e per kWh). The default, 125, is the British grid’s average from October 2025 to September 2026 (National Grid ESO Carbon Intensity API). </w:t>
+      </w:r>
+      <w:r>
+        <w:t>Monthly averages ranged from 97 to 152, and the grid is cleaner on windy nights than on still winter evenings.</w:t>
       </w:r>
     </w:p>
     <w:p>
@@ -24288,10 +24329,7 @@
         <w:t>Cost:</w:t>
       </w:r>
       <w:r>
-        <w:t xml:space="preserve"> </w:t>
-      </w:r>
-      <w:r>
-        <w:t xml:space="preserve">each half-hour’s energy times that half-hour’s unit rate, VAT included. By default the rates are Flexible Octopus for region H (Southern Electric; set yours with </w:t>
+        <w:t xml:space="preserve"> each half-hour’s energy times that half-hour’s unit rate, VAT included. By default the rates are Flexible Octopus for region H (Southern Electric; set yours with </w:t>
       </w:r>
       <w:r>
         <w:rPr>
@@ -24354,7 +24392,10 @@
         <w:pStyle w:val="FirstParagraph"/>
       </w:pPr>
       <w:r>
-        <w:t>For scale: a 12-hour run at about 60 W in total uses about 0.7 kWh: about 90 g CO2e and 19p on Flexible Octopus, about as much electricity as boiling a full kettle four times (about 0.17 kWh each).</w:t>
+        <w:t xml:space="preserve">For scale: a 12-hour run at about 60 W in total uses about 0.7 kWh: about 90 g CO2e and 19p on Flexible Octopus, </w:t>
+      </w:r>
+      <w:r>
+        <w:t>about as much electricity as boiling a full kettle four times (about 0.17 kWh each).</w:t>
       </w:r>
     </w:p>
     <w:p>
@@ -24362,7 +24403,7 @@
         <w:pStyle w:val="Heading2"/>
       </w:pPr>
       <w:bookmarkStart w:id="84" w:name="exporting-a-model"/>
-      <w:bookmarkStart w:id="85" w:name="_Toc241660047"/>
+      <w:bookmarkStart w:id="85" w:name="_Toc241660865"/>
       <w:bookmarkEnd w:id="82"/>
       <w:r>
         <w:rPr>
@@ -24387,10 +24428,7 @@
         <w:t>python tiny_gpt.py --export tinyGPT_v1</w:t>
       </w:r>
       <w:r>
-        <w:t xml:space="preserve"> writes a folder with the following files. Every script accepts that folder </w:t>
-      </w:r>
-      <w:r>
-        <w:t>wherever it accepts a checkpoint.</w:t>
+        <w:t xml:space="preserve"> writes a folder with the following files. Every script accepts that folder wherever it accepts a checkpoint.</w:t>
       </w:r>
     </w:p>
     <w:tbl>
@@ -24592,7 +24630,7 @@
         <w:pStyle w:val="Heading1"/>
       </w:pPr>
       <w:bookmarkStart w:id="86" w:name="evaluating-a-model"/>
-      <w:bookmarkStart w:id="87" w:name="_Toc241660048"/>
+      <w:bookmarkStart w:id="87" w:name="_Toc241660866"/>
       <w:bookmarkEnd w:id="72"/>
       <w:bookmarkEnd w:id="84"/>
       <w:r>
@@ -24612,7 +24650,7 @@
         <w:pStyle w:val="Heading2"/>
       </w:pPr>
       <w:bookmarkStart w:id="88" w:name="loss-perplexity-and-bits-per-byte"/>
-      <w:bookmarkStart w:id="89" w:name="_Toc241660049"/>
+      <w:bookmarkStart w:id="89" w:name="_Toc241660867"/>
       <w:r>
         <w:rPr>
           <w:rStyle w:val="SectionNumber"/>
@@ -24697,7 +24735,7 @@
         <w:pStyle w:val="Heading2"/>
       </w:pPr>
       <w:bookmarkStart w:id="90" w:name="the-fact-benchmark"/>
-      <w:bookmarkStart w:id="91" w:name="_Toc241660050"/>
+      <w:bookmarkStart w:id="91" w:name="_Toc241660868"/>
       <w:bookmarkEnd w:id="88"/>
       <w:r>
         <w:rPr>
@@ -24747,10 +24785,7 @@
         <w:t>Format:</w:t>
       </w:r>
       <w:r>
-        <w:t xml:space="preserve"> </w:t>
-      </w:r>
-      <w:r>
-        <w:t xml:space="preserve">each line is a sentence start, the correct continuation and three wrong ones, for example: “Cells that break down bone matrix during remodelling are called” → </w:t>
+        <w:t xml:space="preserve"> each line is a sentence start, the correct continuation and three wrong ones, for example: “Cells that break down bone matrix during remodelling are called” → </w:t>
       </w:r>
       <w:r>
         <w:rPr>
@@ -25064,10 +25099,7 @@
         <w:t>per character</w:t>
       </w:r>
       <w:r>
-        <w:t xml:space="preserve"> than </w:t>
-      </w:r>
-      <w:r>
-        <w:t>every wrong one. This is the length-normalised multiple-choice method used by the standard evaluation harness.</w:t>
+        <w:t xml:space="preserve"> than every wrong one. This is the length-normalised multiple-choice method used by the standard evaluation harness.</w:t>
       </w:r>
     </w:p>
     <w:p>
@@ -25225,10 +25257,7 @@
         <w:t>.</w:t>
       </w:r>
       <w:r>
-        <w:t xml:space="preserve"> Small open models with the Llama design (SmolLM2 135M, 360M and 1.7B; </w:t>
-      </w:r>
-      <w:r>
-        <w:t>TinyLlama 1.1B) are run on the benchmark by tinyGPT’s own model code, with no extra packages. Their Hugging Face weights need only a reordering of the attention rows for tinyGPT’s RoPE layout; a unit test checks the conversion.</w:t>
+        <w:t xml:space="preserve"> Small open models with the Llama design (SmolLM2 135M, 360M and 1.7B; TinyLlama 1.1B) are run on the benchmark by tinyGPT’s own model code, with no extra packages. Their Hugging Face weights need only a reordering of the attention rows for tinyGPT’s RoPE layout; a unit test checks the conversion.</w:t>
       </w:r>
     </w:p>
     <w:p>
@@ -25296,7 +25325,10 @@
         <w:t>No self-grading:</w:t>
       </w:r>
       <w:r>
-        <w:t xml:space="preserve"> tinyGPT itself is never used, so its scores per difficulty stay unbiased.</w:t>
+        <w:t xml:space="preserve"> </w:t>
+      </w:r>
+      <w:r>
+        <w:t>tinyGPT itself is never used, so its scores per difficulty stay unbiased.</w:t>
       </w:r>
     </w:p>
     <w:p>
@@ -25315,10 +25347,7 @@
         <w:t>Suspect items:</w:t>
       </w:r>
       <w:r>
-        <w:t xml:space="preserve"> </w:t>
-      </w:r>
-      <w:r>
-        <w:t>items that every reference model gets wrong in the same way are listed for a manual check.</w:t>
+        <w:t xml:space="preserve"> items that every reference model gets wrong in the same way are listed for a manual check.</w:t>
       </w:r>
     </w:p>
     <w:p>
@@ -26068,10 +26097,7 @@
         <w:t>Headroom:</w:t>
       </w:r>
       <w:r>
-        <w:t xml:space="preserve"> </w:t>
-      </w:r>
-      <w:r>
-        <w:t>the benchmark now has room at both ends. The strongest small model scores 68%, and larger or better-trained models should do clearly better.</w:t>
+        <w:t xml:space="preserve"> the benchmark now has room at both ends. The strongest small model scores 68%, and larger or better-trained models should do clearly better.</w:t>
       </w:r>
     </w:p>
     <w:p>
@@ -26094,7 +26120,7 @@
         <w:pStyle w:val="Heading2"/>
       </w:pPr>
       <w:bookmarkStart w:id="92" w:name="Xd55aac8070434e0efdbeb1fff754f7b8fd345b5"/>
-      <w:bookmarkStart w:id="93" w:name="_Toc241660051"/>
+      <w:bookmarkStart w:id="93" w:name="_Toc241660869"/>
       <w:bookmarkEnd w:id="90"/>
       <w:r>
         <w:rPr>
@@ -26170,7 +26196,10 @@
         <w:pStyle w:val="FirstParagraph"/>
       </w:pPr>
       <w:r>
-        <w:t>Tokens within a document are strongly correlated, so an interval over tokens would be far too narrow. This is the same logic as clustered standard errors.</w:t>
+        <w:t xml:space="preserve">Tokens within a document are strongly correlated, so an interval over tokens would be far too narrow. This is the </w:t>
+      </w:r>
+      <w:r>
+        <w:t>same logic as clustered standard errors.</w:t>
       </w:r>
     </w:p>
     <w:p>
@@ -26226,7 +26255,7 @@
         <w:pStyle w:val="Heading2"/>
       </w:pPr>
       <w:bookmarkStart w:id="94" w:name="the-dashboard"/>
-      <w:bookmarkStart w:id="95" w:name="_Toc241660052"/>
+      <w:bookmarkStart w:id="95" w:name="_Toc241660870"/>
       <w:bookmarkEnd w:id="92"/>
       <w:r>
         <w:rPr>
@@ -26270,7 +26299,10 @@
         <w:t>Name:</w:t>
       </w:r>
       <w:r>
-        <w:t xml:space="preserve"> it’s the same every time, so each new dashboard replaces the previous one. The step and the time it was drawn are printed in its title. - </w:t>
+        <w:t xml:space="preserve"> it’s the same every time, so each new dashboard replaces the previous one. The step and the time it was </w:t>
+      </w:r>
+      <w:r>
+        <w:t xml:space="preserve">drawn are printed in its title. - </w:t>
       </w:r>
       <w:r>
         <w:rPr>
@@ -26418,7 +26450,7 @@
         <w:pStyle w:val="Heading2"/>
       </w:pPr>
       <w:bookmarkStart w:id="96" w:name="X7efef3a44031ff533b64507845ffdeb5da843ff"/>
-      <w:bookmarkStart w:id="97" w:name="_Toc241660053"/>
+      <w:bookmarkStart w:id="97" w:name="_Toc241660871"/>
       <w:bookmarkEnd w:id="94"/>
       <w:r>
         <w:rPr>
@@ -26428,6 +26460,8 @@
       </w:r>
       <w:r>
         <w:tab/>
+      </w:r>
+      <w:r>
         <w:t>Towards standard LLM benchmarks, with a biology bias</w:t>
       </w:r>
       <w:bookmarkEnd w:id="97"/>
@@ -27099,7 +27133,13 @@
               <w:rPr>
                 <w:sz w:val="17"/>
               </w:rPr>
-              <w:t>448 (198 “diamond”)</w:t>
+              <w:t xml:space="preserve">448 (198 </w:t>
+            </w:r>
+            <w:r>
+              <w:rPr>
+                <w:sz w:val="17"/>
+              </w:rPr>
+              <w:t>“diamond”)</w:t>
             </w:r>
           </w:p>
         </w:tc>
@@ -27216,7 +27256,7 @@
         <w:pStyle w:val="Heading1"/>
       </w:pPr>
       <w:bookmarkStart w:id="98" w:name="Xa1cc98f937cc273961788fd9ca4ca9fa7d2cd66"/>
-      <w:bookmarkStart w:id="99" w:name="_Toc241660054"/>
+      <w:bookmarkStart w:id="99" w:name="_Toc241660872"/>
       <w:bookmarkEnd w:id="86"/>
       <w:bookmarkEnd w:id="96"/>
       <w:r>
@@ -27236,7 +27276,7 @@
         <w:pStyle w:val="Heading2"/>
       </w:pPr>
       <w:bookmarkStart w:id="100" w:name="separate-scripts-sharing-one-model"/>
-      <w:bookmarkStart w:id="101" w:name="_Toc241660055"/>
+      <w:bookmarkStart w:id="101" w:name="_Toc241660873"/>
       <w:r>
         <w:rPr>
           <w:rStyle w:val="SectionNumber"/>
@@ -27767,7 +27807,7 @@
         <w:pStyle w:val="Heading2"/>
       </w:pPr>
       <w:bookmarkStart w:id="102" w:name="supervised-fine-tuning"/>
-      <w:bookmarkStart w:id="103" w:name="_Toc241660056"/>
+      <w:bookmarkStart w:id="103" w:name="_Toc241660874"/>
       <w:bookmarkEnd w:id="100"/>
       <w:r>
         <w:rPr>
@@ -28010,7 +28050,7 @@
         <w:pStyle w:val="Heading2"/>
       </w:pPr>
       <w:bookmarkStart w:id="104" w:name="preference-tuning-dpo"/>
-      <w:bookmarkStart w:id="105" w:name="_Toc241660057"/>
+      <w:bookmarkStart w:id="105" w:name="_Toc241660875"/>
       <w:bookmarkEnd w:id="102"/>
       <w:r>
         <w:rPr>
@@ -28187,7 +28227,7 @@
         <w:pStyle w:val="Heading2"/>
       </w:pPr>
       <w:bookmarkStart w:id="106" w:name="X9ed80f729ac16c52123de20ef25b4d7814666fd"/>
-      <w:bookmarkStart w:id="107" w:name="_Toc241660058"/>
+      <w:bookmarkStart w:id="107" w:name="_Toc241660876"/>
       <w:bookmarkEnd w:id="104"/>
       <w:r>
         <w:rPr>
@@ -28385,7 +28425,7 @@
         <w:pStyle w:val="Heading2"/>
       </w:pPr>
       <w:bookmarkStart w:id="108" w:name="what-to-expect-at-this-size"/>
-      <w:bookmarkStart w:id="109" w:name="_Toc241660059"/>
+      <w:bookmarkStart w:id="109" w:name="_Toc241660877"/>
       <w:bookmarkEnd w:id="106"/>
       <w:r>
         <w:rPr>
@@ -28474,7 +28514,7 @@
         <w:pStyle w:val="Heading1"/>
       </w:pPr>
       <w:bookmarkStart w:id="110" w:name="was-this-text-written-by-my-model"/>
-      <w:bookmarkStart w:id="111" w:name="_Toc241660060"/>
+      <w:bookmarkStart w:id="111" w:name="_Toc241660878"/>
       <w:bookmarkEnd w:id="98"/>
       <w:bookmarkEnd w:id="108"/>
       <w:r>
@@ -28502,7 +28542,7 @@
         <w:pStyle w:val="Heading2"/>
       </w:pPr>
       <w:bookmarkStart w:id="112" w:name="X94868af322c496bf0a6feeceae7424bccee950c"/>
-      <w:bookmarkStart w:id="113" w:name="_Toc241660061"/>
+      <w:bookmarkStart w:id="113" w:name="_Toc241660879"/>
       <w:r>
         <w:rPr>
           <w:rStyle w:val="SectionNumber"/>
@@ -28658,7 +28698,7 @@
         <w:pStyle w:val="Heading2"/>
       </w:pPr>
       <w:bookmarkStart w:id="114" w:name="likelihood-score-evidence-for-any-text"/>
-      <w:bookmarkStart w:id="115" w:name="_Toc241660062"/>
+      <w:bookmarkStart w:id="115" w:name="_Toc241660880"/>
       <w:bookmarkEnd w:id="112"/>
       <w:r>
         <w:rPr>
@@ -28836,7 +28876,7 @@
         <w:pStyle w:val="Heading1"/>
       </w:pPr>
       <w:bookmarkStart w:id="116" w:name="the-mathematics-and-statistics"/>
-      <w:bookmarkStart w:id="117" w:name="_Toc241660063"/>
+      <w:bookmarkStart w:id="117" w:name="_Toc241660881"/>
       <w:bookmarkEnd w:id="110"/>
       <w:bookmarkEnd w:id="114"/>
       <w:r>
@@ -28911,7 +28951,7 @@
         <w:pStyle w:val="Heading2"/>
       </w:pPr>
       <w:bookmarkStart w:id="118" w:name="likelihood-perplexity-and-bits-per-byte"/>
-      <w:bookmarkStart w:id="119" w:name="_Toc241660064"/>
+      <w:bookmarkStart w:id="119" w:name="_Toc241660882"/>
       <w:r>
         <w:rPr>
           <w:rStyle w:val="SectionNumber"/>
@@ -30425,7 +30465,7 @@
         <w:pStyle w:val="Heading2"/>
       </w:pPr>
       <w:bookmarkStart w:id="120" w:name="the-transformer-1"/>
-      <w:bookmarkStart w:id="121" w:name="_Toc241660065"/>
+      <w:bookmarkStart w:id="121" w:name="_Toc241660883"/>
       <w:bookmarkEnd w:id="118"/>
       <w:r>
         <w:rPr>
@@ -34018,7 +34058,7 @@
         <w:pStyle w:val="Heading2"/>
       </w:pPr>
       <w:bookmarkStart w:id="122" w:name="optimisation"/>
-      <w:bookmarkStart w:id="123" w:name="_Toc241660066"/>
+      <w:bookmarkStart w:id="123" w:name="_Toc241660884"/>
       <w:bookmarkEnd w:id="120"/>
       <w:r>
         <w:rPr>
@@ -36923,7 +36963,7 @@
         <w:pStyle w:val="Heading2"/>
       </w:pPr>
       <w:bookmarkStart w:id="124" w:name="scaling-laws-and-repeated-data"/>
-      <w:bookmarkStart w:id="125" w:name="_Toc241660067"/>
+      <w:bookmarkStart w:id="125" w:name="_Toc241660885"/>
       <w:bookmarkEnd w:id="122"/>
       <w:r>
         <w:rPr>
@@ -38058,7 +38098,7 @@
         <w:pStyle w:val="Heading2"/>
       </w:pPr>
       <w:bookmarkStart w:id="126" w:name="evaluation-statistics"/>
-      <w:bookmarkStart w:id="127" w:name="_Toc241660068"/>
+      <w:bookmarkStart w:id="127" w:name="_Toc241660886"/>
       <w:bookmarkEnd w:id="124"/>
       <w:r>
         <w:rPr>
@@ -40200,7 +40240,7 @@
         <w:pStyle w:val="Heading2"/>
       </w:pPr>
       <w:bookmarkStart w:id="128" w:name="post-training"/>
-      <w:bookmarkStart w:id="129" w:name="_Toc241660069"/>
+      <w:bookmarkStart w:id="129" w:name="_Toc241660887"/>
       <w:bookmarkEnd w:id="126"/>
       <w:r>
         <w:rPr>
@@ -43391,7 +43431,7 @@
         <w:pStyle w:val="Heading2"/>
       </w:pPr>
       <w:bookmarkStart w:id="130" w:name="generation-and-detection"/>
-      <w:bookmarkStart w:id="131" w:name="_Toc241660070"/>
+      <w:bookmarkStart w:id="131" w:name="_Toc241660888"/>
       <w:bookmarkEnd w:id="128"/>
       <w:r>
         <w:rPr>
@@ -44978,7 +45018,7 @@
         <w:pStyle w:val="Heading2"/>
       </w:pPr>
       <w:bookmarkStart w:id="132" w:name="data-statistics"/>
-      <w:bookmarkStart w:id="133" w:name="_Toc241660071"/>
+      <w:bookmarkStart w:id="133" w:name="_Toc241660889"/>
       <w:bookmarkEnd w:id="130"/>
       <w:r>
         <w:rPr>
@@ -45592,7 +45632,7 @@
         <w:pStyle w:val="Heading1"/>
       </w:pPr>
       <w:bookmarkStart w:id="134" w:name="the-laptop-gpu-throttle"/>
-      <w:bookmarkStart w:id="135" w:name="_Toc241660072"/>
+      <w:bookmarkStart w:id="135" w:name="_Toc241660890"/>
       <w:bookmarkEnd w:id="116"/>
       <w:bookmarkEnd w:id="132"/>
       <w:r>
@@ -45612,7 +45652,7 @@
         <w:pStyle w:val="Heading2"/>
       </w:pPr>
       <w:bookmarkStart w:id="136" w:name="what-was-measured"/>
-      <w:bookmarkStart w:id="137" w:name="_Toc241660073"/>
+      <w:bookmarkStart w:id="137" w:name="_Toc241660891"/>
       <w:r>
         <w:rPr>
           <w:rStyle w:val="SectionNumber"/>
@@ -45857,7 +45897,7 @@
         <w:pStyle w:val="Heading2"/>
       </w:pPr>
       <w:bookmarkStart w:id="138" w:name="likely-causes"/>
-      <w:bookmarkStart w:id="139" w:name="_Toc241660074"/>
+      <w:bookmarkStart w:id="139" w:name="_Toc241660892"/>
       <w:bookmarkEnd w:id="136"/>
       <w:r>
         <w:rPr>
@@ -46015,7 +46055,7 @@
         <w:pStyle w:val="Heading2"/>
       </w:pPr>
       <w:bookmarkStart w:id="140" w:name="what-to-try-in-order"/>
-      <w:bookmarkStart w:id="141" w:name="_Toc241660075"/>
+      <w:bookmarkStart w:id="141" w:name="_Toc241660893"/>
       <w:bookmarkEnd w:id="138"/>
       <w:r>
         <w:rPr>
@@ -46400,7 +46440,7 @@
         <w:pStyle w:val="Heading1"/>
       </w:pPr>
       <w:bookmarkStart w:id="142" w:name="scaling-up"/>
-      <w:bookmarkStart w:id="143" w:name="_Toc241660076"/>
+      <w:bookmarkStart w:id="143" w:name="_Toc241660894"/>
       <w:bookmarkEnd w:id="134"/>
       <w:bookmarkEnd w:id="140"/>
       <w:r>
@@ -46420,7 +46460,7 @@
         <w:pStyle w:val="Heading2"/>
       </w:pPr>
       <w:bookmarkStart w:id="144" w:name="X60c251acf6cc087f15a89907a3ae63c867638c5"/>
-      <w:bookmarkStart w:id="145" w:name="_Toc241660077"/>
+      <w:bookmarkStart w:id="145" w:name="_Toc241660895"/>
       <w:r>
         <w:rPr>
           <w:rStyle w:val="SectionNumber"/>
@@ -47090,7 +47130,7 @@
         <w:pStyle w:val="Heading2"/>
       </w:pPr>
       <w:bookmarkStart w:id="146" w:name="renting-an-h100-lambda-cloud"/>
-      <w:bookmarkStart w:id="147" w:name="_Toc241660078"/>
+      <w:bookmarkStart w:id="147" w:name="_Toc241660896"/>
       <w:bookmarkEnd w:id="144"/>
       <w:r>
         <w:rPr>
@@ -47807,7 +47847,7 @@
         <w:pStyle w:val="Heading2"/>
       </w:pPr>
       <w:bookmarkStart w:id="148" w:name="a-1b-model-from-scratch"/>
-      <w:bookmarkStart w:id="149" w:name="_Toc241660079"/>
+      <w:bookmarkStart w:id="149" w:name="_Toc241660897"/>
       <w:bookmarkEnd w:id="146"/>
       <w:r>
         <w:rPr>
@@ -48304,7 +48344,7 @@
         <w:pStyle w:val="Heading2"/>
       </w:pPr>
       <w:bookmarkStart w:id="150" w:name="is-1b-enough-for-a-specialised-field"/>
-      <w:bookmarkStart w:id="151" w:name="_Toc241660080"/>
+      <w:bookmarkStart w:id="151" w:name="_Toc241660898"/>
       <w:bookmarkEnd w:id="148"/>
       <w:r>
         <w:rPr>
@@ -48458,7 +48498,7 @@
         <w:pStyle w:val="Heading2"/>
       </w:pPr>
       <w:bookmarkStart w:id="152" w:name="X30c0ff3366ed0f880f1b78628a446bbd6327d7e"/>
-      <w:bookmarkStart w:id="153" w:name="_Toc241660081"/>
+      <w:bookmarkStart w:id="153" w:name="_Toc241660899"/>
       <w:bookmarkEnd w:id="150"/>
       <w:r>
         <w:rPr>
@@ -48771,7 +48811,7 @@
         <w:pStyle w:val="Heading2"/>
       </w:pPr>
       <w:bookmarkStart w:id="154" w:name="the-mac-studio-plan-from-guide.md"/>
-      <w:bookmarkStart w:id="155" w:name="_Toc241660082"/>
+      <w:bookmarkStart w:id="155" w:name="_Toc241660900"/>
       <w:bookmarkEnd w:id="152"/>
       <w:r>
         <w:rPr>
@@ -51916,7 +51956,7 @@
         <w:pStyle w:val="Heading1"/>
       </w:pPr>
       <w:bookmarkStart w:id="162" w:name="techniques-roadmap"/>
-      <w:bookmarkStart w:id="163" w:name="_Toc241660083"/>
+      <w:bookmarkStart w:id="163" w:name="_Toc241660901"/>
       <w:bookmarkEnd w:id="142"/>
       <w:bookmarkEnd w:id="154"/>
       <w:bookmarkEnd w:id="161"/>
@@ -51975,7 +52015,7 @@
         <w:pStyle w:val="Heading2"/>
       </w:pPr>
       <w:bookmarkStart w:id="164" w:name="done-on-29-september"/>
-      <w:bookmarkStart w:id="165" w:name="_Toc241660084"/>
+      <w:bookmarkStart w:id="165" w:name="_Toc241660902"/>
       <w:r>
         <w:rPr>
           <w:rStyle w:val="SectionNumber"/>
@@ -52416,7 +52456,7 @@
         <w:pStyle w:val="Heading2"/>
       </w:pPr>
       <w:bookmarkStart w:id="166" w:name="recommended-next-in-order"/>
-      <w:bookmarkStart w:id="167" w:name="_Toc241660085"/>
+      <w:bookmarkStart w:id="167" w:name="_Toc241660903"/>
       <w:bookmarkEnd w:id="164"/>
       <w:r>
         <w:rPr>
@@ -53775,7 +53815,7 @@
         <w:pStyle w:val="Heading2"/>
       </w:pPr>
       <w:bookmarkStart w:id="168" w:name="later-or-at-larger-scale"/>
-      <w:bookmarkStart w:id="169" w:name="_Toc241660086"/>
+      <w:bookmarkStart w:id="169" w:name="_Toc241660904"/>
       <w:bookmarkEnd w:id="166"/>
       <w:r>
         <w:rPr>
@@ -54008,7 +54048,7 @@
         <w:pStyle w:val="Heading1"/>
       </w:pPr>
       <w:bookmarkStart w:id="170" w:name="tools-safety-and-naming"/>
-      <w:bookmarkStart w:id="171" w:name="_Toc241660087"/>
+      <w:bookmarkStart w:id="171" w:name="_Toc241660905"/>
       <w:bookmarkEnd w:id="162"/>
       <w:bookmarkEnd w:id="168"/>
       <w:r>
@@ -54028,7 +54068,7 @@
         <w:pStyle w:val="Heading2"/>
       </w:pPr>
       <w:bookmarkStart w:id="172" w:name="other-training-frameworks"/>
-      <w:bookmarkStart w:id="173" w:name="_Toc241660088"/>
+      <w:bookmarkStart w:id="173" w:name="_Toc241660906"/>
       <w:r>
         <w:rPr>
           <w:rStyle w:val="SectionNumber"/>
@@ -54669,7 +54709,7 @@
         <w:pStyle w:val="Heading2"/>
       </w:pPr>
       <w:bookmarkStart w:id="174" w:name="safety-rules-built-into-the-scripts"/>
-      <w:bookmarkStart w:id="175" w:name="_Toc241660089"/>
+      <w:bookmarkStart w:id="175" w:name="_Toc241660907"/>
       <w:bookmarkEnd w:id="172"/>
       <w:r>
         <w:rPr>
@@ -54947,7 +54987,7 @@
         <w:pStyle w:val="Heading2"/>
       </w:pPr>
       <w:bookmarkStart w:id="176" w:name="a-name-for-the-model"/>
-      <w:bookmarkStart w:id="177" w:name="_Toc241660090"/>
+      <w:bookmarkStart w:id="177" w:name="_Toc241660908"/>
       <w:bookmarkEnd w:id="174"/>
       <w:r>
         <w:rPr>
@@ -55077,7 +55117,7 @@
         <w:pStyle w:val="Heading1"/>
       </w:pPr>
       <w:bookmarkStart w:id="178" w:name="glossary"/>
-      <w:bookmarkStart w:id="179" w:name="_Toc241660091"/>
+      <w:bookmarkStart w:id="179" w:name="_Toc241660909"/>
       <w:bookmarkEnd w:id="170"/>
       <w:bookmarkEnd w:id="176"/>
       <w:r>
@@ -56688,7 +56728,7 @@
         <w:pStyle w:val="Heading1"/>
       </w:pPr>
       <w:bookmarkStart w:id="180" w:name="reading-list-and-references"/>
-      <w:bookmarkStart w:id="181" w:name="_Toc241660092"/>
+      <w:bookmarkStart w:id="181" w:name="_Toc241660910"/>
       <w:bookmarkEnd w:id="178"/>
       <w:r>
         <w:t>Reading list and references</w:t>
@@ -57072,7 +57112,7 @@
   <w:abstractNum w:abstractNumId="0" w15:restartNumberingAfterBreak="0">
     <w:nsid w:val="0000A990"/>
     <w:multiLevelType w:val="multilevel"/>
-    <w:tmpl w:val="FDCC42BA"/>
+    <w:tmpl w:val="20B89C5E"/>
     <w:lvl w:ilvl="0">
       <w:numFmt w:val="bullet"/>
       <w:lvlText w:val=" "/>
@@ -57149,7 +57189,7 @@
   <w:abstractNum w:abstractNumId="1" w15:restartNumberingAfterBreak="0">
     <w:nsid w:val="0000A991"/>
     <w:multiLevelType w:val="multilevel"/>
-    <w:tmpl w:val="FAC86530"/>
+    <w:tmpl w:val="1D7EE42A"/>
     <w:lvl w:ilvl="0">
       <w:numFmt w:val="bullet"/>
       <w:lvlText w:val=""/>
@@ -57253,7 +57293,7 @@
   <w:abstractNum w:abstractNumId="2" w15:restartNumberingAfterBreak="0">
     <w:nsid w:val="00A99411"/>
     <w:multiLevelType w:val="multilevel"/>
-    <w:tmpl w:val="B74461F6"/>
+    <w:tmpl w:val="E1CCFD98"/>
     <w:lvl w:ilvl="0">
       <w:start w:val="1"/>
       <w:numFmt w:val="decimal"/>
@@ -57336,25 +57376,25 @@
       </w:pPr>
     </w:lvl>
   </w:abstractNum>
-  <w:num w:numId="1" w16cid:durableId="953638371">
+  <w:num w:numId="1" w16cid:durableId="1736977185">
     <w:abstractNumId w:val="0"/>
   </w:num>
-  <w:num w:numId="2" w16cid:durableId="1269046547">
+  <w:num w:numId="2" w16cid:durableId="2089769955">
     <w:abstractNumId w:val="1"/>
   </w:num>
-  <w:num w:numId="3" w16cid:durableId="1088767028">
+  <w:num w:numId="3" w16cid:durableId="2060133069">
     <w:abstractNumId w:val="1"/>
   </w:num>
-  <w:num w:numId="4" w16cid:durableId="1579636227">
+  <w:num w:numId="4" w16cid:durableId="1274089122">
     <w:abstractNumId w:val="1"/>
   </w:num>
-  <w:num w:numId="5" w16cid:durableId="748236412">
+  <w:num w:numId="5" w16cid:durableId="309792363">
     <w:abstractNumId w:val="1"/>
   </w:num>
-  <w:num w:numId="6" w16cid:durableId="1514802076">
+  <w:num w:numId="6" w16cid:durableId="54936142">
     <w:abstractNumId w:val="1"/>
   </w:num>
-  <w:num w:numId="7" w16cid:durableId="1889413089">
+  <w:num w:numId="7" w16cid:durableId="846867601">
     <w:abstractNumId w:val="2"/>
     <w:lvlOverride w:ilvl="0">
       <w:startOverride w:val="1"/>
@@ -57384,19 +57424,19 @@
       <w:startOverride w:val="1"/>
     </w:lvlOverride>
   </w:num>
-  <w:num w:numId="8" w16cid:durableId="1743211015">
+  <w:num w:numId="8" w16cid:durableId="1954165309">
     <w:abstractNumId w:val="1"/>
   </w:num>
-  <w:num w:numId="9" w16cid:durableId="309555378">
+  <w:num w:numId="9" w16cid:durableId="1358852324">
     <w:abstractNumId w:val="1"/>
   </w:num>
-  <w:num w:numId="10" w16cid:durableId="1567951132">
+  <w:num w:numId="10" w16cid:durableId="1407534282">
     <w:abstractNumId w:val="1"/>
   </w:num>
-  <w:num w:numId="11" w16cid:durableId="628390628">
+  <w:num w:numId="11" w16cid:durableId="120152026">
     <w:abstractNumId w:val="1"/>
   </w:num>
-  <w:num w:numId="12" w16cid:durableId="333193634">
+  <w:num w:numId="12" w16cid:durableId="611019006">
     <w:abstractNumId w:val="2"/>
     <w:lvlOverride w:ilvl="0">
       <w:startOverride w:val="1"/>
@@ -57426,43 +57466,43 @@
       <w:startOverride w:val="1"/>
     </w:lvlOverride>
   </w:num>
-  <w:num w:numId="13" w16cid:durableId="217934266">
+  <w:num w:numId="13" w16cid:durableId="1267497916">
     <w:abstractNumId w:val="1"/>
   </w:num>
-  <w:num w:numId="14" w16cid:durableId="1861890140">
+  <w:num w:numId="14" w16cid:durableId="332532793">
     <w:abstractNumId w:val="1"/>
   </w:num>
-  <w:num w:numId="15" w16cid:durableId="2062510615">
+  <w:num w:numId="15" w16cid:durableId="495340312">
     <w:abstractNumId w:val="1"/>
   </w:num>
-  <w:num w:numId="16" w16cid:durableId="2038383317">
+  <w:num w:numId="16" w16cid:durableId="546071874">
     <w:abstractNumId w:val="1"/>
   </w:num>
-  <w:num w:numId="17" w16cid:durableId="1468279259">
+  <w:num w:numId="17" w16cid:durableId="2013876831">
     <w:abstractNumId w:val="1"/>
   </w:num>
-  <w:num w:numId="18" w16cid:durableId="584145836">
+  <w:num w:numId="18" w16cid:durableId="1841432195">
     <w:abstractNumId w:val="1"/>
   </w:num>
-  <w:num w:numId="19" w16cid:durableId="1548294679">
+  <w:num w:numId="19" w16cid:durableId="1370642673">
     <w:abstractNumId w:val="1"/>
   </w:num>
-  <w:num w:numId="20" w16cid:durableId="1426271049">
+  <w:num w:numId="20" w16cid:durableId="1802721535">
     <w:abstractNumId w:val="1"/>
   </w:num>
-  <w:num w:numId="21" w16cid:durableId="155729038">
+  <w:num w:numId="21" w16cid:durableId="325934638">
     <w:abstractNumId w:val="1"/>
   </w:num>
-  <w:num w:numId="22" w16cid:durableId="2005164439">
+  <w:num w:numId="22" w16cid:durableId="1529686274">
     <w:abstractNumId w:val="1"/>
   </w:num>
-  <w:num w:numId="23" w16cid:durableId="629483362">
+  <w:num w:numId="23" w16cid:durableId="1799950312">
     <w:abstractNumId w:val="1"/>
   </w:num>
-  <w:num w:numId="24" w16cid:durableId="140343785">
+  <w:num w:numId="24" w16cid:durableId="1200170834">
     <w:abstractNumId w:val="1"/>
   </w:num>
-  <w:num w:numId="25" w16cid:durableId="1201623340">
+  <w:num w:numId="25" w16cid:durableId="836773297">
     <w:abstractNumId w:val="2"/>
     <w:lvlOverride w:ilvl="0">
       <w:startOverride w:val="1"/>
@@ -57492,7 +57532,7 @@
       <w:startOverride w:val="1"/>
     </w:lvlOverride>
   </w:num>
-  <w:num w:numId="26" w16cid:durableId="757288083">
+  <w:num w:numId="26" w16cid:durableId="822087973">
     <w:abstractNumId w:val="2"/>
     <w:lvlOverride w:ilvl="0">
       <w:startOverride w:val="1"/>
@@ -57522,16 +57562,16 @@
       <w:startOverride w:val="1"/>
     </w:lvlOverride>
   </w:num>
-  <w:num w:numId="27" w16cid:durableId="775557325">
+  <w:num w:numId="27" w16cid:durableId="1357196926">
     <w:abstractNumId w:val="1"/>
   </w:num>
-  <w:num w:numId="28" w16cid:durableId="1928997632">
+  <w:num w:numId="28" w16cid:durableId="838807654">
     <w:abstractNumId w:val="1"/>
   </w:num>
-  <w:num w:numId="29" w16cid:durableId="629937895">
+  <w:num w:numId="29" w16cid:durableId="660700859">
     <w:abstractNumId w:val="1"/>
   </w:num>
-  <w:num w:numId="30" w16cid:durableId="319427726">
+  <w:num w:numId="30" w16cid:durableId="873887395">
     <w:abstractNumId w:val="2"/>
     <w:lvlOverride w:ilvl="0">
       <w:startOverride w:val="1"/>
@@ -57561,7 +57601,7 @@
       <w:startOverride w:val="1"/>
     </w:lvlOverride>
   </w:num>
-  <w:num w:numId="31" w16cid:durableId="1961763294">
+  <w:num w:numId="31" w16cid:durableId="1465079160">
     <w:abstractNumId w:val="2"/>
     <w:lvlOverride w:ilvl="0">
       <w:startOverride w:val="1"/>
@@ -57591,16 +57631,16 @@
       <w:startOverride w:val="1"/>
     </w:lvlOverride>
   </w:num>
-  <w:num w:numId="32" w16cid:durableId="1576545491">
+  <w:num w:numId="32" w16cid:durableId="278756658">
     <w:abstractNumId w:val="1"/>
   </w:num>
-  <w:num w:numId="33" w16cid:durableId="995767758">
+  <w:num w:numId="33" w16cid:durableId="634332187">
     <w:abstractNumId w:val="1"/>
   </w:num>
-  <w:num w:numId="34" w16cid:durableId="1615475912">
+  <w:num w:numId="34" w16cid:durableId="374893001">
     <w:abstractNumId w:val="1"/>
   </w:num>
-  <w:num w:numId="35" w16cid:durableId="1236207942">
+  <w:num w:numId="35" w16cid:durableId="134297879">
     <w:abstractNumId w:val="2"/>
     <w:lvlOverride w:ilvl="0">
       <w:startOverride w:val="1"/>
@@ -57630,25 +57670,25 @@
       <w:startOverride w:val="1"/>
     </w:lvlOverride>
   </w:num>
-  <w:num w:numId="36" w16cid:durableId="661272365">
+  <w:num w:numId="36" w16cid:durableId="1803693975">
     <w:abstractNumId w:val="1"/>
   </w:num>
-  <w:num w:numId="37" w16cid:durableId="391391781">
+  <w:num w:numId="37" w16cid:durableId="1412045350">
     <w:abstractNumId w:val="1"/>
   </w:num>
-  <w:num w:numId="38" w16cid:durableId="698312219">
+  <w:num w:numId="38" w16cid:durableId="1451558026">
     <w:abstractNumId w:val="1"/>
   </w:num>
-  <w:num w:numId="39" w16cid:durableId="1332487139">
+  <w:num w:numId="39" w16cid:durableId="101803545">
     <w:abstractNumId w:val="1"/>
   </w:num>
-  <w:num w:numId="40" w16cid:durableId="1650405235">
+  <w:num w:numId="40" w16cid:durableId="1197307453">
     <w:abstractNumId w:val="1"/>
   </w:num>
-  <w:num w:numId="41" w16cid:durableId="286281241">
+  <w:num w:numId="41" w16cid:durableId="1212614488">
     <w:abstractNumId w:val="1"/>
   </w:num>
-  <w:num w:numId="42" w16cid:durableId="1613584564">
+  <w:num w:numId="42" w16cid:durableId="1100225934">
     <w:abstractNumId w:val="2"/>
     <w:lvlOverride w:ilvl="0">
       <w:startOverride w:val="1"/>
@@ -57678,10 +57718,10 @@
       <w:startOverride w:val="1"/>
     </w:lvlOverride>
   </w:num>
-  <w:num w:numId="43" w16cid:durableId="1694645896">
+  <w:num w:numId="43" w16cid:durableId="2111974528">
     <w:abstractNumId w:val="1"/>
   </w:num>
-  <w:num w:numId="44" w16cid:durableId="1147480119">
+  <w:num w:numId="44" w16cid:durableId="155608470">
     <w:abstractNumId w:val="2"/>
     <w:lvlOverride w:ilvl="0">
       <w:startOverride w:val="1"/>
@@ -57711,10 +57751,10 @@
       <w:startOverride w:val="1"/>
     </w:lvlOverride>
   </w:num>
-  <w:num w:numId="45" w16cid:durableId="1689869937">
+  <w:num w:numId="45" w16cid:durableId="1881821742">
     <w:abstractNumId w:val="1"/>
   </w:num>
-  <w:num w:numId="46" w16cid:durableId="2126851463">
+  <w:num w:numId="46" w16cid:durableId="698049694">
     <w:abstractNumId w:val="2"/>
     <w:lvlOverride w:ilvl="0">
       <w:startOverride w:val="1"/>
@@ -57744,19 +57784,19 @@
       <w:startOverride w:val="1"/>
     </w:lvlOverride>
   </w:num>
-  <w:num w:numId="47" w16cid:durableId="947615550">
+  <w:num w:numId="47" w16cid:durableId="1093011763">
     <w:abstractNumId w:val="1"/>
   </w:num>
-  <w:num w:numId="48" w16cid:durableId="1554586741">
+  <w:num w:numId="48" w16cid:durableId="1614703409">
     <w:abstractNumId w:val="1"/>
   </w:num>
-  <w:num w:numId="49" w16cid:durableId="100610459">
+  <w:num w:numId="49" w16cid:durableId="848913622">
     <w:abstractNumId w:val="1"/>
   </w:num>
-  <w:num w:numId="50" w16cid:durableId="187722268">
+  <w:num w:numId="50" w16cid:durableId="1583762605">
     <w:abstractNumId w:val="1"/>
   </w:num>
-  <w:num w:numId="51" w16cid:durableId="1712605061">
+  <w:num w:numId="51" w16cid:durableId="277419361">
     <w:abstractNumId w:val="2"/>
     <w:lvlOverride w:ilvl="0">
       <w:startOverride w:val="1"/>
@@ -57786,19 +57826,19 @@
       <w:startOverride w:val="1"/>
     </w:lvlOverride>
   </w:num>
-  <w:num w:numId="52" w16cid:durableId="439029897">
+  <w:num w:numId="52" w16cid:durableId="14384745">
     <w:abstractNumId w:val="1"/>
   </w:num>
-  <w:num w:numId="53" w16cid:durableId="672148988">
+  <w:num w:numId="53" w16cid:durableId="1504929667">
     <w:abstractNumId w:val="1"/>
   </w:num>
-  <w:num w:numId="54" w16cid:durableId="818880677">
+  <w:num w:numId="54" w16cid:durableId="8797298">
     <w:abstractNumId w:val="1"/>
   </w:num>
-  <w:num w:numId="55" w16cid:durableId="2030527165">
+  <w:num w:numId="55" w16cid:durableId="665131090">
     <w:abstractNumId w:val="1"/>
   </w:num>
-  <w:num w:numId="56" w16cid:durableId="1964730971">
+  <w:num w:numId="56" w16cid:durableId="1508406598">
     <w:abstractNumId w:val="2"/>
     <w:lvlOverride w:ilvl="0">
       <w:startOverride w:val="1"/>
@@ -57828,19 +57868,19 @@
       <w:startOverride w:val="1"/>
     </w:lvlOverride>
   </w:num>
-  <w:num w:numId="57" w16cid:durableId="1812091116">
+  <w:num w:numId="57" w16cid:durableId="1014306338">
     <w:abstractNumId w:val="1"/>
   </w:num>
-  <w:num w:numId="58" w16cid:durableId="311178400">
+  <w:num w:numId="58" w16cid:durableId="1040933662">
     <w:abstractNumId w:val="1"/>
   </w:num>
-  <w:num w:numId="59" w16cid:durableId="1159421097">
+  <w:num w:numId="59" w16cid:durableId="1656956602">
     <w:abstractNumId w:val="1"/>
   </w:num>
-  <w:num w:numId="60" w16cid:durableId="518351390">
+  <w:num w:numId="60" w16cid:durableId="1572427000">
     <w:abstractNumId w:val="1"/>
   </w:num>
-  <w:num w:numId="61" w16cid:durableId="535429758">
+  <w:num w:numId="61" w16cid:durableId="1537354419">
     <w:abstractNumId w:val="2"/>
     <w:lvlOverride w:ilvl="0">
       <w:startOverride w:val="1"/>
@@ -57870,28 +57910,28 @@
       <w:startOverride w:val="1"/>
     </w:lvlOverride>
   </w:num>
-  <w:num w:numId="62" w16cid:durableId="87045618">
+  <w:num w:numId="62" w16cid:durableId="1795827909">
     <w:abstractNumId w:val="1"/>
   </w:num>
-  <w:num w:numId="63" w16cid:durableId="1521237067">
+  <w:num w:numId="63" w16cid:durableId="633563045">
     <w:abstractNumId w:val="1"/>
   </w:num>
-  <w:num w:numId="64" w16cid:durableId="625236133">
+  <w:num w:numId="64" w16cid:durableId="319892871">
     <w:abstractNumId w:val="1"/>
   </w:num>
-  <w:num w:numId="65" w16cid:durableId="1591083957">
+  <w:num w:numId="65" w16cid:durableId="741831310">
     <w:abstractNumId w:val="1"/>
   </w:num>
-  <w:num w:numId="66" w16cid:durableId="501625022">
+  <w:num w:numId="66" w16cid:durableId="2099520903">
     <w:abstractNumId w:val="1"/>
   </w:num>
-  <w:num w:numId="67" w16cid:durableId="834564554">
+  <w:num w:numId="67" w16cid:durableId="1170104305">
     <w:abstractNumId w:val="1"/>
   </w:num>
-  <w:num w:numId="68" w16cid:durableId="279536905">
+  <w:num w:numId="68" w16cid:durableId="762653156">
     <w:abstractNumId w:val="1"/>
   </w:num>
-  <w:num w:numId="69" w16cid:durableId="1695032316">
+  <w:num w:numId="69" w16cid:durableId="1726022589">
     <w:abstractNumId w:val="2"/>
     <w:lvlOverride w:ilvl="0">
       <w:startOverride w:val="1"/>
@@ -57921,16 +57961,16 @@
       <w:startOverride w:val="1"/>
     </w:lvlOverride>
   </w:num>
-  <w:num w:numId="70" w16cid:durableId="1245920737">
+  <w:num w:numId="70" w16cid:durableId="2138136138">
     <w:abstractNumId w:val="1"/>
   </w:num>
-  <w:num w:numId="71" w16cid:durableId="1362781354">
+  <w:num w:numId="71" w16cid:durableId="269433298">
     <w:abstractNumId w:val="1"/>
   </w:num>
-  <w:num w:numId="72" w16cid:durableId="1102262915">
+  <w:num w:numId="72" w16cid:durableId="1832595479">
     <w:abstractNumId w:val="1"/>
   </w:num>
-  <w:num w:numId="73" w16cid:durableId="1659773531">
+  <w:num w:numId="73" w16cid:durableId="478613498">
     <w:abstractNumId w:val="2"/>
     <w:lvlOverride w:ilvl="0">
       <w:startOverride w:val="1"/>
@@ -57960,16 +58000,16 @@
       <w:startOverride w:val="1"/>
     </w:lvlOverride>
   </w:num>
-  <w:num w:numId="74" w16cid:durableId="205414885">
+  <w:num w:numId="74" w16cid:durableId="1429040317">
     <w:abstractNumId w:val="1"/>
   </w:num>
-  <w:num w:numId="75" w16cid:durableId="1572697436">
+  <w:num w:numId="75" w16cid:durableId="1420442448">
     <w:abstractNumId w:val="1"/>
   </w:num>
-  <w:num w:numId="76" w16cid:durableId="1258169478">
+  <w:num w:numId="76" w16cid:durableId="1194423872">
     <w:abstractNumId w:val="1"/>
   </w:num>
-  <w:num w:numId="77" w16cid:durableId="485511576">
+  <w:num w:numId="77" w16cid:durableId="550848827">
     <w:abstractNumId w:val="2"/>
     <w:lvlOverride w:ilvl="0">
       <w:startOverride w:val="1"/>
@@ -57999,13 +58039,13 @@
       <w:startOverride w:val="1"/>
     </w:lvlOverride>
   </w:num>
-  <w:num w:numId="78" w16cid:durableId="1690065653">
+  <w:num w:numId="78" w16cid:durableId="2018922532">
     <w:abstractNumId w:val="1"/>
   </w:num>
-  <w:num w:numId="79" w16cid:durableId="2048216191">
+  <w:num w:numId="79" w16cid:durableId="1115631916">
     <w:abstractNumId w:val="1"/>
   </w:num>
-  <w:num w:numId="80" w16cid:durableId="552156493">
+  <w:num w:numId="80" w16cid:durableId="97458311">
     <w:abstractNumId w:val="2"/>
     <w:lvlOverride w:ilvl="0">
       <w:startOverride w:val="1"/>
@@ -58035,31 +58075,31 @@
       <w:startOverride w:val="1"/>
     </w:lvlOverride>
   </w:num>
-  <w:num w:numId="81" w16cid:durableId="1450658543">
+  <w:num w:numId="81" w16cid:durableId="897975024">
     <w:abstractNumId w:val="1"/>
   </w:num>
-  <w:num w:numId="82" w16cid:durableId="106627922">
+  <w:num w:numId="82" w16cid:durableId="705371996">
     <w:abstractNumId w:val="1"/>
   </w:num>
-  <w:num w:numId="83" w16cid:durableId="211311138">
+  <w:num w:numId="83" w16cid:durableId="501237464">
     <w:abstractNumId w:val="1"/>
   </w:num>
-  <w:num w:numId="84" w16cid:durableId="771052387">
+  <w:num w:numId="84" w16cid:durableId="1216703154">
     <w:abstractNumId w:val="1"/>
   </w:num>
-  <w:num w:numId="85" w16cid:durableId="2040279514">
+  <w:num w:numId="85" w16cid:durableId="1839611452">
     <w:abstractNumId w:val="1"/>
   </w:num>
-  <w:num w:numId="86" w16cid:durableId="601229258">
+  <w:num w:numId="86" w16cid:durableId="213544892">
     <w:abstractNumId w:val="1"/>
   </w:num>
-  <w:num w:numId="87" w16cid:durableId="55932713">
+  <w:num w:numId="87" w16cid:durableId="1889293773">
     <w:abstractNumId w:val="1"/>
   </w:num>
-  <w:num w:numId="88" w16cid:durableId="505294192">
+  <w:num w:numId="88" w16cid:durableId="1429082315">
     <w:abstractNumId w:val="1"/>
   </w:num>
-  <w:num w:numId="89" w16cid:durableId="1349672693">
+  <w:num w:numId="89" w16cid:durableId="1672101228">
     <w:abstractNumId w:val="2"/>
     <w:lvlOverride w:ilvl="0">
       <w:startOverride w:val="1"/>
@@ -58089,16 +58129,16 @@
       <w:startOverride w:val="1"/>
     </w:lvlOverride>
   </w:num>
-  <w:num w:numId="90" w16cid:durableId="156121329">
+  <w:num w:numId="90" w16cid:durableId="1648392388">
     <w:abstractNumId w:val="1"/>
   </w:num>
-  <w:num w:numId="91" w16cid:durableId="730226253">
+  <w:num w:numId="91" w16cid:durableId="1355764589">
     <w:abstractNumId w:val="1"/>
   </w:num>
-  <w:num w:numId="92" w16cid:durableId="382218196">
+  <w:num w:numId="92" w16cid:durableId="1150947544">
     <w:abstractNumId w:val="1"/>
   </w:num>
-  <w:num w:numId="93" w16cid:durableId="1707869289">
+  <w:num w:numId="93" w16cid:durableId="1062872758">
     <w:abstractNumId w:val="2"/>
     <w:lvlOverride w:ilvl="0">
       <w:startOverride w:val="1"/>
@@ -58128,10 +58168,10 @@
       <w:startOverride w:val="1"/>
     </w:lvlOverride>
   </w:num>
-  <w:num w:numId="94" w16cid:durableId="1804955259">
+  <w:num w:numId="94" w16cid:durableId="1948855388">
     <w:abstractNumId w:val="1"/>
   </w:num>
-  <w:num w:numId="95" w16cid:durableId="291374646">
+  <w:num w:numId="95" w16cid:durableId="47847264">
     <w:abstractNumId w:val="2"/>
     <w:lvlOverride w:ilvl="0">
       <w:startOverride w:val="1"/>
@@ -58161,10 +58201,10 @@
       <w:startOverride w:val="1"/>
     </w:lvlOverride>
   </w:num>
-  <w:num w:numId="96" w16cid:durableId="648441119">
+  <w:num w:numId="96" w16cid:durableId="1061755374">
     <w:abstractNumId w:val="1"/>
   </w:num>
-  <w:num w:numId="97" w16cid:durableId="1862472807">
+  <w:num w:numId="97" w16cid:durableId="1121535889">
     <w:abstractNumId w:val="2"/>
     <w:lvlOverride w:ilvl="0">
       <w:startOverride w:val="1"/>
@@ -58194,10 +58234,10 @@
       <w:startOverride w:val="1"/>
     </w:lvlOverride>
   </w:num>
-  <w:num w:numId="98" w16cid:durableId="765613901">
+  <w:num w:numId="98" w16cid:durableId="1192494602">
     <w:abstractNumId w:val="1"/>
   </w:num>
-  <w:num w:numId="99" w16cid:durableId="203059812">
+  <w:num w:numId="99" w16cid:durableId="310327126">
     <w:abstractNumId w:val="2"/>
     <w:lvlOverride w:ilvl="0">
       <w:startOverride w:val="1"/>
@@ -58227,13 +58267,13 @@
       <w:startOverride w:val="1"/>
     </w:lvlOverride>
   </w:num>
-  <w:num w:numId="100" w16cid:durableId="373314511">
+  <w:num w:numId="100" w16cid:durableId="1816992672">
     <w:abstractNumId w:val="1"/>
   </w:num>
-  <w:num w:numId="101" w16cid:durableId="621619270">
+  <w:num w:numId="101" w16cid:durableId="1730306451">
     <w:abstractNumId w:val="1"/>
   </w:num>
-  <w:num w:numId="102" w16cid:durableId="1981766142">
+  <w:num w:numId="102" w16cid:durableId="836577978">
     <w:abstractNumId w:val="2"/>
     <w:lvlOverride w:ilvl="0">
       <w:startOverride w:val="1"/>
@@ -58263,34 +58303,34 @@
       <w:startOverride w:val="1"/>
     </w:lvlOverride>
   </w:num>
-  <w:num w:numId="103" w16cid:durableId="2008628930">
+  <w:num w:numId="103" w16cid:durableId="1082877705">
     <w:abstractNumId w:val="1"/>
   </w:num>
-  <w:num w:numId="104" w16cid:durableId="101270250">
+  <w:num w:numId="104" w16cid:durableId="660544663">
     <w:abstractNumId w:val="1"/>
   </w:num>
-  <w:num w:numId="105" w16cid:durableId="1470051395">
+  <w:num w:numId="105" w16cid:durableId="2043747847">
     <w:abstractNumId w:val="1"/>
   </w:num>
-  <w:num w:numId="106" w16cid:durableId="1320422514">
+  <w:num w:numId="106" w16cid:durableId="26878341">
     <w:abstractNumId w:val="1"/>
   </w:num>
-  <w:num w:numId="107" w16cid:durableId="1775242095">
+  <w:num w:numId="107" w16cid:durableId="1723862672">
     <w:abstractNumId w:val="1"/>
   </w:num>
-  <w:num w:numId="108" w16cid:durableId="384256440">
+  <w:num w:numId="108" w16cid:durableId="219946172">
     <w:abstractNumId w:val="1"/>
   </w:num>
-  <w:num w:numId="109" w16cid:durableId="1730152391">
+  <w:num w:numId="109" w16cid:durableId="26223866">
     <w:abstractNumId w:val="1"/>
   </w:num>
-  <w:num w:numId="110" w16cid:durableId="300579301">
+  <w:num w:numId="110" w16cid:durableId="1805805647">
     <w:abstractNumId w:val="1"/>
   </w:num>
-  <w:num w:numId="111" w16cid:durableId="15234391">
+  <w:num w:numId="111" w16cid:durableId="1212230019">
     <w:abstractNumId w:val="1"/>
   </w:num>
-  <w:num w:numId="112" w16cid:durableId="2038315504">
+  <w:num w:numId="112" w16cid:durableId="230047685">
     <w:abstractNumId w:val="2"/>
     <w:lvlOverride w:ilvl="0">
       <w:startOverride w:val="1"/>
@@ -58320,13 +58360,13 @@
       <w:startOverride w:val="1"/>
     </w:lvlOverride>
   </w:num>
-  <w:num w:numId="113" w16cid:durableId="256717462">
+  <w:num w:numId="113" w16cid:durableId="1504977815">
     <w:abstractNumId w:val="1"/>
   </w:num>
-  <w:num w:numId="114" w16cid:durableId="41099709">
+  <w:num w:numId="114" w16cid:durableId="1216576214">
     <w:abstractNumId w:val="1"/>
   </w:num>
-  <w:num w:numId="115" w16cid:durableId="564099823">
+  <w:num w:numId="115" w16cid:durableId="602228856">
     <w:abstractNumId w:val="2"/>
     <w:lvlOverride w:ilvl="0">
       <w:startOverride w:val="1"/>
@@ -58356,7 +58396,7 @@
       <w:startOverride w:val="1"/>
     </w:lvlOverride>
   </w:num>
-  <w:num w:numId="116" w16cid:durableId="112141593">
+  <w:num w:numId="116" w16cid:durableId="978001093">
     <w:abstractNumId w:val="2"/>
     <w:lvlOverride w:ilvl="0">
       <w:startOverride w:val="1"/>
@@ -58386,7 +58426,7 @@
       <w:startOverride w:val="1"/>
     </w:lvlOverride>
   </w:num>
-  <w:num w:numId="117" w16cid:durableId="2014405612">
+  <w:num w:numId="117" w16cid:durableId="1306079361">
     <w:abstractNumId w:val="2"/>
     <w:lvlOverride w:ilvl="0">
       <w:startOverride w:val="1"/>
@@ -58416,16 +58456,16 @@
       <w:startOverride w:val="1"/>
     </w:lvlOverride>
   </w:num>
-  <w:num w:numId="118" w16cid:durableId="1270117147">
+  <w:num w:numId="118" w16cid:durableId="644897623">
     <w:abstractNumId w:val="1"/>
   </w:num>
-  <w:num w:numId="119" w16cid:durableId="627586331">
+  <w:num w:numId="119" w16cid:durableId="1800371577">
     <w:abstractNumId w:val="1"/>
   </w:num>
-  <w:num w:numId="120" w16cid:durableId="852306927">
+  <w:num w:numId="120" w16cid:durableId="170729257">
     <w:abstractNumId w:val="1"/>
   </w:num>
-  <w:num w:numId="121" w16cid:durableId="822893908">
+  <w:num w:numId="121" w16cid:durableId="1498382270">
     <w:abstractNumId w:val="2"/>
     <w:lvlOverride w:ilvl="0">
       <w:startOverride w:val="1"/>
@@ -58455,28 +58495,28 @@
       <w:startOverride w:val="1"/>
     </w:lvlOverride>
   </w:num>
-  <w:num w:numId="122" w16cid:durableId="4017523">
+  <w:num w:numId="122" w16cid:durableId="857230795">
     <w:abstractNumId w:val="1"/>
   </w:num>
-  <w:num w:numId="123" w16cid:durableId="1079062880">
+  <w:num w:numId="123" w16cid:durableId="1791392906">
     <w:abstractNumId w:val="1"/>
   </w:num>
-  <w:num w:numId="124" w16cid:durableId="498424437">
+  <w:num w:numId="124" w16cid:durableId="780077287">
     <w:abstractNumId w:val="1"/>
   </w:num>
-  <w:num w:numId="125" w16cid:durableId="2071418318">
+  <w:num w:numId="125" w16cid:durableId="304313639">
     <w:abstractNumId w:val="1"/>
   </w:num>
-  <w:num w:numId="126" w16cid:durableId="2049602074">
+  <w:num w:numId="126" w16cid:durableId="486094152">
     <w:abstractNumId w:val="1"/>
   </w:num>
-  <w:num w:numId="127" w16cid:durableId="1295328666">
+  <w:num w:numId="127" w16cid:durableId="1470397161">
     <w:abstractNumId w:val="1"/>
   </w:num>
-  <w:num w:numId="128" w16cid:durableId="90391597">
+  <w:num w:numId="128" w16cid:durableId="1044600458">
     <w:abstractNumId w:val="1"/>
   </w:num>
-  <w:num w:numId="129" w16cid:durableId="2116629864">
+  <w:num w:numId="129" w16cid:durableId="89351160">
     <w:abstractNumId w:val="2"/>
     <w:lvlOverride w:ilvl="0">
       <w:startOverride w:val="1"/>
@@ -58506,7 +58546,7 @@
       <w:startOverride w:val="1"/>
     </w:lvlOverride>
   </w:num>
-  <w:num w:numId="130" w16cid:durableId="35084749">
+  <w:num w:numId="130" w16cid:durableId="2036541594">
     <w:abstractNumId w:val="1"/>
   </w:num>
   <w:numIdMacAtCleanup w:val="130"/>
@@ -59773,7 +59813,7 @@
     <w:next w:val="Normal"/>
     <w:autoRedefine/>
     <w:uiPriority w:val="39"/>
-    <w:rsid w:val="004B60C8"/>
+    <w:rsid w:val="006E7DA0"/>
   </w:style>
   <w:style w:type="paragraph" w:styleId="TOC2">
     <w:name w:val="toc 2"/>
@@ -59781,7 +59821,7 @@
     <w:next w:val="Normal"/>
     <w:autoRedefine/>
     <w:uiPriority w:val="39"/>
-    <w:rsid w:val="004B60C8"/>
+    <w:rsid w:val="006E7DA0"/>
     <w:pPr>
       <w:ind w:left="210"/>
     </w:pPr>
@@ -59793,7 +59833,7 @@
     <w:autoRedefine/>
     <w:uiPriority w:val="39"/>
     <w:unhideWhenUsed/>
-    <w:rsid w:val="004B60C8"/>
+    <w:rsid w:val="006E7DA0"/>
     <w:pPr>
       <w:spacing w:line="278" w:lineRule="auto"/>
       <w:ind w:left="480"/>
@@ -59813,7 +59853,7 @@
     <w:autoRedefine/>
     <w:uiPriority w:val="39"/>
     <w:unhideWhenUsed/>
-    <w:rsid w:val="004B60C8"/>
+    <w:rsid w:val="006E7DA0"/>
     <w:pPr>
       <w:spacing w:line="278" w:lineRule="auto"/>
       <w:ind w:left="720"/>
@@ -59833,7 +59873,7 @@
     <w:autoRedefine/>
     <w:uiPriority w:val="39"/>
     <w:unhideWhenUsed/>
-    <w:rsid w:val="004B60C8"/>
+    <w:rsid w:val="006E7DA0"/>
     <w:pPr>
       <w:spacing w:line="278" w:lineRule="auto"/>
       <w:ind w:left="960"/>
@@ -59853,7 +59893,7 @@
     <w:autoRedefine/>
     <w:uiPriority w:val="39"/>
     <w:unhideWhenUsed/>
-    <w:rsid w:val="004B60C8"/>
+    <w:rsid w:val="006E7DA0"/>
     <w:pPr>
       <w:spacing w:line="278" w:lineRule="auto"/>
       <w:ind w:left="1200"/>
@@ -59873,7 +59913,7 @@
     <w:autoRedefine/>
     <w:uiPriority w:val="39"/>
     <w:unhideWhenUsed/>
-    <w:rsid w:val="004B60C8"/>
+    <w:rsid w:val="006E7DA0"/>
     <w:pPr>
       <w:spacing w:line="278" w:lineRule="auto"/>
       <w:ind w:left="1440"/>
@@ -59893,7 +59933,7 @@
     <w:autoRedefine/>
     <w:uiPriority w:val="39"/>
     <w:unhideWhenUsed/>
-    <w:rsid w:val="004B60C8"/>
+    <w:rsid w:val="006E7DA0"/>
     <w:pPr>
       <w:spacing w:line="278" w:lineRule="auto"/>
       <w:ind w:left="1680"/>
@@ -59913,7 +59953,7 @@
     <w:autoRedefine/>
     <w:uiPriority w:val="39"/>
     <w:unhideWhenUsed/>
-    <w:rsid w:val="004B60C8"/>
+    <w:rsid w:val="006E7DA0"/>
     <w:pPr>
       <w:spacing w:line="278" w:lineRule="auto"/>
       <w:ind w:left="1920"/>
@@ -59932,7 +59972,7 @@
     <w:uiPriority w:val="99"/>
     <w:semiHidden/>
     <w:unhideWhenUsed/>
-    <w:rsid w:val="004B60C8"/>
+    <w:rsid w:val="006E7DA0"/>
     <w:rPr>
       <w:color w:val="605E5C"/>
       <w:shd w:val="clear" w:color="auto" w:fill="E1DFDD"/>

</xml_diff>

<commit_message>
PyTorch 2.10 + triton-windows: torch.compile on Windows (about 1.45x faster training); converter never replaces outputs written after a batch was planned
</commit_message>
<xml_diff>
--- a/tinyGPT_learning_guide.docx
+++ b/tinyGPT_learning_guide.docx
@@ -35,7 +35,7 @@
           <w:sz w:val="21"/>
           <w:szCs w:val="24"/>
         </w:rPr>
-        <w:id w:val="259802819"/>
+        <w:id w:val="-126777943"/>
         <w:docPartObj>
           <w:docPartGallery w:val="Table of Contents"/>
           <w:docPartUnique/>
@@ -77,7 +77,7 @@
           <w:r>
             <w:fldChar w:fldCharType="separate"/>
           </w:r>
-          <w:hyperlink w:anchor="_Toc241660823" w:history="1">
+          <w:hyperlink w:anchor="_Toc241663686" w:history="1">
             <w:r>
               <w:rPr>
                 <w:rStyle w:val="Hyperlink"/>
@@ -123,7 +123,7 @@
                 <w:noProof/>
                 <w:webHidden/>
               </w:rPr>
-              <w:instrText xml:space="preserve"> PAGEREF _Toc241660823 \h </w:instrText>
+              <w:instrText xml:space="preserve"> PAGEREF _Toc241663686 \h </w:instrText>
             </w:r>
             <w:r>
               <w:rPr>
@@ -171,7 +171,7 @@
               <w14:ligatures w14:val="standardContextual"/>
             </w:rPr>
           </w:pPr>
-          <w:hyperlink w:anchor="_Toc241660824" w:history="1">
+          <w:hyperlink w:anchor="_Toc241663687" w:history="1">
             <w:r>
               <w:rPr>
                 <w:rStyle w:val="Hyperlink"/>
@@ -217,7 +217,7 @@
                 <w:noProof/>
                 <w:webHidden/>
               </w:rPr>
-              <w:instrText xml:space="preserve"> PAGEREF _Toc241660824 \h </w:instrText>
+              <w:instrText xml:space="preserve"> PAGEREF _Toc241663687 \h </w:instrText>
             </w:r>
             <w:r>
               <w:rPr>
@@ -265,7 +265,7 @@
               <w14:ligatures w14:val="standardContextual"/>
             </w:rPr>
           </w:pPr>
-          <w:hyperlink w:anchor="_Toc241660825" w:history="1">
+          <w:hyperlink w:anchor="_Toc241663688" w:history="1">
             <w:r>
               <w:rPr>
                 <w:rStyle w:val="Hyperlink"/>
@@ -311,7 +311,7 @@
                 <w:noProof/>
                 <w:webHidden/>
               </w:rPr>
-              <w:instrText xml:space="preserve"> PAGEREF _Toc241660825 \h </w:instrText>
+              <w:instrText xml:space="preserve"> PAGEREF _Toc241663688 \h </w:instrText>
             </w:r>
             <w:r>
               <w:rPr>
@@ -359,7 +359,7 @@
               <w14:ligatures w14:val="standardContextual"/>
             </w:rPr>
           </w:pPr>
-          <w:hyperlink w:anchor="_Toc241660826" w:history="1">
+          <w:hyperlink w:anchor="_Toc241663689" w:history="1">
             <w:r>
               <w:rPr>
                 <w:rStyle w:val="Hyperlink"/>
@@ -405,7 +405,7 @@
                 <w:noProof/>
                 <w:webHidden/>
               </w:rPr>
-              <w:instrText xml:space="preserve"> PAGEREF _Toc241660826 \h </w:instrText>
+              <w:instrText xml:space="preserve"> PAGEREF _Toc241663689 \h </w:instrText>
             </w:r>
             <w:r>
               <w:rPr>
@@ -453,7 +453,7 @@
               <w14:ligatures w14:val="standardContextual"/>
             </w:rPr>
           </w:pPr>
-          <w:hyperlink w:anchor="_Toc241660827" w:history="1">
+          <w:hyperlink w:anchor="_Toc241663690" w:history="1">
             <w:r>
               <w:rPr>
                 <w:rStyle w:val="Hyperlink"/>
@@ -499,7 +499,7 @@
                 <w:noProof/>
                 <w:webHidden/>
               </w:rPr>
-              <w:instrText xml:space="preserve"> PAGEREF _Toc241660827 \h </w:instrText>
+              <w:instrText xml:space="preserve"> PAGEREF _Toc241663690 \h </w:instrText>
             </w:r>
             <w:r>
               <w:rPr>
@@ -547,7 +547,7 @@
               <w14:ligatures w14:val="standardContextual"/>
             </w:rPr>
           </w:pPr>
-          <w:hyperlink w:anchor="_Toc241660828" w:history="1">
+          <w:hyperlink w:anchor="_Toc241663691" w:history="1">
             <w:r>
               <w:rPr>
                 <w:rStyle w:val="Hyperlink"/>
@@ -593,7 +593,7 @@
                 <w:noProof/>
                 <w:webHidden/>
               </w:rPr>
-              <w:instrText xml:space="preserve"> PAGEREF _Toc241660828 \h </w:instrText>
+              <w:instrText xml:space="preserve"> PAGEREF _Toc241663691 \h </w:instrText>
             </w:r>
             <w:r>
               <w:rPr>
@@ -641,7 +641,7 @@
               <w14:ligatures w14:val="standardContextual"/>
             </w:rPr>
           </w:pPr>
-          <w:hyperlink w:anchor="_Toc241660829" w:history="1">
+          <w:hyperlink w:anchor="_Toc241663692" w:history="1">
             <w:r>
               <w:rPr>
                 <w:rStyle w:val="Hyperlink"/>
@@ -687,7 +687,7 @@
                 <w:noProof/>
                 <w:webHidden/>
               </w:rPr>
-              <w:instrText xml:space="preserve"> PAGEREF _Toc241660829 \h </w:instrText>
+              <w:instrText xml:space="preserve"> PAGEREF _Toc241663692 \h </w:instrText>
             </w:r>
             <w:r>
               <w:rPr>
@@ -735,7 +735,7 @@
               <w14:ligatures w14:val="standardContextual"/>
             </w:rPr>
           </w:pPr>
-          <w:hyperlink w:anchor="_Toc241660830" w:history="1">
+          <w:hyperlink w:anchor="_Toc241663693" w:history="1">
             <w:r>
               <w:rPr>
                 <w:rStyle w:val="Hyperlink"/>
@@ -781,7 +781,7 @@
                 <w:noProof/>
                 <w:webHidden/>
               </w:rPr>
-              <w:instrText xml:space="preserve"> PAGEREF _Toc241660830 \h </w:instrText>
+              <w:instrText xml:space="preserve"> PAGEREF _Toc241663693 \h </w:instrText>
             </w:r>
             <w:r>
               <w:rPr>
@@ -829,7 +829,7 @@
               <w14:ligatures w14:val="standardContextual"/>
             </w:rPr>
           </w:pPr>
-          <w:hyperlink w:anchor="_Toc241660831" w:history="1">
+          <w:hyperlink w:anchor="_Toc241663694" w:history="1">
             <w:r>
               <w:rPr>
                 <w:rStyle w:val="Hyperlink"/>
@@ -875,7 +875,7 @@
                 <w:noProof/>
                 <w:webHidden/>
               </w:rPr>
-              <w:instrText xml:space="preserve"> PAGEREF _Toc241660831 \h </w:instrText>
+              <w:instrText xml:space="preserve"> PAGEREF _Toc241663694 \h </w:instrText>
             </w:r>
             <w:r>
               <w:rPr>
@@ -923,7 +923,7 @@
               <w14:ligatures w14:val="standardContextual"/>
             </w:rPr>
           </w:pPr>
-          <w:hyperlink w:anchor="_Toc241660832" w:history="1">
+          <w:hyperlink w:anchor="_Toc241663695" w:history="1">
             <w:r>
               <w:rPr>
                 <w:rStyle w:val="Hyperlink"/>
@@ -969,7 +969,7 @@
                 <w:noProof/>
                 <w:webHidden/>
               </w:rPr>
-              <w:instrText xml:space="preserve"> PAGEREF _Toc241660832 \h </w:instrText>
+              <w:instrText xml:space="preserve"> PAGEREF _Toc241663695 \h </w:instrText>
             </w:r>
             <w:r>
               <w:rPr>
@@ -1017,7 +1017,7 @@
               <w14:ligatures w14:val="standardContextual"/>
             </w:rPr>
           </w:pPr>
-          <w:hyperlink w:anchor="_Toc241660833" w:history="1">
+          <w:hyperlink w:anchor="_Toc241663696" w:history="1">
             <w:r>
               <w:rPr>
                 <w:rStyle w:val="Hyperlink"/>
@@ -1063,7 +1063,7 @@
                 <w:noProof/>
                 <w:webHidden/>
               </w:rPr>
-              <w:instrText xml:space="preserve"> PAGEREF _Toc241660833 \h </w:instrText>
+              <w:instrText xml:space="preserve"> PAGEREF _Toc241663696 \h </w:instrText>
             </w:r>
             <w:r>
               <w:rPr>
@@ -1111,7 +1111,7 @@
               <w14:ligatures w14:val="standardContextual"/>
             </w:rPr>
           </w:pPr>
-          <w:hyperlink w:anchor="_Toc241660834" w:history="1">
+          <w:hyperlink w:anchor="_Toc241663697" w:history="1">
             <w:r>
               <w:rPr>
                 <w:rStyle w:val="Hyperlink"/>
@@ -1157,7 +1157,7 @@
                 <w:noProof/>
                 <w:webHidden/>
               </w:rPr>
-              <w:instrText xml:space="preserve"> PAGEREF _Toc241660834 \h </w:instrText>
+              <w:instrText xml:space="preserve"> PAGEREF _Toc241663697 \h </w:instrText>
             </w:r>
             <w:r>
               <w:rPr>
@@ -1205,7 +1205,7 @@
               <w14:ligatures w14:val="standardContextual"/>
             </w:rPr>
           </w:pPr>
-          <w:hyperlink w:anchor="_Toc241660835" w:history="1">
+          <w:hyperlink w:anchor="_Toc241663698" w:history="1">
             <w:r>
               <w:rPr>
                 <w:rStyle w:val="Hyperlink"/>
@@ -1251,7 +1251,7 @@
                 <w:noProof/>
                 <w:webHidden/>
               </w:rPr>
-              <w:instrText xml:space="preserve"> PAGEREF _Toc241660835 \h </w:instrText>
+              <w:instrText xml:space="preserve"> PAGEREF _Toc241663698 \h </w:instrText>
             </w:r>
             <w:r>
               <w:rPr>
@@ -1299,7 +1299,7 @@
               <w14:ligatures w14:val="standardContextual"/>
             </w:rPr>
           </w:pPr>
-          <w:hyperlink w:anchor="_Toc241660836" w:history="1">
+          <w:hyperlink w:anchor="_Toc241663699" w:history="1">
             <w:r>
               <w:rPr>
                 <w:rStyle w:val="Hyperlink"/>
@@ -1345,7 +1345,7 @@
                 <w:noProof/>
                 <w:webHidden/>
               </w:rPr>
-              <w:instrText xml:space="preserve"> PAGEREF _Toc241660836 \h </w:instrText>
+              <w:instrText xml:space="preserve"> PAGEREF _Toc241663699 \h </w:instrText>
             </w:r>
             <w:r>
               <w:rPr>
@@ -1393,7 +1393,7 @@
               <w14:ligatures w14:val="standardContextual"/>
             </w:rPr>
           </w:pPr>
-          <w:hyperlink w:anchor="_Toc241660837" w:history="1">
+          <w:hyperlink w:anchor="_Toc241663700" w:history="1">
             <w:r>
               <w:rPr>
                 <w:rStyle w:val="Hyperlink"/>
@@ -1439,7 +1439,7 @@
                 <w:noProof/>
                 <w:webHidden/>
               </w:rPr>
-              <w:instrText xml:space="preserve"> PAGEREF _Toc241660837 \h </w:instrText>
+              <w:instrText xml:space="preserve"> PAGEREF _Toc241663700 \h </w:instrText>
             </w:r>
             <w:r>
               <w:rPr>
@@ -1487,7 +1487,7 @@
               <w14:ligatures w14:val="standardContextual"/>
             </w:rPr>
           </w:pPr>
-          <w:hyperlink w:anchor="_Toc241660838" w:history="1">
+          <w:hyperlink w:anchor="_Toc241663701" w:history="1">
             <w:r>
               <w:rPr>
                 <w:rStyle w:val="Hyperlink"/>
@@ -1533,7 +1533,7 @@
                 <w:noProof/>
                 <w:webHidden/>
               </w:rPr>
-              <w:instrText xml:space="preserve"> PAGEREF _Toc241660838 \h </w:instrText>
+              <w:instrText xml:space="preserve"> PAGEREF _Toc241663701 \h </w:instrText>
             </w:r>
             <w:r>
               <w:rPr>
@@ -1581,7 +1581,7 @@
               <w14:ligatures w14:val="standardContextual"/>
             </w:rPr>
           </w:pPr>
-          <w:hyperlink w:anchor="_Toc241660839" w:history="1">
+          <w:hyperlink w:anchor="_Toc241663702" w:history="1">
             <w:r>
               <w:rPr>
                 <w:rStyle w:val="Hyperlink"/>
@@ -1627,7 +1627,7 @@
                 <w:noProof/>
                 <w:webHidden/>
               </w:rPr>
-              <w:instrText xml:space="preserve"> PAGEREF _Toc241660839 \h </w:instrText>
+              <w:instrText xml:space="preserve"> PAGEREF _Toc241663702 \h </w:instrText>
             </w:r>
             <w:r>
               <w:rPr>
@@ -1675,7 +1675,7 @@
               <w14:ligatures w14:val="standardContextual"/>
             </w:rPr>
           </w:pPr>
-          <w:hyperlink w:anchor="_Toc241660840" w:history="1">
+          <w:hyperlink w:anchor="_Toc241663703" w:history="1">
             <w:r>
               <w:rPr>
                 <w:rStyle w:val="Hyperlink"/>
@@ -1721,7 +1721,7 @@
                 <w:noProof/>
                 <w:webHidden/>
               </w:rPr>
-              <w:instrText xml:space="preserve"> PAGEREF _Toc241660840 \h </w:instrText>
+              <w:instrText xml:space="preserve"> PAGEREF _Toc241663703 \h </w:instrText>
             </w:r>
             <w:r>
               <w:rPr>
@@ -1769,7 +1769,7 @@
               <w14:ligatures w14:val="standardContextual"/>
             </w:rPr>
           </w:pPr>
-          <w:hyperlink w:anchor="_Toc241660841" w:history="1">
+          <w:hyperlink w:anchor="_Toc241663704" w:history="1">
             <w:r>
               <w:rPr>
                 <w:rStyle w:val="Hyperlink"/>
@@ -1815,7 +1815,7 @@
                 <w:noProof/>
                 <w:webHidden/>
               </w:rPr>
-              <w:instrText xml:space="preserve"> PAGEREF _Toc241660841 \h </w:instrText>
+              <w:instrText xml:space="preserve"> PAGEREF _Toc241663704 \h </w:instrText>
             </w:r>
             <w:r>
               <w:rPr>
@@ -1863,7 +1863,7 @@
               <w14:ligatures w14:val="standardContextual"/>
             </w:rPr>
           </w:pPr>
-          <w:hyperlink w:anchor="_Toc241660842" w:history="1">
+          <w:hyperlink w:anchor="_Toc241663705" w:history="1">
             <w:r>
               <w:rPr>
                 <w:rStyle w:val="Hyperlink"/>
@@ -1909,7 +1909,7 @@
                 <w:noProof/>
                 <w:webHidden/>
               </w:rPr>
-              <w:instrText xml:space="preserve"> PAGEREF _Toc241660842 \h </w:instrText>
+              <w:instrText xml:space="preserve"> PAGEREF _Toc241663705 \h </w:instrText>
             </w:r>
             <w:r>
               <w:rPr>
@@ -1957,7 +1957,7 @@
               <w14:ligatures w14:val="standardContextual"/>
             </w:rPr>
           </w:pPr>
-          <w:hyperlink w:anchor="_Toc241660843" w:history="1">
+          <w:hyperlink w:anchor="_Toc241663706" w:history="1">
             <w:r>
               <w:rPr>
                 <w:rStyle w:val="Hyperlink"/>
@@ -2003,7 +2003,7 @@
                 <w:noProof/>
                 <w:webHidden/>
               </w:rPr>
-              <w:instrText xml:space="preserve"> PAGEREF _Toc241660843 \h </w:instrText>
+              <w:instrText xml:space="preserve"> PAGEREF _Toc241663706 \h </w:instrText>
             </w:r>
             <w:r>
               <w:rPr>
@@ -2051,7 +2051,7 @@
               <w14:ligatures w14:val="standardContextual"/>
             </w:rPr>
           </w:pPr>
-          <w:hyperlink w:anchor="_Toc241660844" w:history="1">
+          <w:hyperlink w:anchor="_Toc241663707" w:history="1">
             <w:r>
               <w:rPr>
                 <w:rStyle w:val="Hyperlink"/>
@@ -2097,7 +2097,7 @@
                 <w:noProof/>
                 <w:webHidden/>
               </w:rPr>
-              <w:instrText xml:space="preserve"> PAGEREF _Toc241660844 \h </w:instrText>
+              <w:instrText xml:space="preserve"> PAGEREF _Toc241663707 \h </w:instrText>
             </w:r>
             <w:r>
               <w:rPr>
@@ -2145,7 +2145,7 @@
               <w14:ligatures w14:val="standardContextual"/>
             </w:rPr>
           </w:pPr>
-          <w:hyperlink w:anchor="_Toc241660845" w:history="1">
+          <w:hyperlink w:anchor="_Toc241663708" w:history="1">
             <w:r>
               <w:rPr>
                 <w:rStyle w:val="Hyperlink"/>
@@ -2191,7 +2191,7 @@
                 <w:noProof/>
                 <w:webHidden/>
               </w:rPr>
-              <w:instrText xml:space="preserve"> PAGEREF _Toc241660845 \h </w:instrText>
+              <w:instrText xml:space="preserve"> PAGEREF _Toc241663708 \h </w:instrText>
             </w:r>
             <w:r>
               <w:rPr>
@@ -2239,7 +2239,7 @@
               <w14:ligatures w14:val="standardContextual"/>
             </w:rPr>
           </w:pPr>
-          <w:hyperlink w:anchor="_Toc241660846" w:history="1">
+          <w:hyperlink w:anchor="_Toc241663709" w:history="1">
             <w:r>
               <w:rPr>
                 <w:rStyle w:val="Hyperlink"/>
@@ -2285,7 +2285,7 @@
                 <w:noProof/>
                 <w:webHidden/>
               </w:rPr>
-              <w:instrText xml:space="preserve"> PAGEREF _Toc241660846 \h </w:instrText>
+              <w:instrText xml:space="preserve"> PAGEREF _Toc241663709 \h </w:instrText>
             </w:r>
             <w:r>
               <w:rPr>
@@ -2333,7 +2333,7 @@
               <w14:ligatures w14:val="standardContextual"/>
             </w:rPr>
           </w:pPr>
-          <w:hyperlink w:anchor="_Toc241660847" w:history="1">
+          <w:hyperlink w:anchor="_Toc241663710" w:history="1">
             <w:r>
               <w:rPr>
                 <w:rStyle w:val="Hyperlink"/>
@@ -2379,7 +2379,7 @@
                 <w:noProof/>
                 <w:webHidden/>
               </w:rPr>
-              <w:instrText xml:space="preserve"> PAGEREF _Toc241660847 \h </w:instrText>
+              <w:instrText xml:space="preserve"> PAGEREF _Toc241663710 \h </w:instrText>
             </w:r>
             <w:r>
               <w:rPr>
@@ -2427,7 +2427,7 @@
               <w14:ligatures w14:val="standardContextual"/>
             </w:rPr>
           </w:pPr>
-          <w:hyperlink w:anchor="_Toc241660848" w:history="1">
+          <w:hyperlink w:anchor="_Toc241663711" w:history="1">
             <w:r>
               <w:rPr>
                 <w:rStyle w:val="Hyperlink"/>
@@ -2473,7 +2473,7 @@
                 <w:noProof/>
                 <w:webHidden/>
               </w:rPr>
-              <w:instrText xml:space="preserve"> PAGEREF _Toc241660848 \h </w:instrText>
+              <w:instrText xml:space="preserve"> PAGEREF _Toc241663711 \h </w:instrText>
             </w:r>
             <w:r>
               <w:rPr>
@@ -2521,7 +2521,7 @@
               <w14:ligatures w14:val="standardContextual"/>
             </w:rPr>
           </w:pPr>
-          <w:hyperlink w:anchor="_Toc241660849" w:history="1">
+          <w:hyperlink w:anchor="_Toc241663712" w:history="1">
             <w:r>
               <w:rPr>
                 <w:rStyle w:val="Hyperlink"/>
@@ -2567,7 +2567,7 @@
                 <w:noProof/>
                 <w:webHidden/>
               </w:rPr>
-              <w:instrText xml:space="preserve"> PAGEREF _Toc241660849 \h </w:instrText>
+              <w:instrText xml:space="preserve"> PAGEREF _Toc241663712 \h </w:instrText>
             </w:r>
             <w:r>
               <w:rPr>
@@ -2615,7 +2615,7 @@
               <w14:ligatures w14:val="standardContextual"/>
             </w:rPr>
           </w:pPr>
-          <w:hyperlink w:anchor="_Toc241660850" w:history="1">
+          <w:hyperlink w:anchor="_Toc241663713" w:history="1">
             <w:r>
               <w:rPr>
                 <w:rStyle w:val="Hyperlink"/>
@@ -2661,7 +2661,7 @@
                 <w:noProof/>
                 <w:webHidden/>
               </w:rPr>
-              <w:instrText xml:space="preserve"> PAGEREF _Toc241660850 \h </w:instrText>
+              <w:instrText xml:space="preserve"> PAGEREF _Toc241663713 \h </w:instrText>
             </w:r>
             <w:r>
               <w:rPr>
@@ -2709,7 +2709,7 @@
               <w14:ligatures w14:val="standardContextual"/>
             </w:rPr>
           </w:pPr>
-          <w:hyperlink w:anchor="_Toc241660851" w:history="1">
+          <w:hyperlink w:anchor="_Toc241663714" w:history="1">
             <w:r>
               <w:rPr>
                 <w:rStyle w:val="Hyperlink"/>
@@ -2755,7 +2755,7 @@
                 <w:noProof/>
                 <w:webHidden/>
               </w:rPr>
-              <w:instrText xml:space="preserve"> PAGEREF _Toc241660851 \h </w:instrText>
+              <w:instrText xml:space="preserve"> PAGEREF _Toc241663714 \h </w:instrText>
             </w:r>
             <w:r>
               <w:rPr>
@@ -2803,7 +2803,7 @@
               <w14:ligatures w14:val="standardContextual"/>
             </w:rPr>
           </w:pPr>
-          <w:hyperlink w:anchor="_Toc241660852" w:history="1">
+          <w:hyperlink w:anchor="_Toc241663715" w:history="1">
             <w:r>
               <w:rPr>
                 <w:rStyle w:val="Hyperlink"/>
@@ -2849,7 +2849,7 @@
                 <w:noProof/>
                 <w:webHidden/>
               </w:rPr>
-              <w:instrText xml:space="preserve"> PAGEREF _Toc241660852 \h </w:instrText>
+              <w:instrText xml:space="preserve"> PAGEREF _Toc241663715 \h </w:instrText>
             </w:r>
             <w:r>
               <w:rPr>
@@ -2897,7 +2897,7 @@
               <w14:ligatures w14:val="standardContextual"/>
             </w:rPr>
           </w:pPr>
-          <w:hyperlink w:anchor="_Toc241660853" w:history="1">
+          <w:hyperlink w:anchor="_Toc241663716" w:history="1">
             <w:r>
               <w:rPr>
                 <w:rStyle w:val="Hyperlink"/>
@@ -2943,7 +2943,7 @@
                 <w:noProof/>
                 <w:webHidden/>
               </w:rPr>
-              <w:instrText xml:space="preserve"> PAGEREF _Toc241660853 \h </w:instrText>
+              <w:instrText xml:space="preserve"> PAGEREF _Toc241663716 \h </w:instrText>
             </w:r>
             <w:r>
               <w:rPr>
@@ -2991,7 +2991,7 @@
               <w14:ligatures w14:val="standardContextual"/>
             </w:rPr>
           </w:pPr>
-          <w:hyperlink w:anchor="_Toc241660854" w:history="1">
+          <w:hyperlink w:anchor="_Toc241663717" w:history="1">
             <w:r>
               <w:rPr>
                 <w:rStyle w:val="Hyperlink"/>
@@ -3037,7 +3037,7 @@
                 <w:noProof/>
                 <w:webHidden/>
               </w:rPr>
-              <w:instrText xml:space="preserve"> PAGEREF _Toc241660854 \h </w:instrText>
+              <w:instrText xml:space="preserve"> PAGEREF _Toc241663717 \h </w:instrText>
             </w:r>
             <w:r>
               <w:rPr>
@@ -3085,7 +3085,7 @@
               <w14:ligatures w14:val="standardContextual"/>
             </w:rPr>
           </w:pPr>
-          <w:hyperlink w:anchor="_Toc241660855" w:history="1">
+          <w:hyperlink w:anchor="_Toc241663718" w:history="1">
             <w:r>
               <w:rPr>
                 <w:rStyle w:val="Hyperlink"/>
@@ -3131,7 +3131,7 @@
                 <w:noProof/>
                 <w:webHidden/>
               </w:rPr>
-              <w:instrText xml:space="preserve"> PAGEREF _Toc241660855 \h </w:instrText>
+              <w:instrText xml:space="preserve"> PAGEREF _Toc241663718 \h </w:instrText>
             </w:r>
             <w:r>
               <w:rPr>
@@ -3179,7 +3179,7 @@
               <w14:ligatures w14:val="standardContextual"/>
             </w:rPr>
           </w:pPr>
-          <w:hyperlink w:anchor="_Toc241660856" w:history="1">
+          <w:hyperlink w:anchor="_Toc241663719" w:history="1">
             <w:r>
               <w:rPr>
                 <w:rStyle w:val="Hyperlink"/>
@@ -3225,7 +3225,7 @@
                 <w:noProof/>
                 <w:webHidden/>
               </w:rPr>
-              <w:instrText xml:space="preserve"> PAGEREF _Toc241660856 \h </w:instrText>
+              <w:instrText xml:space="preserve"> PAGEREF _Toc241663719 \h </w:instrText>
             </w:r>
             <w:r>
               <w:rPr>
@@ -3273,7 +3273,7 @@
               <w14:ligatures w14:val="standardContextual"/>
             </w:rPr>
           </w:pPr>
-          <w:hyperlink w:anchor="_Toc241660857" w:history="1">
+          <w:hyperlink w:anchor="_Toc241663720" w:history="1">
             <w:r>
               <w:rPr>
                 <w:rStyle w:val="Hyperlink"/>
@@ -3319,7 +3319,7 @@
                 <w:noProof/>
                 <w:webHidden/>
               </w:rPr>
-              <w:instrText xml:space="preserve"> PAGEREF _Toc241660857 \h </w:instrText>
+              <w:instrText xml:space="preserve"> PAGEREF _Toc241663720 \h </w:instrText>
             </w:r>
             <w:r>
               <w:rPr>
@@ -3367,7 +3367,7 @@
               <w14:ligatures w14:val="standardContextual"/>
             </w:rPr>
           </w:pPr>
-          <w:hyperlink w:anchor="_Toc241660858" w:history="1">
+          <w:hyperlink w:anchor="_Toc241663721" w:history="1">
             <w:r>
               <w:rPr>
                 <w:rStyle w:val="Hyperlink"/>
@@ -3413,7 +3413,7 @@
                 <w:noProof/>
                 <w:webHidden/>
               </w:rPr>
-              <w:instrText xml:space="preserve"> PAGEREF _Toc241660858 \h </w:instrText>
+              <w:instrText xml:space="preserve"> PAGEREF _Toc241663721 \h </w:instrText>
             </w:r>
             <w:r>
               <w:rPr>
@@ -3461,7 +3461,7 @@
               <w14:ligatures w14:val="standardContextual"/>
             </w:rPr>
           </w:pPr>
-          <w:hyperlink w:anchor="_Toc241660859" w:history="1">
+          <w:hyperlink w:anchor="_Toc241663722" w:history="1">
             <w:r>
               <w:rPr>
                 <w:rStyle w:val="Hyperlink"/>
@@ -3507,7 +3507,7 @@
                 <w:noProof/>
                 <w:webHidden/>
               </w:rPr>
-              <w:instrText xml:space="preserve"> PAGEREF _Toc241660859 \h </w:instrText>
+              <w:instrText xml:space="preserve"> PAGEREF _Toc241663722 \h </w:instrText>
             </w:r>
             <w:r>
               <w:rPr>
@@ -3555,7 +3555,7 @@
               <w14:ligatures w14:val="standardContextual"/>
             </w:rPr>
           </w:pPr>
-          <w:hyperlink w:anchor="_Toc241660860" w:history="1">
+          <w:hyperlink w:anchor="_Toc241663723" w:history="1">
             <w:r>
               <w:rPr>
                 <w:rStyle w:val="Hyperlink"/>
@@ -3601,7 +3601,7 @@
                 <w:noProof/>
                 <w:webHidden/>
               </w:rPr>
-              <w:instrText xml:space="preserve"> PAGEREF _Toc241660860 \h </w:instrText>
+              <w:instrText xml:space="preserve"> PAGEREF _Toc241663723 \h </w:instrText>
             </w:r>
             <w:r>
               <w:rPr>
@@ -3649,7 +3649,7 @@
               <w14:ligatures w14:val="standardContextual"/>
             </w:rPr>
           </w:pPr>
-          <w:hyperlink w:anchor="_Toc241660861" w:history="1">
+          <w:hyperlink w:anchor="_Toc241663724" w:history="1">
             <w:r>
               <w:rPr>
                 <w:rStyle w:val="Hyperlink"/>
@@ -3695,7 +3695,7 @@
                 <w:noProof/>
                 <w:webHidden/>
               </w:rPr>
-              <w:instrText xml:space="preserve"> PAGEREF _Toc241660861 \h </w:instrText>
+              <w:instrText xml:space="preserve"> PAGEREF _Toc241663724 \h </w:instrText>
             </w:r>
             <w:r>
               <w:rPr>
@@ -3743,7 +3743,7 @@
               <w14:ligatures w14:val="standardContextual"/>
             </w:rPr>
           </w:pPr>
-          <w:hyperlink w:anchor="_Toc241660862" w:history="1">
+          <w:hyperlink w:anchor="_Toc241663725" w:history="1">
             <w:r>
               <w:rPr>
                 <w:rStyle w:val="Hyperlink"/>
@@ -3789,7 +3789,7 @@
                 <w:noProof/>
                 <w:webHidden/>
               </w:rPr>
-              <w:instrText xml:space="preserve"> PAGEREF _Toc241660862 \h </w:instrText>
+              <w:instrText xml:space="preserve"> PAGEREF _Toc241663725 \h </w:instrText>
             </w:r>
             <w:r>
               <w:rPr>
@@ -3837,7 +3837,7 @@
               <w14:ligatures w14:val="standardContextual"/>
             </w:rPr>
           </w:pPr>
-          <w:hyperlink w:anchor="_Toc241660863" w:history="1">
+          <w:hyperlink w:anchor="_Toc241663726" w:history="1">
             <w:r>
               <w:rPr>
                 <w:rStyle w:val="Hyperlink"/>
@@ -3883,7 +3883,7 @@
                 <w:noProof/>
                 <w:webHidden/>
               </w:rPr>
-              <w:instrText xml:space="preserve"> PAGEREF _Toc241660863 \h </w:instrText>
+              <w:instrText xml:space="preserve"> PAGEREF _Toc241663726 \h </w:instrText>
             </w:r>
             <w:r>
               <w:rPr>
@@ -3931,7 +3931,7 @@
               <w14:ligatures w14:val="standardContextual"/>
             </w:rPr>
           </w:pPr>
-          <w:hyperlink w:anchor="_Toc241660864" w:history="1">
+          <w:hyperlink w:anchor="_Toc241663727" w:history="1">
             <w:r>
               <w:rPr>
                 <w:rStyle w:val="Hyperlink"/>
@@ -3977,7 +3977,7 @@
                 <w:noProof/>
                 <w:webHidden/>
               </w:rPr>
-              <w:instrText xml:space="preserve"> PAGEREF _Toc241660864 \h </w:instrText>
+              <w:instrText xml:space="preserve"> PAGEREF _Toc241663727 \h </w:instrText>
             </w:r>
             <w:r>
               <w:rPr>
@@ -4025,7 +4025,7 @@
               <w14:ligatures w14:val="standardContextual"/>
             </w:rPr>
           </w:pPr>
-          <w:hyperlink w:anchor="_Toc241660865" w:history="1">
+          <w:hyperlink w:anchor="_Toc241663728" w:history="1">
             <w:r>
               <w:rPr>
                 <w:rStyle w:val="Hyperlink"/>
@@ -4071,7 +4071,7 @@
                 <w:noProof/>
                 <w:webHidden/>
               </w:rPr>
-              <w:instrText xml:space="preserve"> PAGEREF _Toc241660865 \h </w:instrText>
+              <w:instrText xml:space="preserve"> PAGEREF _Toc241663728 \h </w:instrText>
             </w:r>
             <w:r>
               <w:rPr>
@@ -4119,7 +4119,7 @@
               <w14:ligatures w14:val="standardContextual"/>
             </w:rPr>
           </w:pPr>
-          <w:hyperlink w:anchor="_Toc241660866" w:history="1">
+          <w:hyperlink w:anchor="_Toc241663729" w:history="1">
             <w:r>
               <w:rPr>
                 <w:rStyle w:val="Hyperlink"/>
@@ -4165,7 +4165,7 @@
                 <w:noProof/>
                 <w:webHidden/>
               </w:rPr>
-              <w:instrText xml:space="preserve"> PAGEREF _Toc241660866 \h </w:instrText>
+              <w:instrText xml:space="preserve"> PAGEREF _Toc241663729 \h </w:instrText>
             </w:r>
             <w:r>
               <w:rPr>
@@ -4213,7 +4213,7 @@
               <w14:ligatures w14:val="standardContextual"/>
             </w:rPr>
           </w:pPr>
-          <w:hyperlink w:anchor="_Toc241660867" w:history="1">
+          <w:hyperlink w:anchor="_Toc241663730" w:history="1">
             <w:r>
               <w:rPr>
                 <w:rStyle w:val="Hyperlink"/>
@@ -4259,7 +4259,7 @@
                 <w:noProof/>
                 <w:webHidden/>
               </w:rPr>
-              <w:instrText xml:space="preserve"> PAGEREF _Toc241660867 \h </w:instrText>
+              <w:instrText xml:space="preserve"> PAGEREF _Toc241663730 \h </w:instrText>
             </w:r>
             <w:r>
               <w:rPr>
@@ -4307,7 +4307,7 @@
               <w14:ligatures w14:val="standardContextual"/>
             </w:rPr>
           </w:pPr>
-          <w:hyperlink w:anchor="_Toc241660868" w:history="1">
+          <w:hyperlink w:anchor="_Toc241663731" w:history="1">
             <w:r>
               <w:rPr>
                 <w:rStyle w:val="Hyperlink"/>
@@ -4353,7 +4353,7 @@
                 <w:noProof/>
                 <w:webHidden/>
               </w:rPr>
-              <w:instrText xml:space="preserve"> PAGEREF _Toc241660868 \h </w:instrText>
+              <w:instrText xml:space="preserve"> PAGEREF _Toc241663731 \h </w:instrText>
             </w:r>
             <w:r>
               <w:rPr>
@@ -4401,7 +4401,7 @@
               <w14:ligatures w14:val="standardContextual"/>
             </w:rPr>
           </w:pPr>
-          <w:hyperlink w:anchor="_Toc241660869" w:history="1">
+          <w:hyperlink w:anchor="_Toc241663732" w:history="1">
             <w:r>
               <w:rPr>
                 <w:rStyle w:val="Hyperlink"/>
@@ -4447,7 +4447,7 @@
                 <w:noProof/>
                 <w:webHidden/>
               </w:rPr>
-              <w:instrText xml:space="preserve"> PAGEREF _Toc241660869 \h </w:instrText>
+              <w:instrText xml:space="preserve"> PAGEREF _Toc241663732 \h </w:instrText>
             </w:r>
             <w:r>
               <w:rPr>
@@ -4495,7 +4495,7 @@
               <w14:ligatures w14:val="standardContextual"/>
             </w:rPr>
           </w:pPr>
-          <w:hyperlink w:anchor="_Toc241660870" w:history="1">
+          <w:hyperlink w:anchor="_Toc241663733" w:history="1">
             <w:r>
               <w:rPr>
                 <w:rStyle w:val="Hyperlink"/>
@@ -4541,7 +4541,7 @@
                 <w:noProof/>
                 <w:webHidden/>
               </w:rPr>
-              <w:instrText xml:space="preserve"> PAGEREF _Toc241660870 \h </w:instrText>
+              <w:instrText xml:space="preserve"> PAGEREF _Toc241663733 \h </w:instrText>
             </w:r>
             <w:r>
               <w:rPr>
@@ -4589,7 +4589,7 @@
               <w14:ligatures w14:val="standardContextual"/>
             </w:rPr>
           </w:pPr>
-          <w:hyperlink w:anchor="_Toc241660871" w:history="1">
+          <w:hyperlink w:anchor="_Toc241663734" w:history="1">
             <w:r>
               <w:rPr>
                 <w:rStyle w:val="Hyperlink"/>
@@ -4635,7 +4635,7 @@
                 <w:noProof/>
                 <w:webHidden/>
               </w:rPr>
-              <w:instrText xml:space="preserve"> PAGEREF _Toc241660871 \h </w:instrText>
+              <w:instrText xml:space="preserve"> PAGEREF _Toc241663734 \h </w:instrText>
             </w:r>
             <w:r>
               <w:rPr>
@@ -4683,7 +4683,7 @@
               <w14:ligatures w14:val="standardContextual"/>
             </w:rPr>
           </w:pPr>
-          <w:hyperlink w:anchor="_Toc241660872" w:history="1">
+          <w:hyperlink w:anchor="_Toc241663735" w:history="1">
             <w:r>
               <w:rPr>
                 <w:rStyle w:val="Hyperlink"/>
@@ -4729,7 +4729,7 @@
                 <w:noProof/>
                 <w:webHidden/>
               </w:rPr>
-              <w:instrText xml:space="preserve"> PAGEREF _Toc241660872 \h </w:instrText>
+              <w:instrText xml:space="preserve"> PAGEREF _Toc241663735 \h </w:instrText>
             </w:r>
             <w:r>
               <w:rPr>
@@ -4777,7 +4777,7 @@
               <w14:ligatures w14:val="standardContextual"/>
             </w:rPr>
           </w:pPr>
-          <w:hyperlink w:anchor="_Toc241660873" w:history="1">
+          <w:hyperlink w:anchor="_Toc241663736" w:history="1">
             <w:r>
               <w:rPr>
                 <w:rStyle w:val="Hyperlink"/>
@@ -4823,7 +4823,7 @@
                 <w:noProof/>
                 <w:webHidden/>
               </w:rPr>
-              <w:instrText xml:space="preserve"> PAGEREF _Toc241660873 \h </w:instrText>
+              <w:instrText xml:space="preserve"> PAGEREF _Toc241663736 \h </w:instrText>
             </w:r>
             <w:r>
               <w:rPr>
@@ -4871,7 +4871,7 @@
               <w14:ligatures w14:val="standardContextual"/>
             </w:rPr>
           </w:pPr>
-          <w:hyperlink w:anchor="_Toc241660874" w:history="1">
+          <w:hyperlink w:anchor="_Toc241663737" w:history="1">
             <w:r>
               <w:rPr>
                 <w:rStyle w:val="Hyperlink"/>
@@ -4917,7 +4917,7 @@
                 <w:noProof/>
                 <w:webHidden/>
               </w:rPr>
-              <w:instrText xml:space="preserve"> PAGEREF _Toc241660874 \h </w:instrText>
+              <w:instrText xml:space="preserve"> PAGEREF _Toc241663737 \h </w:instrText>
             </w:r>
             <w:r>
               <w:rPr>
@@ -4965,7 +4965,7 @@
               <w14:ligatures w14:val="standardContextual"/>
             </w:rPr>
           </w:pPr>
-          <w:hyperlink w:anchor="_Toc241660875" w:history="1">
+          <w:hyperlink w:anchor="_Toc241663738" w:history="1">
             <w:r>
               <w:rPr>
                 <w:rStyle w:val="Hyperlink"/>
@@ -5011,7 +5011,7 @@
                 <w:noProof/>
                 <w:webHidden/>
               </w:rPr>
-              <w:instrText xml:space="preserve"> PAGEREF _Toc241660875 \h </w:instrText>
+              <w:instrText xml:space="preserve"> PAGEREF _Toc241663738 \h </w:instrText>
             </w:r>
             <w:r>
               <w:rPr>
@@ -5059,7 +5059,7 @@
               <w14:ligatures w14:val="standardContextual"/>
             </w:rPr>
           </w:pPr>
-          <w:hyperlink w:anchor="_Toc241660876" w:history="1">
+          <w:hyperlink w:anchor="_Toc241663739" w:history="1">
             <w:r>
               <w:rPr>
                 <w:rStyle w:val="Hyperlink"/>
@@ -5105,7 +5105,7 @@
                 <w:noProof/>
                 <w:webHidden/>
               </w:rPr>
-              <w:instrText xml:space="preserve"> PAGEREF _Toc241660876 \h </w:instrText>
+              <w:instrText xml:space="preserve"> PAGEREF _Toc241663739 \h </w:instrText>
             </w:r>
             <w:r>
               <w:rPr>
@@ -5153,7 +5153,7 @@
               <w14:ligatures w14:val="standardContextual"/>
             </w:rPr>
           </w:pPr>
-          <w:hyperlink w:anchor="_Toc241660877" w:history="1">
+          <w:hyperlink w:anchor="_Toc241663740" w:history="1">
             <w:r>
               <w:rPr>
                 <w:rStyle w:val="Hyperlink"/>
@@ -5199,7 +5199,7 @@
                 <w:noProof/>
                 <w:webHidden/>
               </w:rPr>
-              <w:instrText xml:space="preserve"> PAGEREF _Toc241660877 \h </w:instrText>
+              <w:instrText xml:space="preserve"> PAGEREF _Toc241663740 \h </w:instrText>
             </w:r>
             <w:r>
               <w:rPr>
@@ -5247,7 +5247,7 @@
               <w14:ligatures w14:val="standardContextual"/>
             </w:rPr>
           </w:pPr>
-          <w:hyperlink w:anchor="_Toc241660878" w:history="1">
+          <w:hyperlink w:anchor="_Toc241663741" w:history="1">
             <w:r>
               <w:rPr>
                 <w:rStyle w:val="Hyperlink"/>
@@ -5293,7 +5293,7 @@
                 <w:noProof/>
                 <w:webHidden/>
               </w:rPr>
-              <w:instrText xml:space="preserve"> PAGEREF _Toc241660878 \h </w:instrText>
+              <w:instrText xml:space="preserve"> PAGEREF _Toc241663741 \h </w:instrText>
             </w:r>
             <w:r>
               <w:rPr>
@@ -5341,7 +5341,7 @@
               <w14:ligatures w14:val="standardContextual"/>
             </w:rPr>
           </w:pPr>
-          <w:hyperlink w:anchor="_Toc241660879" w:history="1">
+          <w:hyperlink w:anchor="_Toc241663742" w:history="1">
             <w:r>
               <w:rPr>
                 <w:rStyle w:val="Hyperlink"/>
@@ -5387,7 +5387,7 @@
                 <w:noProof/>
                 <w:webHidden/>
               </w:rPr>
-              <w:instrText xml:space="preserve"> PAGEREF _Toc241660879 \h </w:instrText>
+              <w:instrText xml:space="preserve"> PAGEREF _Toc241663742 \h </w:instrText>
             </w:r>
             <w:r>
               <w:rPr>
@@ -5435,7 +5435,7 @@
               <w14:ligatures w14:val="standardContextual"/>
             </w:rPr>
           </w:pPr>
-          <w:hyperlink w:anchor="_Toc241660880" w:history="1">
+          <w:hyperlink w:anchor="_Toc241663743" w:history="1">
             <w:r>
               <w:rPr>
                 <w:rStyle w:val="Hyperlink"/>
@@ -5481,7 +5481,7 @@
                 <w:noProof/>
                 <w:webHidden/>
               </w:rPr>
-              <w:instrText xml:space="preserve"> PAGEREF _Toc241660880 \h </w:instrText>
+              <w:instrText xml:space="preserve"> PAGEREF _Toc241663743 \h </w:instrText>
             </w:r>
             <w:r>
               <w:rPr>
@@ -5529,7 +5529,7 @@
               <w14:ligatures w14:val="standardContextual"/>
             </w:rPr>
           </w:pPr>
-          <w:hyperlink w:anchor="_Toc241660881" w:history="1">
+          <w:hyperlink w:anchor="_Toc241663744" w:history="1">
             <w:r>
               <w:rPr>
                 <w:rStyle w:val="Hyperlink"/>
@@ -5575,7 +5575,7 @@
                 <w:noProof/>
                 <w:webHidden/>
               </w:rPr>
-              <w:instrText xml:space="preserve"> PAGEREF _Toc241660881 \h </w:instrText>
+              <w:instrText xml:space="preserve"> PAGEREF _Toc241663744 \h </w:instrText>
             </w:r>
             <w:r>
               <w:rPr>
@@ -5623,7 +5623,7 @@
               <w14:ligatures w14:val="standardContextual"/>
             </w:rPr>
           </w:pPr>
-          <w:hyperlink w:anchor="_Toc241660882" w:history="1">
+          <w:hyperlink w:anchor="_Toc241663745" w:history="1">
             <w:r>
               <w:rPr>
                 <w:rStyle w:val="Hyperlink"/>
@@ -5669,7 +5669,7 @@
                 <w:noProof/>
                 <w:webHidden/>
               </w:rPr>
-              <w:instrText xml:space="preserve"> PAGEREF _Toc241660882 \h </w:instrText>
+              <w:instrText xml:space="preserve"> PAGEREF _Toc241663745 \h </w:instrText>
             </w:r>
             <w:r>
               <w:rPr>
@@ -5717,7 +5717,7 @@
               <w14:ligatures w14:val="standardContextual"/>
             </w:rPr>
           </w:pPr>
-          <w:hyperlink w:anchor="_Toc241660883" w:history="1">
+          <w:hyperlink w:anchor="_Toc241663746" w:history="1">
             <w:r>
               <w:rPr>
                 <w:rStyle w:val="Hyperlink"/>
@@ -5763,7 +5763,7 @@
                 <w:noProof/>
                 <w:webHidden/>
               </w:rPr>
-              <w:instrText xml:space="preserve"> PAGEREF _Toc241660883 \h </w:instrText>
+              <w:instrText xml:space="preserve"> PAGEREF _Toc241663746 \h </w:instrText>
             </w:r>
             <w:r>
               <w:rPr>
@@ -5811,7 +5811,7 @@
               <w14:ligatures w14:val="standardContextual"/>
             </w:rPr>
           </w:pPr>
-          <w:hyperlink w:anchor="_Toc241660884" w:history="1">
+          <w:hyperlink w:anchor="_Toc241663747" w:history="1">
             <w:r>
               <w:rPr>
                 <w:rStyle w:val="Hyperlink"/>
@@ -5857,7 +5857,7 @@
                 <w:noProof/>
                 <w:webHidden/>
               </w:rPr>
-              <w:instrText xml:space="preserve"> PAGEREF _Toc241660884 \h </w:instrText>
+              <w:instrText xml:space="preserve"> PAGEREF _Toc241663747 \h </w:instrText>
             </w:r>
             <w:r>
               <w:rPr>
@@ -5905,7 +5905,7 @@
               <w14:ligatures w14:val="standardContextual"/>
             </w:rPr>
           </w:pPr>
-          <w:hyperlink w:anchor="_Toc241660885" w:history="1">
+          <w:hyperlink w:anchor="_Toc241663748" w:history="1">
             <w:r>
               <w:rPr>
                 <w:rStyle w:val="Hyperlink"/>
@@ -5951,7 +5951,7 @@
                 <w:noProof/>
                 <w:webHidden/>
               </w:rPr>
-              <w:instrText xml:space="preserve"> PAGEREF _Toc241660885 \h </w:instrText>
+              <w:instrText xml:space="preserve"> PAGEREF _Toc241663748 \h </w:instrText>
             </w:r>
             <w:r>
               <w:rPr>
@@ -5999,7 +5999,7 @@
               <w14:ligatures w14:val="standardContextual"/>
             </w:rPr>
           </w:pPr>
-          <w:hyperlink w:anchor="_Toc241660886" w:history="1">
+          <w:hyperlink w:anchor="_Toc241663749" w:history="1">
             <w:r>
               <w:rPr>
                 <w:rStyle w:val="Hyperlink"/>
@@ -6045,7 +6045,7 @@
                 <w:noProof/>
                 <w:webHidden/>
               </w:rPr>
-              <w:instrText xml:space="preserve"> PAGEREF _Toc241660886 \h </w:instrText>
+              <w:instrText xml:space="preserve"> PAGEREF _Toc241663749 \h </w:instrText>
             </w:r>
             <w:r>
               <w:rPr>
@@ -6093,7 +6093,7 @@
               <w14:ligatures w14:val="standardContextual"/>
             </w:rPr>
           </w:pPr>
-          <w:hyperlink w:anchor="_Toc241660887" w:history="1">
+          <w:hyperlink w:anchor="_Toc241663750" w:history="1">
             <w:r>
               <w:rPr>
                 <w:rStyle w:val="Hyperlink"/>
@@ -6139,7 +6139,7 @@
                 <w:noProof/>
                 <w:webHidden/>
               </w:rPr>
-              <w:instrText xml:space="preserve"> PAGEREF _Toc241660887 \h </w:instrText>
+              <w:instrText xml:space="preserve"> PAGEREF _Toc241663750 \h </w:instrText>
             </w:r>
             <w:r>
               <w:rPr>
@@ -6187,7 +6187,7 @@
               <w14:ligatures w14:val="standardContextual"/>
             </w:rPr>
           </w:pPr>
-          <w:hyperlink w:anchor="_Toc241660888" w:history="1">
+          <w:hyperlink w:anchor="_Toc241663751" w:history="1">
             <w:r>
               <w:rPr>
                 <w:rStyle w:val="Hyperlink"/>
@@ -6233,7 +6233,7 @@
                 <w:noProof/>
                 <w:webHidden/>
               </w:rPr>
-              <w:instrText xml:space="preserve"> PAGEREF _Toc241660888 \h </w:instrText>
+              <w:instrText xml:space="preserve"> PAGEREF _Toc241663751 \h </w:instrText>
             </w:r>
             <w:r>
               <w:rPr>
@@ -6281,7 +6281,7 @@
               <w14:ligatures w14:val="standardContextual"/>
             </w:rPr>
           </w:pPr>
-          <w:hyperlink w:anchor="_Toc241660889" w:history="1">
+          <w:hyperlink w:anchor="_Toc241663752" w:history="1">
             <w:r>
               <w:rPr>
                 <w:rStyle w:val="Hyperlink"/>
@@ -6327,7 +6327,7 @@
                 <w:noProof/>
                 <w:webHidden/>
               </w:rPr>
-              <w:instrText xml:space="preserve"> PAGEREF _Toc241660889 \h </w:instrText>
+              <w:instrText xml:space="preserve"> PAGEREF _Toc241663752 \h </w:instrText>
             </w:r>
             <w:r>
               <w:rPr>
@@ -6375,7 +6375,7 @@
               <w14:ligatures w14:val="standardContextual"/>
             </w:rPr>
           </w:pPr>
-          <w:hyperlink w:anchor="_Toc241660890" w:history="1">
+          <w:hyperlink w:anchor="_Toc241663753" w:history="1">
             <w:r>
               <w:rPr>
                 <w:rStyle w:val="Hyperlink"/>
@@ -6421,7 +6421,7 @@
                 <w:noProof/>
                 <w:webHidden/>
               </w:rPr>
-              <w:instrText xml:space="preserve"> PAGEREF _Toc241660890 \h </w:instrText>
+              <w:instrText xml:space="preserve"> PAGEREF _Toc241663753 \h </w:instrText>
             </w:r>
             <w:r>
               <w:rPr>
@@ -6469,7 +6469,7 @@
               <w14:ligatures w14:val="standardContextual"/>
             </w:rPr>
           </w:pPr>
-          <w:hyperlink w:anchor="_Toc241660891" w:history="1">
+          <w:hyperlink w:anchor="_Toc241663754" w:history="1">
             <w:r>
               <w:rPr>
                 <w:rStyle w:val="Hyperlink"/>
@@ -6515,7 +6515,7 @@
                 <w:noProof/>
                 <w:webHidden/>
               </w:rPr>
-              <w:instrText xml:space="preserve"> PAGEREF _Toc241660891 \h </w:instrText>
+              <w:instrText xml:space="preserve"> PAGEREF _Toc241663754 \h </w:instrText>
             </w:r>
             <w:r>
               <w:rPr>
@@ -6563,7 +6563,7 @@
               <w14:ligatures w14:val="standardContextual"/>
             </w:rPr>
           </w:pPr>
-          <w:hyperlink w:anchor="_Toc241660892" w:history="1">
+          <w:hyperlink w:anchor="_Toc241663755" w:history="1">
             <w:r>
               <w:rPr>
                 <w:rStyle w:val="Hyperlink"/>
@@ -6609,7 +6609,7 @@
                 <w:noProof/>
                 <w:webHidden/>
               </w:rPr>
-              <w:instrText xml:space="preserve"> PAGEREF _Toc241660892 \h </w:instrText>
+              <w:instrText xml:space="preserve"> PAGEREF _Toc241663755 \h </w:instrText>
             </w:r>
             <w:r>
               <w:rPr>
@@ -6657,7 +6657,7 @@
               <w14:ligatures w14:val="standardContextual"/>
             </w:rPr>
           </w:pPr>
-          <w:hyperlink w:anchor="_Toc241660893" w:history="1">
+          <w:hyperlink w:anchor="_Toc241663756" w:history="1">
             <w:r>
               <w:rPr>
                 <w:rStyle w:val="Hyperlink"/>
@@ -6703,7 +6703,7 @@
                 <w:noProof/>
                 <w:webHidden/>
               </w:rPr>
-              <w:instrText xml:space="preserve"> PAGEREF _Toc241660893 \h </w:instrText>
+              <w:instrText xml:space="preserve"> PAGEREF _Toc241663756 \h </w:instrText>
             </w:r>
             <w:r>
               <w:rPr>
@@ -6751,7 +6751,7 @@
               <w14:ligatures w14:val="standardContextual"/>
             </w:rPr>
           </w:pPr>
-          <w:hyperlink w:anchor="_Toc241660894" w:history="1">
+          <w:hyperlink w:anchor="_Toc241663757" w:history="1">
             <w:r>
               <w:rPr>
                 <w:rStyle w:val="Hyperlink"/>
@@ -6797,7 +6797,7 @@
                 <w:noProof/>
                 <w:webHidden/>
               </w:rPr>
-              <w:instrText xml:space="preserve"> PAGEREF _Toc241660894 \h </w:instrText>
+              <w:instrText xml:space="preserve"> PAGEREF _Toc241663757 \h </w:instrText>
             </w:r>
             <w:r>
               <w:rPr>
@@ -6845,7 +6845,7 @@
               <w14:ligatures w14:val="standardContextual"/>
             </w:rPr>
           </w:pPr>
-          <w:hyperlink w:anchor="_Toc241660895" w:history="1">
+          <w:hyperlink w:anchor="_Toc241663758" w:history="1">
             <w:r>
               <w:rPr>
                 <w:rStyle w:val="Hyperlink"/>
@@ -6891,7 +6891,7 @@
                 <w:noProof/>
                 <w:webHidden/>
               </w:rPr>
-              <w:instrText xml:space="preserve"> PAGEREF _Toc241660895 \h </w:instrText>
+              <w:instrText xml:space="preserve"> PAGEREF _Toc241663758 \h </w:instrText>
             </w:r>
             <w:r>
               <w:rPr>
@@ -6939,7 +6939,7 @@
               <w14:ligatures w14:val="standardContextual"/>
             </w:rPr>
           </w:pPr>
-          <w:hyperlink w:anchor="_Toc241660896" w:history="1">
+          <w:hyperlink w:anchor="_Toc241663759" w:history="1">
             <w:r>
               <w:rPr>
                 <w:rStyle w:val="Hyperlink"/>
@@ -6985,7 +6985,7 @@
                 <w:noProof/>
                 <w:webHidden/>
               </w:rPr>
-              <w:instrText xml:space="preserve"> PAGEREF _Toc241660896 \h </w:instrText>
+              <w:instrText xml:space="preserve"> PAGEREF _Toc241663759 \h </w:instrText>
             </w:r>
             <w:r>
               <w:rPr>
@@ -7033,7 +7033,7 @@
               <w14:ligatures w14:val="standardContextual"/>
             </w:rPr>
           </w:pPr>
-          <w:hyperlink w:anchor="_Toc241660897" w:history="1">
+          <w:hyperlink w:anchor="_Toc241663760" w:history="1">
             <w:r>
               <w:rPr>
                 <w:rStyle w:val="Hyperlink"/>
@@ -7079,7 +7079,7 @@
                 <w:noProof/>
                 <w:webHidden/>
               </w:rPr>
-              <w:instrText xml:space="preserve"> PAGEREF _Toc241660897 \h </w:instrText>
+              <w:instrText xml:space="preserve"> PAGEREF _Toc241663760 \h </w:instrText>
             </w:r>
             <w:r>
               <w:rPr>
@@ -7127,7 +7127,7 @@
               <w14:ligatures w14:val="standardContextual"/>
             </w:rPr>
           </w:pPr>
-          <w:hyperlink w:anchor="_Toc241660898" w:history="1">
+          <w:hyperlink w:anchor="_Toc241663761" w:history="1">
             <w:r>
               <w:rPr>
                 <w:rStyle w:val="Hyperlink"/>
@@ -7173,7 +7173,7 @@
                 <w:noProof/>
                 <w:webHidden/>
               </w:rPr>
-              <w:instrText xml:space="preserve"> PAGEREF _Toc241660898 \h </w:instrText>
+              <w:instrText xml:space="preserve"> PAGEREF _Toc241663761 \h </w:instrText>
             </w:r>
             <w:r>
               <w:rPr>
@@ -7221,7 +7221,7 @@
               <w14:ligatures w14:val="standardContextual"/>
             </w:rPr>
           </w:pPr>
-          <w:hyperlink w:anchor="_Toc241660899" w:history="1">
+          <w:hyperlink w:anchor="_Toc241663762" w:history="1">
             <w:r>
               <w:rPr>
                 <w:rStyle w:val="Hyperlink"/>
@@ -7267,7 +7267,7 @@
                 <w:noProof/>
                 <w:webHidden/>
               </w:rPr>
-              <w:instrText xml:space="preserve"> PAGEREF _Toc241660899 \h </w:instrText>
+              <w:instrText xml:space="preserve"> PAGEREF _Toc241663762 \h </w:instrText>
             </w:r>
             <w:r>
               <w:rPr>
@@ -7315,7 +7315,7 @@
               <w14:ligatures w14:val="standardContextual"/>
             </w:rPr>
           </w:pPr>
-          <w:hyperlink w:anchor="_Toc241660900" w:history="1">
+          <w:hyperlink w:anchor="_Toc241663763" w:history="1">
             <w:r>
               <w:rPr>
                 <w:rStyle w:val="Hyperlink"/>
@@ -7361,7 +7361,7 @@
                 <w:noProof/>
                 <w:webHidden/>
               </w:rPr>
-              <w:instrText xml:space="preserve"> PAGEREF _Toc241660900 \h </w:instrText>
+              <w:instrText xml:space="preserve"> PAGEREF _Toc241663763 \h </w:instrText>
             </w:r>
             <w:r>
               <w:rPr>
@@ -7409,7 +7409,7 @@
               <w14:ligatures w14:val="standardContextual"/>
             </w:rPr>
           </w:pPr>
-          <w:hyperlink w:anchor="_Toc241660901" w:history="1">
+          <w:hyperlink w:anchor="_Toc241663764" w:history="1">
             <w:r>
               <w:rPr>
                 <w:rStyle w:val="Hyperlink"/>
@@ -7455,7 +7455,7 @@
                 <w:noProof/>
                 <w:webHidden/>
               </w:rPr>
-              <w:instrText xml:space="preserve"> PAGEREF _Toc241660901 \h </w:instrText>
+              <w:instrText xml:space="preserve"> PAGEREF _Toc241663764 \h </w:instrText>
             </w:r>
             <w:r>
               <w:rPr>
@@ -7503,7 +7503,7 @@
               <w14:ligatures w14:val="standardContextual"/>
             </w:rPr>
           </w:pPr>
-          <w:hyperlink w:anchor="_Toc241660902" w:history="1">
+          <w:hyperlink w:anchor="_Toc241663765" w:history="1">
             <w:r>
               <w:rPr>
                 <w:rStyle w:val="Hyperlink"/>
@@ -7549,7 +7549,7 @@
                 <w:noProof/>
                 <w:webHidden/>
               </w:rPr>
-              <w:instrText xml:space="preserve"> PAGEREF _Toc241660902 \h </w:instrText>
+              <w:instrText xml:space="preserve"> PAGEREF _Toc241663765 \h </w:instrText>
             </w:r>
             <w:r>
               <w:rPr>
@@ -7597,7 +7597,7 @@
               <w14:ligatures w14:val="standardContextual"/>
             </w:rPr>
           </w:pPr>
-          <w:hyperlink w:anchor="_Toc241660903" w:history="1">
+          <w:hyperlink w:anchor="_Toc241663766" w:history="1">
             <w:r>
               <w:rPr>
                 <w:rStyle w:val="Hyperlink"/>
@@ -7643,7 +7643,7 @@
                 <w:noProof/>
                 <w:webHidden/>
               </w:rPr>
-              <w:instrText xml:space="preserve"> PAGEREF _Toc241660903 \h </w:instrText>
+              <w:instrText xml:space="preserve"> PAGEREF _Toc241663766 \h </w:instrText>
             </w:r>
             <w:r>
               <w:rPr>
@@ -7691,7 +7691,7 @@
               <w14:ligatures w14:val="standardContextual"/>
             </w:rPr>
           </w:pPr>
-          <w:hyperlink w:anchor="_Toc241660904" w:history="1">
+          <w:hyperlink w:anchor="_Toc241663767" w:history="1">
             <w:r>
               <w:rPr>
                 <w:rStyle w:val="Hyperlink"/>
@@ -7737,7 +7737,7 @@
                 <w:noProof/>
                 <w:webHidden/>
               </w:rPr>
-              <w:instrText xml:space="preserve"> PAGEREF _Toc241660904 \h </w:instrText>
+              <w:instrText xml:space="preserve"> PAGEREF _Toc241663767 \h </w:instrText>
             </w:r>
             <w:r>
               <w:rPr>
@@ -7785,7 +7785,7 @@
               <w14:ligatures w14:val="standardContextual"/>
             </w:rPr>
           </w:pPr>
-          <w:hyperlink w:anchor="_Toc241660905" w:history="1">
+          <w:hyperlink w:anchor="_Toc241663768" w:history="1">
             <w:r>
               <w:rPr>
                 <w:rStyle w:val="Hyperlink"/>
@@ -7831,7 +7831,7 @@
                 <w:noProof/>
                 <w:webHidden/>
               </w:rPr>
-              <w:instrText xml:space="preserve"> PAGEREF _Toc241660905 \h </w:instrText>
+              <w:instrText xml:space="preserve"> PAGEREF _Toc241663768 \h </w:instrText>
             </w:r>
             <w:r>
               <w:rPr>
@@ -7879,7 +7879,7 @@
               <w14:ligatures w14:val="standardContextual"/>
             </w:rPr>
           </w:pPr>
-          <w:hyperlink w:anchor="_Toc241660906" w:history="1">
+          <w:hyperlink w:anchor="_Toc241663769" w:history="1">
             <w:r>
               <w:rPr>
                 <w:rStyle w:val="Hyperlink"/>
@@ -7925,7 +7925,7 @@
                 <w:noProof/>
                 <w:webHidden/>
               </w:rPr>
-              <w:instrText xml:space="preserve"> PAGEREF _Toc241660906 \h </w:instrText>
+              <w:instrText xml:space="preserve"> PAGEREF _Toc241663769 \h </w:instrText>
             </w:r>
             <w:r>
               <w:rPr>
@@ -7973,7 +7973,7 @@
               <w14:ligatures w14:val="standardContextual"/>
             </w:rPr>
           </w:pPr>
-          <w:hyperlink w:anchor="_Toc241660907" w:history="1">
+          <w:hyperlink w:anchor="_Toc241663770" w:history="1">
             <w:r>
               <w:rPr>
                 <w:rStyle w:val="Hyperlink"/>
@@ -8019,7 +8019,7 @@
                 <w:noProof/>
                 <w:webHidden/>
               </w:rPr>
-              <w:instrText xml:space="preserve"> PAGEREF _Toc241660907 \h </w:instrText>
+              <w:instrText xml:space="preserve"> PAGEREF _Toc241663770 \h </w:instrText>
             </w:r>
             <w:r>
               <w:rPr>
@@ -8067,7 +8067,7 @@
               <w14:ligatures w14:val="standardContextual"/>
             </w:rPr>
           </w:pPr>
-          <w:hyperlink w:anchor="_Toc241660908" w:history="1">
+          <w:hyperlink w:anchor="_Toc241663771" w:history="1">
             <w:r>
               <w:rPr>
                 <w:rStyle w:val="Hyperlink"/>
@@ -8113,7 +8113,7 @@
                 <w:noProof/>
                 <w:webHidden/>
               </w:rPr>
-              <w:instrText xml:space="preserve"> PAGEREF _Toc241660908 \h </w:instrText>
+              <w:instrText xml:space="preserve"> PAGEREF _Toc241663771 \h </w:instrText>
             </w:r>
             <w:r>
               <w:rPr>
@@ -8160,7 +8160,7 @@
               <w14:ligatures w14:val="standardContextual"/>
             </w:rPr>
           </w:pPr>
-          <w:hyperlink w:anchor="_Toc241660909" w:history="1">
+          <w:hyperlink w:anchor="_Toc241663772" w:history="1">
             <w:r>
               <w:rPr>
                 <w:rStyle w:val="Hyperlink"/>
@@ -8187,7 +8187,7 @@
                 <w:noProof/>
                 <w:webHidden/>
               </w:rPr>
-              <w:instrText xml:space="preserve"> PAGEREF _Toc241660909 \h </w:instrText>
+              <w:instrText xml:space="preserve"> PAGEREF _Toc241663772 \h </w:instrText>
             </w:r>
             <w:r>
               <w:rPr>
@@ -8234,7 +8234,7 @@
               <w14:ligatures w14:val="standardContextual"/>
             </w:rPr>
           </w:pPr>
-          <w:hyperlink w:anchor="_Toc241660910" w:history="1">
+          <w:hyperlink w:anchor="_Toc241663773" w:history="1">
             <w:r>
               <w:rPr>
                 <w:rStyle w:val="Hyperlink"/>
@@ -8261,7 +8261,7 @@
                 <w:noProof/>
                 <w:webHidden/>
               </w:rPr>
-              <w:instrText xml:space="preserve"> PAGEREF _Toc241660910 \h </w:instrText>
+              <w:instrText xml:space="preserve"> PAGEREF _Toc241663773 \h </w:instrText>
             </w:r>
             <w:r>
               <w:rPr>
@@ -8304,7 +8304,7 @@
         <w:pStyle w:val="Heading1"/>
       </w:pPr>
       <w:bookmarkStart w:id="0" w:name="start-here"/>
-      <w:bookmarkStart w:id="1" w:name="_Toc241660823"/>
+      <w:bookmarkStart w:id="1" w:name="_Toc241663686"/>
       <w:r>
         <w:rPr>
           <w:rStyle w:val="SectionNumber"/>
@@ -8322,7 +8322,7 @@
         <w:pStyle w:val="Heading2"/>
       </w:pPr>
       <w:bookmarkStart w:id="2" w:name="what-tinygpt-is"/>
-      <w:bookmarkStart w:id="3" w:name="_Toc241660824"/>
+      <w:bookmarkStart w:id="3" w:name="_Toc241663687"/>
       <w:r>
         <w:rPr>
           <w:rStyle w:val="SectionNumber"/>
@@ -8465,7 +8465,7 @@
           <w:noProof/>
         </w:rPr>
         <w:drawing>
-          <wp:inline distT="0" distB="0" distL="0" distR="0" wp14:anchorId="5D059B72" wp14:editId="3B2958C7">
+          <wp:inline distT="0" distB="0" distL="0" distR="0" wp14:anchorId="758E0ABE" wp14:editId="653F2304">
             <wp:extent cx="5939999" cy="4517746"/>
             <wp:effectExtent l="0" t="0" r="0" b="0"/>
             <wp:docPr id="10" name="Picture" descr="The tinyGPT pipeline. a, text sources. b, data preparation turns raw text into clean, deduplicated, English, on-topic token shards, split by document. c, pre-training repeats a four-step loop (forward pass, loss, gradients, update) and evaluates every 200 steps. d, post-training turns the base model into a question answerer. e, tools to inspect, compare, export and use checkpoints."/>
@@ -8577,7 +8577,7 @@
         <w:pStyle w:val="Heading2"/>
       </w:pPr>
       <w:bookmarkStart w:id="4" w:name="the-files"/>
-      <w:bookmarkStart w:id="5" w:name="_Toc241660825"/>
+      <w:bookmarkStart w:id="5" w:name="_Toc241663688"/>
       <w:bookmarkEnd w:id="2"/>
       <w:r>
         <w:rPr>
@@ -9358,7 +9358,7 @@
         <w:pStyle w:val="Heading2"/>
       </w:pPr>
       <w:bookmarkStart w:id="6" w:name="everyday-commands"/>
-      <w:bookmarkStart w:id="7" w:name="_Toc241660826"/>
+      <w:bookmarkStart w:id="7" w:name="_Toc241663689"/>
       <w:bookmarkEnd w:id="4"/>
       <w:r>
         <w:rPr>
@@ -9590,7 +9590,7 @@
         <w:pStyle w:val="Heading2"/>
       </w:pPr>
       <w:bookmarkStart w:id="8" w:name="what-changed-on-29-september-2026"/>
-      <w:bookmarkStart w:id="9" w:name="_Toc241660827"/>
+      <w:bookmarkStart w:id="9" w:name="_Toc241663690"/>
       <w:bookmarkEnd w:id="6"/>
       <w:r>
         <w:rPr>
@@ -9900,7 +9900,7 @@
         <w:pStyle w:val="Heading2"/>
       </w:pPr>
       <w:bookmarkStart w:id="10" w:name="X87477c0b04dc5b0a9bcce666f011b24acd90ac6"/>
-      <w:bookmarkStart w:id="11" w:name="_Toc241660828"/>
+      <w:bookmarkStart w:id="11" w:name="_Toc241663691"/>
       <w:bookmarkEnd w:id="8"/>
       <w:r>
         <w:rPr>
@@ -10214,10 +10214,31 @@
           <w:b/>
           <w:bCs/>
         </w:rPr>
-        <w:t>Security:</w:t>
-      </w:r>
-      <w:r>
-        <w:t xml:space="preserve"> see the note on PyTorch 2.5.1 in Section 13.2.</w:t>
+        <w:t>PyTorch 2.10 and torch.compile (same day):</w:t>
+      </w:r>
+      <w:r>
+        <w:t xml:space="preserve"> PyTorch was upgraded from 2.5.1 to 2.10, which also closes the </w:t>
+      </w:r>
+      <w:r>
+        <w:t xml:space="preserve">checkpoint-loading flaw CVE-2025-32434, and the </w:t>
+      </w:r>
+      <w:r>
+        <w:rPr>
+          <w:rStyle w:val="VerbatimChar"/>
+        </w:rPr>
+        <w:t>triton-windows</w:t>
+      </w:r>
+      <w:r>
+        <w:t xml:space="preserve"> package makes </w:t>
+      </w:r>
+      <w:r>
+        <w:rPr>
+          <w:rStyle w:val="VerbatimChar"/>
+        </w:rPr>
+        <w:t>torch.compile</w:t>
+      </w:r>
+      <w:r>
+        <w:t xml:space="preserve"> work on this laptop: training is about 1.45 times faster (Section 3.1).</w:t>
       </w:r>
     </w:p>
     <w:p>
@@ -10391,7 +10412,10 @@
         <w:t>--time-budget-hours</w:t>
       </w:r>
       <w:r>
-        <w:t xml:space="preserve"> now uses the speed your last training run sustained, not a few seconds on a cool GPU, which had been 1.7 times too optimistic.</w:t>
+        <w:t xml:space="preserve"> </w:t>
+      </w:r>
+      <w:r>
+        <w:t>now uses the speed your last training run sustained, not a few seconds on a cool GPU, which had been 1.7 times too optimistic.</w:t>
       </w:r>
     </w:p>
     <w:p>
@@ -10399,7 +10423,7 @@
         <w:pStyle w:val="Heading1"/>
       </w:pPr>
       <w:bookmarkStart w:id="12" w:name="how-language-models-are-trained"/>
-      <w:bookmarkStart w:id="13" w:name="_Toc241660829"/>
+      <w:bookmarkStart w:id="13" w:name="_Toc241663692"/>
       <w:bookmarkEnd w:id="0"/>
       <w:bookmarkEnd w:id="10"/>
       <w:r>
@@ -10469,7 +10493,7 @@
           <w:noProof/>
         </w:rPr>
         <w:drawing>
-          <wp:inline distT="0" distB="0" distL="0" distR="0" wp14:anchorId="3C3FA781" wp14:editId="7109D833">
+          <wp:inline distT="0" distB="0" distL="0" distR="0" wp14:anchorId="422F445E" wp14:editId="2A5EA3EA">
             <wp:extent cx="5759999" cy="2028169"/>
             <wp:effectExtent l="0" t="0" r="0" b="0"/>
             <wp:docPr id="19" name="Picture" descr="The four training stages. Pre-training costs most of the compute. The later stages decide most of how useful the model is."/>
@@ -10523,10 +10547,7 @@
         <w:t>The four training stages.</w:t>
       </w:r>
       <w:r>
-        <w:t xml:space="preserve"> </w:t>
-      </w:r>
-      <w:r>
-        <w:t>Pre-training costs most of the compute. The later stages decide most of how useful the model is.</w:t>
+        <w:t xml:space="preserve"> Pre-training costs most of the compute. The later stages decide most of how useful the model is.</w:t>
       </w:r>
     </w:p>
     <w:p>
@@ -10534,7 +10555,7 @@
         <w:pStyle w:val="Heading2"/>
       </w:pPr>
       <w:bookmarkStart w:id="14" w:name="tokens-text-becomes-numbers"/>
-      <w:bookmarkStart w:id="15" w:name="_Toc241660830"/>
+      <w:bookmarkStart w:id="15" w:name="_Toc241663693"/>
       <w:r>
         <w:rPr>
           <w:rStyle w:val="SectionNumber"/>
@@ -10755,10 +10776,7 @@
         <w:t>Lines</w:t>
       </w:r>
       <w:r>
-        <w:t xml:space="preserve"> </w:t>
-      </w:r>
-      <w:r>
-        <w:t>are encoded one at a time, with a newline token between them, so Markdown structure is kept.</w:t>
+        <w:t xml:space="preserve"> are encoded one at a time, with a newline token between them, so Markdown structure is kept.</w:t>
       </w:r>
     </w:p>
     <w:p>
@@ -10839,7 +10857,7 @@
         <w:pStyle w:val="Heading2"/>
       </w:pPr>
       <w:bookmarkStart w:id="16" w:name="the-transformer"/>
-      <w:bookmarkStart w:id="17" w:name="_Toc241660831"/>
+      <w:bookmarkStart w:id="17" w:name="_Toc241663694"/>
       <w:bookmarkEnd w:id="14"/>
       <w:r>
         <w:rPr>
@@ -10865,7 +10883,10 @@
         <w:t>Embeddings.</w:t>
       </w:r>
       <w:r>
-        <w:t xml:space="preserve"> Each token ID is replaced by a </w:t>
+        <w:t xml:space="preserve"> </w:t>
+      </w:r>
+      <w:r>
+        <w:t xml:space="preserve">Each token ID is replaced by a </w:t>
       </w:r>
       <w:r>
         <w:rPr>
@@ -10890,10 +10911,7 @@
         <w:t>Layers.</w:t>
       </w:r>
       <w:r>
-        <w:t xml:space="preserve"> </w:t>
-      </w:r>
-      <w:r>
-        <w:t xml:space="preserve">The vectors pass through a stack of identical </w:t>
+        <w:t xml:space="preserve"> The vectors pass through a stack of identical </w:t>
       </w:r>
       <w:r>
         <w:rPr>
@@ -11000,10 +11018,7 @@
         </w:numPr>
       </w:pPr>
       <w:r>
-        <w:t xml:space="preserve">The query is compared with the keys of all earlier tokens by dot products. A softmax turns the scores into </w:t>
-      </w:r>
-      <w:r>
-        <w:t xml:space="preserve">weights that sum to 1, and the token takes the weighted average of those tokens’ values. A token never looks ahead: that’s the </w:t>
+        <w:t xml:space="preserve">The query is compared with the keys of all earlier tokens by dot products. A softmax turns the scores into weights that sum to 1, and the token takes the weighted average of those tokens’ values. A token never looks ahead: that’s the </w:t>
       </w:r>
       <w:r>
         <w:rPr>
@@ -11063,7 +11078,10 @@
         <w:t>residual connection</w:t>
       </w:r>
       <w:r>
-        <w:t>) instead of replacing it. That’s what makes deep stacks trainable.</w:t>
+        <w:t xml:space="preserve">) instead of replacing it. That’s what </w:t>
+      </w:r>
+      <w:r>
+        <w:t>makes deep stacks trainable.</w:t>
       </w:r>
     </w:p>
     <w:p>
@@ -11179,10 +11197,7 @@
         <w:t>experts</w:t>
       </w:r>
       <w:r>
-        <w:t xml:space="preserve">, and a small router picks a few </w:t>
-      </w:r>
-      <w:r>
-        <w:t>of them for each token. That’s why “320B total, 18B active” models exist: memory holds all the parameters, but the speed per token depends only on the active ones.</w:t>
+        <w:t>, and a small router picks a few of them for each token. That’s why “320B total, 18B active” models exist: memory holds all the parameters, but the speed per token depends only on the active ones.</w:t>
       </w:r>
     </w:p>
     <w:p>
@@ -11190,7 +11205,7 @@
         <w:pStyle w:val="Heading2"/>
       </w:pPr>
       <w:bookmarkStart w:id="18" w:name="what-it-learns-predict-the-next-token"/>
-      <w:bookmarkStart w:id="19" w:name="_Toc241660832"/>
+      <w:bookmarkStart w:id="19" w:name="_Toc241663695"/>
       <w:bookmarkEnd w:id="16"/>
       <w:r>
         <w:rPr>
@@ -11219,7 +11234,10 @@
         <w:t>every position</w:t>
       </w:r>
       <w:r>
-        <w:t>, the model predicts the next token from the ones before it. The text is its own answer key, so no human labels are needed.</w:t>
+        <w:t xml:space="preserve">, the </w:t>
+      </w:r>
+      <w:r>
+        <w:t>model predicts the next token from the ones before it. The text is its own answer key, so no human labels are needed.</w:t>
       </w:r>
     </w:p>
     <w:p>
@@ -11250,10 +11268,7 @@
         </m:r>
       </m:oMath>
       <w:r>
-        <w:t xml:space="preserve"> </w:t>
-      </w:r>
-      <w:r>
-        <w:t>of the probability the model gave to the correct token:</w:t>
+        <w:t xml:space="preserve"> of the probability the model gave to the correct token:</w:t>
       </w:r>
     </w:p>
     <w:tbl>
@@ -11501,7 +11516,10 @@
         </m:sSup>
       </m:oMath>
       <w:r>
-        <w:t>, the effective number of tokens the model hesitates between. Your run’s validation loss fell from 9.07 (guessing) to 4.89 after 200 steps, a perplexity of 133. Good large models reach a perplexity of about 5 to 7 on general text.</w:t>
+        <w:t xml:space="preserve">, the effective number of tokens the model hesitates between. Your run’s validation loss fell from </w:t>
+      </w:r>
+      <w:r>
+        <w:t>9.07 (guessing) to 4.89 after 200 steps, a perplexity of 133. Good large models reach a perplexity of about 5 to 7 on general text.</w:t>
       </w:r>
     </w:p>
     <w:p>
@@ -11534,7 +11552,10 @@
         <w:pStyle w:val="FirstParagraph"/>
       </w:pPr>
       <w:r>
-        <w:t>Predicting text well rewards learning grammar, facts and patterns of reasoning, because all of them lower the loss. That’s why next-token prediction produces capable models at scale.</w:t>
+        <w:t xml:space="preserve">Predicting text well rewards learning grammar, facts and patterns of reasoning, because all of them lower the loss. </w:t>
+      </w:r>
+      <w:r>
+        <w:t>That’s why next-token prediction produces capable models at scale.</w:t>
       </w:r>
     </w:p>
     <w:p>
@@ -11542,7 +11563,7 @@
         <w:pStyle w:val="Heading2"/>
       </w:pPr>
       <w:bookmarkStart w:id="20" w:name="how-it-learns-gradient-descent"/>
-      <w:bookmarkStart w:id="21" w:name="_Toc241660833"/>
+      <w:bookmarkStart w:id="21" w:name="_Toc241663696"/>
       <w:bookmarkEnd w:id="18"/>
       <w:r>
         <w:rPr>
@@ -11572,10 +11593,7 @@
         <w:t>Take a batch.</w:t>
       </w:r>
       <w:r>
-        <w:t xml:space="preserve"> </w:t>
-      </w:r>
-      <w:r>
-        <w:t>In your run that’s 128 windows of 512 tokens: 65,536 predictions per step.</w:t>
+        <w:t xml:space="preserve"> In your run that’s 128 windows of 512 tokens: 65,536 predictions per step.</w:t>
       </w:r>
     </w:p>
     <w:p>
@@ -11691,10 +11709,7 @@
         <w:t>AdamW</w:t>
       </w:r>
       <w:r>
-        <w:t xml:space="preserve"> </w:t>
-      </w:r>
-      <w:r>
-        <w:t>keeps running averages of each parameter’s gradient and squared gradient. Every parameter then gets its own step size, a cheap stand-in for second-order methods such as Newton–Raphson in a GLM.</w:t>
+        <w:t xml:space="preserve"> keeps running averages of each parameter’s gradient and squared gradient. Every parameter then gets its own step size, a cheap stand-in for second-order methods such as Newton–Raphson in a GLM.</w:t>
       </w:r>
     </w:p>
     <w:p>
@@ -11809,10 +11824,7 @@
         </m:r>
       </m:oMath>
       <w:r>
-        <w:t xml:space="preserve"> </w:t>
-      </w:r>
-      <w:r>
-        <w:t xml:space="preserve">parameters and </w:t>
+        <w:t xml:space="preserve"> parameters and </w:t>
       </w:r>
       <m:oMath>
         <m:r>
@@ -11989,7 +12001,7 @@
         <w:pStyle w:val="Heading2"/>
       </w:pPr>
       <w:bookmarkStart w:id="22" w:name="how-it-writes-generation"/>
-      <w:bookmarkStart w:id="23" w:name="_Toc241660834"/>
+      <w:bookmarkStart w:id="23" w:name="_Toc241663697"/>
       <w:bookmarkEnd w:id="20"/>
       <w:r>
         <w:rPr>
@@ -12064,7 +12076,10 @@
         <w:t>Temperature</w:t>
       </w:r>
       <w:r>
-        <w:t xml:space="preserve"> divides the logits before the softmax. Low values (0.3) almost always pick the top token; high values (1.2) give variety and more mistakes.</w:t>
+        <w:t xml:space="preserve"> divides the logits before the softmax. Low values (0.3) almost always pick the top token; high </w:t>
+      </w:r>
+      <w:r>
+        <w:t>values (1.2) give variety and more mistakes.</w:t>
       </w:r>
     </w:p>
     <w:p>
@@ -12140,7 +12155,7 @@
         <w:pStyle w:val="Heading2"/>
       </w:pPr>
       <w:bookmarkStart w:id="24" w:name="the-four-training-stages"/>
-      <w:bookmarkStart w:id="25" w:name="_Toc241660835"/>
+      <w:bookmarkStart w:id="25" w:name="_Toc241663698"/>
       <w:bookmarkEnd w:id="22"/>
       <w:r>
         <w:rPr>
@@ -12185,7 +12200,10 @@
         <w:t>Frontier scale:</w:t>
       </w:r>
       <w:r>
-        <w:t xml:space="preserve"> 15 to 40 trillion tokens of web pages, books, code, papers and maths, after heavy deduplication and quality filtering.</w:t>
+        <w:t xml:space="preserve"> </w:t>
+      </w:r>
+      <w:r>
+        <w:t>15 to 40 trillion tokens of web pages, books, code, papers and maths, after heavy deduplication and quality filtering.</w:t>
       </w:r>
     </w:p>
     <w:p>
@@ -12520,7 +12538,10 @@
         <w:t>Cost:</w:t>
       </w:r>
       <w:r>
-        <w:t xml:space="preserve"> under 1% of pre-training compute, yet it turns an autocomplete engine into an assistant, because the knowledge is already there and SFT teaches the format.</w:t>
+        <w:t xml:space="preserve"> </w:t>
+      </w:r>
+      <w:r>
+        <w:t>under 1% of pre-training compute, yet it turns an autocomplete engine into an assistant, because the knowledge is already there and SFT teaches the format.</w:t>
       </w:r>
     </w:p>
     <w:p>
@@ -12676,7 +12697,10 @@
         <w:t>GRPO</w:t>
       </w:r>
       <w:r>
-        <w:t xml:space="preserve"> scores each attempt against the others for the same problem: (reward − group mean) ÷ group sd, a standardised residual.</w:t>
+        <w:t xml:space="preserve"> </w:t>
+      </w:r>
+      <w:r>
+        <w:t>scores each attempt against the others for the same problem: (reward − group mean) ÷ group sd, a standardised residual.</w:t>
       </w:r>
     </w:p>
     <w:p>
@@ -12696,7 +12720,7 @@
         <w:pStyle w:val="Heading2"/>
       </w:pPr>
       <w:bookmarkStart w:id="26" w:name="X7de0b60ad97266c320e3b2fb58a9b5aca304cdc"/>
-      <w:bookmarkStart w:id="27" w:name="_Toc241660836"/>
+      <w:bookmarkStart w:id="27" w:name="_Toc241663699"/>
       <w:bookmarkEnd w:id="24"/>
       <w:r>
         <w:rPr>
@@ -12706,8 +12730,6 @@
       </w:r>
       <w:r>
         <w:tab/>
-      </w:r>
-      <w:r>
         <w:t>Measuring progress, and the overfitting trap</w:t>
       </w:r>
       <w:bookmarkEnd w:id="27"/>
@@ -12813,10 +12835,7 @@
         <w:t>Contamination</w:t>
       </w:r>
       <w:r>
-        <w:t xml:space="preserve"> (benchmark items leaking into training data) inflates </w:t>
-      </w:r>
-      <w:r>
-        <w:t>scores. data_prep.py’s 13-gram audit checks the train/validation split for this.</w:t>
+        <w:t xml:space="preserve"> (benchmark items leaking into training data) inflates scores. data_prep.py’s 13-gram audit checks the train/validation split for this.</w:t>
       </w:r>
     </w:p>
     <w:p>
@@ -12843,7 +12862,7 @@
         <w:pStyle w:val="Heading2"/>
       </w:pPr>
       <w:bookmarkStart w:id="28" w:name="making-models-smaller-and-cheaper"/>
-      <w:bookmarkStart w:id="29" w:name="_Toc241660837"/>
+      <w:bookmarkStart w:id="29" w:name="_Toc241663700"/>
       <w:bookmarkEnd w:id="26"/>
       <w:r>
         <w:rPr>
@@ -12892,7 +12911,10 @@
         <w:t>Distillation:</w:t>
       </w:r>
       <w:r>
-        <w:t xml:space="preserve"> train a small student on a large teacher’s outputs or probability distributions. Most “Flash” and “mini” models are made this way.</w:t>
+        <w:t xml:space="preserve"> train a small student on a large teacher’s outputs or probability distributions. Most “Flash” and “mini” </w:t>
+      </w:r>
+      <w:r>
+        <w:t>models are made this way.</w:t>
       </w:r>
     </w:p>
     <w:p>
@@ -12943,7 +12965,7 @@
         <w:pStyle w:val="Heading2"/>
       </w:pPr>
       <w:bookmarkStart w:id="30" w:name="fine-tuning-at-home-lora-and-qlora"/>
-      <w:bookmarkStart w:id="31" w:name="_Toc241660838"/>
+      <w:bookmarkStart w:id="31" w:name="_Toc241663701"/>
       <w:bookmarkEnd w:id="28"/>
       <w:r>
         <w:rPr>
@@ -13151,10 +13173,7 @@
         <w:t>QLoRA</w:t>
       </w:r>
       <w:r>
-        <w:t xml:space="preserve"> </w:t>
-      </w:r>
-      <w:r>
-        <w:t>does the same on a 4-bit copy of the model.</w:t>
+        <w:t xml:space="preserve"> does the same on a 4-bit copy of the model.</w:t>
       </w:r>
     </w:p>
     <w:p>
@@ -13276,7 +13295,10 @@
         <w:t>What it can’t change much:</w:t>
       </w:r>
       <w:r>
-        <w:t xml:space="preserve"> raw reasoning, and reliable recall of new facts. Recall is better served by searching your documents at answer time.</w:t>
+        <w:t xml:space="preserve"> </w:t>
+      </w:r>
+      <w:r>
+        <w:t>raw reasoning, and reliable recall of new facts. Recall is better served by searching your documents at answer time.</w:t>
       </w:r>
     </w:p>
     <w:p>
@@ -13284,7 +13306,7 @@
         <w:pStyle w:val="Heading2"/>
       </w:pPr>
       <w:bookmarkStart w:id="32" w:name="why-the-top-closed-models-lead"/>
-      <w:bookmarkStart w:id="33" w:name="_Toc241660839"/>
+      <w:bookmarkStart w:id="33" w:name="_Toc241663702"/>
       <w:bookmarkEnd w:id="30"/>
       <w:r>
         <w:rPr>
@@ -13405,7 +13427,7 @@
         <w:pStyle w:val="Heading1"/>
       </w:pPr>
       <w:bookmarkStart w:id="34" w:name="the-tinygpt-model"/>
-      <w:bookmarkStart w:id="35" w:name="_Toc241660840"/>
+      <w:bookmarkStart w:id="35" w:name="_Toc241663703"/>
       <w:bookmarkEnd w:id="12"/>
       <w:bookmarkEnd w:id="32"/>
       <w:r>
@@ -13429,7 +13451,7 @@
           <w:noProof/>
         </w:rPr>
         <w:drawing>
-          <wp:inline distT="0" distB="0" distL="0" distR="0" wp14:anchorId="21B822A7" wp14:editId="3016198A">
+          <wp:inline distT="0" distB="0" distL="0" distR="0" wp14:anchorId="0BC312B7" wp14:editId="55B1ADA0">
             <wp:extent cx="5939999" cy="3848450"/>
             <wp:effectExtent l="0" t="0" r="0" b="0"/>
             <wp:docPr id="33" name="Picture" descr="The tinyGPT architecture. a, one forward pass: embedding, L identical blocks (each with two residual additions), final normalisation and the tied output layer. b, causal attention in one head. c, where the 17,308,032 parameters of your run sit."/>
@@ -13532,7 +13554,7 @@
         <w:pStyle w:val="Heading2"/>
       </w:pPr>
       <w:bookmarkStart w:id="36" w:name="design-choices-and-why"/>
-      <w:bookmarkStart w:id="37" w:name="_Toc241660841"/>
+      <w:bookmarkStart w:id="37" w:name="_Toc241663704"/>
       <w:r>
         <w:rPr>
           <w:rStyle w:val="SectionNumber"/>
@@ -14119,7 +14141,87 @@
               <w:rPr>
                 <w:sz w:val="17"/>
               </w:rPr>
-              <w:t>On Windows with torch 2.5.1, the native GQA path fell back to a kernel about 17 times slower</w:t>
+              <w:t>On Windows the native GQA path falls back to a kernel about 5 times slower (17 times with torch 2.5.1)</w:t>
+            </w:r>
+          </w:p>
+        </w:tc>
+      </w:tr>
+      <w:tr>
+        <w:trPr>
+          <w:cantSplit/>
+          <w:jc w:val="center"/>
+        </w:trPr>
+        <w:tc>
+          <w:tcPr>
+            <w:tcW w:w="1188" w:type="dxa"/>
+            <w:shd w:val="clear" w:color="auto" w:fill="EEF3FA"/>
+          </w:tcPr>
+          <w:p>
+            <w:pPr>
+              <w:pStyle w:val="Compact"/>
+              <w:spacing w:before="20" w:after="20"/>
+            </w:pPr>
+            <w:r>
+              <w:rPr>
+                <w:sz w:val="17"/>
+              </w:rPr>
+              <w:t>Compilation</w:t>
+            </w:r>
+          </w:p>
+        </w:tc>
+        <w:tc>
+          <w:tcPr>
+            <w:tcW w:w="2772" w:type="dxa"/>
+            <w:shd w:val="clear" w:color="auto" w:fill="EEF3FA"/>
+          </w:tcPr>
+          <w:p>
+            <w:pPr>
+              <w:pStyle w:val="Compact"/>
+              <w:spacing w:before="20" w:after="20"/>
+            </w:pPr>
+            <w:r>
+              <w:rPr>
+                <w:rStyle w:val="VerbatimChar"/>
+                <w:sz w:val="17"/>
+              </w:rPr>
+              <w:t>torch.compile</w:t>
+            </w:r>
+            <w:r>
+              <w:rPr>
+                <w:sz w:val="17"/>
+              </w:rPr>
+              <w:t xml:space="preserve"> when Triton is installed (</w:t>
+            </w:r>
+            <w:r>
+              <w:rPr>
+                <w:rStyle w:val="VerbatimChar"/>
+                <w:sz w:val="17"/>
+              </w:rPr>
+              <w:t>triton-windows</w:t>
+            </w:r>
+            <w:r>
+              <w:rPr>
+                <w:sz w:val="17"/>
+              </w:rPr>
+              <w:t xml:space="preserve"> on Windows)</w:t>
+            </w:r>
+          </w:p>
+        </w:tc>
+        <w:tc>
+          <w:tcPr>
+            <w:tcW w:w="3960" w:type="dxa"/>
+            <w:shd w:val="clear" w:color="auto" w:fill="EEF3FA"/>
+          </w:tcPr>
+          <w:p>
+            <w:pPr>
+              <w:pStyle w:val="Compact"/>
+              <w:spacing w:before="20" w:after="20"/>
+            </w:pPr>
+            <w:r>
+              <w:rPr>
+                <w:sz w:val="17"/>
+              </w:rPr>
+              <w:t>Fuses many small GPU operations into few: 1.46 times faster for 36.6M and 1.44 times for 70M parameters on the RTX 3070, measured alternating both modes; the first steps take 10-30 s longer to compile</w:t>
             </w:r>
           </w:p>
         </w:tc>
@@ -14130,7 +14232,7 @@
         <w:pStyle w:val="Heading2"/>
       </w:pPr>
       <w:bookmarkStart w:id="38" w:name="why-decoder-only-and-not-encoder-decoder"/>
-      <w:bookmarkStart w:id="39" w:name="_Toc241660842"/>
+      <w:bookmarkStart w:id="39" w:name="_Toc241663705"/>
       <w:bookmarkEnd w:id="36"/>
       <w:r>
         <w:rPr>
@@ -14759,7 +14861,7 @@
         <w:pStyle w:val="Heading2"/>
       </w:pPr>
       <w:bookmarkStart w:id="40" w:name="your-runs-settings-explained"/>
-      <w:bookmarkStart w:id="41" w:name="_Toc241660843"/>
+      <w:bookmarkStart w:id="41" w:name="_Toc241663706"/>
       <w:bookmarkEnd w:id="38"/>
       <w:r>
         <w:rPr>
@@ -17459,7 +17561,7 @@
         <w:pStyle w:val="Heading2"/>
       </w:pPr>
       <w:bookmarkStart w:id="42" w:name="how-the-planner-chooses-a-model"/>
-      <w:bookmarkStart w:id="43" w:name="_Toc241660844"/>
+      <w:bookmarkStart w:id="43" w:name="_Toc241663707"/>
       <w:bookmarkEnd w:id="40"/>
       <w:r>
         <w:rPr>
@@ -17734,7 +17836,7 @@
         <w:pStyle w:val="Heading2"/>
       </w:pPr>
       <w:bookmarkStart w:id="44" w:name="hands-on-exercises"/>
-      <w:bookmarkStart w:id="45" w:name="_Toc241660845"/>
+      <w:bookmarkStart w:id="45" w:name="_Toc241663708"/>
       <w:bookmarkEnd w:id="42"/>
       <w:r>
         <w:rPr>
@@ -17996,7 +18098,7 @@
         <w:pStyle w:val="Heading1"/>
       </w:pPr>
       <w:bookmarkStart w:id="46" w:name="your-training-data"/>
-      <w:bookmarkStart w:id="47" w:name="_Toc241660846"/>
+      <w:bookmarkStart w:id="47" w:name="_Toc241663709"/>
       <w:bookmarkEnd w:id="34"/>
       <w:bookmarkEnd w:id="44"/>
       <w:r>
@@ -18016,7 +18118,7 @@
         <w:pStyle w:val="Heading2"/>
       </w:pPr>
       <w:bookmarkStart w:id="48" w:name="folder-layout"/>
-      <w:bookmarkStart w:id="49" w:name="_Toc241660847"/>
+      <w:bookmarkStart w:id="49" w:name="_Toc241663710"/>
       <w:r>
         <w:rPr>
           <w:rStyle w:val="SectionNumber"/>
@@ -18914,7 +19016,7 @@
         <w:pStyle w:val="Heading2"/>
       </w:pPr>
       <w:bookmarkStart w:id="50" w:name="converting-documents"/>
-      <w:bookmarkStart w:id="51" w:name="_Toc241660848"/>
+      <w:bookmarkStart w:id="51" w:name="_Toc241663711"/>
       <w:bookmarkEnd w:id="48"/>
       <w:r>
         <w:rPr>
@@ -19462,7 +19564,7 @@
         <w:pStyle w:val="Heading2"/>
       </w:pPr>
       <w:bookmarkStart w:id="52" w:name="english-only"/>
-      <w:bookmarkStart w:id="53" w:name="_Toc241660849"/>
+      <w:bookmarkStart w:id="53" w:name="_Toc241663712"/>
       <w:bookmarkEnd w:id="50"/>
       <w:r>
         <w:rPr>
@@ -19661,7 +19763,7 @@
         <w:pStyle w:val="Heading2"/>
       </w:pPr>
       <w:bookmarkStart w:id="54" w:name="keyword-selection"/>
-      <w:bookmarkStart w:id="55" w:name="_Toc241660850"/>
+      <w:bookmarkStart w:id="55" w:name="_Toc241663713"/>
       <w:bookmarkEnd w:id="52"/>
       <w:r>
         <w:rPr>
@@ -20219,7 +20321,7 @@
         <w:pStyle w:val="Heading2"/>
       </w:pPr>
       <w:bookmarkStart w:id="56" w:name="X94ef1ff796aac1cc9e44d72727e00c60c26242e"/>
-      <w:bookmarkStart w:id="57" w:name="_Toc241660851"/>
+      <w:bookmarkStart w:id="57" w:name="_Toc241663714"/>
       <w:bookmarkEnd w:id="54"/>
       <w:r>
         <w:rPr>
@@ -20558,7 +20660,7 @@
         <w:pStyle w:val="Heading2"/>
       </w:pPr>
       <w:bookmarkStart w:id="58" w:name="cleaning-deduplication-split-and-audit"/>
-      <w:bookmarkStart w:id="59" w:name="_Toc241660852"/>
+      <w:bookmarkStart w:id="59" w:name="_Toc241663715"/>
       <w:bookmarkEnd w:id="56"/>
       <w:r>
         <w:rPr>
@@ -20730,7 +20832,7 @@
         <w:pStyle w:val="Heading2"/>
       </w:pPr>
       <w:bookmarkStart w:id="60" w:name="X9bdd5544e1f332161ce69c21b8c82062f563dfc"/>
-      <w:bookmarkStart w:id="61" w:name="_Toc241660853"/>
+      <w:bookmarkStart w:id="61" w:name="_Toc241663716"/>
       <w:bookmarkEnd w:id="58"/>
       <w:r>
         <w:rPr>
@@ -21160,7 +21262,7 @@
         <w:pStyle w:val="Heading2"/>
       </w:pPr>
       <w:bookmarkStart w:id="62" w:name="Xc4591382f4fd028a28f1b17bee47be5b816a3b4"/>
-      <w:bookmarkStart w:id="63" w:name="_Toc241660854"/>
+      <w:bookmarkStart w:id="63" w:name="_Toc241663717"/>
       <w:bookmarkEnd w:id="60"/>
       <w:r>
         <w:rPr>
@@ -21404,7 +21506,7 @@
         <w:pStyle w:val="Heading2"/>
       </w:pPr>
       <w:bookmarkStart w:id="64" w:name="Xfc3d086a28d050a6fd537126ae8e168cdb8bdcc"/>
-      <w:bookmarkStart w:id="65" w:name="_Toc241660855"/>
+      <w:bookmarkStart w:id="65" w:name="_Toc241663718"/>
       <w:bookmarkEnd w:id="62"/>
       <w:r>
         <w:rPr>
@@ -21725,7 +21827,7 @@
         <w:pStyle w:val="Heading2"/>
       </w:pPr>
       <w:bookmarkStart w:id="66" w:name="more-data-worth-getting"/>
-      <w:bookmarkStart w:id="67" w:name="_Toc241660856"/>
+      <w:bookmarkStart w:id="67" w:name="_Toc241663719"/>
       <w:bookmarkEnd w:id="64"/>
       <w:r>
         <w:rPr>
@@ -22692,7 +22794,7 @@
         <w:pStyle w:val="Heading2"/>
       </w:pPr>
       <w:bookmarkStart w:id="68" w:name="gwas-summary-statistics"/>
-      <w:bookmarkStart w:id="69" w:name="_Toc241660857"/>
+      <w:bookmarkStart w:id="69" w:name="_Toc241663720"/>
       <w:bookmarkEnd w:id="66"/>
       <w:r>
         <w:rPr>
@@ -22962,7 +23064,7 @@
         <w:pStyle w:val="Heading2"/>
       </w:pPr>
       <w:bookmarkStart w:id="70" w:name="pictures-png-in-the-future"/>
-      <w:bookmarkStart w:id="71" w:name="_Toc241660858"/>
+      <w:bookmarkStart w:id="71" w:name="_Toc241663721"/>
       <w:bookmarkEnd w:id="68"/>
       <w:r>
         <w:rPr>
@@ -23082,7 +23184,7 @@
         <w:pStyle w:val="Heading1"/>
       </w:pPr>
       <w:bookmarkStart w:id="72" w:name="training-a-run"/>
-      <w:bookmarkStart w:id="73" w:name="_Toc241660859"/>
+      <w:bookmarkStart w:id="73" w:name="_Toc241663722"/>
       <w:bookmarkEnd w:id="46"/>
       <w:bookmarkEnd w:id="70"/>
       <w:r>
@@ -23102,7 +23204,7 @@
         <w:pStyle w:val="Heading2"/>
       </w:pPr>
       <w:bookmarkStart w:id="74" w:name="reading-the-log"/>
-      <w:bookmarkStart w:id="75" w:name="_Toc241660860"/>
+      <w:bookmarkStart w:id="75" w:name="_Toc241663723"/>
       <w:r>
         <w:rPr>
           <w:rStyle w:val="SectionNumber"/>
@@ -23623,7 +23725,7 @@
         <w:pStyle w:val="Heading2"/>
       </w:pPr>
       <w:bookmarkStart w:id="76" w:name="checkpoints-pausing-and-resuming"/>
-      <w:bookmarkStart w:id="77" w:name="_Toc241660861"/>
+      <w:bookmarkStart w:id="77" w:name="_Toc241663724"/>
       <w:bookmarkEnd w:id="74"/>
       <w:r>
         <w:rPr>
@@ -23861,7 +23963,7 @@
         <w:pStyle w:val="Heading2"/>
       </w:pPr>
       <w:bookmarkStart w:id="78" w:name="Xce23c4353a139fefc25bd39ebff21fc6eef92b5"/>
-      <w:bookmarkStart w:id="79" w:name="_Toc241660862"/>
+      <w:bookmarkStart w:id="79" w:name="_Toc241663725"/>
       <w:bookmarkEnd w:id="76"/>
       <w:r>
         <w:rPr>
@@ -24059,7 +24161,7 @@
         <w:pStyle w:val="Heading2"/>
       </w:pPr>
       <w:bookmarkStart w:id="80" w:name="the-experiments-table"/>
-      <w:bookmarkStart w:id="81" w:name="_Toc241660863"/>
+      <w:bookmarkStart w:id="81" w:name="_Toc241663726"/>
       <w:bookmarkEnd w:id="78"/>
       <w:r>
         <w:rPr>
@@ -24165,7 +24267,7 @@
         <w:pStyle w:val="Heading2"/>
       </w:pPr>
       <w:bookmarkStart w:id="82" w:name="energy-carbon-and-cost"/>
-      <w:bookmarkStart w:id="83" w:name="_Toc241660864"/>
+      <w:bookmarkStart w:id="83" w:name="_Toc241663727"/>
       <w:bookmarkEnd w:id="80"/>
       <w:r>
         <w:rPr>
@@ -24403,7 +24505,7 @@
         <w:pStyle w:val="Heading2"/>
       </w:pPr>
       <w:bookmarkStart w:id="84" w:name="exporting-a-model"/>
-      <w:bookmarkStart w:id="85" w:name="_Toc241660865"/>
+      <w:bookmarkStart w:id="85" w:name="_Toc241663728"/>
       <w:bookmarkEnd w:id="82"/>
       <w:r>
         <w:rPr>
@@ -24630,7 +24732,7 @@
         <w:pStyle w:val="Heading1"/>
       </w:pPr>
       <w:bookmarkStart w:id="86" w:name="evaluating-a-model"/>
-      <w:bookmarkStart w:id="87" w:name="_Toc241660866"/>
+      <w:bookmarkStart w:id="87" w:name="_Toc241663729"/>
       <w:bookmarkEnd w:id="72"/>
       <w:bookmarkEnd w:id="84"/>
       <w:r>
@@ -24650,7 +24752,7 @@
         <w:pStyle w:val="Heading2"/>
       </w:pPr>
       <w:bookmarkStart w:id="88" w:name="loss-perplexity-and-bits-per-byte"/>
-      <w:bookmarkStart w:id="89" w:name="_Toc241660867"/>
+      <w:bookmarkStart w:id="89" w:name="_Toc241663730"/>
       <w:r>
         <w:rPr>
           <w:rStyle w:val="SectionNumber"/>
@@ -24735,7 +24837,7 @@
         <w:pStyle w:val="Heading2"/>
       </w:pPr>
       <w:bookmarkStart w:id="90" w:name="the-fact-benchmark"/>
-      <w:bookmarkStart w:id="91" w:name="_Toc241660868"/>
+      <w:bookmarkStart w:id="91" w:name="_Toc241663731"/>
       <w:bookmarkEnd w:id="88"/>
       <w:r>
         <w:rPr>
@@ -26120,7 +26222,7 @@
         <w:pStyle w:val="Heading2"/>
       </w:pPr>
       <w:bookmarkStart w:id="92" w:name="Xd55aac8070434e0efdbeb1fff754f7b8fd345b5"/>
-      <w:bookmarkStart w:id="93" w:name="_Toc241660869"/>
+      <w:bookmarkStart w:id="93" w:name="_Toc241663732"/>
       <w:bookmarkEnd w:id="90"/>
       <w:r>
         <w:rPr>
@@ -26255,7 +26357,7 @@
         <w:pStyle w:val="Heading2"/>
       </w:pPr>
       <w:bookmarkStart w:id="94" w:name="the-dashboard"/>
-      <w:bookmarkStart w:id="95" w:name="_Toc241660870"/>
+      <w:bookmarkStart w:id="95" w:name="_Toc241663733"/>
       <w:bookmarkEnd w:id="92"/>
       <w:r>
         <w:rPr>
@@ -26450,7 +26552,7 @@
         <w:pStyle w:val="Heading2"/>
       </w:pPr>
       <w:bookmarkStart w:id="96" w:name="X7efef3a44031ff533b64507845ffdeb5da843ff"/>
-      <w:bookmarkStart w:id="97" w:name="_Toc241660871"/>
+      <w:bookmarkStart w:id="97" w:name="_Toc241663734"/>
       <w:bookmarkEnd w:id="94"/>
       <w:r>
         <w:rPr>
@@ -27256,7 +27358,7 @@
         <w:pStyle w:val="Heading1"/>
       </w:pPr>
       <w:bookmarkStart w:id="98" w:name="Xa1cc98f937cc273961788fd9ca4ca9fa7d2cd66"/>
-      <w:bookmarkStart w:id="99" w:name="_Toc241660872"/>
+      <w:bookmarkStart w:id="99" w:name="_Toc241663735"/>
       <w:bookmarkEnd w:id="86"/>
       <w:bookmarkEnd w:id="96"/>
       <w:r>
@@ -27276,7 +27378,7 @@
         <w:pStyle w:val="Heading2"/>
       </w:pPr>
       <w:bookmarkStart w:id="100" w:name="separate-scripts-sharing-one-model"/>
-      <w:bookmarkStart w:id="101" w:name="_Toc241660873"/>
+      <w:bookmarkStart w:id="101" w:name="_Toc241663736"/>
       <w:r>
         <w:rPr>
           <w:rStyle w:val="SectionNumber"/>
@@ -27807,7 +27909,7 @@
         <w:pStyle w:val="Heading2"/>
       </w:pPr>
       <w:bookmarkStart w:id="102" w:name="supervised-fine-tuning"/>
-      <w:bookmarkStart w:id="103" w:name="_Toc241660874"/>
+      <w:bookmarkStart w:id="103" w:name="_Toc241663737"/>
       <w:bookmarkEnd w:id="100"/>
       <w:r>
         <w:rPr>
@@ -28050,7 +28152,7 @@
         <w:pStyle w:val="Heading2"/>
       </w:pPr>
       <w:bookmarkStart w:id="104" w:name="preference-tuning-dpo"/>
-      <w:bookmarkStart w:id="105" w:name="_Toc241660875"/>
+      <w:bookmarkStart w:id="105" w:name="_Toc241663738"/>
       <w:bookmarkEnd w:id="102"/>
       <w:r>
         <w:rPr>
@@ -28227,7 +28329,7 @@
         <w:pStyle w:val="Heading2"/>
       </w:pPr>
       <w:bookmarkStart w:id="106" w:name="X9ed80f729ac16c52123de20ef25b4d7814666fd"/>
-      <w:bookmarkStart w:id="107" w:name="_Toc241660876"/>
+      <w:bookmarkStart w:id="107" w:name="_Toc241663739"/>
       <w:bookmarkEnd w:id="104"/>
       <w:r>
         <w:rPr>
@@ -28425,7 +28527,7 @@
         <w:pStyle w:val="Heading2"/>
       </w:pPr>
       <w:bookmarkStart w:id="108" w:name="what-to-expect-at-this-size"/>
-      <w:bookmarkStart w:id="109" w:name="_Toc241660877"/>
+      <w:bookmarkStart w:id="109" w:name="_Toc241663740"/>
       <w:bookmarkEnd w:id="106"/>
       <w:r>
         <w:rPr>
@@ -28514,7 +28616,7 @@
         <w:pStyle w:val="Heading1"/>
       </w:pPr>
       <w:bookmarkStart w:id="110" w:name="was-this-text-written-by-my-model"/>
-      <w:bookmarkStart w:id="111" w:name="_Toc241660878"/>
+      <w:bookmarkStart w:id="111" w:name="_Toc241663741"/>
       <w:bookmarkEnd w:id="98"/>
       <w:bookmarkEnd w:id="108"/>
       <w:r>
@@ -28542,7 +28644,7 @@
         <w:pStyle w:val="Heading2"/>
       </w:pPr>
       <w:bookmarkStart w:id="112" w:name="X94868af322c496bf0a6feeceae7424bccee950c"/>
-      <w:bookmarkStart w:id="113" w:name="_Toc241660879"/>
+      <w:bookmarkStart w:id="113" w:name="_Toc241663742"/>
       <w:r>
         <w:rPr>
           <w:rStyle w:val="SectionNumber"/>
@@ -28698,7 +28800,7 @@
         <w:pStyle w:val="Heading2"/>
       </w:pPr>
       <w:bookmarkStart w:id="114" w:name="likelihood-score-evidence-for-any-text"/>
-      <w:bookmarkStart w:id="115" w:name="_Toc241660880"/>
+      <w:bookmarkStart w:id="115" w:name="_Toc241663743"/>
       <w:bookmarkEnd w:id="112"/>
       <w:r>
         <w:rPr>
@@ -28876,7 +28978,7 @@
         <w:pStyle w:val="Heading1"/>
       </w:pPr>
       <w:bookmarkStart w:id="116" w:name="the-mathematics-and-statistics"/>
-      <w:bookmarkStart w:id="117" w:name="_Toc241660881"/>
+      <w:bookmarkStart w:id="117" w:name="_Toc241663744"/>
       <w:bookmarkEnd w:id="110"/>
       <w:bookmarkEnd w:id="114"/>
       <w:r>
@@ -28951,7 +29053,7 @@
         <w:pStyle w:val="Heading2"/>
       </w:pPr>
       <w:bookmarkStart w:id="118" w:name="likelihood-perplexity-and-bits-per-byte"/>
-      <w:bookmarkStart w:id="119" w:name="_Toc241660882"/>
+      <w:bookmarkStart w:id="119" w:name="_Toc241663745"/>
       <w:r>
         <w:rPr>
           <w:rStyle w:val="SectionNumber"/>
@@ -30465,7 +30567,7 @@
         <w:pStyle w:val="Heading2"/>
       </w:pPr>
       <w:bookmarkStart w:id="120" w:name="the-transformer-1"/>
-      <w:bookmarkStart w:id="121" w:name="_Toc241660883"/>
+      <w:bookmarkStart w:id="121" w:name="_Toc241663746"/>
       <w:bookmarkEnd w:id="118"/>
       <w:r>
         <w:rPr>
@@ -34058,7 +34160,7 @@
         <w:pStyle w:val="Heading2"/>
       </w:pPr>
       <w:bookmarkStart w:id="122" w:name="optimisation"/>
-      <w:bookmarkStart w:id="123" w:name="_Toc241660884"/>
+      <w:bookmarkStart w:id="123" w:name="_Toc241663747"/>
       <w:bookmarkEnd w:id="120"/>
       <w:r>
         <w:rPr>
@@ -36963,7 +37065,7 @@
         <w:pStyle w:val="Heading2"/>
       </w:pPr>
       <w:bookmarkStart w:id="124" w:name="scaling-laws-and-repeated-data"/>
-      <w:bookmarkStart w:id="125" w:name="_Toc241660885"/>
+      <w:bookmarkStart w:id="125" w:name="_Toc241663748"/>
       <w:bookmarkEnd w:id="122"/>
       <w:r>
         <w:rPr>
@@ -38098,7 +38200,7 @@
         <w:pStyle w:val="Heading2"/>
       </w:pPr>
       <w:bookmarkStart w:id="126" w:name="evaluation-statistics"/>
-      <w:bookmarkStart w:id="127" w:name="_Toc241660886"/>
+      <w:bookmarkStart w:id="127" w:name="_Toc241663749"/>
       <w:bookmarkEnd w:id="124"/>
       <w:r>
         <w:rPr>
@@ -40240,7 +40342,7 @@
         <w:pStyle w:val="Heading2"/>
       </w:pPr>
       <w:bookmarkStart w:id="128" w:name="post-training"/>
-      <w:bookmarkStart w:id="129" w:name="_Toc241660887"/>
+      <w:bookmarkStart w:id="129" w:name="_Toc241663750"/>
       <w:bookmarkEnd w:id="126"/>
       <w:r>
         <w:rPr>
@@ -43431,7 +43533,7 @@
         <w:pStyle w:val="Heading2"/>
       </w:pPr>
       <w:bookmarkStart w:id="130" w:name="generation-and-detection"/>
-      <w:bookmarkStart w:id="131" w:name="_Toc241660888"/>
+      <w:bookmarkStart w:id="131" w:name="_Toc241663751"/>
       <w:bookmarkEnd w:id="128"/>
       <w:r>
         <w:rPr>
@@ -45018,7 +45120,7 @@
         <w:pStyle w:val="Heading2"/>
       </w:pPr>
       <w:bookmarkStart w:id="132" w:name="data-statistics"/>
-      <w:bookmarkStart w:id="133" w:name="_Toc241660889"/>
+      <w:bookmarkStart w:id="133" w:name="_Toc241663752"/>
       <w:bookmarkEnd w:id="130"/>
       <w:r>
         <w:rPr>
@@ -45632,7 +45734,7 @@
         <w:pStyle w:val="Heading1"/>
       </w:pPr>
       <w:bookmarkStart w:id="134" w:name="the-laptop-gpu-throttle"/>
-      <w:bookmarkStart w:id="135" w:name="_Toc241660890"/>
+      <w:bookmarkStart w:id="135" w:name="_Toc241663753"/>
       <w:bookmarkEnd w:id="116"/>
       <w:bookmarkEnd w:id="132"/>
       <w:r>
@@ -45652,7 +45754,7 @@
         <w:pStyle w:val="Heading2"/>
       </w:pPr>
       <w:bookmarkStart w:id="136" w:name="what-was-measured"/>
-      <w:bookmarkStart w:id="137" w:name="_Toc241660891"/>
+      <w:bookmarkStart w:id="137" w:name="_Toc241663754"/>
       <w:r>
         <w:rPr>
           <w:rStyle w:val="SectionNumber"/>
@@ -45897,7 +45999,7 @@
         <w:pStyle w:val="Heading2"/>
       </w:pPr>
       <w:bookmarkStart w:id="138" w:name="likely-causes"/>
-      <w:bookmarkStart w:id="139" w:name="_Toc241660892"/>
+      <w:bookmarkStart w:id="139" w:name="_Toc241663755"/>
       <w:bookmarkEnd w:id="136"/>
       <w:r>
         <w:rPr>
@@ -46055,7 +46157,7 @@
         <w:pStyle w:val="Heading2"/>
       </w:pPr>
       <w:bookmarkStart w:id="140" w:name="what-to-try-in-order"/>
-      <w:bookmarkStart w:id="141" w:name="_Toc241660893"/>
+      <w:bookmarkStart w:id="141" w:name="_Toc241663756"/>
       <w:bookmarkEnd w:id="138"/>
       <w:r>
         <w:rPr>
@@ -46440,7 +46542,7 @@
         <w:pStyle w:val="Heading1"/>
       </w:pPr>
       <w:bookmarkStart w:id="142" w:name="scaling-up"/>
-      <w:bookmarkStart w:id="143" w:name="_Toc241660894"/>
+      <w:bookmarkStart w:id="143" w:name="_Toc241663757"/>
       <w:bookmarkEnd w:id="134"/>
       <w:bookmarkEnd w:id="140"/>
       <w:r>
@@ -46460,7 +46562,7 @@
         <w:pStyle w:val="Heading2"/>
       </w:pPr>
       <w:bookmarkStart w:id="144" w:name="X60c251acf6cc087f15a89907a3ae63c867638c5"/>
-      <w:bookmarkStart w:id="145" w:name="_Toc241660895"/>
+      <w:bookmarkStart w:id="145" w:name="_Toc241663758"/>
       <w:r>
         <w:rPr>
           <w:rStyle w:val="SectionNumber"/>
@@ -47130,7 +47232,7 @@
         <w:pStyle w:val="Heading2"/>
       </w:pPr>
       <w:bookmarkStart w:id="146" w:name="renting-an-h100-lambda-cloud"/>
-      <w:bookmarkStart w:id="147" w:name="_Toc241660896"/>
+      <w:bookmarkStart w:id="147" w:name="_Toc241663759"/>
       <w:bookmarkEnd w:id="144"/>
       <w:r>
         <w:rPr>
@@ -47778,7 +47880,16 @@
         <w:t>torch.compile</w:t>
       </w:r>
       <w:r>
-        <w:t xml:space="preserve"> works (it needs Triton, which Windows lacks).</w:t>
+        <w:t xml:space="preserve"> works out of the box (on Windows it needs the </w:t>
+      </w:r>
+      <w:r>
+        <w:rPr>
+          <w:rStyle w:val="VerbatimChar"/>
+        </w:rPr>
+        <w:t>triton-windows</w:t>
+      </w:r>
+      <w:r>
+        <w:t xml:space="preserve"> package).</w:t>
       </w:r>
     </w:p>
     <w:p>
@@ -47847,7 +47958,7 @@
         <w:pStyle w:val="Heading2"/>
       </w:pPr>
       <w:bookmarkStart w:id="148" w:name="a-1b-model-from-scratch"/>
-      <w:bookmarkStart w:id="149" w:name="_Toc241660897"/>
+      <w:bookmarkStart w:id="149" w:name="_Toc241663760"/>
       <w:bookmarkEnd w:id="146"/>
       <w:r>
         <w:rPr>
@@ -48344,7 +48455,7 @@
         <w:pStyle w:val="Heading2"/>
       </w:pPr>
       <w:bookmarkStart w:id="150" w:name="is-1b-enough-for-a-specialised-field"/>
-      <w:bookmarkStart w:id="151" w:name="_Toc241660898"/>
+      <w:bookmarkStart w:id="151" w:name="_Toc241663761"/>
       <w:bookmarkEnd w:id="148"/>
       <w:r>
         <w:rPr>
@@ -48401,10 +48512,10 @@
         <w:t>Knowledge:</w:t>
       </w:r>
       <w:r>
-        <w:t xml:space="preserve"> at about 2 bits per parameter, a 1B model holds about 250 MB of facts. That’s a lot of textbook </w:t>
-      </w:r>
-      <w:r>
-        <w:t>knowledge, but not the literature. It will still invent details.</w:t>
+        <w:t xml:space="preserve"> </w:t>
+      </w:r>
+      <w:r>
+        <w:t>at about 2 bits per parameter, a 1B model holds about 250 MB of facts. That’s a lot of textbook knowledge, but not the literature. It will still invent details.</w:t>
       </w:r>
     </w:p>
     <w:p>
@@ -48498,7 +48609,7 @@
         <w:pStyle w:val="Heading2"/>
       </w:pPr>
       <w:bookmarkStart w:id="152" w:name="X30c0ff3366ed0f880f1b78628a446bbd6327d7e"/>
-      <w:bookmarkStart w:id="153" w:name="_Toc241660899"/>
+      <w:bookmarkStart w:id="153" w:name="_Toc241663762"/>
       <w:bookmarkEnd w:id="150"/>
       <w:r>
         <w:rPr>
@@ -48527,10 +48638,7 @@
         <w:t>open model’s own architecture and tokenizer</w:t>
       </w:r>
       <w:r>
-        <w:t xml:space="preserve">. You feed it </w:t>
-      </w:r>
-      <w:r>
-        <w:t>your text, and its weights keep their shapes.</w:t>
+        <w:t>. You feed it your text, and its weights keep their shapes.</w:t>
       </w:r>
     </w:p>
     <w:p>
@@ -48811,7 +48919,7 @@
         <w:pStyle w:val="Heading2"/>
       </w:pPr>
       <w:bookmarkStart w:id="154" w:name="the-mac-studio-plan-from-guide.md"/>
-      <w:bookmarkStart w:id="155" w:name="_Toc241660900"/>
+      <w:bookmarkStart w:id="155" w:name="_Toc241663763"/>
       <w:bookmarkEnd w:id="152"/>
       <w:r>
         <w:rPr>
@@ -48883,10 +48991,7 @@
         <w:t>A model:</w:t>
       </w:r>
       <w:r>
-        <w:t xml:space="preserve"> </w:t>
-      </w:r>
-      <w:r>
-        <w:t>the strongest open mixture-of-experts model that fits, about 235–355B parameters in total with 20–35B active, at 4-bit.</w:t>
+        <w:t xml:space="preserve"> the strongest open mixture-of-experts model that fits, about 235–355B parameters in total with 20–35B active, at 4-bit.</w:t>
       </w:r>
     </w:p>
     <w:p>
@@ -49352,8 +49457,6 @@
       </w:r>
       <w:r>
         <w:tab/>
-      </w:r>
-      <w:r>
         <w:t>What fits in 256 GB</w:t>
       </w:r>
     </w:p>
@@ -49978,7 +50081,10 @@
         <w:t>512 GB would matter</w:t>
       </w:r>
       <w:r>
-        <w:t xml:space="preserve"> only for running 400B+ models or QLoRA of 355B. It doesn’t matter for tinyGPT-style training from scratch, which is limited by compute.</w:t>
+        <w:t xml:space="preserve"> only for running 400B+ models or QLoRA of 355B. It doesn’t matter for tinyGPT-style training </w:t>
+      </w:r>
+      <w:r>
+        <w:t>from scratch, which is limited by compute.</w:t>
       </w:r>
     </w:p>
     <w:p>
@@ -51005,7 +51111,10 @@
         <w:t>analysis:</w:t>
       </w:r>
       <w:r>
-        <w:t xml:space="preserve"> 1–3K task → R or Python code examples, </w:t>
+        <w:t xml:space="preserve"> </w:t>
+      </w:r>
+      <w:r>
+        <w:t xml:space="preserve">1–3K task → R or Python code examples, </w:t>
       </w:r>
       <w:r>
         <w:rPr>
@@ -51496,7 +51605,10 @@
         <w:t>Free research compute:</w:t>
       </w:r>
       <w:r>
-        <w:t xml:space="preserve"> your university’s research computing service, and the UK AI Research Resource (Isambard-AI, Dawn) for eligible projects.</w:t>
+        <w:t xml:space="preserve"> </w:t>
+      </w:r>
+      <w:r>
+        <w:t>your university’s research computing service, and the UK AI Research Resource (Isambard-AI, Dawn) for eligible projects.</w:t>
       </w:r>
     </w:p>
     <w:p>
@@ -51532,8 +51644,6 @@
       </w:r>
       <w:r>
         <w:tab/>
-      </w:r>
-      <w:r>
         <w:t>The video model, the subscription and the timeline</w:t>
       </w:r>
     </w:p>
@@ -51603,7 +51713,10 @@
         <w:t>Not reliable for</w:t>
       </w:r>
       <w:r>
-        <w:t xml:space="preserve"> equations, labels, molecules or a consistent person. Train only on your own renders or licensed footage.</w:t>
+        <w:t xml:space="preserve"> </w:t>
+      </w:r>
+      <w:r>
+        <w:t>equations, labels, molecules or a consistent person. Train only on your own renders or licensed footage.</w:t>
       </w:r>
     </w:p>
     <w:p>
@@ -51618,10 +51731,7 @@
         <w:t>The subscription:</w:t>
       </w:r>
       <w:r>
-        <w:t xml:space="preserve"> after phases C and D, log for a month which tasks the local model handles well, then decide </w:t>
-      </w:r>
-      <w:r>
-        <w:t>whether to downgrade. The log should make the decision.</w:t>
+        <w:t xml:space="preserve"> after phases C and D, log for a month which tasks the local model handles well, then decide whether to downgrade. The log should make the decision.</w:t>
       </w:r>
     </w:p>
     <w:p>
@@ -51956,7 +52066,7 @@
         <w:pStyle w:val="Heading1"/>
       </w:pPr>
       <w:bookmarkStart w:id="162" w:name="techniques-roadmap"/>
-      <w:bookmarkStart w:id="163" w:name="_Toc241660901"/>
+      <w:bookmarkStart w:id="163" w:name="_Toc241663764"/>
       <w:bookmarkEnd w:id="142"/>
       <w:bookmarkEnd w:id="154"/>
       <w:bookmarkEnd w:id="161"/>
@@ -52015,7 +52125,7 @@
         <w:pStyle w:val="Heading2"/>
       </w:pPr>
       <w:bookmarkStart w:id="164" w:name="done-on-29-september"/>
-      <w:bookmarkStart w:id="165" w:name="_Toc241660902"/>
+      <w:bookmarkStart w:id="165" w:name="_Toc241663765"/>
       <w:r>
         <w:rPr>
           <w:rStyle w:val="SectionNumber"/>
@@ -52456,7 +52566,7 @@
         <w:pStyle w:val="Heading2"/>
       </w:pPr>
       <w:bookmarkStart w:id="166" w:name="recommended-next-in-order"/>
-      <w:bookmarkStart w:id="167" w:name="_Toc241660903"/>
+      <w:bookmarkStart w:id="167" w:name="_Toc241663766"/>
       <w:bookmarkEnd w:id="164"/>
       <w:r>
         <w:rPr>
@@ -52782,13 +52892,7 @@
               <w:rPr>
                 <w:sz w:val="17"/>
               </w:rPr>
-              <w:t xml:space="preserve"> to 6–10 short runs to find the best size for</w:t>
-            </w:r>
-            <w:r>
-              <w:rPr>
-                <w:sz w:val="17"/>
-              </w:rPr>
-              <w:t xml:space="preserve"> </w:t>
+              <w:t xml:space="preserve"> to 6–10 short runs to find the best size for </w:t>
             </w:r>
             <w:r>
               <w:rPr>
@@ -53815,7 +53919,7 @@
         <w:pStyle w:val="Heading2"/>
       </w:pPr>
       <w:bookmarkStart w:id="168" w:name="later-or-at-larger-scale"/>
-      <w:bookmarkStart w:id="169" w:name="_Toc241660904"/>
+      <w:bookmarkStart w:id="169" w:name="_Toc241663767"/>
       <w:bookmarkEnd w:id="166"/>
       <w:r>
         <w:rPr>
@@ -53845,10 +53949,7 @@
         <w:t>Optimisers:</w:t>
       </w:r>
       <w:r>
-        <w:t xml:space="preserve"> µP (learning rates that transfer across widths), Muon, schedule-free AdamW and critical-batch-size </w:t>
-      </w:r>
-      <w:r>
-        <w:t>estimation.</w:t>
+        <w:t xml:space="preserve"> µP (learning rates that transfer across widths), Muon, schedule-free AdamW and critical-batch-size estimation.</w:t>
       </w:r>
     </w:p>
     <w:p>
@@ -53905,7 +54006,7 @@
         <w:t>Efficiency:</w:t>
       </w:r>
       <w:r>
-        <w:t xml:space="preserve"> chunked cross-entropy, activation checkpointing, 8-bit optimisers and </w:t>
+        <w:t xml:space="preserve"> chunked cross-entropy, activation checkpointing, 8-bit optimisers and FlashAttention kernels (</w:t>
       </w:r>
       <w:r>
         <w:rPr>
@@ -53914,7 +54015,10 @@
         <w:t>torch.compile</w:t>
       </w:r>
       <w:r>
-        <w:t xml:space="preserve"> with FlashAttention (on Linux or the Mac).</w:t>
+        <w:t xml:space="preserve"> </w:t>
+      </w:r>
+      <w:r>
+        <w:t>is already on).</w:t>
       </w:r>
     </w:p>
     <w:p>
@@ -53977,10 +54081,7 @@
         <w:t>replacement</w:t>
       </w:r>
       <w:r>
-        <w:t xml:space="preserve"> </w:t>
-      </w:r>
-      <w:r>
-        <w:t>for keyword selection (your decision, Section 4.4).</w:t>
+        <w:t xml:space="preserve"> for keyword selection (your decision, Section 4.4).</w:t>
       </w:r>
     </w:p>
     <w:p>
@@ -54048,7 +54149,7 @@
         <w:pStyle w:val="Heading1"/>
       </w:pPr>
       <w:bookmarkStart w:id="170" w:name="tools-safety-and-naming"/>
-      <w:bookmarkStart w:id="171" w:name="_Toc241660905"/>
+      <w:bookmarkStart w:id="171" w:name="_Toc241663768"/>
       <w:bookmarkEnd w:id="162"/>
       <w:bookmarkEnd w:id="168"/>
       <w:r>
@@ -54068,7 +54169,7 @@
         <w:pStyle w:val="Heading2"/>
       </w:pPr>
       <w:bookmarkStart w:id="172" w:name="other-training-frameworks"/>
-      <w:bookmarkStart w:id="173" w:name="_Toc241660906"/>
+      <w:bookmarkStart w:id="173" w:name="_Toc241663769"/>
       <w:r>
         <w:rPr>
           <w:rStyle w:val="SectionNumber"/>
@@ -54709,7 +54810,7 @@
         <w:pStyle w:val="Heading2"/>
       </w:pPr>
       <w:bookmarkStart w:id="174" w:name="safety-rules-built-into-the-scripts"/>
-      <w:bookmarkStart w:id="175" w:name="_Toc241660907"/>
+      <w:bookmarkStart w:id="175" w:name="_Toc241663770"/>
       <w:bookmarkEnd w:id="172"/>
       <w:r>
         <w:rPr>
@@ -54769,14 +54870,7 @@
         </w:numPr>
       </w:pPr>
       <w:r>
-        <w:rPr>
-          <w:b/>
-          <w:bCs/>
-        </w:rPr>
-        <w:t>Caveat for PyTorch 2.5.1 (installed here):</w:t>
-      </w:r>
-      <w:r>
-        <w:t xml:space="preserve"> CVE-2025-32434 showed that </w:t>
+        <w:t xml:space="preserve">CVE-2025-32434 showed that </w:t>
       </w:r>
       <w:r>
         <w:rPr>
@@ -54785,16 +54879,10 @@
         <w:t>weights_only=True</w:t>
       </w:r>
       <w:r>
-        <w:t xml:space="preserve"> can be bypassed in PyTorch before 2.6. Until PyTorch is upgraded, load only checkpoints you made yourself. The upgrade (not done; it needs your approval): </w:t>
-      </w:r>
-      <w:r>
-        <w:rPr>
-          <w:rStyle w:val="VerbatimChar"/>
-        </w:rPr>
-        <w:t>python -m pip install --upgrade torch --index-url https://download.pytorch.org/whl/cu126</w:t>
-      </w:r>
-      <w:r>
-        <w:t>, then rerun the tests.</w:t>
+        <w:t xml:space="preserve"> can be bypassed in PyTorch before 2.6. PyTorch 2.10 is installed here, so this is closed; on another machine with an older PyTorch, load only checkpoints you made </w:t>
+      </w:r>
+      <w:r>
+        <w:t>yourself.</w:t>
       </w:r>
     </w:p>
     <w:p>
@@ -54942,7 +55030,10 @@
         <w:t>No installs.</w:t>
       </w:r>
       <w:r>
-        <w:t xml:space="preserve"> Every package in requirements.txt is already installed. On a new machine: </w:t>
+        <w:t xml:space="preserve"> Every package in requirements.txt is already installed. On a new machine:</w:t>
+      </w:r>
+      <w:r>
+        <w:t xml:space="preserve"> </w:t>
       </w:r>
       <w:r>
         <w:rPr>
@@ -54987,7 +55078,7 @@
         <w:pStyle w:val="Heading2"/>
       </w:pPr>
       <w:bookmarkStart w:id="176" w:name="a-name-for-the-model"/>
-      <w:bookmarkStart w:id="177" w:name="_Toc241660908"/>
+      <w:bookmarkStart w:id="177" w:name="_Toc241663771"/>
       <w:bookmarkEnd w:id="174"/>
       <w:r>
         <w:rPr>
@@ -55117,7 +55208,7 @@
         <w:pStyle w:val="Heading1"/>
       </w:pPr>
       <w:bookmarkStart w:id="178" w:name="glossary"/>
-      <w:bookmarkStart w:id="179" w:name="_Toc241660909"/>
+      <w:bookmarkStart w:id="179" w:name="_Toc241663772"/>
       <w:bookmarkEnd w:id="170"/>
       <w:bookmarkEnd w:id="176"/>
       <w:r>
@@ -56728,7 +56819,7 @@
         <w:pStyle w:val="Heading1"/>
       </w:pPr>
       <w:bookmarkStart w:id="180" w:name="reading-list-and-references"/>
-      <w:bookmarkStart w:id="181" w:name="_Toc241660910"/>
+      <w:bookmarkStart w:id="181" w:name="_Toc241663773"/>
       <w:bookmarkEnd w:id="178"/>
       <w:r>
         <w:t>Reading list and references</w:t>
@@ -57112,7 +57203,7 @@
   <w:abstractNum w:abstractNumId="0" w15:restartNumberingAfterBreak="0">
     <w:nsid w:val="0000A990"/>
     <w:multiLevelType w:val="multilevel"/>
-    <w:tmpl w:val="20B89C5E"/>
+    <w:tmpl w:val="98825A88"/>
     <w:lvl w:ilvl="0">
       <w:numFmt w:val="bullet"/>
       <w:lvlText w:val=" "/>
@@ -57189,7 +57280,7 @@
   <w:abstractNum w:abstractNumId="1" w15:restartNumberingAfterBreak="0">
     <w:nsid w:val="0000A991"/>
     <w:multiLevelType w:val="multilevel"/>
-    <w:tmpl w:val="1D7EE42A"/>
+    <w:tmpl w:val="DE260284"/>
     <w:lvl w:ilvl="0">
       <w:numFmt w:val="bullet"/>
       <w:lvlText w:val=""/>
@@ -57293,7 +57384,7 @@
   <w:abstractNum w:abstractNumId="2" w15:restartNumberingAfterBreak="0">
     <w:nsid w:val="00A99411"/>
     <w:multiLevelType w:val="multilevel"/>
-    <w:tmpl w:val="E1CCFD98"/>
+    <w:tmpl w:val="5E509F34"/>
     <w:lvl w:ilvl="0">
       <w:start w:val="1"/>
       <w:numFmt w:val="decimal"/>
@@ -57376,25 +57467,25 @@
       </w:pPr>
     </w:lvl>
   </w:abstractNum>
-  <w:num w:numId="1" w16cid:durableId="1736977185">
+  <w:num w:numId="1" w16cid:durableId="722212784">
     <w:abstractNumId w:val="0"/>
   </w:num>
-  <w:num w:numId="2" w16cid:durableId="2089769955">
+  <w:num w:numId="2" w16cid:durableId="949894241">
     <w:abstractNumId w:val="1"/>
   </w:num>
-  <w:num w:numId="3" w16cid:durableId="2060133069">
+  <w:num w:numId="3" w16cid:durableId="768626374">
     <w:abstractNumId w:val="1"/>
   </w:num>
-  <w:num w:numId="4" w16cid:durableId="1274089122">
+  <w:num w:numId="4" w16cid:durableId="1476944775">
     <w:abstractNumId w:val="1"/>
   </w:num>
-  <w:num w:numId="5" w16cid:durableId="309792363">
+  <w:num w:numId="5" w16cid:durableId="599918358">
     <w:abstractNumId w:val="1"/>
   </w:num>
-  <w:num w:numId="6" w16cid:durableId="54936142">
+  <w:num w:numId="6" w16cid:durableId="282351320">
     <w:abstractNumId w:val="1"/>
   </w:num>
-  <w:num w:numId="7" w16cid:durableId="846867601">
+  <w:num w:numId="7" w16cid:durableId="337854593">
     <w:abstractNumId w:val="2"/>
     <w:lvlOverride w:ilvl="0">
       <w:startOverride w:val="1"/>
@@ -57424,19 +57515,19 @@
       <w:startOverride w:val="1"/>
     </w:lvlOverride>
   </w:num>
-  <w:num w:numId="8" w16cid:durableId="1954165309">
+  <w:num w:numId="8" w16cid:durableId="1103451068">
     <w:abstractNumId w:val="1"/>
   </w:num>
-  <w:num w:numId="9" w16cid:durableId="1358852324">
+  <w:num w:numId="9" w16cid:durableId="1909143049">
     <w:abstractNumId w:val="1"/>
   </w:num>
-  <w:num w:numId="10" w16cid:durableId="1407534282">
+  <w:num w:numId="10" w16cid:durableId="1674406013">
     <w:abstractNumId w:val="1"/>
   </w:num>
-  <w:num w:numId="11" w16cid:durableId="120152026">
+  <w:num w:numId="11" w16cid:durableId="476651099">
     <w:abstractNumId w:val="1"/>
   </w:num>
-  <w:num w:numId="12" w16cid:durableId="611019006">
+  <w:num w:numId="12" w16cid:durableId="639069384">
     <w:abstractNumId w:val="2"/>
     <w:lvlOverride w:ilvl="0">
       <w:startOverride w:val="1"/>
@@ -57466,43 +57557,43 @@
       <w:startOverride w:val="1"/>
     </w:lvlOverride>
   </w:num>
-  <w:num w:numId="13" w16cid:durableId="1267497916">
+  <w:num w:numId="13" w16cid:durableId="902764073">
     <w:abstractNumId w:val="1"/>
   </w:num>
-  <w:num w:numId="14" w16cid:durableId="332532793">
+  <w:num w:numId="14" w16cid:durableId="1337343038">
     <w:abstractNumId w:val="1"/>
   </w:num>
-  <w:num w:numId="15" w16cid:durableId="495340312">
+  <w:num w:numId="15" w16cid:durableId="951980946">
     <w:abstractNumId w:val="1"/>
   </w:num>
-  <w:num w:numId="16" w16cid:durableId="546071874">
+  <w:num w:numId="16" w16cid:durableId="1146901073">
     <w:abstractNumId w:val="1"/>
   </w:num>
-  <w:num w:numId="17" w16cid:durableId="2013876831">
+  <w:num w:numId="17" w16cid:durableId="915866020">
     <w:abstractNumId w:val="1"/>
   </w:num>
-  <w:num w:numId="18" w16cid:durableId="1841432195">
+  <w:num w:numId="18" w16cid:durableId="1565992148">
     <w:abstractNumId w:val="1"/>
   </w:num>
-  <w:num w:numId="19" w16cid:durableId="1370642673">
+  <w:num w:numId="19" w16cid:durableId="329719487">
     <w:abstractNumId w:val="1"/>
   </w:num>
-  <w:num w:numId="20" w16cid:durableId="1802721535">
+  <w:num w:numId="20" w16cid:durableId="1550610266">
     <w:abstractNumId w:val="1"/>
   </w:num>
-  <w:num w:numId="21" w16cid:durableId="325934638">
+  <w:num w:numId="21" w16cid:durableId="1794715177">
     <w:abstractNumId w:val="1"/>
   </w:num>
-  <w:num w:numId="22" w16cid:durableId="1529686274">
+  <w:num w:numId="22" w16cid:durableId="734161917">
     <w:abstractNumId w:val="1"/>
   </w:num>
-  <w:num w:numId="23" w16cid:durableId="1799950312">
+  <w:num w:numId="23" w16cid:durableId="2047949990">
     <w:abstractNumId w:val="1"/>
   </w:num>
-  <w:num w:numId="24" w16cid:durableId="1200170834">
+  <w:num w:numId="24" w16cid:durableId="434374887">
     <w:abstractNumId w:val="1"/>
   </w:num>
-  <w:num w:numId="25" w16cid:durableId="836773297">
+  <w:num w:numId="25" w16cid:durableId="906719737">
     <w:abstractNumId w:val="2"/>
     <w:lvlOverride w:ilvl="0">
       <w:startOverride w:val="1"/>
@@ -57532,7 +57623,7 @@
       <w:startOverride w:val="1"/>
     </w:lvlOverride>
   </w:num>
-  <w:num w:numId="26" w16cid:durableId="822087973">
+  <w:num w:numId="26" w16cid:durableId="1878854145">
     <w:abstractNumId w:val="2"/>
     <w:lvlOverride w:ilvl="0">
       <w:startOverride w:val="1"/>
@@ -57562,16 +57653,16 @@
       <w:startOverride w:val="1"/>
     </w:lvlOverride>
   </w:num>
-  <w:num w:numId="27" w16cid:durableId="1357196926">
+  <w:num w:numId="27" w16cid:durableId="421609517">
     <w:abstractNumId w:val="1"/>
   </w:num>
-  <w:num w:numId="28" w16cid:durableId="838807654">
+  <w:num w:numId="28" w16cid:durableId="1763643203">
     <w:abstractNumId w:val="1"/>
   </w:num>
-  <w:num w:numId="29" w16cid:durableId="660700859">
+  <w:num w:numId="29" w16cid:durableId="756176018">
     <w:abstractNumId w:val="1"/>
   </w:num>
-  <w:num w:numId="30" w16cid:durableId="873887395">
+  <w:num w:numId="30" w16cid:durableId="99841781">
     <w:abstractNumId w:val="2"/>
     <w:lvlOverride w:ilvl="0">
       <w:startOverride w:val="1"/>
@@ -57601,7 +57692,7 @@
       <w:startOverride w:val="1"/>
     </w:lvlOverride>
   </w:num>
-  <w:num w:numId="31" w16cid:durableId="1465079160">
+  <w:num w:numId="31" w16cid:durableId="1448112893">
     <w:abstractNumId w:val="2"/>
     <w:lvlOverride w:ilvl="0">
       <w:startOverride w:val="1"/>
@@ -57631,16 +57722,16 @@
       <w:startOverride w:val="1"/>
     </w:lvlOverride>
   </w:num>
-  <w:num w:numId="32" w16cid:durableId="278756658">
+  <w:num w:numId="32" w16cid:durableId="434324356">
     <w:abstractNumId w:val="1"/>
   </w:num>
-  <w:num w:numId="33" w16cid:durableId="634332187">
+  <w:num w:numId="33" w16cid:durableId="1250387552">
     <w:abstractNumId w:val="1"/>
   </w:num>
-  <w:num w:numId="34" w16cid:durableId="374893001">
+  <w:num w:numId="34" w16cid:durableId="2123766652">
     <w:abstractNumId w:val="1"/>
   </w:num>
-  <w:num w:numId="35" w16cid:durableId="134297879">
+  <w:num w:numId="35" w16cid:durableId="483088578">
     <w:abstractNumId w:val="2"/>
     <w:lvlOverride w:ilvl="0">
       <w:startOverride w:val="1"/>
@@ -57670,25 +57761,25 @@
       <w:startOverride w:val="1"/>
     </w:lvlOverride>
   </w:num>
-  <w:num w:numId="36" w16cid:durableId="1803693975">
+  <w:num w:numId="36" w16cid:durableId="554123108">
     <w:abstractNumId w:val="1"/>
   </w:num>
-  <w:num w:numId="37" w16cid:durableId="1412045350">
+  <w:num w:numId="37" w16cid:durableId="849375351">
     <w:abstractNumId w:val="1"/>
   </w:num>
-  <w:num w:numId="38" w16cid:durableId="1451558026">
+  <w:num w:numId="38" w16cid:durableId="1201893626">
     <w:abstractNumId w:val="1"/>
   </w:num>
-  <w:num w:numId="39" w16cid:durableId="101803545">
+  <w:num w:numId="39" w16cid:durableId="2123719422">
     <w:abstractNumId w:val="1"/>
   </w:num>
-  <w:num w:numId="40" w16cid:durableId="1197307453">
+  <w:num w:numId="40" w16cid:durableId="955332235">
     <w:abstractNumId w:val="1"/>
   </w:num>
-  <w:num w:numId="41" w16cid:durableId="1212614488">
+  <w:num w:numId="41" w16cid:durableId="1241715207">
     <w:abstractNumId w:val="1"/>
   </w:num>
-  <w:num w:numId="42" w16cid:durableId="1100225934">
+  <w:num w:numId="42" w16cid:durableId="1075323348">
     <w:abstractNumId w:val="2"/>
     <w:lvlOverride w:ilvl="0">
       <w:startOverride w:val="1"/>
@@ -57718,10 +57809,10 @@
       <w:startOverride w:val="1"/>
     </w:lvlOverride>
   </w:num>
-  <w:num w:numId="43" w16cid:durableId="2111974528">
+  <w:num w:numId="43" w16cid:durableId="1787431623">
     <w:abstractNumId w:val="1"/>
   </w:num>
-  <w:num w:numId="44" w16cid:durableId="155608470">
+  <w:num w:numId="44" w16cid:durableId="71700457">
     <w:abstractNumId w:val="2"/>
     <w:lvlOverride w:ilvl="0">
       <w:startOverride w:val="1"/>
@@ -57751,10 +57842,10 @@
       <w:startOverride w:val="1"/>
     </w:lvlOverride>
   </w:num>
-  <w:num w:numId="45" w16cid:durableId="1881821742">
+  <w:num w:numId="45" w16cid:durableId="355079586">
     <w:abstractNumId w:val="1"/>
   </w:num>
-  <w:num w:numId="46" w16cid:durableId="698049694">
+  <w:num w:numId="46" w16cid:durableId="222835727">
     <w:abstractNumId w:val="2"/>
     <w:lvlOverride w:ilvl="0">
       <w:startOverride w:val="1"/>
@@ -57784,19 +57875,19 @@
       <w:startOverride w:val="1"/>
     </w:lvlOverride>
   </w:num>
-  <w:num w:numId="47" w16cid:durableId="1093011763">
+  <w:num w:numId="47" w16cid:durableId="589705485">
     <w:abstractNumId w:val="1"/>
   </w:num>
-  <w:num w:numId="48" w16cid:durableId="1614703409">
+  <w:num w:numId="48" w16cid:durableId="636452336">
     <w:abstractNumId w:val="1"/>
   </w:num>
-  <w:num w:numId="49" w16cid:durableId="848913622">
+  <w:num w:numId="49" w16cid:durableId="701244986">
     <w:abstractNumId w:val="1"/>
   </w:num>
-  <w:num w:numId="50" w16cid:durableId="1583762605">
+  <w:num w:numId="50" w16cid:durableId="1416588120">
     <w:abstractNumId w:val="1"/>
   </w:num>
-  <w:num w:numId="51" w16cid:durableId="277419361">
+  <w:num w:numId="51" w16cid:durableId="2092853899">
     <w:abstractNumId w:val="2"/>
     <w:lvlOverride w:ilvl="0">
       <w:startOverride w:val="1"/>
@@ -57826,19 +57917,19 @@
       <w:startOverride w:val="1"/>
     </w:lvlOverride>
   </w:num>
-  <w:num w:numId="52" w16cid:durableId="14384745">
+  <w:num w:numId="52" w16cid:durableId="1091854067">
     <w:abstractNumId w:val="1"/>
   </w:num>
-  <w:num w:numId="53" w16cid:durableId="1504929667">
+  <w:num w:numId="53" w16cid:durableId="2033726091">
     <w:abstractNumId w:val="1"/>
   </w:num>
-  <w:num w:numId="54" w16cid:durableId="8797298">
+  <w:num w:numId="54" w16cid:durableId="45186167">
     <w:abstractNumId w:val="1"/>
   </w:num>
-  <w:num w:numId="55" w16cid:durableId="665131090">
+  <w:num w:numId="55" w16cid:durableId="1479179976">
     <w:abstractNumId w:val="1"/>
   </w:num>
-  <w:num w:numId="56" w16cid:durableId="1508406598">
+  <w:num w:numId="56" w16cid:durableId="995837377">
     <w:abstractNumId w:val="2"/>
     <w:lvlOverride w:ilvl="0">
       <w:startOverride w:val="1"/>
@@ -57868,19 +57959,19 @@
       <w:startOverride w:val="1"/>
     </w:lvlOverride>
   </w:num>
-  <w:num w:numId="57" w16cid:durableId="1014306338">
+  <w:num w:numId="57" w16cid:durableId="1930117480">
     <w:abstractNumId w:val="1"/>
   </w:num>
-  <w:num w:numId="58" w16cid:durableId="1040933662">
+  <w:num w:numId="58" w16cid:durableId="2111123682">
     <w:abstractNumId w:val="1"/>
   </w:num>
-  <w:num w:numId="59" w16cid:durableId="1656956602">
+  <w:num w:numId="59" w16cid:durableId="955529706">
     <w:abstractNumId w:val="1"/>
   </w:num>
-  <w:num w:numId="60" w16cid:durableId="1572427000">
+  <w:num w:numId="60" w16cid:durableId="1021975173">
     <w:abstractNumId w:val="1"/>
   </w:num>
-  <w:num w:numId="61" w16cid:durableId="1537354419">
+  <w:num w:numId="61" w16cid:durableId="63377930">
     <w:abstractNumId w:val="2"/>
     <w:lvlOverride w:ilvl="0">
       <w:startOverride w:val="1"/>
@@ -57910,28 +58001,28 @@
       <w:startOverride w:val="1"/>
     </w:lvlOverride>
   </w:num>
-  <w:num w:numId="62" w16cid:durableId="1795827909">
+  <w:num w:numId="62" w16cid:durableId="960306963">
     <w:abstractNumId w:val="1"/>
   </w:num>
-  <w:num w:numId="63" w16cid:durableId="633563045">
+  <w:num w:numId="63" w16cid:durableId="1047756703">
     <w:abstractNumId w:val="1"/>
   </w:num>
-  <w:num w:numId="64" w16cid:durableId="319892871">
+  <w:num w:numId="64" w16cid:durableId="127627792">
     <w:abstractNumId w:val="1"/>
   </w:num>
-  <w:num w:numId="65" w16cid:durableId="741831310">
+  <w:num w:numId="65" w16cid:durableId="739865452">
     <w:abstractNumId w:val="1"/>
   </w:num>
-  <w:num w:numId="66" w16cid:durableId="2099520903">
+  <w:num w:numId="66" w16cid:durableId="1917283659">
     <w:abstractNumId w:val="1"/>
   </w:num>
-  <w:num w:numId="67" w16cid:durableId="1170104305">
+  <w:num w:numId="67" w16cid:durableId="303316649">
     <w:abstractNumId w:val="1"/>
   </w:num>
-  <w:num w:numId="68" w16cid:durableId="762653156">
+  <w:num w:numId="68" w16cid:durableId="218901103">
     <w:abstractNumId w:val="1"/>
   </w:num>
-  <w:num w:numId="69" w16cid:durableId="1726022589">
+  <w:num w:numId="69" w16cid:durableId="2060124633">
     <w:abstractNumId w:val="2"/>
     <w:lvlOverride w:ilvl="0">
       <w:startOverride w:val="1"/>
@@ -57961,16 +58052,16 @@
       <w:startOverride w:val="1"/>
     </w:lvlOverride>
   </w:num>
-  <w:num w:numId="70" w16cid:durableId="2138136138">
+  <w:num w:numId="70" w16cid:durableId="422339555">
     <w:abstractNumId w:val="1"/>
   </w:num>
-  <w:num w:numId="71" w16cid:durableId="269433298">
+  <w:num w:numId="71" w16cid:durableId="103118625">
     <w:abstractNumId w:val="1"/>
   </w:num>
-  <w:num w:numId="72" w16cid:durableId="1832595479">
+  <w:num w:numId="72" w16cid:durableId="1679429636">
     <w:abstractNumId w:val="1"/>
   </w:num>
-  <w:num w:numId="73" w16cid:durableId="478613498">
+  <w:num w:numId="73" w16cid:durableId="351299806">
     <w:abstractNumId w:val="2"/>
     <w:lvlOverride w:ilvl="0">
       <w:startOverride w:val="1"/>
@@ -58000,16 +58091,16 @@
       <w:startOverride w:val="1"/>
     </w:lvlOverride>
   </w:num>
-  <w:num w:numId="74" w16cid:durableId="1429040317">
+  <w:num w:numId="74" w16cid:durableId="721562831">
     <w:abstractNumId w:val="1"/>
   </w:num>
-  <w:num w:numId="75" w16cid:durableId="1420442448">
+  <w:num w:numId="75" w16cid:durableId="1067150751">
     <w:abstractNumId w:val="1"/>
   </w:num>
-  <w:num w:numId="76" w16cid:durableId="1194423872">
+  <w:num w:numId="76" w16cid:durableId="1422489071">
     <w:abstractNumId w:val="1"/>
   </w:num>
-  <w:num w:numId="77" w16cid:durableId="550848827">
+  <w:num w:numId="77" w16cid:durableId="72509280">
     <w:abstractNumId w:val="2"/>
     <w:lvlOverride w:ilvl="0">
       <w:startOverride w:val="1"/>
@@ -58039,13 +58130,13 @@
       <w:startOverride w:val="1"/>
     </w:lvlOverride>
   </w:num>
-  <w:num w:numId="78" w16cid:durableId="2018922532">
+  <w:num w:numId="78" w16cid:durableId="1399134007">
     <w:abstractNumId w:val="1"/>
   </w:num>
-  <w:num w:numId="79" w16cid:durableId="1115631916">
+  <w:num w:numId="79" w16cid:durableId="1469980846">
     <w:abstractNumId w:val="1"/>
   </w:num>
-  <w:num w:numId="80" w16cid:durableId="97458311">
+  <w:num w:numId="80" w16cid:durableId="1365137739">
     <w:abstractNumId w:val="2"/>
     <w:lvlOverride w:ilvl="0">
       <w:startOverride w:val="1"/>
@@ -58075,31 +58166,31 @@
       <w:startOverride w:val="1"/>
     </w:lvlOverride>
   </w:num>
-  <w:num w:numId="81" w16cid:durableId="897975024">
+  <w:num w:numId="81" w16cid:durableId="1767379647">
     <w:abstractNumId w:val="1"/>
   </w:num>
-  <w:num w:numId="82" w16cid:durableId="705371996">
+  <w:num w:numId="82" w16cid:durableId="2057469652">
     <w:abstractNumId w:val="1"/>
   </w:num>
-  <w:num w:numId="83" w16cid:durableId="501237464">
+  <w:num w:numId="83" w16cid:durableId="1319579349">
     <w:abstractNumId w:val="1"/>
   </w:num>
-  <w:num w:numId="84" w16cid:durableId="1216703154">
+  <w:num w:numId="84" w16cid:durableId="16350795">
     <w:abstractNumId w:val="1"/>
   </w:num>
-  <w:num w:numId="85" w16cid:durableId="1839611452">
+  <w:num w:numId="85" w16cid:durableId="332756378">
     <w:abstractNumId w:val="1"/>
   </w:num>
-  <w:num w:numId="86" w16cid:durableId="213544892">
+  <w:num w:numId="86" w16cid:durableId="316803930">
     <w:abstractNumId w:val="1"/>
   </w:num>
-  <w:num w:numId="87" w16cid:durableId="1889293773">
+  <w:num w:numId="87" w16cid:durableId="1974942367">
     <w:abstractNumId w:val="1"/>
   </w:num>
-  <w:num w:numId="88" w16cid:durableId="1429082315">
+  <w:num w:numId="88" w16cid:durableId="1191533007">
     <w:abstractNumId w:val="1"/>
   </w:num>
-  <w:num w:numId="89" w16cid:durableId="1672101228">
+  <w:num w:numId="89" w16cid:durableId="312028559">
     <w:abstractNumId w:val="2"/>
     <w:lvlOverride w:ilvl="0">
       <w:startOverride w:val="1"/>
@@ -58129,16 +58220,16 @@
       <w:startOverride w:val="1"/>
     </w:lvlOverride>
   </w:num>
-  <w:num w:numId="90" w16cid:durableId="1648392388">
+  <w:num w:numId="90" w16cid:durableId="1531719369">
     <w:abstractNumId w:val="1"/>
   </w:num>
-  <w:num w:numId="91" w16cid:durableId="1355764589">
+  <w:num w:numId="91" w16cid:durableId="865093174">
     <w:abstractNumId w:val="1"/>
   </w:num>
-  <w:num w:numId="92" w16cid:durableId="1150947544">
+  <w:num w:numId="92" w16cid:durableId="568882696">
     <w:abstractNumId w:val="1"/>
   </w:num>
-  <w:num w:numId="93" w16cid:durableId="1062872758">
+  <w:num w:numId="93" w16cid:durableId="1513304280">
     <w:abstractNumId w:val="2"/>
     <w:lvlOverride w:ilvl="0">
       <w:startOverride w:val="1"/>
@@ -58168,10 +58259,10 @@
       <w:startOverride w:val="1"/>
     </w:lvlOverride>
   </w:num>
-  <w:num w:numId="94" w16cid:durableId="1948855388">
+  <w:num w:numId="94" w16cid:durableId="72047863">
     <w:abstractNumId w:val="1"/>
   </w:num>
-  <w:num w:numId="95" w16cid:durableId="47847264">
+  <w:num w:numId="95" w16cid:durableId="70471936">
     <w:abstractNumId w:val="2"/>
     <w:lvlOverride w:ilvl="0">
       <w:startOverride w:val="1"/>
@@ -58201,10 +58292,10 @@
       <w:startOverride w:val="1"/>
     </w:lvlOverride>
   </w:num>
-  <w:num w:numId="96" w16cid:durableId="1061755374">
+  <w:num w:numId="96" w16cid:durableId="298540647">
     <w:abstractNumId w:val="1"/>
   </w:num>
-  <w:num w:numId="97" w16cid:durableId="1121535889">
+  <w:num w:numId="97" w16cid:durableId="1052848670">
     <w:abstractNumId w:val="2"/>
     <w:lvlOverride w:ilvl="0">
       <w:startOverride w:val="1"/>
@@ -58234,10 +58325,10 @@
       <w:startOverride w:val="1"/>
     </w:lvlOverride>
   </w:num>
-  <w:num w:numId="98" w16cid:durableId="1192494602">
+  <w:num w:numId="98" w16cid:durableId="524297432">
     <w:abstractNumId w:val="1"/>
   </w:num>
-  <w:num w:numId="99" w16cid:durableId="310327126">
+  <w:num w:numId="99" w16cid:durableId="1368411485">
     <w:abstractNumId w:val="2"/>
     <w:lvlOverride w:ilvl="0">
       <w:startOverride w:val="1"/>
@@ -58267,13 +58358,13 @@
       <w:startOverride w:val="1"/>
     </w:lvlOverride>
   </w:num>
-  <w:num w:numId="100" w16cid:durableId="1816992672">
+  <w:num w:numId="100" w16cid:durableId="554776161">
     <w:abstractNumId w:val="1"/>
   </w:num>
-  <w:num w:numId="101" w16cid:durableId="1730306451">
+  <w:num w:numId="101" w16cid:durableId="2074502486">
     <w:abstractNumId w:val="1"/>
   </w:num>
-  <w:num w:numId="102" w16cid:durableId="836577978">
+  <w:num w:numId="102" w16cid:durableId="1536649556">
     <w:abstractNumId w:val="2"/>
     <w:lvlOverride w:ilvl="0">
       <w:startOverride w:val="1"/>
@@ -58303,34 +58394,34 @@
       <w:startOverride w:val="1"/>
     </w:lvlOverride>
   </w:num>
-  <w:num w:numId="103" w16cid:durableId="1082877705">
+  <w:num w:numId="103" w16cid:durableId="2088913496">
     <w:abstractNumId w:val="1"/>
   </w:num>
-  <w:num w:numId="104" w16cid:durableId="660544663">
+  <w:num w:numId="104" w16cid:durableId="341783752">
     <w:abstractNumId w:val="1"/>
   </w:num>
-  <w:num w:numId="105" w16cid:durableId="2043747847">
+  <w:num w:numId="105" w16cid:durableId="287053185">
     <w:abstractNumId w:val="1"/>
   </w:num>
-  <w:num w:numId="106" w16cid:durableId="26878341">
+  <w:num w:numId="106" w16cid:durableId="1642688055">
     <w:abstractNumId w:val="1"/>
   </w:num>
-  <w:num w:numId="107" w16cid:durableId="1723862672">
+  <w:num w:numId="107" w16cid:durableId="1523208191">
     <w:abstractNumId w:val="1"/>
   </w:num>
-  <w:num w:numId="108" w16cid:durableId="219946172">
+  <w:num w:numId="108" w16cid:durableId="156500764">
     <w:abstractNumId w:val="1"/>
   </w:num>
-  <w:num w:numId="109" w16cid:durableId="26223866">
+  <w:num w:numId="109" w16cid:durableId="1895849034">
     <w:abstractNumId w:val="1"/>
   </w:num>
-  <w:num w:numId="110" w16cid:durableId="1805805647">
+  <w:num w:numId="110" w16cid:durableId="653725539">
     <w:abstractNumId w:val="1"/>
   </w:num>
-  <w:num w:numId="111" w16cid:durableId="1212230019">
+  <w:num w:numId="111" w16cid:durableId="1349523483">
     <w:abstractNumId w:val="1"/>
   </w:num>
-  <w:num w:numId="112" w16cid:durableId="230047685">
+  <w:num w:numId="112" w16cid:durableId="919488380">
     <w:abstractNumId w:val="2"/>
     <w:lvlOverride w:ilvl="0">
       <w:startOverride w:val="1"/>
@@ -58360,13 +58451,13 @@
       <w:startOverride w:val="1"/>
     </w:lvlOverride>
   </w:num>
-  <w:num w:numId="113" w16cid:durableId="1504977815">
+  <w:num w:numId="113" w16cid:durableId="1669211088">
     <w:abstractNumId w:val="1"/>
   </w:num>
-  <w:num w:numId="114" w16cid:durableId="1216576214">
+  <w:num w:numId="114" w16cid:durableId="159085895">
     <w:abstractNumId w:val="1"/>
   </w:num>
-  <w:num w:numId="115" w16cid:durableId="602228856">
+  <w:num w:numId="115" w16cid:durableId="1974672602">
     <w:abstractNumId w:val="2"/>
     <w:lvlOverride w:ilvl="0">
       <w:startOverride w:val="1"/>
@@ -58396,7 +58487,7 @@
       <w:startOverride w:val="1"/>
     </w:lvlOverride>
   </w:num>
-  <w:num w:numId="116" w16cid:durableId="978001093">
+  <w:num w:numId="116" w16cid:durableId="245308128">
     <w:abstractNumId w:val="2"/>
     <w:lvlOverride w:ilvl="0">
       <w:startOverride w:val="1"/>
@@ -58426,7 +58517,7 @@
       <w:startOverride w:val="1"/>
     </w:lvlOverride>
   </w:num>
-  <w:num w:numId="117" w16cid:durableId="1306079361">
+  <w:num w:numId="117" w16cid:durableId="799809384">
     <w:abstractNumId w:val="2"/>
     <w:lvlOverride w:ilvl="0">
       <w:startOverride w:val="1"/>
@@ -58456,16 +58547,16 @@
       <w:startOverride w:val="1"/>
     </w:lvlOverride>
   </w:num>
-  <w:num w:numId="118" w16cid:durableId="644897623">
+  <w:num w:numId="118" w16cid:durableId="1823692480">
     <w:abstractNumId w:val="1"/>
   </w:num>
-  <w:num w:numId="119" w16cid:durableId="1800371577">
+  <w:num w:numId="119" w16cid:durableId="1860969485">
     <w:abstractNumId w:val="1"/>
   </w:num>
-  <w:num w:numId="120" w16cid:durableId="170729257">
+  <w:num w:numId="120" w16cid:durableId="575744307">
     <w:abstractNumId w:val="1"/>
   </w:num>
-  <w:num w:numId="121" w16cid:durableId="1498382270">
+  <w:num w:numId="121" w16cid:durableId="2121950325">
     <w:abstractNumId w:val="2"/>
     <w:lvlOverride w:ilvl="0">
       <w:startOverride w:val="1"/>
@@ -58495,28 +58586,28 @@
       <w:startOverride w:val="1"/>
     </w:lvlOverride>
   </w:num>
-  <w:num w:numId="122" w16cid:durableId="857230795">
+  <w:num w:numId="122" w16cid:durableId="1095200730">
     <w:abstractNumId w:val="1"/>
   </w:num>
-  <w:num w:numId="123" w16cid:durableId="1791392906">
+  <w:num w:numId="123" w16cid:durableId="149560906">
     <w:abstractNumId w:val="1"/>
   </w:num>
-  <w:num w:numId="124" w16cid:durableId="780077287">
+  <w:num w:numId="124" w16cid:durableId="1142162502">
     <w:abstractNumId w:val="1"/>
   </w:num>
-  <w:num w:numId="125" w16cid:durableId="304313639">
+  <w:num w:numId="125" w16cid:durableId="774791096">
     <w:abstractNumId w:val="1"/>
   </w:num>
-  <w:num w:numId="126" w16cid:durableId="486094152">
+  <w:num w:numId="126" w16cid:durableId="412747675">
     <w:abstractNumId w:val="1"/>
   </w:num>
-  <w:num w:numId="127" w16cid:durableId="1470397161">
+  <w:num w:numId="127" w16cid:durableId="2103867064">
     <w:abstractNumId w:val="1"/>
   </w:num>
-  <w:num w:numId="128" w16cid:durableId="1044600458">
+  <w:num w:numId="128" w16cid:durableId="1879851953">
     <w:abstractNumId w:val="1"/>
   </w:num>
-  <w:num w:numId="129" w16cid:durableId="89351160">
+  <w:num w:numId="129" w16cid:durableId="569731850">
     <w:abstractNumId w:val="2"/>
     <w:lvlOverride w:ilvl="0">
       <w:startOverride w:val="1"/>
@@ -58546,7 +58637,7 @@
       <w:startOverride w:val="1"/>
     </w:lvlOverride>
   </w:num>
-  <w:num w:numId="130" w16cid:durableId="2036541594">
+  <w:num w:numId="130" w16cid:durableId="1601375433">
     <w:abstractNumId w:val="1"/>
   </w:num>
   <w:numIdMacAtCleanup w:val="130"/>
@@ -59813,7 +59904,7 @@
     <w:next w:val="Normal"/>
     <w:autoRedefine/>
     <w:uiPriority w:val="39"/>
-    <w:rsid w:val="006E7DA0"/>
+    <w:rsid w:val="00395E25"/>
   </w:style>
   <w:style w:type="paragraph" w:styleId="TOC2">
     <w:name w:val="toc 2"/>
@@ -59821,7 +59912,7 @@
     <w:next w:val="Normal"/>
     <w:autoRedefine/>
     <w:uiPriority w:val="39"/>
-    <w:rsid w:val="006E7DA0"/>
+    <w:rsid w:val="00395E25"/>
     <w:pPr>
       <w:ind w:left="210"/>
     </w:pPr>
@@ -59833,7 +59924,7 @@
     <w:autoRedefine/>
     <w:uiPriority w:val="39"/>
     <w:unhideWhenUsed/>
-    <w:rsid w:val="006E7DA0"/>
+    <w:rsid w:val="00395E25"/>
     <w:pPr>
       <w:spacing w:line="278" w:lineRule="auto"/>
       <w:ind w:left="480"/>
@@ -59853,7 +59944,7 @@
     <w:autoRedefine/>
     <w:uiPriority w:val="39"/>
     <w:unhideWhenUsed/>
-    <w:rsid w:val="006E7DA0"/>
+    <w:rsid w:val="00395E25"/>
     <w:pPr>
       <w:spacing w:line="278" w:lineRule="auto"/>
       <w:ind w:left="720"/>
@@ -59873,7 +59964,7 @@
     <w:autoRedefine/>
     <w:uiPriority w:val="39"/>
     <w:unhideWhenUsed/>
-    <w:rsid w:val="006E7DA0"/>
+    <w:rsid w:val="00395E25"/>
     <w:pPr>
       <w:spacing w:line="278" w:lineRule="auto"/>
       <w:ind w:left="960"/>
@@ -59893,7 +59984,7 @@
     <w:autoRedefine/>
     <w:uiPriority w:val="39"/>
     <w:unhideWhenUsed/>
-    <w:rsid w:val="006E7DA0"/>
+    <w:rsid w:val="00395E25"/>
     <w:pPr>
       <w:spacing w:line="278" w:lineRule="auto"/>
       <w:ind w:left="1200"/>
@@ -59913,7 +60004,7 @@
     <w:autoRedefine/>
     <w:uiPriority w:val="39"/>
     <w:unhideWhenUsed/>
-    <w:rsid w:val="006E7DA0"/>
+    <w:rsid w:val="00395E25"/>
     <w:pPr>
       <w:spacing w:line="278" w:lineRule="auto"/>
       <w:ind w:left="1440"/>
@@ -59933,7 +60024,7 @@
     <w:autoRedefine/>
     <w:uiPriority w:val="39"/>
     <w:unhideWhenUsed/>
-    <w:rsid w:val="006E7DA0"/>
+    <w:rsid w:val="00395E25"/>
     <w:pPr>
       <w:spacing w:line="278" w:lineRule="auto"/>
       <w:ind w:left="1680"/>
@@ -59953,7 +60044,7 @@
     <w:autoRedefine/>
     <w:uiPriority w:val="39"/>
     <w:unhideWhenUsed/>
-    <w:rsid w:val="006E7DA0"/>
+    <w:rsid w:val="00395E25"/>
     <w:pPr>
       <w:spacing w:line="278" w:lineRule="auto"/>
       <w:ind w:left="1920"/>
@@ -59972,7 +60063,7 @@
     <w:uiPriority w:val="99"/>
     <w:semiHidden/>
     <w:unhideWhenUsed/>
-    <w:rsid w:val="006E7DA0"/>
+    <w:rsid w:val="00395E25"/>
     <w:rPr>
       <w:color w:val="605E5C"/>
       <w:shd w:val="clear" w:color="auto" w:fill="E1DFDD"/>

</xml_diff>

<commit_message>
Keywords: 608 -> 1,006 terms (mathematics, statistics, population/statistical genetics, genomics, clinical genetics, cell biology, immunology, neuroscience, ecology); youtube_transcripts --recheck-off-topic
</commit_message>
<xml_diff>
--- a/tinyGPT_learning_guide.docx
+++ b/tinyGPT_learning_guide.docx
@@ -35,7 +35,7 @@
           <w:sz w:val="21"/>
           <w:szCs w:val="24"/>
         </w:rPr>
-        <w:id w:val="-126777943"/>
+        <w:id w:val="902952737"/>
         <w:docPartObj>
           <w:docPartGallery w:val="Table of Contents"/>
           <w:docPartUnique/>
@@ -77,7 +77,7 @@
           <w:r>
             <w:fldChar w:fldCharType="separate"/>
           </w:r>
-          <w:hyperlink w:anchor="_Toc241663686" w:history="1">
+          <w:hyperlink w:anchor="_Toc241665114" w:history="1">
             <w:r>
               <w:rPr>
                 <w:rStyle w:val="Hyperlink"/>
@@ -123,7 +123,7 @@
                 <w:noProof/>
                 <w:webHidden/>
               </w:rPr>
-              <w:instrText xml:space="preserve"> PAGEREF _Toc241663686 \h </w:instrText>
+              <w:instrText xml:space="preserve"> PAGEREF _Toc241665114 \h </w:instrText>
             </w:r>
             <w:r>
               <w:rPr>
@@ -171,7 +171,7 @@
               <w14:ligatures w14:val="standardContextual"/>
             </w:rPr>
           </w:pPr>
-          <w:hyperlink w:anchor="_Toc241663687" w:history="1">
+          <w:hyperlink w:anchor="_Toc241665115" w:history="1">
             <w:r>
               <w:rPr>
                 <w:rStyle w:val="Hyperlink"/>
@@ -217,7 +217,7 @@
                 <w:noProof/>
                 <w:webHidden/>
               </w:rPr>
-              <w:instrText xml:space="preserve"> PAGEREF _Toc241663687 \h </w:instrText>
+              <w:instrText xml:space="preserve"> PAGEREF _Toc241665115 \h </w:instrText>
             </w:r>
             <w:r>
               <w:rPr>
@@ -265,7 +265,7 @@
               <w14:ligatures w14:val="standardContextual"/>
             </w:rPr>
           </w:pPr>
-          <w:hyperlink w:anchor="_Toc241663688" w:history="1">
+          <w:hyperlink w:anchor="_Toc241665116" w:history="1">
             <w:r>
               <w:rPr>
                 <w:rStyle w:val="Hyperlink"/>
@@ -311,7 +311,7 @@
                 <w:noProof/>
                 <w:webHidden/>
               </w:rPr>
-              <w:instrText xml:space="preserve"> PAGEREF _Toc241663688 \h </w:instrText>
+              <w:instrText xml:space="preserve"> PAGEREF _Toc241665116 \h </w:instrText>
             </w:r>
             <w:r>
               <w:rPr>
@@ -359,7 +359,7 @@
               <w14:ligatures w14:val="standardContextual"/>
             </w:rPr>
           </w:pPr>
-          <w:hyperlink w:anchor="_Toc241663689" w:history="1">
+          <w:hyperlink w:anchor="_Toc241665117" w:history="1">
             <w:r>
               <w:rPr>
                 <w:rStyle w:val="Hyperlink"/>
@@ -405,7 +405,7 @@
                 <w:noProof/>
                 <w:webHidden/>
               </w:rPr>
-              <w:instrText xml:space="preserve"> PAGEREF _Toc241663689 \h </w:instrText>
+              <w:instrText xml:space="preserve"> PAGEREF _Toc241665117 \h </w:instrText>
             </w:r>
             <w:r>
               <w:rPr>
@@ -453,7 +453,7 @@
               <w14:ligatures w14:val="standardContextual"/>
             </w:rPr>
           </w:pPr>
-          <w:hyperlink w:anchor="_Toc241663690" w:history="1">
+          <w:hyperlink w:anchor="_Toc241665118" w:history="1">
             <w:r>
               <w:rPr>
                 <w:rStyle w:val="Hyperlink"/>
@@ -499,7 +499,7 @@
                 <w:noProof/>
                 <w:webHidden/>
               </w:rPr>
-              <w:instrText xml:space="preserve"> PAGEREF _Toc241663690 \h </w:instrText>
+              <w:instrText xml:space="preserve"> PAGEREF _Toc241665118 \h </w:instrText>
             </w:r>
             <w:r>
               <w:rPr>
@@ -547,7 +547,7 @@
               <w14:ligatures w14:val="standardContextual"/>
             </w:rPr>
           </w:pPr>
-          <w:hyperlink w:anchor="_Toc241663691" w:history="1">
+          <w:hyperlink w:anchor="_Toc241665119" w:history="1">
             <w:r>
               <w:rPr>
                 <w:rStyle w:val="Hyperlink"/>
@@ -593,7 +593,7 @@
                 <w:noProof/>
                 <w:webHidden/>
               </w:rPr>
-              <w:instrText xml:space="preserve"> PAGEREF _Toc241663691 \h </w:instrText>
+              <w:instrText xml:space="preserve"> PAGEREF _Toc241665119 \h </w:instrText>
             </w:r>
             <w:r>
               <w:rPr>
@@ -641,7 +641,7 @@
               <w14:ligatures w14:val="standardContextual"/>
             </w:rPr>
           </w:pPr>
-          <w:hyperlink w:anchor="_Toc241663692" w:history="1">
+          <w:hyperlink w:anchor="_Toc241665120" w:history="1">
             <w:r>
               <w:rPr>
                 <w:rStyle w:val="Hyperlink"/>
@@ -687,7 +687,7 @@
                 <w:noProof/>
                 <w:webHidden/>
               </w:rPr>
-              <w:instrText xml:space="preserve"> PAGEREF _Toc241663692 \h </w:instrText>
+              <w:instrText xml:space="preserve"> PAGEREF _Toc241665120 \h </w:instrText>
             </w:r>
             <w:r>
               <w:rPr>
@@ -735,7 +735,7 @@
               <w14:ligatures w14:val="standardContextual"/>
             </w:rPr>
           </w:pPr>
-          <w:hyperlink w:anchor="_Toc241663693" w:history="1">
+          <w:hyperlink w:anchor="_Toc241665121" w:history="1">
             <w:r>
               <w:rPr>
                 <w:rStyle w:val="Hyperlink"/>
@@ -781,7 +781,7 @@
                 <w:noProof/>
                 <w:webHidden/>
               </w:rPr>
-              <w:instrText xml:space="preserve"> PAGEREF _Toc241663693 \h </w:instrText>
+              <w:instrText xml:space="preserve"> PAGEREF _Toc241665121 \h </w:instrText>
             </w:r>
             <w:r>
               <w:rPr>
@@ -829,7 +829,7 @@
               <w14:ligatures w14:val="standardContextual"/>
             </w:rPr>
           </w:pPr>
-          <w:hyperlink w:anchor="_Toc241663694" w:history="1">
+          <w:hyperlink w:anchor="_Toc241665122" w:history="1">
             <w:r>
               <w:rPr>
                 <w:rStyle w:val="Hyperlink"/>
@@ -875,7 +875,7 @@
                 <w:noProof/>
                 <w:webHidden/>
               </w:rPr>
-              <w:instrText xml:space="preserve"> PAGEREF _Toc241663694 \h </w:instrText>
+              <w:instrText xml:space="preserve"> PAGEREF _Toc241665122 \h </w:instrText>
             </w:r>
             <w:r>
               <w:rPr>
@@ -923,7 +923,7 @@
               <w14:ligatures w14:val="standardContextual"/>
             </w:rPr>
           </w:pPr>
-          <w:hyperlink w:anchor="_Toc241663695" w:history="1">
+          <w:hyperlink w:anchor="_Toc241665123" w:history="1">
             <w:r>
               <w:rPr>
                 <w:rStyle w:val="Hyperlink"/>
@@ -969,7 +969,7 @@
                 <w:noProof/>
                 <w:webHidden/>
               </w:rPr>
-              <w:instrText xml:space="preserve"> PAGEREF _Toc241663695 \h </w:instrText>
+              <w:instrText xml:space="preserve"> PAGEREF _Toc241665123 \h </w:instrText>
             </w:r>
             <w:r>
               <w:rPr>
@@ -1017,7 +1017,7 @@
               <w14:ligatures w14:val="standardContextual"/>
             </w:rPr>
           </w:pPr>
-          <w:hyperlink w:anchor="_Toc241663696" w:history="1">
+          <w:hyperlink w:anchor="_Toc241665124" w:history="1">
             <w:r>
               <w:rPr>
                 <w:rStyle w:val="Hyperlink"/>
@@ -1063,7 +1063,7 @@
                 <w:noProof/>
                 <w:webHidden/>
               </w:rPr>
-              <w:instrText xml:space="preserve"> PAGEREF _Toc241663696 \h </w:instrText>
+              <w:instrText xml:space="preserve"> PAGEREF _Toc241665124 \h </w:instrText>
             </w:r>
             <w:r>
               <w:rPr>
@@ -1111,7 +1111,7 @@
               <w14:ligatures w14:val="standardContextual"/>
             </w:rPr>
           </w:pPr>
-          <w:hyperlink w:anchor="_Toc241663697" w:history="1">
+          <w:hyperlink w:anchor="_Toc241665125" w:history="1">
             <w:r>
               <w:rPr>
                 <w:rStyle w:val="Hyperlink"/>
@@ -1157,7 +1157,7 @@
                 <w:noProof/>
                 <w:webHidden/>
               </w:rPr>
-              <w:instrText xml:space="preserve"> PAGEREF _Toc241663697 \h </w:instrText>
+              <w:instrText xml:space="preserve"> PAGEREF _Toc241665125 \h </w:instrText>
             </w:r>
             <w:r>
               <w:rPr>
@@ -1205,7 +1205,7 @@
               <w14:ligatures w14:val="standardContextual"/>
             </w:rPr>
           </w:pPr>
-          <w:hyperlink w:anchor="_Toc241663698" w:history="1">
+          <w:hyperlink w:anchor="_Toc241665126" w:history="1">
             <w:r>
               <w:rPr>
                 <w:rStyle w:val="Hyperlink"/>
@@ -1251,7 +1251,7 @@
                 <w:noProof/>
                 <w:webHidden/>
               </w:rPr>
-              <w:instrText xml:space="preserve"> PAGEREF _Toc241663698 \h </w:instrText>
+              <w:instrText xml:space="preserve"> PAGEREF _Toc241665126 \h </w:instrText>
             </w:r>
             <w:r>
               <w:rPr>
@@ -1299,7 +1299,7 @@
               <w14:ligatures w14:val="standardContextual"/>
             </w:rPr>
           </w:pPr>
-          <w:hyperlink w:anchor="_Toc241663699" w:history="1">
+          <w:hyperlink w:anchor="_Toc241665127" w:history="1">
             <w:r>
               <w:rPr>
                 <w:rStyle w:val="Hyperlink"/>
@@ -1345,7 +1345,7 @@
                 <w:noProof/>
                 <w:webHidden/>
               </w:rPr>
-              <w:instrText xml:space="preserve"> PAGEREF _Toc241663699 \h </w:instrText>
+              <w:instrText xml:space="preserve"> PAGEREF _Toc241665127 \h </w:instrText>
             </w:r>
             <w:r>
               <w:rPr>
@@ -1393,7 +1393,7 @@
               <w14:ligatures w14:val="standardContextual"/>
             </w:rPr>
           </w:pPr>
-          <w:hyperlink w:anchor="_Toc241663700" w:history="1">
+          <w:hyperlink w:anchor="_Toc241665128" w:history="1">
             <w:r>
               <w:rPr>
                 <w:rStyle w:val="Hyperlink"/>
@@ -1439,7 +1439,7 @@
                 <w:noProof/>
                 <w:webHidden/>
               </w:rPr>
-              <w:instrText xml:space="preserve"> PAGEREF _Toc241663700 \h </w:instrText>
+              <w:instrText xml:space="preserve"> PAGEREF _Toc241665128 \h </w:instrText>
             </w:r>
             <w:r>
               <w:rPr>
@@ -1487,7 +1487,7 @@
               <w14:ligatures w14:val="standardContextual"/>
             </w:rPr>
           </w:pPr>
-          <w:hyperlink w:anchor="_Toc241663701" w:history="1">
+          <w:hyperlink w:anchor="_Toc241665129" w:history="1">
             <w:r>
               <w:rPr>
                 <w:rStyle w:val="Hyperlink"/>
@@ -1533,7 +1533,7 @@
                 <w:noProof/>
                 <w:webHidden/>
               </w:rPr>
-              <w:instrText xml:space="preserve"> PAGEREF _Toc241663701 \h </w:instrText>
+              <w:instrText xml:space="preserve"> PAGEREF _Toc241665129 \h </w:instrText>
             </w:r>
             <w:r>
               <w:rPr>
@@ -1581,7 +1581,7 @@
               <w14:ligatures w14:val="standardContextual"/>
             </w:rPr>
           </w:pPr>
-          <w:hyperlink w:anchor="_Toc241663702" w:history="1">
+          <w:hyperlink w:anchor="_Toc241665130" w:history="1">
             <w:r>
               <w:rPr>
                 <w:rStyle w:val="Hyperlink"/>
@@ -1627,7 +1627,7 @@
                 <w:noProof/>
                 <w:webHidden/>
               </w:rPr>
-              <w:instrText xml:space="preserve"> PAGEREF _Toc241663702 \h </w:instrText>
+              <w:instrText xml:space="preserve"> PAGEREF _Toc241665130 \h </w:instrText>
             </w:r>
             <w:r>
               <w:rPr>
@@ -1675,7 +1675,7 @@
               <w14:ligatures w14:val="standardContextual"/>
             </w:rPr>
           </w:pPr>
-          <w:hyperlink w:anchor="_Toc241663703" w:history="1">
+          <w:hyperlink w:anchor="_Toc241665131" w:history="1">
             <w:r>
               <w:rPr>
                 <w:rStyle w:val="Hyperlink"/>
@@ -1721,7 +1721,7 @@
                 <w:noProof/>
                 <w:webHidden/>
               </w:rPr>
-              <w:instrText xml:space="preserve"> PAGEREF _Toc241663703 \h </w:instrText>
+              <w:instrText xml:space="preserve"> PAGEREF _Toc241665131 \h </w:instrText>
             </w:r>
             <w:r>
               <w:rPr>
@@ -1769,7 +1769,7 @@
               <w14:ligatures w14:val="standardContextual"/>
             </w:rPr>
           </w:pPr>
-          <w:hyperlink w:anchor="_Toc241663704" w:history="1">
+          <w:hyperlink w:anchor="_Toc241665132" w:history="1">
             <w:r>
               <w:rPr>
                 <w:rStyle w:val="Hyperlink"/>
@@ -1815,7 +1815,7 @@
                 <w:noProof/>
                 <w:webHidden/>
               </w:rPr>
-              <w:instrText xml:space="preserve"> PAGEREF _Toc241663704 \h </w:instrText>
+              <w:instrText xml:space="preserve"> PAGEREF _Toc241665132 \h </w:instrText>
             </w:r>
             <w:r>
               <w:rPr>
@@ -1863,7 +1863,7 @@
               <w14:ligatures w14:val="standardContextual"/>
             </w:rPr>
           </w:pPr>
-          <w:hyperlink w:anchor="_Toc241663705" w:history="1">
+          <w:hyperlink w:anchor="_Toc241665133" w:history="1">
             <w:r>
               <w:rPr>
                 <w:rStyle w:val="Hyperlink"/>
@@ -1909,7 +1909,7 @@
                 <w:noProof/>
                 <w:webHidden/>
               </w:rPr>
-              <w:instrText xml:space="preserve"> PAGEREF _Toc241663705 \h </w:instrText>
+              <w:instrText xml:space="preserve"> PAGEREF _Toc241665133 \h </w:instrText>
             </w:r>
             <w:r>
               <w:rPr>
@@ -1957,7 +1957,7 @@
               <w14:ligatures w14:val="standardContextual"/>
             </w:rPr>
           </w:pPr>
-          <w:hyperlink w:anchor="_Toc241663706" w:history="1">
+          <w:hyperlink w:anchor="_Toc241665134" w:history="1">
             <w:r>
               <w:rPr>
                 <w:rStyle w:val="Hyperlink"/>
@@ -2003,7 +2003,7 @@
                 <w:noProof/>
                 <w:webHidden/>
               </w:rPr>
-              <w:instrText xml:space="preserve"> PAGEREF _Toc241663706 \h </w:instrText>
+              <w:instrText xml:space="preserve"> PAGEREF _Toc241665134 \h </w:instrText>
             </w:r>
             <w:r>
               <w:rPr>
@@ -2051,7 +2051,7 @@
               <w14:ligatures w14:val="standardContextual"/>
             </w:rPr>
           </w:pPr>
-          <w:hyperlink w:anchor="_Toc241663707" w:history="1">
+          <w:hyperlink w:anchor="_Toc241665135" w:history="1">
             <w:r>
               <w:rPr>
                 <w:rStyle w:val="Hyperlink"/>
@@ -2097,7 +2097,7 @@
                 <w:noProof/>
                 <w:webHidden/>
               </w:rPr>
-              <w:instrText xml:space="preserve"> PAGEREF _Toc241663707 \h </w:instrText>
+              <w:instrText xml:space="preserve"> PAGEREF _Toc241665135 \h </w:instrText>
             </w:r>
             <w:r>
               <w:rPr>
@@ -2145,7 +2145,7 @@
               <w14:ligatures w14:val="standardContextual"/>
             </w:rPr>
           </w:pPr>
-          <w:hyperlink w:anchor="_Toc241663708" w:history="1">
+          <w:hyperlink w:anchor="_Toc241665136" w:history="1">
             <w:r>
               <w:rPr>
                 <w:rStyle w:val="Hyperlink"/>
@@ -2191,7 +2191,7 @@
                 <w:noProof/>
                 <w:webHidden/>
               </w:rPr>
-              <w:instrText xml:space="preserve"> PAGEREF _Toc241663708 \h </w:instrText>
+              <w:instrText xml:space="preserve"> PAGEREF _Toc241665136 \h </w:instrText>
             </w:r>
             <w:r>
               <w:rPr>
@@ -2239,7 +2239,7 @@
               <w14:ligatures w14:val="standardContextual"/>
             </w:rPr>
           </w:pPr>
-          <w:hyperlink w:anchor="_Toc241663709" w:history="1">
+          <w:hyperlink w:anchor="_Toc241665137" w:history="1">
             <w:r>
               <w:rPr>
                 <w:rStyle w:val="Hyperlink"/>
@@ -2285,7 +2285,7 @@
                 <w:noProof/>
                 <w:webHidden/>
               </w:rPr>
-              <w:instrText xml:space="preserve"> PAGEREF _Toc241663709 \h </w:instrText>
+              <w:instrText xml:space="preserve"> PAGEREF _Toc241665137 \h </w:instrText>
             </w:r>
             <w:r>
               <w:rPr>
@@ -2333,7 +2333,7 @@
               <w14:ligatures w14:val="standardContextual"/>
             </w:rPr>
           </w:pPr>
-          <w:hyperlink w:anchor="_Toc241663710" w:history="1">
+          <w:hyperlink w:anchor="_Toc241665138" w:history="1">
             <w:r>
               <w:rPr>
                 <w:rStyle w:val="Hyperlink"/>
@@ -2379,7 +2379,7 @@
                 <w:noProof/>
                 <w:webHidden/>
               </w:rPr>
-              <w:instrText xml:space="preserve"> PAGEREF _Toc241663710 \h </w:instrText>
+              <w:instrText xml:space="preserve"> PAGEREF _Toc241665138 \h </w:instrText>
             </w:r>
             <w:r>
               <w:rPr>
@@ -2427,7 +2427,7 @@
               <w14:ligatures w14:val="standardContextual"/>
             </w:rPr>
           </w:pPr>
-          <w:hyperlink w:anchor="_Toc241663711" w:history="1">
+          <w:hyperlink w:anchor="_Toc241665139" w:history="1">
             <w:r>
               <w:rPr>
                 <w:rStyle w:val="Hyperlink"/>
@@ -2473,7 +2473,7 @@
                 <w:noProof/>
                 <w:webHidden/>
               </w:rPr>
-              <w:instrText xml:space="preserve"> PAGEREF _Toc241663711 \h </w:instrText>
+              <w:instrText xml:space="preserve"> PAGEREF _Toc241665139 \h </w:instrText>
             </w:r>
             <w:r>
               <w:rPr>
@@ -2521,7 +2521,7 @@
               <w14:ligatures w14:val="standardContextual"/>
             </w:rPr>
           </w:pPr>
-          <w:hyperlink w:anchor="_Toc241663712" w:history="1">
+          <w:hyperlink w:anchor="_Toc241665140" w:history="1">
             <w:r>
               <w:rPr>
                 <w:rStyle w:val="Hyperlink"/>
@@ -2567,7 +2567,7 @@
                 <w:noProof/>
                 <w:webHidden/>
               </w:rPr>
-              <w:instrText xml:space="preserve"> PAGEREF _Toc241663712 \h </w:instrText>
+              <w:instrText xml:space="preserve"> PAGEREF _Toc241665140 \h </w:instrText>
             </w:r>
             <w:r>
               <w:rPr>
@@ -2615,7 +2615,7 @@
               <w14:ligatures w14:val="standardContextual"/>
             </w:rPr>
           </w:pPr>
-          <w:hyperlink w:anchor="_Toc241663713" w:history="1">
+          <w:hyperlink w:anchor="_Toc241665141" w:history="1">
             <w:r>
               <w:rPr>
                 <w:rStyle w:val="Hyperlink"/>
@@ -2661,7 +2661,7 @@
                 <w:noProof/>
                 <w:webHidden/>
               </w:rPr>
-              <w:instrText xml:space="preserve"> PAGEREF _Toc241663713 \h </w:instrText>
+              <w:instrText xml:space="preserve"> PAGEREF _Toc241665141 \h </w:instrText>
             </w:r>
             <w:r>
               <w:rPr>
@@ -2709,7 +2709,7 @@
               <w14:ligatures w14:val="standardContextual"/>
             </w:rPr>
           </w:pPr>
-          <w:hyperlink w:anchor="_Toc241663714" w:history="1">
+          <w:hyperlink w:anchor="_Toc241665142" w:history="1">
             <w:r>
               <w:rPr>
                 <w:rStyle w:val="Hyperlink"/>
@@ -2755,7 +2755,7 @@
                 <w:noProof/>
                 <w:webHidden/>
               </w:rPr>
-              <w:instrText xml:space="preserve"> PAGEREF _Toc241663714 \h </w:instrText>
+              <w:instrText xml:space="preserve"> PAGEREF _Toc241665142 \h </w:instrText>
             </w:r>
             <w:r>
               <w:rPr>
@@ -2803,7 +2803,7 @@
               <w14:ligatures w14:val="standardContextual"/>
             </w:rPr>
           </w:pPr>
-          <w:hyperlink w:anchor="_Toc241663715" w:history="1">
+          <w:hyperlink w:anchor="_Toc241665143" w:history="1">
             <w:r>
               <w:rPr>
                 <w:rStyle w:val="Hyperlink"/>
@@ -2849,7 +2849,7 @@
                 <w:noProof/>
                 <w:webHidden/>
               </w:rPr>
-              <w:instrText xml:space="preserve"> PAGEREF _Toc241663715 \h </w:instrText>
+              <w:instrText xml:space="preserve"> PAGEREF _Toc241665143 \h </w:instrText>
             </w:r>
             <w:r>
               <w:rPr>
@@ -2897,7 +2897,7 @@
               <w14:ligatures w14:val="standardContextual"/>
             </w:rPr>
           </w:pPr>
-          <w:hyperlink w:anchor="_Toc241663716" w:history="1">
+          <w:hyperlink w:anchor="_Toc241665144" w:history="1">
             <w:r>
               <w:rPr>
                 <w:rStyle w:val="Hyperlink"/>
@@ -2943,7 +2943,7 @@
                 <w:noProof/>
                 <w:webHidden/>
               </w:rPr>
-              <w:instrText xml:space="preserve"> PAGEREF _Toc241663716 \h </w:instrText>
+              <w:instrText xml:space="preserve"> PAGEREF _Toc241665144 \h </w:instrText>
             </w:r>
             <w:r>
               <w:rPr>
@@ -2991,7 +2991,7 @@
               <w14:ligatures w14:val="standardContextual"/>
             </w:rPr>
           </w:pPr>
-          <w:hyperlink w:anchor="_Toc241663717" w:history="1">
+          <w:hyperlink w:anchor="_Toc241665145" w:history="1">
             <w:r>
               <w:rPr>
                 <w:rStyle w:val="Hyperlink"/>
@@ -3037,7 +3037,7 @@
                 <w:noProof/>
                 <w:webHidden/>
               </w:rPr>
-              <w:instrText xml:space="preserve"> PAGEREF _Toc241663717 \h </w:instrText>
+              <w:instrText xml:space="preserve"> PAGEREF _Toc241665145 \h </w:instrText>
             </w:r>
             <w:r>
               <w:rPr>
@@ -3057,7 +3057,7 @@
                 <w:noProof/>
                 <w:webHidden/>
               </w:rPr>
-              <w:t>21</w:t>
+              <w:t>22</w:t>
             </w:r>
             <w:r>
               <w:rPr>
@@ -3085,7 +3085,7 @@
               <w14:ligatures w14:val="standardContextual"/>
             </w:rPr>
           </w:pPr>
-          <w:hyperlink w:anchor="_Toc241663718" w:history="1">
+          <w:hyperlink w:anchor="_Toc241665146" w:history="1">
             <w:r>
               <w:rPr>
                 <w:rStyle w:val="Hyperlink"/>
@@ -3131,7 +3131,7 @@
                 <w:noProof/>
                 <w:webHidden/>
               </w:rPr>
-              <w:instrText xml:space="preserve"> PAGEREF _Toc241663718 \h </w:instrText>
+              <w:instrText xml:space="preserve"> PAGEREF _Toc241665146 \h </w:instrText>
             </w:r>
             <w:r>
               <w:rPr>
@@ -3179,7 +3179,7 @@
               <w14:ligatures w14:val="standardContextual"/>
             </w:rPr>
           </w:pPr>
-          <w:hyperlink w:anchor="_Toc241663719" w:history="1">
+          <w:hyperlink w:anchor="_Toc241665147" w:history="1">
             <w:r>
               <w:rPr>
                 <w:rStyle w:val="Hyperlink"/>
@@ -3225,7 +3225,7 @@
                 <w:noProof/>
                 <w:webHidden/>
               </w:rPr>
-              <w:instrText xml:space="preserve"> PAGEREF _Toc241663719 \h </w:instrText>
+              <w:instrText xml:space="preserve"> PAGEREF _Toc241665147 \h </w:instrText>
             </w:r>
             <w:r>
               <w:rPr>
@@ -3273,7 +3273,7 @@
               <w14:ligatures w14:val="standardContextual"/>
             </w:rPr>
           </w:pPr>
-          <w:hyperlink w:anchor="_Toc241663720" w:history="1">
+          <w:hyperlink w:anchor="_Toc241665148" w:history="1">
             <w:r>
               <w:rPr>
                 <w:rStyle w:val="Hyperlink"/>
@@ -3319,7 +3319,7 @@
                 <w:noProof/>
                 <w:webHidden/>
               </w:rPr>
-              <w:instrText xml:space="preserve"> PAGEREF _Toc241663720 \h </w:instrText>
+              <w:instrText xml:space="preserve"> PAGEREF _Toc241665148 \h </w:instrText>
             </w:r>
             <w:r>
               <w:rPr>
@@ -3367,7 +3367,7 @@
               <w14:ligatures w14:val="standardContextual"/>
             </w:rPr>
           </w:pPr>
-          <w:hyperlink w:anchor="_Toc241663721" w:history="1">
+          <w:hyperlink w:anchor="_Toc241665149" w:history="1">
             <w:r>
               <w:rPr>
                 <w:rStyle w:val="Hyperlink"/>
@@ -3413,7 +3413,7 @@
                 <w:noProof/>
                 <w:webHidden/>
               </w:rPr>
-              <w:instrText xml:space="preserve"> PAGEREF _Toc241663721 \h </w:instrText>
+              <w:instrText xml:space="preserve"> PAGEREF _Toc241665149 \h </w:instrText>
             </w:r>
             <w:r>
               <w:rPr>
@@ -3461,7 +3461,7 @@
               <w14:ligatures w14:val="standardContextual"/>
             </w:rPr>
           </w:pPr>
-          <w:hyperlink w:anchor="_Toc241663722" w:history="1">
+          <w:hyperlink w:anchor="_Toc241665150" w:history="1">
             <w:r>
               <w:rPr>
                 <w:rStyle w:val="Hyperlink"/>
@@ -3507,7 +3507,7 @@
                 <w:noProof/>
                 <w:webHidden/>
               </w:rPr>
-              <w:instrText xml:space="preserve"> PAGEREF _Toc241663722 \h </w:instrText>
+              <w:instrText xml:space="preserve"> PAGEREF _Toc241665150 \h </w:instrText>
             </w:r>
             <w:r>
               <w:rPr>
@@ -3555,7 +3555,7 @@
               <w14:ligatures w14:val="standardContextual"/>
             </w:rPr>
           </w:pPr>
-          <w:hyperlink w:anchor="_Toc241663723" w:history="1">
+          <w:hyperlink w:anchor="_Toc241665151" w:history="1">
             <w:r>
               <w:rPr>
                 <w:rStyle w:val="Hyperlink"/>
@@ -3601,7 +3601,7 @@
                 <w:noProof/>
                 <w:webHidden/>
               </w:rPr>
-              <w:instrText xml:space="preserve"> PAGEREF _Toc241663723 \h </w:instrText>
+              <w:instrText xml:space="preserve"> PAGEREF _Toc241665151 \h </w:instrText>
             </w:r>
             <w:r>
               <w:rPr>
@@ -3649,7 +3649,7 @@
               <w14:ligatures w14:val="standardContextual"/>
             </w:rPr>
           </w:pPr>
-          <w:hyperlink w:anchor="_Toc241663724" w:history="1">
+          <w:hyperlink w:anchor="_Toc241665152" w:history="1">
             <w:r>
               <w:rPr>
                 <w:rStyle w:val="Hyperlink"/>
@@ -3695,7 +3695,7 @@
                 <w:noProof/>
                 <w:webHidden/>
               </w:rPr>
-              <w:instrText xml:space="preserve"> PAGEREF _Toc241663724 \h </w:instrText>
+              <w:instrText xml:space="preserve"> PAGEREF _Toc241665152 \h </w:instrText>
             </w:r>
             <w:r>
               <w:rPr>
@@ -3743,7 +3743,7 @@
               <w14:ligatures w14:val="standardContextual"/>
             </w:rPr>
           </w:pPr>
-          <w:hyperlink w:anchor="_Toc241663725" w:history="1">
+          <w:hyperlink w:anchor="_Toc241665153" w:history="1">
             <w:r>
               <w:rPr>
                 <w:rStyle w:val="Hyperlink"/>
@@ -3789,7 +3789,7 @@
                 <w:noProof/>
                 <w:webHidden/>
               </w:rPr>
-              <w:instrText xml:space="preserve"> PAGEREF _Toc241663725 \h </w:instrText>
+              <w:instrText xml:space="preserve"> PAGEREF _Toc241665153 \h </w:instrText>
             </w:r>
             <w:r>
               <w:rPr>
@@ -3837,7 +3837,7 @@
               <w14:ligatures w14:val="standardContextual"/>
             </w:rPr>
           </w:pPr>
-          <w:hyperlink w:anchor="_Toc241663726" w:history="1">
+          <w:hyperlink w:anchor="_Toc241665154" w:history="1">
             <w:r>
               <w:rPr>
                 <w:rStyle w:val="Hyperlink"/>
@@ -3883,7 +3883,7 @@
                 <w:noProof/>
                 <w:webHidden/>
               </w:rPr>
-              <w:instrText xml:space="preserve"> PAGEREF _Toc241663726 \h </w:instrText>
+              <w:instrText xml:space="preserve"> PAGEREF _Toc241665154 \h </w:instrText>
             </w:r>
             <w:r>
               <w:rPr>
@@ -3931,7 +3931,7 @@
               <w14:ligatures w14:val="standardContextual"/>
             </w:rPr>
           </w:pPr>
-          <w:hyperlink w:anchor="_Toc241663727" w:history="1">
+          <w:hyperlink w:anchor="_Toc241665155" w:history="1">
             <w:r>
               <w:rPr>
                 <w:rStyle w:val="Hyperlink"/>
@@ -3977,7 +3977,7 @@
                 <w:noProof/>
                 <w:webHidden/>
               </w:rPr>
-              <w:instrText xml:space="preserve"> PAGEREF _Toc241663727 \h </w:instrText>
+              <w:instrText xml:space="preserve"> PAGEREF _Toc241665155 \h </w:instrText>
             </w:r>
             <w:r>
               <w:rPr>
@@ -4025,7 +4025,7 @@
               <w14:ligatures w14:val="standardContextual"/>
             </w:rPr>
           </w:pPr>
-          <w:hyperlink w:anchor="_Toc241663728" w:history="1">
+          <w:hyperlink w:anchor="_Toc241665156" w:history="1">
             <w:r>
               <w:rPr>
                 <w:rStyle w:val="Hyperlink"/>
@@ -4071,7 +4071,7 @@
                 <w:noProof/>
                 <w:webHidden/>
               </w:rPr>
-              <w:instrText xml:space="preserve"> PAGEREF _Toc241663728 \h </w:instrText>
+              <w:instrText xml:space="preserve"> PAGEREF _Toc241665156 \h </w:instrText>
             </w:r>
             <w:r>
               <w:rPr>
@@ -4119,7 +4119,7 @@
               <w14:ligatures w14:val="standardContextual"/>
             </w:rPr>
           </w:pPr>
-          <w:hyperlink w:anchor="_Toc241663729" w:history="1">
+          <w:hyperlink w:anchor="_Toc241665157" w:history="1">
             <w:r>
               <w:rPr>
                 <w:rStyle w:val="Hyperlink"/>
@@ -4165,7 +4165,7 @@
                 <w:noProof/>
                 <w:webHidden/>
               </w:rPr>
-              <w:instrText xml:space="preserve"> PAGEREF _Toc241663729 \h </w:instrText>
+              <w:instrText xml:space="preserve"> PAGEREF _Toc241665157 \h </w:instrText>
             </w:r>
             <w:r>
               <w:rPr>
@@ -4213,7 +4213,7 @@
               <w14:ligatures w14:val="standardContextual"/>
             </w:rPr>
           </w:pPr>
-          <w:hyperlink w:anchor="_Toc241663730" w:history="1">
+          <w:hyperlink w:anchor="_Toc241665158" w:history="1">
             <w:r>
               <w:rPr>
                 <w:rStyle w:val="Hyperlink"/>
@@ -4259,7 +4259,7 @@
                 <w:noProof/>
                 <w:webHidden/>
               </w:rPr>
-              <w:instrText xml:space="preserve"> PAGEREF _Toc241663730 \h </w:instrText>
+              <w:instrText xml:space="preserve"> PAGEREF _Toc241665158 \h </w:instrText>
             </w:r>
             <w:r>
               <w:rPr>
@@ -4307,7 +4307,7 @@
               <w14:ligatures w14:val="standardContextual"/>
             </w:rPr>
           </w:pPr>
-          <w:hyperlink w:anchor="_Toc241663731" w:history="1">
+          <w:hyperlink w:anchor="_Toc241665159" w:history="1">
             <w:r>
               <w:rPr>
                 <w:rStyle w:val="Hyperlink"/>
@@ -4353,7 +4353,7 @@
                 <w:noProof/>
                 <w:webHidden/>
               </w:rPr>
-              <w:instrText xml:space="preserve"> PAGEREF _Toc241663731 \h </w:instrText>
+              <w:instrText xml:space="preserve"> PAGEREF _Toc241665159 \h </w:instrText>
             </w:r>
             <w:r>
               <w:rPr>
@@ -4401,7 +4401,7 @@
               <w14:ligatures w14:val="standardContextual"/>
             </w:rPr>
           </w:pPr>
-          <w:hyperlink w:anchor="_Toc241663732" w:history="1">
+          <w:hyperlink w:anchor="_Toc241665160" w:history="1">
             <w:r>
               <w:rPr>
                 <w:rStyle w:val="Hyperlink"/>
@@ -4447,7 +4447,7 @@
                 <w:noProof/>
                 <w:webHidden/>
               </w:rPr>
-              <w:instrText xml:space="preserve"> PAGEREF _Toc241663732 \h </w:instrText>
+              <w:instrText xml:space="preserve"> PAGEREF _Toc241665160 \h </w:instrText>
             </w:r>
             <w:r>
               <w:rPr>
@@ -4495,7 +4495,7 @@
               <w14:ligatures w14:val="standardContextual"/>
             </w:rPr>
           </w:pPr>
-          <w:hyperlink w:anchor="_Toc241663733" w:history="1">
+          <w:hyperlink w:anchor="_Toc241665161" w:history="1">
             <w:r>
               <w:rPr>
                 <w:rStyle w:val="Hyperlink"/>
@@ -4541,7 +4541,7 @@
                 <w:noProof/>
                 <w:webHidden/>
               </w:rPr>
-              <w:instrText xml:space="preserve"> PAGEREF _Toc241663733 \h </w:instrText>
+              <w:instrText xml:space="preserve"> PAGEREF _Toc241665161 \h </w:instrText>
             </w:r>
             <w:r>
               <w:rPr>
@@ -4589,7 +4589,7 @@
               <w14:ligatures w14:val="standardContextual"/>
             </w:rPr>
           </w:pPr>
-          <w:hyperlink w:anchor="_Toc241663734" w:history="1">
+          <w:hyperlink w:anchor="_Toc241665162" w:history="1">
             <w:r>
               <w:rPr>
                 <w:rStyle w:val="Hyperlink"/>
@@ -4635,7 +4635,7 @@
                 <w:noProof/>
                 <w:webHidden/>
               </w:rPr>
-              <w:instrText xml:space="preserve"> PAGEREF _Toc241663734 \h </w:instrText>
+              <w:instrText xml:space="preserve"> PAGEREF _Toc241665162 \h </w:instrText>
             </w:r>
             <w:r>
               <w:rPr>
@@ -4683,7 +4683,7 @@
               <w14:ligatures w14:val="standardContextual"/>
             </w:rPr>
           </w:pPr>
-          <w:hyperlink w:anchor="_Toc241663735" w:history="1">
+          <w:hyperlink w:anchor="_Toc241665163" w:history="1">
             <w:r>
               <w:rPr>
                 <w:rStyle w:val="Hyperlink"/>
@@ -4729,7 +4729,7 @@
                 <w:noProof/>
                 <w:webHidden/>
               </w:rPr>
-              <w:instrText xml:space="preserve"> PAGEREF _Toc241663735 \h </w:instrText>
+              <w:instrText xml:space="preserve"> PAGEREF _Toc241665163 \h </w:instrText>
             </w:r>
             <w:r>
               <w:rPr>
@@ -4777,7 +4777,7 @@
               <w14:ligatures w14:val="standardContextual"/>
             </w:rPr>
           </w:pPr>
-          <w:hyperlink w:anchor="_Toc241663736" w:history="1">
+          <w:hyperlink w:anchor="_Toc241665164" w:history="1">
             <w:r>
               <w:rPr>
                 <w:rStyle w:val="Hyperlink"/>
@@ -4823,7 +4823,7 @@
                 <w:noProof/>
                 <w:webHidden/>
               </w:rPr>
-              <w:instrText xml:space="preserve"> PAGEREF _Toc241663736 \h </w:instrText>
+              <w:instrText xml:space="preserve"> PAGEREF _Toc241665164 \h </w:instrText>
             </w:r>
             <w:r>
               <w:rPr>
@@ -4871,7 +4871,7 @@
               <w14:ligatures w14:val="standardContextual"/>
             </w:rPr>
           </w:pPr>
-          <w:hyperlink w:anchor="_Toc241663737" w:history="1">
+          <w:hyperlink w:anchor="_Toc241665165" w:history="1">
             <w:r>
               <w:rPr>
                 <w:rStyle w:val="Hyperlink"/>
@@ -4917,7 +4917,7 @@
                 <w:noProof/>
                 <w:webHidden/>
               </w:rPr>
-              <w:instrText xml:space="preserve"> PAGEREF _Toc241663737 \h </w:instrText>
+              <w:instrText xml:space="preserve"> PAGEREF _Toc241665165 \h </w:instrText>
             </w:r>
             <w:r>
               <w:rPr>
@@ -4965,7 +4965,7 @@
               <w14:ligatures w14:val="standardContextual"/>
             </w:rPr>
           </w:pPr>
-          <w:hyperlink w:anchor="_Toc241663738" w:history="1">
+          <w:hyperlink w:anchor="_Toc241665166" w:history="1">
             <w:r>
               <w:rPr>
                 <w:rStyle w:val="Hyperlink"/>
@@ -5011,7 +5011,7 @@
                 <w:noProof/>
                 <w:webHidden/>
               </w:rPr>
-              <w:instrText xml:space="preserve"> PAGEREF _Toc241663738 \h </w:instrText>
+              <w:instrText xml:space="preserve"> PAGEREF _Toc241665166 \h </w:instrText>
             </w:r>
             <w:r>
               <w:rPr>
@@ -5059,7 +5059,7 @@
               <w14:ligatures w14:val="standardContextual"/>
             </w:rPr>
           </w:pPr>
-          <w:hyperlink w:anchor="_Toc241663739" w:history="1">
+          <w:hyperlink w:anchor="_Toc241665167" w:history="1">
             <w:r>
               <w:rPr>
                 <w:rStyle w:val="Hyperlink"/>
@@ -5105,7 +5105,7 @@
                 <w:noProof/>
                 <w:webHidden/>
               </w:rPr>
-              <w:instrText xml:space="preserve"> PAGEREF _Toc241663739 \h </w:instrText>
+              <w:instrText xml:space="preserve"> PAGEREF _Toc241665167 \h </w:instrText>
             </w:r>
             <w:r>
               <w:rPr>
@@ -5153,7 +5153,7 @@
               <w14:ligatures w14:val="standardContextual"/>
             </w:rPr>
           </w:pPr>
-          <w:hyperlink w:anchor="_Toc241663740" w:history="1">
+          <w:hyperlink w:anchor="_Toc241665168" w:history="1">
             <w:r>
               <w:rPr>
                 <w:rStyle w:val="Hyperlink"/>
@@ -5199,7 +5199,7 @@
                 <w:noProof/>
                 <w:webHidden/>
               </w:rPr>
-              <w:instrText xml:space="preserve"> PAGEREF _Toc241663740 \h </w:instrText>
+              <w:instrText xml:space="preserve"> PAGEREF _Toc241665168 \h </w:instrText>
             </w:r>
             <w:r>
               <w:rPr>
@@ -5247,7 +5247,7 @@
               <w14:ligatures w14:val="standardContextual"/>
             </w:rPr>
           </w:pPr>
-          <w:hyperlink w:anchor="_Toc241663741" w:history="1">
+          <w:hyperlink w:anchor="_Toc241665169" w:history="1">
             <w:r>
               <w:rPr>
                 <w:rStyle w:val="Hyperlink"/>
@@ -5293,7 +5293,7 @@
                 <w:noProof/>
                 <w:webHidden/>
               </w:rPr>
-              <w:instrText xml:space="preserve"> PAGEREF _Toc241663741 \h </w:instrText>
+              <w:instrText xml:space="preserve"> PAGEREF _Toc241665169 \h </w:instrText>
             </w:r>
             <w:r>
               <w:rPr>
@@ -5341,7 +5341,7 @@
               <w14:ligatures w14:val="standardContextual"/>
             </w:rPr>
           </w:pPr>
-          <w:hyperlink w:anchor="_Toc241663742" w:history="1">
+          <w:hyperlink w:anchor="_Toc241665170" w:history="1">
             <w:r>
               <w:rPr>
                 <w:rStyle w:val="Hyperlink"/>
@@ -5387,7 +5387,7 @@
                 <w:noProof/>
                 <w:webHidden/>
               </w:rPr>
-              <w:instrText xml:space="preserve"> PAGEREF _Toc241663742 \h </w:instrText>
+              <w:instrText xml:space="preserve"> PAGEREF _Toc241665170 \h </w:instrText>
             </w:r>
             <w:r>
               <w:rPr>
@@ -5435,7 +5435,7 @@
               <w14:ligatures w14:val="standardContextual"/>
             </w:rPr>
           </w:pPr>
-          <w:hyperlink w:anchor="_Toc241663743" w:history="1">
+          <w:hyperlink w:anchor="_Toc241665171" w:history="1">
             <w:r>
               <w:rPr>
                 <w:rStyle w:val="Hyperlink"/>
@@ -5481,7 +5481,7 @@
                 <w:noProof/>
                 <w:webHidden/>
               </w:rPr>
-              <w:instrText xml:space="preserve"> PAGEREF _Toc241663743 \h </w:instrText>
+              <w:instrText xml:space="preserve"> PAGEREF _Toc241665171 \h </w:instrText>
             </w:r>
             <w:r>
               <w:rPr>
@@ -5529,7 +5529,7 @@
               <w14:ligatures w14:val="standardContextual"/>
             </w:rPr>
           </w:pPr>
-          <w:hyperlink w:anchor="_Toc241663744" w:history="1">
+          <w:hyperlink w:anchor="_Toc241665172" w:history="1">
             <w:r>
               <w:rPr>
                 <w:rStyle w:val="Hyperlink"/>
@@ -5575,7 +5575,7 @@
                 <w:noProof/>
                 <w:webHidden/>
               </w:rPr>
-              <w:instrText xml:space="preserve"> PAGEREF _Toc241663744 \h </w:instrText>
+              <w:instrText xml:space="preserve"> PAGEREF _Toc241665172 \h </w:instrText>
             </w:r>
             <w:r>
               <w:rPr>
@@ -5623,7 +5623,7 @@
               <w14:ligatures w14:val="standardContextual"/>
             </w:rPr>
           </w:pPr>
-          <w:hyperlink w:anchor="_Toc241663745" w:history="1">
+          <w:hyperlink w:anchor="_Toc241665173" w:history="1">
             <w:r>
               <w:rPr>
                 <w:rStyle w:val="Hyperlink"/>
@@ -5669,7 +5669,7 @@
                 <w:noProof/>
                 <w:webHidden/>
               </w:rPr>
-              <w:instrText xml:space="preserve"> PAGEREF _Toc241663745 \h </w:instrText>
+              <w:instrText xml:space="preserve"> PAGEREF _Toc241665173 \h </w:instrText>
             </w:r>
             <w:r>
               <w:rPr>
@@ -5717,7 +5717,7 @@
               <w14:ligatures w14:val="standardContextual"/>
             </w:rPr>
           </w:pPr>
-          <w:hyperlink w:anchor="_Toc241663746" w:history="1">
+          <w:hyperlink w:anchor="_Toc241665174" w:history="1">
             <w:r>
               <w:rPr>
                 <w:rStyle w:val="Hyperlink"/>
@@ -5763,7 +5763,7 @@
                 <w:noProof/>
                 <w:webHidden/>
               </w:rPr>
-              <w:instrText xml:space="preserve"> PAGEREF _Toc241663746 \h </w:instrText>
+              <w:instrText xml:space="preserve"> PAGEREF _Toc241665174 \h </w:instrText>
             </w:r>
             <w:r>
               <w:rPr>
@@ -5811,7 +5811,7 @@
               <w14:ligatures w14:val="standardContextual"/>
             </w:rPr>
           </w:pPr>
-          <w:hyperlink w:anchor="_Toc241663747" w:history="1">
+          <w:hyperlink w:anchor="_Toc241665175" w:history="1">
             <w:r>
               <w:rPr>
                 <w:rStyle w:val="Hyperlink"/>
@@ -5857,7 +5857,7 @@
                 <w:noProof/>
                 <w:webHidden/>
               </w:rPr>
-              <w:instrText xml:space="preserve"> PAGEREF _Toc241663747 \h </w:instrText>
+              <w:instrText xml:space="preserve"> PAGEREF _Toc241665175 \h </w:instrText>
             </w:r>
             <w:r>
               <w:rPr>
@@ -5905,7 +5905,7 @@
               <w14:ligatures w14:val="standardContextual"/>
             </w:rPr>
           </w:pPr>
-          <w:hyperlink w:anchor="_Toc241663748" w:history="1">
+          <w:hyperlink w:anchor="_Toc241665176" w:history="1">
             <w:r>
               <w:rPr>
                 <w:rStyle w:val="Hyperlink"/>
@@ -5951,7 +5951,7 @@
                 <w:noProof/>
                 <w:webHidden/>
               </w:rPr>
-              <w:instrText xml:space="preserve"> PAGEREF _Toc241663748 \h </w:instrText>
+              <w:instrText xml:space="preserve"> PAGEREF _Toc241665176 \h </w:instrText>
             </w:r>
             <w:r>
               <w:rPr>
@@ -5999,7 +5999,7 @@
               <w14:ligatures w14:val="standardContextual"/>
             </w:rPr>
           </w:pPr>
-          <w:hyperlink w:anchor="_Toc241663749" w:history="1">
+          <w:hyperlink w:anchor="_Toc241665177" w:history="1">
             <w:r>
               <w:rPr>
                 <w:rStyle w:val="Hyperlink"/>
@@ -6045,7 +6045,7 @@
                 <w:noProof/>
                 <w:webHidden/>
               </w:rPr>
-              <w:instrText xml:space="preserve"> PAGEREF _Toc241663749 \h </w:instrText>
+              <w:instrText xml:space="preserve"> PAGEREF _Toc241665177 \h </w:instrText>
             </w:r>
             <w:r>
               <w:rPr>
@@ -6093,7 +6093,7 @@
               <w14:ligatures w14:val="standardContextual"/>
             </w:rPr>
           </w:pPr>
-          <w:hyperlink w:anchor="_Toc241663750" w:history="1">
+          <w:hyperlink w:anchor="_Toc241665178" w:history="1">
             <w:r>
               <w:rPr>
                 <w:rStyle w:val="Hyperlink"/>
@@ -6139,7 +6139,7 @@
                 <w:noProof/>
                 <w:webHidden/>
               </w:rPr>
-              <w:instrText xml:space="preserve"> PAGEREF _Toc241663750 \h </w:instrText>
+              <w:instrText xml:space="preserve"> PAGEREF _Toc241665178 \h </w:instrText>
             </w:r>
             <w:r>
               <w:rPr>
@@ -6187,7 +6187,7 @@
               <w14:ligatures w14:val="standardContextual"/>
             </w:rPr>
           </w:pPr>
-          <w:hyperlink w:anchor="_Toc241663751" w:history="1">
+          <w:hyperlink w:anchor="_Toc241665179" w:history="1">
             <w:r>
               <w:rPr>
                 <w:rStyle w:val="Hyperlink"/>
@@ -6233,7 +6233,7 @@
                 <w:noProof/>
                 <w:webHidden/>
               </w:rPr>
-              <w:instrText xml:space="preserve"> PAGEREF _Toc241663751 \h </w:instrText>
+              <w:instrText xml:space="preserve"> PAGEREF _Toc241665179 \h </w:instrText>
             </w:r>
             <w:r>
               <w:rPr>
@@ -6281,7 +6281,7 @@
               <w14:ligatures w14:val="standardContextual"/>
             </w:rPr>
           </w:pPr>
-          <w:hyperlink w:anchor="_Toc241663752" w:history="1">
+          <w:hyperlink w:anchor="_Toc241665180" w:history="1">
             <w:r>
               <w:rPr>
                 <w:rStyle w:val="Hyperlink"/>
@@ -6327,7 +6327,7 @@
                 <w:noProof/>
                 <w:webHidden/>
               </w:rPr>
-              <w:instrText xml:space="preserve"> PAGEREF _Toc241663752 \h </w:instrText>
+              <w:instrText xml:space="preserve"> PAGEREF _Toc241665180 \h </w:instrText>
             </w:r>
             <w:r>
               <w:rPr>
@@ -6375,7 +6375,7 @@
               <w14:ligatures w14:val="standardContextual"/>
             </w:rPr>
           </w:pPr>
-          <w:hyperlink w:anchor="_Toc241663753" w:history="1">
+          <w:hyperlink w:anchor="_Toc241665181" w:history="1">
             <w:r>
               <w:rPr>
                 <w:rStyle w:val="Hyperlink"/>
@@ -6421,7 +6421,7 @@
                 <w:noProof/>
                 <w:webHidden/>
               </w:rPr>
-              <w:instrText xml:space="preserve"> PAGEREF _Toc241663753 \h </w:instrText>
+              <w:instrText xml:space="preserve"> PAGEREF _Toc241665181 \h </w:instrText>
             </w:r>
             <w:r>
               <w:rPr>
@@ -6469,7 +6469,7 @@
               <w14:ligatures w14:val="standardContextual"/>
             </w:rPr>
           </w:pPr>
-          <w:hyperlink w:anchor="_Toc241663754" w:history="1">
+          <w:hyperlink w:anchor="_Toc241665182" w:history="1">
             <w:r>
               <w:rPr>
                 <w:rStyle w:val="Hyperlink"/>
@@ -6515,7 +6515,7 @@
                 <w:noProof/>
                 <w:webHidden/>
               </w:rPr>
-              <w:instrText xml:space="preserve"> PAGEREF _Toc241663754 \h </w:instrText>
+              <w:instrText xml:space="preserve"> PAGEREF _Toc241665182 \h </w:instrText>
             </w:r>
             <w:r>
               <w:rPr>
@@ -6563,7 +6563,7 @@
               <w14:ligatures w14:val="standardContextual"/>
             </w:rPr>
           </w:pPr>
-          <w:hyperlink w:anchor="_Toc241663755" w:history="1">
+          <w:hyperlink w:anchor="_Toc241665183" w:history="1">
             <w:r>
               <w:rPr>
                 <w:rStyle w:val="Hyperlink"/>
@@ -6609,7 +6609,7 @@
                 <w:noProof/>
                 <w:webHidden/>
               </w:rPr>
-              <w:instrText xml:space="preserve"> PAGEREF _Toc241663755 \h </w:instrText>
+              <w:instrText xml:space="preserve"> PAGEREF _Toc241665183 \h </w:instrText>
             </w:r>
             <w:r>
               <w:rPr>
@@ -6657,7 +6657,7 @@
               <w14:ligatures w14:val="standardContextual"/>
             </w:rPr>
           </w:pPr>
-          <w:hyperlink w:anchor="_Toc241663756" w:history="1">
+          <w:hyperlink w:anchor="_Toc241665184" w:history="1">
             <w:r>
               <w:rPr>
                 <w:rStyle w:val="Hyperlink"/>
@@ -6703,7 +6703,7 @@
                 <w:noProof/>
                 <w:webHidden/>
               </w:rPr>
-              <w:instrText xml:space="preserve"> PAGEREF _Toc241663756 \h </w:instrText>
+              <w:instrText xml:space="preserve"> PAGEREF _Toc241665184 \h </w:instrText>
             </w:r>
             <w:r>
               <w:rPr>
@@ -6751,7 +6751,7 @@
               <w14:ligatures w14:val="standardContextual"/>
             </w:rPr>
           </w:pPr>
-          <w:hyperlink w:anchor="_Toc241663757" w:history="1">
+          <w:hyperlink w:anchor="_Toc241665185" w:history="1">
             <w:r>
               <w:rPr>
                 <w:rStyle w:val="Hyperlink"/>
@@ -6797,7 +6797,7 @@
                 <w:noProof/>
                 <w:webHidden/>
               </w:rPr>
-              <w:instrText xml:space="preserve"> PAGEREF _Toc241663757 \h </w:instrText>
+              <w:instrText xml:space="preserve"> PAGEREF _Toc241665185 \h </w:instrText>
             </w:r>
             <w:r>
               <w:rPr>
@@ -6845,7 +6845,7 @@
               <w14:ligatures w14:val="standardContextual"/>
             </w:rPr>
           </w:pPr>
-          <w:hyperlink w:anchor="_Toc241663758" w:history="1">
+          <w:hyperlink w:anchor="_Toc241665186" w:history="1">
             <w:r>
               <w:rPr>
                 <w:rStyle w:val="Hyperlink"/>
@@ -6891,7 +6891,7 @@
                 <w:noProof/>
                 <w:webHidden/>
               </w:rPr>
-              <w:instrText xml:space="preserve"> PAGEREF _Toc241663758 \h </w:instrText>
+              <w:instrText xml:space="preserve"> PAGEREF _Toc241665186 \h </w:instrText>
             </w:r>
             <w:r>
               <w:rPr>
@@ -6939,7 +6939,7 @@
               <w14:ligatures w14:val="standardContextual"/>
             </w:rPr>
           </w:pPr>
-          <w:hyperlink w:anchor="_Toc241663759" w:history="1">
+          <w:hyperlink w:anchor="_Toc241665187" w:history="1">
             <w:r>
               <w:rPr>
                 <w:rStyle w:val="Hyperlink"/>
@@ -6985,7 +6985,7 @@
                 <w:noProof/>
                 <w:webHidden/>
               </w:rPr>
-              <w:instrText xml:space="preserve"> PAGEREF _Toc241663759 \h </w:instrText>
+              <w:instrText xml:space="preserve"> PAGEREF _Toc241665187 \h </w:instrText>
             </w:r>
             <w:r>
               <w:rPr>
@@ -7033,7 +7033,7 @@
               <w14:ligatures w14:val="standardContextual"/>
             </w:rPr>
           </w:pPr>
-          <w:hyperlink w:anchor="_Toc241663760" w:history="1">
+          <w:hyperlink w:anchor="_Toc241665188" w:history="1">
             <w:r>
               <w:rPr>
                 <w:rStyle w:val="Hyperlink"/>
@@ -7079,7 +7079,7 @@
                 <w:noProof/>
                 <w:webHidden/>
               </w:rPr>
-              <w:instrText xml:space="preserve"> PAGEREF _Toc241663760 \h </w:instrText>
+              <w:instrText xml:space="preserve"> PAGEREF _Toc241665188 \h </w:instrText>
             </w:r>
             <w:r>
               <w:rPr>
@@ -7127,7 +7127,7 @@
               <w14:ligatures w14:val="standardContextual"/>
             </w:rPr>
           </w:pPr>
-          <w:hyperlink w:anchor="_Toc241663761" w:history="1">
+          <w:hyperlink w:anchor="_Toc241665189" w:history="1">
             <w:r>
               <w:rPr>
                 <w:rStyle w:val="Hyperlink"/>
@@ -7173,7 +7173,7 @@
                 <w:noProof/>
                 <w:webHidden/>
               </w:rPr>
-              <w:instrText xml:space="preserve"> PAGEREF _Toc241663761 \h </w:instrText>
+              <w:instrText xml:space="preserve"> PAGEREF _Toc241665189 \h </w:instrText>
             </w:r>
             <w:r>
               <w:rPr>
@@ -7221,7 +7221,7 @@
               <w14:ligatures w14:val="standardContextual"/>
             </w:rPr>
           </w:pPr>
-          <w:hyperlink w:anchor="_Toc241663762" w:history="1">
+          <w:hyperlink w:anchor="_Toc241665190" w:history="1">
             <w:r>
               <w:rPr>
                 <w:rStyle w:val="Hyperlink"/>
@@ -7267,7 +7267,7 @@
                 <w:noProof/>
                 <w:webHidden/>
               </w:rPr>
-              <w:instrText xml:space="preserve"> PAGEREF _Toc241663762 \h </w:instrText>
+              <w:instrText xml:space="preserve"> PAGEREF _Toc241665190 \h </w:instrText>
             </w:r>
             <w:r>
               <w:rPr>
@@ -7315,7 +7315,7 @@
               <w14:ligatures w14:val="standardContextual"/>
             </w:rPr>
           </w:pPr>
-          <w:hyperlink w:anchor="_Toc241663763" w:history="1">
+          <w:hyperlink w:anchor="_Toc241665191" w:history="1">
             <w:r>
               <w:rPr>
                 <w:rStyle w:val="Hyperlink"/>
@@ -7361,7 +7361,7 @@
                 <w:noProof/>
                 <w:webHidden/>
               </w:rPr>
-              <w:instrText xml:space="preserve"> PAGEREF _Toc241663763 \h </w:instrText>
+              <w:instrText xml:space="preserve"> PAGEREF _Toc241665191 \h </w:instrText>
             </w:r>
             <w:r>
               <w:rPr>
@@ -7409,7 +7409,7 @@
               <w14:ligatures w14:val="standardContextual"/>
             </w:rPr>
           </w:pPr>
-          <w:hyperlink w:anchor="_Toc241663764" w:history="1">
+          <w:hyperlink w:anchor="_Toc241665192" w:history="1">
             <w:r>
               <w:rPr>
                 <w:rStyle w:val="Hyperlink"/>
@@ -7455,7 +7455,7 @@
                 <w:noProof/>
                 <w:webHidden/>
               </w:rPr>
-              <w:instrText xml:space="preserve"> PAGEREF _Toc241663764 \h </w:instrText>
+              <w:instrText xml:space="preserve"> PAGEREF _Toc241665192 \h </w:instrText>
             </w:r>
             <w:r>
               <w:rPr>
@@ -7503,7 +7503,7 @@
               <w14:ligatures w14:val="standardContextual"/>
             </w:rPr>
           </w:pPr>
-          <w:hyperlink w:anchor="_Toc241663765" w:history="1">
+          <w:hyperlink w:anchor="_Toc241665193" w:history="1">
             <w:r>
               <w:rPr>
                 <w:rStyle w:val="Hyperlink"/>
@@ -7549,7 +7549,7 @@
                 <w:noProof/>
                 <w:webHidden/>
               </w:rPr>
-              <w:instrText xml:space="preserve"> PAGEREF _Toc241663765 \h </w:instrText>
+              <w:instrText xml:space="preserve"> PAGEREF _Toc241665193 \h </w:instrText>
             </w:r>
             <w:r>
               <w:rPr>
@@ -7597,7 +7597,7 @@
               <w14:ligatures w14:val="standardContextual"/>
             </w:rPr>
           </w:pPr>
-          <w:hyperlink w:anchor="_Toc241663766" w:history="1">
+          <w:hyperlink w:anchor="_Toc241665194" w:history="1">
             <w:r>
               <w:rPr>
                 <w:rStyle w:val="Hyperlink"/>
@@ -7643,7 +7643,7 @@
                 <w:noProof/>
                 <w:webHidden/>
               </w:rPr>
-              <w:instrText xml:space="preserve"> PAGEREF _Toc241663766 \h </w:instrText>
+              <w:instrText xml:space="preserve"> PAGEREF _Toc241665194 \h </w:instrText>
             </w:r>
             <w:r>
               <w:rPr>
@@ -7691,7 +7691,7 @@
               <w14:ligatures w14:val="standardContextual"/>
             </w:rPr>
           </w:pPr>
-          <w:hyperlink w:anchor="_Toc241663767" w:history="1">
+          <w:hyperlink w:anchor="_Toc241665195" w:history="1">
             <w:r>
               <w:rPr>
                 <w:rStyle w:val="Hyperlink"/>
@@ -7737,7 +7737,7 @@
                 <w:noProof/>
                 <w:webHidden/>
               </w:rPr>
-              <w:instrText xml:space="preserve"> PAGEREF _Toc241663767 \h </w:instrText>
+              <w:instrText xml:space="preserve"> PAGEREF _Toc241665195 \h </w:instrText>
             </w:r>
             <w:r>
               <w:rPr>
@@ -7785,7 +7785,7 @@
               <w14:ligatures w14:val="standardContextual"/>
             </w:rPr>
           </w:pPr>
-          <w:hyperlink w:anchor="_Toc241663768" w:history="1">
+          <w:hyperlink w:anchor="_Toc241665196" w:history="1">
             <w:r>
               <w:rPr>
                 <w:rStyle w:val="Hyperlink"/>
@@ -7831,7 +7831,7 @@
                 <w:noProof/>
                 <w:webHidden/>
               </w:rPr>
-              <w:instrText xml:space="preserve"> PAGEREF _Toc241663768 \h </w:instrText>
+              <w:instrText xml:space="preserve"> PAGEREF _Toc241665196 \h </w:instrText>
             </w:r>
             <w:r>
               <w:rPr>
@@ -7879,7 +7879,7 @@
               <w14:ligatures w14:val="standardContextual"/>
             </w:rPr>
           </w:pPr>
-          <w:hyperlink w:anchor="_Toc241663769" w:history="1">
+          <w:hyperlink w:anchor="_Toc241665197" w:history="1">
             <w:r>
               <w:rPr>
                 <w:rStyle w:val="Hyperlink"/>
@@ -7925,7 +7925,7 @@
                 <w:noProof/>
                 <w:webHidden/>
               </w:rPr>
-              <w:instrText xml:space="preserve"> PAGEREF _Toc241663769 \h </w:instrText>
+              <w:instrText xml:space="preserve"> PAGEREF _Toc241665197 \h </w:instrText>
             </w:r>
             <w:r>
               <w:rPr>
@@ -7973,7 +7973,7 @@
               <w14:ligatures w14:val="standardContextual"/>
             </w:rPr>
           </w:pPr>
-          <w:hyperlink w:anchor="_Toc241663770" w:history="1">
+          <w:hyperlink w:anchor="_Toc241665198" w:history="1">
             <w:r>
               <w:rPr>
                 <w:rStyle w:val="Hyperlink"/>
@@ -8019,7 +8019,7 @@
                 <w:noProof/>
                 <w:webHidden/>
               </w:rPr>
-              <w:instrText xml:space="preserve"> PAGEREF _Toc241663770 \h </w:instrText>
+              <w:instrText xml:space="preserve"> PAGEREF _Toc241665198 \h </w:instrText>
             </w:r>
             <w:r>
               <w:rPr>
@@ -8067,7 +8067,7 @@
               <w14:ligatures w14:val="standardContextual"/>
             </w:rPr>
           </w:pPr>
-          <w:hyperlink w:anchor="_Toc241663771" w:history="1">
+          <w:hyperlink w:anchor="_Toc241665199" w:history="1">
             <w:r>
               <w:rPr>
                 <w:rStyle w:val="Hyperlink"/>
@@ -8113,7 +8113,7 @@
                 <w:noProof/>
                 <w:webHidden/>
               </w:rPr>
-              <w:instrText xml:space="preserve"> PAGEREF _Toc241663771 \h </w:instrText>
+              <w:instrText xml:space="preserve"> PAGEREF _Toc241665199 \h </w:instrText>
             </w:r>
             <w:r>
               <w:rPr>
@@ -8160,7 +8160,7 @@
               <w14:ligatures w14:val="standardContextual"/>
             </w:rPr>
           </w:pPr>
-          <w:hyperlink w:anchor="_Toc241663772" w:history="1">
+          <w:hyperlink w:anchor="_Toc241665200" w:history="1">
             <w:r>
               <w:rPr>
                 <w:rStyle w:val="Hyperlink"/>
@@ -8187,7 +8187,7 @@
                 <w:noProof/>
                 <w:webHidden/>
               </w:rPr>
-              <w:instrText xml:space="preserve"> PAGEREF _Toc241663772 \h </w:instrText>
+              <w:instrText xml:space="preserve"> PAGEREF _Toc241665200 \h </w:instrText>
             </w:r>
             <w:r>
               <w:rPr>
@@ -8234,7 +8234,7 @@
               <w14:ligatures w14:val="standardContextual"/>
             </w:rPr>
           </w:pPr>
-          <w:hyperlink w:anchor="_Toc241663773" w:history="1">
+          <w:hyperlink w:anchor="_Toc241665201" w:history="1">
             <w:r>
               <w:rPr>
                 <w:rStyle w:val="Hyperlink"/>
@@ -8261,7 +8261,7 @@
                 <w:noProof/>
                 <w:webHidden/>
               </w:rPr>
-              <w:instrText xml:space="preserve"> PAGEREF _Toc241663773 \h </w:instrText>
+              <w:instrText xml:space="preserve"> PAGEREF _Toc241665201 \h </w:instrText>
             </w:r>
             <w:r>
               <w:rPr>
@@ -8304,7 +8304,7 @@
         <w:pStyle w:val="Heading1"/>
       </w:pPr>
       <w:bookmarkStart w:id="0" w:name="start-here"/>
-      <w:bookmarkStart w:id="1" w:name="_Toc241663686"/>
+      <w:bookmarkStart w:id="1" w:name="_Toc241665114"/>
       <w:r>
         <w:rPr>
           <w:rStyle w:val="SectionNumber"/>
@@ -8322,7 +8322,7 @@
         <w:pStyle w:val="Heading2"/>
       </w:pPr>
       <w:bookmarkStart w:id="2" w:name="what-tinygpt-is"/>
-      <w:bookmarkStart w:id="3" w:name="_Toc241663687"/>
+      <w:bookmarkStart w:id="3" w:name="_Toc241665115"/>
       <w:r>
         <w:rPr>
           <w:rStyle w:val="SectionNumber"/>
@@ -8465,7 +8465,7 @@
           <w:noProof/>
         </w:rPr>
         <w:drawing>
-          <wp:inline distT="0" distB="0" distL="0" distR="0" wp14:anchorId="758E0ABE" wp14:editId="653F2304">
+          <wp:inline distT="0" distB="0" distL="0" distR="0" wp14:anchorId="517E7671" wp14:editId="7B92B3B3">
             <wp:extent cx="5939999" cy="4517746"/>
             <wp:effectExtent l="0" t="0" r="0" b="0"/>
             <wp:docPr id="10" name="Picture" descr="The tinyGPT pipeline. a, text sources. b, data preparation turns raw text into clean, deduplicated, English, on-topic token shards, split by document. c, pre-training repeats a four-step loop (forward pass, loss, gradients, update) and evaluates every 200 steps. d, post-training turns the base model into a question answerer. e, tools to inspect, compare, export and use checkpoints."/>
@@ -8577,7 +8577,7 @@
         <w:pStyle w:val="Heading2"/>
       </w:pPr>
       <w:bookmarkStart w:id="4" w:name="the-files"/>
-      <w:bookmarkStart w:id="5" w:name="_Toc241663688"/>
+      <w:bookmarkStart w:id="5" w:name="_Toc241665116"/>
       <w:bookmarkEnd w:id="2"/>
       <w:r>
         <w:rPr>
@@ -9143,7 +9143,7 @@
               <w:rPr>
                 <w:sz w:val="17"/>
               </w:rPr>
-              <w:t>608 topic terms for the keyword filter</w:t>
+              <w:t>1,006 topic terms for the keyword filter</w:t>
             </w:r>
           </w:p>
         </w:tc>
@@ -9358,7 +9358,7 @@
         <w:pStyle w:val="Heading2"/>
       </w:pPr>
       <w:bookmarkStart w:id="6" w:name="everyday-commands"/>
-      <w:bookmarkStart w:id="7" w:name="_Toc241663689"/>
+      <w:bookmarkStart w:id="7" w:name="_Toc241665117"/>
       <w:bookmarkEnd w:id="4"/>
       <w:r>
         <w:rPr>
@@ -9590,7 +9590,7 @@
         <w:pStyle w:val="Heading2"/>
       </w:pPr>
       <w:bookmarkStart w:id="8" w:name="what-changed-on-29-september-2026"/>
-      <w:bookmarkStart w:id="9" w:name="_Toc241663690"/>
+      <w:bookmarkStart w:id="9" w:name="_Toc241665118"/>
       <w:bookmarkEnd w:id="6"/>
       <w:r>
         <w:rPr>
@@ -9900,7 +9900,7 @@
         <w:pStyle w:val="Heading2"/>
       </w:pPr>
       <w:bookmarkStart w:id="10" w:name="X87477c0b04dc5b0a9bcce666f011b24acd90ac6"/>
-      <w:bookmarkStart w:id="11" w:name="_Toc241663691"/>
+      <w:bookmarkStart w:id="11" w:name="_Toc241665119"/>
       <w:bookmarkEnd w:id="8"/>
       <w:r>
         <w:rPr>
@@ -10423,7 +10423,7 @@
         <w:pStyle w:val="Heading1"/>
       </w:pPr>
       <w:bookmarkStart w:id="12" w:name="how-language-models-are-trained"/>
-      <w:bookmarkStart w:id="13" w:name="_Toc241663692"/>
+      <w:bookmarkStart w:id="13" w:name="_Toc241665120"/>
       <w:bookmarkEnd w:id="0"/>
       <w:bookmarkEnd w:id="10"/>
       <w:r>
@@ -10493,7 +10493,7 @@
           <w:noProof/>
         </w:rPr>
         <w:drawing>
-          <wp:inline distT="0" distB="0" distL="0" distR="0" wp14:anchorId="422F445E" wp14:editId="2A5EA3EA">
+          <wp:inline distT="0" distB="0" distL="0" distR="0" wp14:anchorId="4604D463" wp14:editId="4254A545">
             <wp:extent cx="5759999" cy="2028169"/>
             <wp:effectExtent l="0" t="0" r="0" b="0"/>
             <wp:docPr id="19" name="Picture" descr="The four training stages. Pre-training costs most of the compute. The later stages decide most of how useful the model is."/>
@@ -10555,7 +10555,7 @@
         <w:pStyle w:val="Heading2"/>
       </w:pPr>
       <w:bookmarkStart w:id="14" w:name="tokens-text-becomes-numbers"/>
-      <w:bookmarkStart w:id="15" w:name="_Toc241663693"/>
+      <w:bookmarkStart w:id="15" w:name="_Toc241665121"/>
       <w:r>
         <w:rPr>
           <w:rStyle w:val="SectionNumber"/>
@@ -10857,7 +10857,7 @@
         <w:pStyle w:val="Heading2"/>
       </w:pPr>
       <w:bookmarkStart w:id="16" w:name="the-transformer"/>
-      <w:bookmarkStart w:id="17" w:name="_Toc241663694"/>
+      <w:bookmarkStart w:id="17" w:name="_Toc241665122"/>
       <w:bookmarkEnd w:id="14"/>
       <w:r>
         <w:rPr>
@@ -11205,7 +11205,7 @@
         <w:pStyle w:val="Heading2"/>
       </w:pPr>
       <w:bookmarkStart w:id="18" w:name="what-it-learns-predict-the-next-token"/>
-      <w:bookmarkStart w:id="19" w:name="_Toc241663695"/>
+      <w:bookmarkStart w:id="19" w:name="_Toc241665123"/>
       <w:bookmarkEnd w:id="16"/>
       <w:r>
         <w:rPr>
@@ -11563,7 +11563,7 @@
         <w:pStyle w:val="Heading2"/>
       </w:pPr>
       <w:bookmarkStart w:id="20" w:name="how-it-learns-gradient-descent"/>
-      <w:bookmarkStart w:id="21" w:name="_Toc241663696"/>
+      <w:bookmarkStart w:id="21" w:name="_Toc241665124"/>
       <w:bookmarkEnd w:id="18"/>
       <w:r>
         <w:rPr>
@@ -12001,7 +12001,7 @@
         <w:pStyle w:val="Heading2"/>
       </w:pPr>
       <w:bookmarkStart w:id="22" w:name="how-it-writes-generation"/>
-      <w:bookmarkStart w:id="23" w:name="_Toc241663697"/>
+      <w:bookmarkStart w:id="23" w:name="_Toc241665125"/>
       <w:bookmarkEnd w:id="20"/>
       <w:r>
         <w:rPr>
@@ -12155,7 +12155,7 @@
         <w:pStyle w:val="Heading2"/>
       </w:pPr>
       <w:bookmarkStart w:id="24" w:name="the-four-training-stages"/>
-      <w:bookmarkStart w:id="25" w:name="_Toc241663698"/>
+      <w:bookmarkStart w:id="25" w:name="_Toc241665126"/>
       <w:bookmarkEnd w:id="22"/>
       <w:r>
         <w:rPr>
@@ -12720,7 +12720,7 @@
         <w:pStyle w:val="Heading2"/>
       </w:pPr>
       <w:bookmarkStart w:id="26" w:name="X7de0b60ad97266c320e3b2fb58a9b5aca304cdc"/>
-      <w:bookmarkStart w:id="27" w:name="_Toc241663699"/>
+      <w:bookmarkStart w:id="27" w:name="_Toc241665127"/>
       <w:bookmarkEnd w:id="24"/>
       <w:r>
         <w:rPr>
@@ -12862,7 +12862,7 @@
         <w:pStyle w:val="Heading2"/>
       </w:pPr>
       <w:bookmarkStart w:id="28" w:name="making-models-smaller-and-cheaper"/>
-      <w:bookmarkStart w:id="29" w:name="_Toc241663700"/>
+      <w:bookmarkStart w:id="29" w:name="_Toc241665128"/>
       <w:bookmarkEnd w:id="26"/>
       <w:r>
         <w:rPr>
@@ -12965,7 +12965,7 @@
         <w:pStyle w:val="Heading2"/>
       </w:pPr>
       <w:bookmarkStart w:id="30" w:name="fine-tuning-at-home-lora-and-qlora"/>
-      <w:bookmarkStart w:id="31" w:name="_Toc241663701"/>
+      <w:bookmarkStart w:id="31" w:name="_Toc241665129"/>
       <w:bookmarkEnd w:id="28"/>
       <w:r>
         <w:rPr>
@@ -13306,7 +13306,7 @@
         <w:pStyle w:val="Heading2"/>
       </w:pPr>
       <w:bookmarkStart w:id="32" w:name="why-the-top-closed-models-lead"/>
-      <w:bookmarkStart w:id="33" w:name="_Toc241663702"/>
+      <w:bookmarkStart w:id="33" w:name="_Toc241665130"/>
       <w:bookmarkEnd w:id="30"/>
       <w:r>
         <w:rPr>
@@ -13427,7 +13427,7 @@
         <w:pStyle w:val="Heading1"/>
       </w:pPr>
       <w:bookmarkStart w:id="34" w:name="the-tinygpt-model"/>
-      <w:bookmarkStart w:id="35" w:name="_Toc241663703"/>
+      <w:bookmarkStart w:id="35" w:name="_Toc241665131"/>
       <w:bookmarkEnd w:id="12"/>
       <w:bookmarkEnd w:id="32"/>
       <w:r>
@@ -13451,7 +13451,7 @@
           <w:noProof/>
         </w:rPr>
         <w:drawing>
-          <wp:inline distT="0" distB="0" distL="0" distR="0" wp14:anchorId="0BC312B7" wp14:editId="55B1ADA0">
+          <wp:inline distT="0" distB="0" distL="0" distR="0" wp14:anchorId="44551099" wp14:editId="0E6A90D5">
             <wp:extent cx="5939999" cy="3848450"/>
             <wp:effectExtent l="0" t="0" r="0" b="0"/>
             <wp:docPr id="33" name="Picture" descr="The tinyGPT architecture. a, one forward pass: embedding, L identical blocks (each with two residual additions), final normalisation and the tied output layer. b, causal attention in one head. c, where the 17,308,032 parameters of your run sit."/>
@@ -13554,7 +13554,7 @@
         <w:pStyle w:val="Heading2"/>
       </w:pPr>
       <w:bookmarkStart w:id="36" w:name="design-choices-and-why"/>
-      <w:bookmarkStart w:id="37" w:name="_Toc241663704"/>
+      <w:bookmarkStart w:id="37" w:name="_Toc241665132"/>
       <w:r>
         <w:rPr>
           <w:rStyle w:val="SectionNumber"/>
@@ -14232,7 +14232,7 @@
         <w:pStyle w:val="Heading2"/>
       </w:pPr>
       <w:bookmarkStart w:id="38" w:name="why-decoder-only-and-not-encoder-decoder"/>
-      <w:bookmarkStart w:id="39" w:name="_Toc241663705"/>
+      <w:bookmarkStart w:id="39" w:name="_Toc241665133"/>
       <w:bookmarkEnd w:id="36"/>
       <w:r>
         <w:rPr>
@@ -14861,7 +14861,7 @@
         <w:pStyle w:val="Heading2"/>
       </w:pPr>
       <w:bookmarkStart w:id="40" w:name="your-runs-settings-explained"/>
-      <w:bookmarkStart w:id="41" w:name="_Toc241663706"/>
+      <w:bookmarkStart w:id="41" w:name="_Toc241665134"/>
       <w:bookmarkEnd w:id="38"/>
       <w:r>
         <w:rPr>
@@ -17561,7 +17561,7 @@
         <w:pStyle w:val="Heading2"/>
       </w:pPr>
       <w:bookmarkStart w:id="42" w:name="how-the-planner-chooses-a-model"/>
-      <w:bookmarkStart w:id="43" w:name="_Toc241663707"/>
+      <w:bookmarkStart w:id="43" w:name="_Toc241665135"/>
       <w:bookmarkEnd w:id="40"/>
       <w:r>
         <w:rPr>
@@ -17836,7 +17836,7 @@
         <w:pStyle w:val="Heading2"/>
       </w:pPr>
       <w:bookmarkStart w:id="44" w:name="hands-on-exercises"/>
-      <w:bookmarkStart w:id="45" w:name="_Toc241663708"/>
+      <w:bookmarkStart w:id="45" w:name="_Toc241665136"/>
       <w:bookmarkEnd w:id="42"/>
       <w:r>
         <w:rPr>
@@ -18098,7 +18098,7 @@
         <w:pStyle w:val="Heading1"/>
       </w:pPr>
       <w:bookmarkStart w:id="46" w:name="your-training-data"/>
-      <w:bookmarkStart w:id="47" w:name="_Toc241663709"/>
+      <w:bookmarkStart w:id="47" w:name="_Toc241665137"/>
       <w:bookmarkEnd w:id="34"/>
       <w:bookmarkEnd w:id="44"/>
       <w:r>
@@ -18118,7 +18118,7 @@
         <w:pStyle w:val="Heading2"/>
       </w:pPr>
       <w:bookmarkStart w:id="48" w:name="folder-layout"/>
-      <w:bookmarkStart w:id="49" w:name="_Toc241663710"/>
+      <w:bookmarkStart w:id="49" w:name="_Toc241665138"/>
       <w:r>
         <w:rPr>
           <w:rStyle w:val="SectionNumber"/>
@@ -19016,7 +19016,7 @@
         <w:pStyle w:val="Heading2"/>
       </w:pPr>
       <w:bookmarkStart w:id="50" w:name="converting-documents"/>
-      <w:bookmarkStart w:id="51" w:name="_Toc241663711"/>
+      <w:bookmarkStart w:id="51" w:name="_Toc241665139"/>
       <w:bookmarkEnd w:id="48"/>
       <w:r>
         <w:rPr>
@@ -19564,7 +19564,7 @@
         <w:pStyle w:val="Heading2"/>
       </w:pPr>
       <w:bookmarkStart w:id="52" w:name="english-only"/>
-      <w:bookmarkStart w:id="53" w:name="_Toc241663712"/>
+      <w:bookmarkStart w:id="53" w:name="_Toc241665140"/>
       <w:bookmarkEnd w:id="50"/>
       <w:r>
         <w:rPr>
@@ -19763,7 +19763,7 @@
         <w:pStyle w:val="Heading2"/>
       </w:pPr>
       <w:bookmarkStart w:id="54" w:name="keyword-selection"/>
-      <w:bookmarkStart w:id="55" w:name="_Toc241663713"/>
+      <w:bookmarkStart w:id="55" w:name="_Toc241665141"/>
       <w:bookmarkEnd w:id="52"/>
       <w:r>
         <w:rPr>
@@ -19806,10 +19806,10 @@
         </w:numPr>
       </w:pPr>
       <w:r>
-        <w:t xml:space="preserve">keywords_biology.txt has 608 terms. It covers molecular and cell biology, genetics, statistics, machine learning, </w:t>
-      </w:r>
-      <w:r>
-        <w:t>medicine, drugs, animals, plants and genomics technology.</w:t>
+        <w:t xml:space="preserve">keywords_biology.txt has 1,006 terms (608 until 30 September, when mathematics, statistics, population and </w:t>
+      </w:r>
+      <w:r>
+        <w:t>statistical genetics, genomics technology, clinical genetics, immunology, neuroscience and ecology terms were added). It covers molecular and cell biology, genetics, statistics, machine learning, medicine, drugs, animals, plants and genomics technology.</w:t>
       </w:r>
     </w:p>
     <w:p>
@@ -19989,7 +19989,10 @@
         <w:t>Why keywords, and not “text that looks like my Markdown”:</w:t>
       </w:r>
       <w:r>
-        <w:t xml:space="preserve"> your Markdown doesn’t cover every topic you care about. Importance resampling towards it would make the corpus narrower. Keyword selection stays.</w:t>
+        <w:t xml:space="preserve"> </w:t>
+      </w:r>
+      <w:r>
+        <w:t>your Markdown doesn’t cover every topic you care about. Importance resampling towards it would make the corpus narrower. Keyword selection stays.</w:t>
       </w:r>
     </w:p>
     <w:p>
@@ -20020,10 +20023,10 @@
         <w:t>Prefilter:</w:t>
       </w:r>
       <w:r>
-        <w:t xml:space="preserve"> </w:t>
-      </w:r>
-      <w:r>
-        <w:t>a C++ regular-expression engine (RE2, inside pyarrow) first discards documents with too few keyword matches. It scans all 6.4 million Wikipedia articles in about 2 minutes on 4 threads. Its count is never below the exact count: terms whose matches could overlap (“genetic drift” and “genetic*”) are counted by separate patterns (three for the 608 biology terms). On 100,000 FineWeb-Edu and peS2o documents it rejected none that the exact count keeps.</w:t>
+        <w:t xml:space="preserve"> a C++ regular-expression engine (RE2, inside pyarrow) first discards documents with too few keyword matches. It scans all 6.4 million Wikipedia articles in about 2 minutes on 4 threads. Its count is never below the exact count: terms whose matches could overlap (“genetic drift” and “genetic*”) are counted by </w:t>
+      </w:r>
+      <w:r>
+        <w:t>separate patterns (five for the 1,006 terms). On 100,000 FineWeb-Edu and peS2o documents it rejected none that the exact count keeps.</w:t>
       </w:r>
     </w:p>
     <w:p>
@@ -20042,10 +20045,7 @@
         <w:t>Counting:</w:t>
       </w:r>
       <w:r>
-        <w:t xml:space="preserve"> </w:t>
-      </w:r>
-      <w:r>
-        <w:t>the survivors are counted with dictionary lookups instead of one large regular expression. Speed rose from 0.5 to 5.7 MB of text per second per thread.</w:t>
+        <w:t xml:space="preserve"> the survivors are counted with dictionary lookups instead of one large regular expression. Speed rose from 0.5 to 5.7 MB of text per second per thread.</w:t>
       </w:r>
     </w:p>
     <w:p>
@@ -20083,7 +20083,10 @@
         <w:t>Wildcards:</w:t>
       </w:r>
       <w:r>
-        <w:t xml:space="preserve"> each word is checked against the wildcard terms only if its first (or last) three letters could start (or end) one, which halved the counting time.</w:t>
+        <w:t xml:space="preserve"> </w:t>
+      </w:r>
+      <w:r>
+        <w:t>each word is checked against the wildcard terms only if its first (or last) three letters could start (or end) one, which halved the counting time.</w:t>
       </w:r>
     </w:p>
     <w:p>
@@ -20107,7 +20110,10 @@
         <w:t>--workers</w:t>
       </w:r>
       <w:r>
-        <w:t>). These are cleaning, the English test, the exact keyword count, and the duplicate and boilerplate keys. The per-document part of pass 2 and of the leakage audit go to workers as well.</w:t>
+        <w:t xml:space="preserve">). These are cleaning, the English test, the exact keyword count, and the duplicate </w:t>
+      </w:r>
+      <w:r>
+        <w:t>and boilerplate keys. The per-document part of pass 2 and of the leakage audit go to workers as well.</w:t>
       </w:r>
     </w:p>
     <w:p>
@@ -20126,10 +20132,7 @@
         <w:t>Same output:</w:t>
       </w:r>
       <w:r>
-        <w:t xml:space="preserve"> </w:t>
-      </w:r>
-      <w:r>
-        <w:t>results come back in the original order, so the dataset is byte-identical for any number of workers; a test checks this.</w:t>
+        <w:t xml:space="preserve"> results come back in the original order, so the dataset is byte-identical for any number of workers; a test checks this.</w:t>
       </w:r>
     </w:p>
     <w:p>
@@ -20242,7 +20245,10 @@
         <w:t>--threads 6</w:t>
       </w:r>
       <w:r>
-        <w:t xml:space="preserve"> gives pyarrow and the tokenizer more cores.</w:t>
+        <w:t xml:space="preserve"> </w:t>
+      </w:r>
+      <w:r>
+        <w:t>gives pyarrow and the tokenizer more cores.</w:t>
       </w:r>
     </w:p>
     <w:p>
@@ -20260,10 +20266,7 @@
         <w:t>--scan-only</w:t>
       </w:r>
       <w:r>
-        <w:t xml:space="preserve"> </w:t>
-      </w:r>
-      <w:r>
-        <w:t>runs the filters and writes the report without tokenising, so you can tune thresholds first.</w:t>
+        <w:t xml:space="preserve"> runs the filters and writes the report without tokenising, so you can tune thresholds first.</w:t>
       </w:r>
     </w:p>
     <w:p>
@@ -20321,7 +20324,7 @@
         <w:pStyle w:val="Heading2"/>
       </w:pPr>
       <w:bookmarkStart w:id="56" w:name="X94ef1ff796aac1cc9e44d72727e00c60c26242e"/>
-      <w:bookmarkStart w:id="57" w:name="_Toc241663714"/>
+      <w:bookmarkStart w:id="57" w:name="_Toc241665142"/>
       <w:bookmarkEnd w:id="54"/>
       <w:r>
         <w:rPr>
@@ -20388,7 +20391,10 @@
         <w:t>estimate_dataset.py</w:t>
       </w:r>
       <w:r>
-        <w:t>). A sample of every source (2% of web records, at least 300 files of each folder) goes through data_prep’s real checks: cleaning, English test, length, quality score and keywords. The kept share is scaled up.</w:t>
+        <w:t xml:space="preserve">). A sample of every source (2% of web records, at least 300 files of each folder) goes through data_prep’s real </w:t>
+      </w:r>
+      <w:r>
+        <w:t>checks: cleaning, English test, length, quality score and keywords. The kept share is scaled up.</w:t>
       </w:r>
     </w:p>
     <w:p>
@@ -20407,10 +20413,7 @@
         <w:t>Tokens:</w:t>
       </w:r>
       <w:r>
-        <w:t xml:space="preserve"> </w:t>
-      </w:r>
-      <w:r>
-        <w:t>characters per token come from a tokenizer trained on the kept sample with data_prep’s settings.</w:t>
+        <w:t xml:space="preserve"> characters per token come from a tokenizer trained on the kept sample with data_prep’s settings.</w:t>
       </w:r>
     </w:p>
     <w:p>
@@ -20456,7 +20459,10 @@
         <w:t>--steps</w:t>
       </w:r>
       <w:r>
-        <w:t xml:space="preserve"> on its own only splits the data’s token budget (4 epochs) into that many steps, so </w:t>
+        <w:t xml:space="preserve"> on its own only splits the data’s token budget (4 epochs)</w:t>
+      </w:r>
+      <w:r>
+        <w:t xml:space="preserve"> into that many steps, so </w:t>
       </w:r>
       <w:r>
         <w:rPr>
@@ -20465,10 +20471,7 @@
         <w:t>--steps 15500</w:t>
       </w:r>
       <w:r>
-        <w:t xml:space="preserve"> </w:t>
-      </w:r>
-      <w:r>
-        <w:t>with a 70M shape still trains 10 billion tokens. Training hours use the speed of your last run in experiments.csv, as floating-point operations per second, so it carries over to other sizes.</w:t>
+        <w:t xml:space="preserve"> with a 70M shape still trains 10 billion tokens. Training hours use the speed of your last run in experiments.csv, as floating-point operations per second, so it carries over to other sizes.</w:t>
       </w:r>
     </w:p>
     <w:p>
@@ -20660,7 +20663,7 @@
         <w:pStyle w:val="Heading2"/>
       </w:pPr>
       <w:bookmarkStart w:id="58" w:name="cleaning-deduplication-split-and-audit"/>
-      <w:bookmarkStart w:id="59" w:name="_Toc241663715"/>
+      <w:bookmarkStart w:id="59" w:name="_Toc241665143"/>
       <w:bookmarkEnd w:id="56"/>
       <w:r>
         <w:rPr>
@@ -20670,6 +20673,8 @@
       </w:r>
       <w:r>
         <w:tab/>
+      </w:r>
+      <w:r>
         <w:t>Cleaning, deduplication, split and audit</w:t>
       </w:r>
       <w:bookmarkEnd w:id="59"/>
@@ -20738,10 +20743,10 @@
         <w:t>Boilerplate lines</w:t>
       </w:r>
       <w:r>
-        <w:t xml:space="preserve"> that recur in 20 or more documents (headers, licences, navigation) are stripped. Headings are never counted: “## Materials and methods” repeats in 40% of PubMed Central papers, but it is </w:t>
-      </w:r>
-      <w:r>
-        <w:t>structure, not boilerplate (Markdown headings and short ALL-CAPS lines are exempt).</w:t>
+        <w:t xml:space="preserve"> that recur in 20 or more documents (headers, licences, navigation) are stripped. Headings are never counted: “## Materials and methods” </w:t>
+      </w:r>
+      <w:r>
+        <w:t>repeats in 40% of PubMed Central papers, but it is structure, not boilerplate (Markdown headings and short ALL-CAPS lines are exempt).</w:t>
       </w:r>
     </w:p>
     <w:p>
@@ -20807,7 +20812,10 @@
         <w:t>Leakage audit:</w:t>
       </w:r>
       <w:r>
-        <w:t xml:space="preserve"> the share of validation word 13-grams that also occur in training data. A high share means the validation loss is optimistic.</w:t>
+        <w:t xml:space="preserve"> the share of validation word 13-grams that also occur in training data. A high share means the</w:t>
+      </w:r>
+      <w:r>
+        <w:t xml:space="preserve"> validation loss is optimistic.</w:t>
       </w:r>
     </w:p>
     <w:p>
@@ -20832,7 +20840,7 @@
         <w:pStyle w:val="Heading2"/>
       </w:pPr>
       <w:bookmarkStart w:id="60" w:name="X9bdd5544e1f332161ce69c21b8c82062f563dfc"/>
-      <w:bookmarkStart w:id="61" w:name="_Toc241663716"/>
+      <w:bookmarkStart w:id="61" w:name="_Toc241665144"/>
       <w:bookmarkEnd w:id="58"/>
       <w:r>
         <w:rPr>
@@ -21262,7 +21270,7 @@
         <w:pStyle w:val="Heading2"/>
       </w:pPr>
       <w:bookmarkStart w:id="62" w:name="Xc4591382f4fd028a28f1b17bee47be5b816a3b4"/>
-      <w:bookmarkStart w:id="63" w:name="_Toc241663717"/>
+      <w:bookmarkStart w:id="63" w:name="_Toc241665145"/>
       <w:bookmarkEnd w:id="60"/>
       <w:r>
         <w:rPr>
@@ -21272,6 +21280,8 @@
       </w:r>
       <w:r>
         <w:tab/>
+      </w:r>
+      <w:r>
         <w:t>Open-access papers from PubMed Central: download_pmc.py</w:t>
       </w:r>
       <w:bookmarkEnd w:id="63"/>
@@ -21331,10 +21341,10 @@
         <w:t>Fetch:</w:t>
       </w:r>
       <w:r>
-        <w:t xml:space="preserve"> the publishers’ structured XML (JATS) comes from NCBI PubMed Central, 100 papers per request, at most 3 requests per second (NCBI’s limit without an API key). 100,000 papers take about an hour. NCBI asks that </w:t>
-      </w:r>
-      <w:r>
-        <w:t>large jobs run at weekends or between 2 am and 10 am UK time.</w:t>
+        <w:t xml:space="preserve"> the publishers’ structured XML (JATS) comes from NCBI PubMed Central, 100 papers per request, at most </w:t>
+      </w:r>
+      <w:r>
+        <w:t>3 requests per second (NCBI’s limit without an API key). 100,000 papers take about an hour. NCBI asks that large jobs run at weekends or between 2 am and 10 am UK time.</w:t>
       </w:r>
     </w:p>
     <w:p>
@@ -21381,10 +21391,7 @@
         <w:t>Why XML, not PDF:</w:t>
       </w:r>
       <w:r>
-        <w:t xml:space="preserve"> the XML has the real section structure and equations, with no page headers, columns or </w:t>
-      </w:r>
-      <w:r>
-        <w:t>hyphenation to repair.</w:t>
+        <w:t xml:space="preserve"> the XML has the real section structure and equations, with no page headers, columns or hyphenation to repair.</w:t>
       </w:r>
     </w:p>
     <w:p>
@@ -21486,7 +21493,10 @@
         <w:t>Licences:</w:t>
       </w:r>
       <w:r>
-        <w:t xml:space="preserve"> most papers are CC BY; some are CC BY-NC or NIH author manuscripts (text mining allowed). Fine for a personal model; check </w:t>
+        <w:t xml:space="preserve"> </w:t>
+      </w:r>
+      <w:r>
+        <w:t xml:space="preserve">most papers are CC BY; some are CC BY-NC or NIH author manuscripts (text mining allowed). Fine for a personal model; check </w:t>
       </w:r>
       <w:r>
         <w:rPr>
@@ -21495,10 +21505,7 @@
         <w:t>report.tsv</w:t>
       </w:r>
       <w:r>
-        <w:t xml:space="preserve"> </w:t>
-      </w:r>
-      <w:r>
-        <w:t>before publishing a model trained on them.</w:t>
+        <w:t xml:space="preserve"> before publishing a model trained on them.</w:t>
       </w:r>
     </w:p>
     <w:p>
@@ -21506,7 +21513,7 @@
         <w:pStyle w:val="Heading2"/>
       </w:pPr>
       <w:bookmarkStart w:id="64" w:name="Xfc3d086a28d050a6fd537126ae8e168cdb8bdcc"/>
-      <w:bookmarkStart w:id="65" w:name="_Toc241663718"/>
+      <w:bookmarkStart w:id="65" w:name="_Toc241665146"/>
       <w:bookmarkEnd w:id="62"/>
       <w:r>
         <w:rPr>
@@ -21554,7 +21561,10 @@
         <w:pStyle w:val="FirstParagraph"/>
       </w:pPr>
       <w:r>
-        <w:t xml:space="preserve">A channel can be given as </w:t>
+        <w:t>A channel can be given as</w:t>
+      </w:r>
+      <w:r>
+        <w:t xml:space="preserve"> </w:t>
       </w:r>
       <w:r>
         <w:rPr>
@@ -21647,7 +21657,10 @@
         <w:t>--whisper</w:t>
       </w:r>
       <w:r>
-        <w:t xml:space="preserve"> run transcribes them. Whisper (distil-large-v3) uses the GPU only when no other job does, and moves to the CPU at once if a training run starts. On the CPU (small.en, 4 threads) it runs about 4 times faster than real time.</w:t>
+        <w:t xml:space="preserve"> run transcribes them. Whisper (distil-large-v3) uses the GPU only when </w:t>
+      </w:r>
+      <w:r>
+        <w:t>no other job does, and moves to the CPU at once if a training run starts. On the CPU (small.en, 4 threads) it runs about 4 times faster than real time.</w:t>
       </w:r>
     </w:p>
     <w:p>
@@ -21666,10 +21679,10 @@
         <w:t>On topic only:</w:t>
       </w:r>
       <w:r>
-        <w:t xml:space="preserve"> </w:t>
-      </w:r>
-      <w:r>
-        <w:t>a transcript is kept if it matches keywords_biology.txt at least 10 times, with 3 different terms and at least 4 matches per 1,000 words. The density rule matters because channels repeat their theme in every intro: every StatQuest video mentions “statistics”, “machine learning” and “neural networks”, which alone passed the looser web-text test. Whisper is used only for videos whose title or description mentions a keyword.</w:t>
+        <w:t xml:space="preserve"> a transcript is kept if it matches keywords_biology.txt at least 10 times, with 3 different terms and at least 4 matches per 1,000 words. The density rule matters because channels repeat their theme in every intro: every StatQuest video mentions “statistics”, “machine learning” and “neural networks”, which alone </w:t>
+      </w:r>
+      <w:r>
+        <w:t>passed the looser web-text test. Whisper is used only for videos whose title or description mentions a keyword.</w:t>
       </w:r>
     </w:p>
     <w:p>
@@ -21688,10 +21701,7 @@
         <w:t>Nothing large is stored:</w:t>
       </w:r>
       <w:r>
-        <w:t xml:space="preserve"> </w:t>
-      </w:r>
-      <w:r>
-        <w:t>no video is downloaded; Whisper’s audio track is deleted as soon as its transcript is written.</w:t>
+        <w:t xml:space="preserve"> no video is downloaded; Whisper’s audio track is deleted as soon as its transcript is written.</w:t>
       </w:r>
     </w:p>
     <w:p>
@@ -21737,7 +21747,10 @@
         <w:t>ai_training_data\_lectures_meta\&lt;channel&gt;_report.tsv</w:t>
       </w:r>
       <w:r>
-        <w:t>: status (ok, off_topic, queued_whisper, not_english, too_short…), transcript source, duration, words, keyword matches and licence of every video.</w:t>
+        <w:t xml:space="preserve">: status (ok, off_topic, queued_whisper, not_english, </w:t>
+      </w:r>
+      <w:r>
+        <w:t>too_short…), transcript source, duration, words, keyword matches and licence of every video.</w:t>
       </w:r>
     </w:p>
     <w:p>
@@ -21772,14 +21785,7 @@
           <w:b/>
           <w:bCs/>
         </w:rPr>
-        <w:t xml:space="preserve">If YouTube asks to </w:t>
-      </w:r>
-      <w:r>
-        <w:rPr>
-          <w:b/>
-          <w:bCs/>
-        </w:rPr>
-        <w:t>“confirm you’re not a bot”,</w:t>
+        <w:t>If YouTube asks to “confirm you’re not a bot”,</w:t>
       </w:r>
       <w:r>
         <w:t xml:space="preserve"> the run stops. Wait a few hours, or add </w:t>
@@ -21827,7 +21833,7 @@
         <w:pStyle w:val="Heading2"/>
       </w:pPr>
       <w:bookmarkStart w:id="66" w:name="more-data-worth-getting"/>
-      <w:bookmarkStart w:id="67" w:name="_Toc241663719"/>
+      <w:bookmarkStart w:id="67" w:name="_Toc241665147"/>
       <w:bookmarkEnd w:id="64"/>
       <w:r>
         <w:rPr>
@@ -22786,7 +22792,10 @@
         <w:t>Paywalled journals:</w:t>
       </w:r>
       <w:r>
-        <w:t xml:space="preserve"> use your institution’s lawful access and the publishers’ text-and-data-mining routes. UK law (CDPA section 29A) allows text-and-data-mining copies for non-commercial research.</w:t>
+        <w:t xml:space="preserve"> </w:t>
+      </w:r>
+      <w:r>
+        <w:t>use your institution’s lawful access and the publishers’ text-and-data-mining routes. UK law (CDPA section 29A) allows text-and-data-mining copies for non-commercial research.</w:t>
       </w:r>
     </w:p>
     <w:p>
@@ -22794,7 +22803,7 @@
         <w:pStyle w:val="Heading2"/>
       </w:pPr>
       <w:bookmarkStart w:id="68" w:name="gwas-summary-statistics"/>
-      <w:bookmarkStart w:id="69" w:name="_Toc241663720"/>
+      <w:bookmarkStart w:id="69" w:name="_Toc241665148"/>
       <w:bookmarkEnd w:id="66"/>
       <w:r>
         <w:rPr>
@@ -22824,10 +22833,10 @@
         <w:t>Reading them is easy and fast.</w:t>
       </w:r>
       <w:r>
-        <w:t xml:space="preserve"> </w:t>
-      </w:r>
-      <w:r>
-        <w:t>convert_to_markdown.py reads bgzipped files directly (bgzip is ordinary multi-part gzip), with pyarrow’s multi-threaded reader. It recognises the usual column names and handles a 3-million-variant file in about 15 seconds. A 300 to 800 MB file takes about 1 to 2 minutes, so a thousand files is roughly a day of CPU time.</w:t>
+        <w:t xml:space="preserve"> convert_to_markdown.py reads bgzipped files directly (bgzip is ordinary multi-part gzip), with pyarrow’s multi-threaded reader. It recognises the usual column names and handles a </w:t>
+      </w:r>
+      <w:r>
+        <w:t>3-million-variant file in about 15 seconds. A 300 to 800 MB file takes about 1 to 2 minutes, so a thousand files is roughly a day of CPU time.</w:t>
       </w:r>
     </w:p>
     <w:p>
@@ -22865,10 +22874,7 @@
         <w:t>What the converter writes instead</w:t>
       </w:r>
       <w:r>
-        <w:t xml:space="preserve"> </w:t>
-      </w:r>
-      <w:r>
-        <w:t xml:space="preserve">is a short text summary: variant count, genomic inflation </w:t>
+        <w:t xml:space="preserve"> is a short text summary: variant count, genomic inflation </w:t>
       </w:r>
       <m:oMath>
         <m:sSub>
@@ -22898,7 +22904,10 @@
         </m:sSub>
       </m:oMath>
       <w:r>
-        <w:t>, genome-wide significant loci after 1 Mb clumping with their top variants and effects, and counts per chromosome. That’s about 1 to 3 thousand tokens per study.</w:t>
+        <w:t xml:space="preserve">, genome-wide significant loci after 1 Mb clumping with their top variants and effects, and counts per chromosome. </w:t>
+      </w:r>
+      <w:r>
+        <w:t>That’s about 1 to 3 thousand tokens per study.</w:t>
       </w:r>
     </w:p>
     <w:p>
@@ -23064,7 +23073,7 @@
         <w:pStyle w:val="Heading2"/>
       </w:pPr>
       <w:bookmarkStart w:id="70" w:name="pictures-png-in-the-future"/>
-      <w:bookmarkStart w:id="71" w:name="_Toc241663721"/>
+      <w:bookmarkStart w:id="71" w:name="_Toc241665149"/>
       <w:bookmarkEnd w:id="68"/>
       <w:r>
         <w:rPr>
@@ -23092,7 +23101,10 @@
         <w:t>images</w:t>
       </w:r>
       <w:r>
-        <w:t xml:space="preserve"> folder is kept out of text training. There are three routes, in order of practicality:</w:t>
+        <w:t xml:space="preserve"> </w:t>
+      </w:r>
+      <w:r>
+        <w:t>folder is kept out of text training. There are three routes, in order of practicality:</w:t>
       </w:r>
     </w:p>
     <w:p>
@@ -23111,10 +23123,7 @@
         <w:t>Pictures to text, now.</w:t>
       </w:r>
       <w:r>
-        <w:t xml:space="preserve"> Use figure captions (the PDF converter keeps them) and descriptions of each figure </w:t>
-      </w:r>
-      <w:r>
-        <w:t>written by a vision-language model on the Mac Studio. The text then trains tinyGPT as usual. For charts, keep the underlying data table instead.</w:t>
+        <w:t xml:space="preserve"> Use figure captions (the PDF converter keeps them) and descriptions of each figure written by a vision-language model on the Mac Studio. The text then trains tinyGPT as usual. For charts, keep the underlying data table instead.</w:t>
       </w:r>
     </w:p>
     <w:p>
@@ -23133,7 +23142,10 @@
         <w:t>Continuous image features, the LLaVA route.</w:t>
       </w:r>
       <w:r>
-        <w:t xml:space="preserve"> A pretrained image encoder (a ViT such as SigLIP) turns each image into patch vectors. A small projection layer maps them into the model’s width, and the model reads them like tokens.</w:t>
+        <w:t xml:space="preserve"> A pretrained image encoder (a ViT such as SigLIP) turns each image </w:t>
+      </w:r>
+      <w:r>
+        <w:t>into patch vectors. A small projection layer maps them into the model’s width, and the model reads them like tokens.</w:t>
       </w:r>
     </w:p>
     <w:p>
@@ -23176,7 +23188,10 @@
         <w:t>Discrete image tokens, the Chameleon route.</w:t>
       </w:r>
       <w:r>
-        <w:t xml:space="preserve"> A VQ-VAE or VQGAN turns an image into, for example, 256 codes from an 8,192-entry codebook. These codes are added to the vocabulary, and the model reads and writes them like words. It’s elegant, but costly to train well.</w:t>
+        <w:t xml:space="preserve"> A VQ-VAE or VQGAN turns an image into, for example, 256 codes from an 8,192-entry codebook. These codes are added to the vocabulary, and the model reads and writes them like words. </w:t>
+      </w:r>
+      <w:r>
+        <w:t>It’s elegant, but costly to train well.</w:t>
       </w:r>
     </w:p>
     <w:p>
@@ -23184,7 +23199,7 @@
         <w:pStyle w:val="Heading1"/>
       </w:pPr>
       <w:bookmarkStart w:id="72" w:name="training-a-run"/>
-      <w:bookmarkStart w:id="73" w:name="_Toc241663722"/>
+      <w:bookmarkStart w:id="73" w:name="_Toc241665150"/>
       <w:bookmarkEnd w:id="46"/>
       <w:bookmarkEnd w:id="70"/>
       <w:r>
@@ -23204,7 +23219,7 @@
         <w:pStyle w:val="Heading2"/>
       </w:pPr>
       <w:bookmarkStart w:id="74" w:name="reading-the-log"/>
-      <w:bookmarkStart w:id="75" w:name="_Toc241663723"/>
+      <w:bookmarkStart w:id="75" w:name="_Toc241665151"/>
       <w:r>
         <w:rPr>
           <w:rStyle w:val="SectionNumber"/>
@@ -23430,13 +23445,7 @@
               <w:rPr>
                 <w:sz w:val="17"/>
               </w:rPr>
-              <w:t>Validation perplexity,</w:t>
-            </w:r>
-            <w:r>
-              <w:rPr>
-                <w:sz w:val="17"/>
-              </w:rPr>
-              <w:t xml:space="preserve"> </w:t>
+              <w:t xml:space="preserve">Validation perplexity, </w:t>
             </w:r>
             <m:oMath>
               <m:sSup>
@@ -23677,10 +23686,10 @@
         <w:t>...</w:t>
       </w:r>
       <w:r>
-        <w:t xml:space="preserve"> appears every 2 minutes between evaluations, so a slow step never </w:t>
-      </w:r>
-      <w:r>
-        <w:t>looks like a hang. It shows the training loss since the previous line, speed and time to the next validation; it includes no validation. The run header explains this once, so the line itself stays short.</w:t>
+        <w:t xml:space="preserve"> </w:t>
+      </w:r>
+      <w:r>
+        <w:t>appears every 2 minutes between evaluations, so a slow step never looks like a hang. It shows the training loss since the previous line, speed and time to the next validation; it includes no validation. The run header explains this once, so the line itself stays short.</w:t>
       </w:r>
     </w:p>
     <w:p>
@@ -23725,7 +23734,7 @@
         <w:pStyle w:val="Heading2"/>
       </w:pPr>
       <w:bookmarkStart w:id="76" w:name="checkpoints-pausing-and-resuming"/>
-      <w:bookmarkStart w:id="77" w:name="_Toc241663724"/>
+      <w:bookmarkStart w:id="77" w:name="_Toc241665152"/>
       <w:bookmarkEnd w:id="74"/>
       <w:r>
         <w:rPr>
@@ -23873,10 +23882,7 @@
         <w:t>python tiny_gpt.py --resume</w:t>
       </w:r>
       <w:r>
-        <w:t xml:space="preserve"> </w:t>
-      </w:r>
-      <w:r>
-        <w:t>continues exactly where the run stopped. The learning-rate schedule is stateless, so resuming is exact.</w:t>
+        <w:t xml:space="preserve"> continues exactly where the run stopped. The learning-rate schedule is stateless, so resuming is exact.</w:t>
       </w:r>
     </w:p>
     <w:p>
@@ -23931,10 +23937,10 @@
         <w:t>--init-from other.pt</w:t>
       </w:r>
       <w:r>
-        <w:t xml:space="preserve"> starts a new run from another checkpoint’s </w:t>
-      </w:r>
-      <w:r>
-        <w:t>weights: that’s continued pre-training on new data.</w:t>
+        <w:t xml:space="preserve"> </w:t>
+      </w:r>
+      <w:r>
+        <w:t>starts a new run from another checkpoint’s weights: that’s continued pre-training on new data.</w:t>
       </w:r>
     </w:p>
     <w:p>
@@ -23963,7 +23969,7 @@
         <w:pStyle w:val="Heading2"/>
       </w:pPr>
       <w:bookmarkStart w:id="78" w:name="Xce23c4353a139fefc25bd39ebff21fc6eef92b5"/>
-      <w:bookmarkStart w:id="79" w:name="_Toc241663725"/>
+      <w:bookmarkStart w:id="79" w:name="_Toc241665153"/>
       <w:bookmarkEnd w:id="76"/>
       <w:r>
         <w:rPr>
@@ -24052,7 +24058,10 @@
         <w:t>ai_training_data</w:t>
       </w:r>
       <w:r>
-        <w:t xml:space="preserve"> (old and new text) with the </w:t>
+        <w:t xml:space="preserve"> </w:t>
+      </w:r>
+      <w:r>
+        <w:t xml:space="preserve">(old and new text) with the </w:t>
       </w:r>
       <w:r>
         <w:rPr>
@@ -24062,10 +24071,7 @@
         <w:t>same tokenizer</w:t>
       </w:r>
       <w:r>
-        <w:t xml:space="preserve"> </w:t>
-      </w:r>
-      <w:r>
-        <w:t>as the first dataset (</w:t>
+        <w:t xml:space="preserve"> as the first dataset (</w:t>
       </w:r>
       <w:r>
         <w:rPr>
@@ -24161,7 +24167,7 @@
         <w:pStyle w:val="Heading2"/>
       </w:pPr>
       <w:bookmarkStart w:id="80" w:name="the-experiments-table"/>
-      <w:bookmarkStart w:id="81" w:name="_Toc241663726"/>
+      <w:bookmarkStart w:id="81" w:name="_Toc241665154"/>
       <w:bookmarkEnd w:id="78"/>
       <w:r>
         <w:rPr>
@@ -24267,7 +24273,7 @@
         <w:pStyle w:val="Heading2"/>
       </w:pPr>
       <w:bookmarkStart w:id="82" w:name="energy-carbon-and-cost"/>
-      <w:bookmarkStart w:id="83" w:name="_Toc241663727"/>
+      <w:bookmarkStart w:id="83" w:name="_Toc241665155"/>
       <w:bookmarkEnd w:id="80"/>
       <w:r>
         <w:rPr>
@@ -24505,7 +24511,7 @@
         <w:pStyle w:val="Heading2"/>
       </w:pPr>
       <w:bookmarkStart w:id="84" w:name="exporting-a-model"/>
-      <w:bookmarkStart w:id="85" w:name="_Toc241663728"/>
+      <w:bookmarkStart w:id="85" w:name="_Toc241665156"/>
       <w:bookmarkEnd w:id="82"/>
       <w:r>
         <w:rPr>
@@ -24732,7 +24738,7 @@
         <w:pStyle w:val="Heading1"/>
       </w:pPr>
       <w:bookmarkStart w:id="86" w:name="evaluating-a-model"/>
-      <w:bookmarkStart w:id="87" w:name="_Toc241663729"/>
+      <w:bookmarkStart w:id="87" w:name="_Toc241665157"/>
       <w:bookmarkEnd w:id="72"/>
       <w:bookmarkEnd w:id="84"/>
       <w:r>
@@ -24752,7 +24758,7 @@
         <w:pStyle w:val="Heading2"/>
       </w:pPr>
       <w:bookmarkStart w:id="88" w:name="loss-perplexity-and-bits-per-byte"/>
-      <w:bookmarkStart w:id="89" w:name="_Toc241663730"/>
+      <w:bookmarkStart w:id="89" w:name="_Toc241665158"/>
       <w:r>
         <w:rPr>
           <w:rStyle w:val="SectionNumber"/>
@@ -24837,7 +24843,7 @@
         <w:pStyle w:val="Heading2"/>
       </w:pPr>
       <w:bookmarkStart w:id="90" w:name="the-fact-benchmark"/>
-      <w:bookmarkStart w:id="91" w:name="_Toc241663731"/>
+      <w:bookmarkStart w:id="91" w:name="_Toc241665159"/>
       <w:bookmarkEnd w:id="88"/>
       <w:r>
         <w:rPr>
@@ -26222,7 +26228,7 @@
         <w:pStyle w:val="Heading2"/>
       </w:pPr>
       <w:bookmarkStart w:id="92" w:name="Xd55aac8070434e0efdbeb1fff754f7b8fd345b5"/>
-      <w:bookmarkStart w:id="93" w:name="_Toc241663732"/>
+      <w:bookmarkStart w:id="93" w:name="_Toc241665160"/>
       <w:bookmarkEnd w:id="90"/>
       <w:r>
         <w:rPr>
@@ -26357,7 +26363,7 @@
         <w:pStyle w:val="Heading2"/>
       </w:pPr>
       <w:bookmarkStart w:id="94" w:name="the-dashboard"/>
-      <w:bookmarkStart w:id="95" w:name="_Toc241663733"/>
+      <w:bookmarkStart w:id="95" w:name="_Toc241665161"/>
       <w:bookmarkEnd w:id="92"/>
       <w:r>
         <w:rPr>
@@ -26552,7 +26558,7 @@
         <w:pStyle w:val="Heading2"/>
       </w:pPr>
       <w:bookmarkStart w:id="96" w:name="X7efef3a44031ff533b64507845ffdeb5da843ff"/>
-      <w:bookmarkStart w:id="97" w:name="_Toc241663734"/>
+      <w:bookmarkStart w:id="97" w:name="_Toc241665162"/>
       <w:bookmarkEnd w:id="94"/>
       <w:r>
         <w:rPr>
@@ -27358,7 +27364,7 @@
         <w:pStyle w:val="Heading1"/>
       </w:pPr>
       <w:bookmarkStart w:id="98" w:name="Xa1cc98f937cc273961788fd9ca4ca9fa7d2cd66"/>
-      <w:bookmarkStart w:id="99" w:name="_Toc241663735"/>
+      <w:bookmarkStart w:id="99" w:name="_Toc241665163"/>
       <w:bookmarkEnd w:id="86"/>
       <w:bookmarkEnd w:id="96"/>
       <w:r>
@@ -27378,7 +27384,7 @@
         <w:pStyle w:val="Heading2"/>
       </w:pPr>
       <w:bookmarkStart w:id="100" w:name="separate-scripts-sharing-one-model"/>
-      <w:bookmarkStart w:id="101" w:name="_Toc241663736"/>
+      <w:bookmarkStart w:id="101" w:name="_Toc241665164"/>
       <w:r>
         <w:rPr>
           <w:rStyle w:val="SectionNumber"/>
@@ -27909,7 +27915,7 @@
         <w:pStyle w:val="Heading2"/>
       </w:pPr>
       <w:bookmarkStart w:id="102" w:name="supervised-fine-tuning"/>
-      <w:bookmarkStart w:id="103" w:name="_Toc241663737"/>
+      <w:bookmarkStart w:id="103" w:name="_Toc241665165"/>
       <w:bookmarkEnd w:id="100"/>
       <w:r>
         <w:rPr>
@@ -28152,7 +28158,7 @@
         <w:pStyle w:val="Heading2"/>
       </w:pPr>
       <w:bookmarkStart w:id="104" w:name="preference-tuning-dpo"/>
-      <w:bookmarkStart w:id="105" w:name="_Toc241663738"/>
+      <w:bookmarkStart w:id="105" w:name="_Toc241665166"/>
       <w:bookmarkEnd w:id="102"/>
       <w:r>
         <w:rPr>
@@ -28329,7 +28335,7 @@
         <w:pStyle w:val="Heading2"/>
       </w:pPr>
       <w:bookmarkStart w:id="106" w:name="X9ed80f729ac16c52123de20ef25b4d7814666fd"/>
-      <w:bookmarkStart w:id="107" w:name="_Toc241663739"/>
+      <w:bookmarkStart w:id="107" w:name="_Toc241665167"/>
       <w:bookmarkEnd w:id="104"/>
       <w:r>
         <w:rPr>
@@ -28527,7 +28533,7 @@
         <w:pStyle w:val="Heading2"/>
       </w:pPr>
       <w:bookmarkStart w:id="108" w:name="what-to-expect-at-this-size"/>
-      <w:bookmarkStart w:id="109" w:name="_Toc241663740"/>
+      <w:bookmarkStart w:id="109" w:name="_Toc241665168"/>
       <w:bookmarkEnd w:id="106"/>
       <w:r>
         <w:rPr>
@@ -28616,7 +28622,7 @@
         <w:pStyle w:val="Heading1"/>
       </w:pPr>
       <w:bookmarkStart w:id="110" w:name="was-this-text-written-by-my-model"/>
-      <w:bookmarkStart w:id="111" w:name="_Toc241663741"/>
+      <w:bookmarkStart w:id="111" w:name="_Toc241665169"/>
       <w:bookmarkEnd w:id="98"/>
       <w:bookmarkEnd w:id="108"/>
       <w:r>
@@ -28644,7 +28650,7 @@
         <w:pStyle w:val="Heading2"/>
       </w:pPr>
       <w:bookmarkStart w:id="112" w:name="X94868af322c496bf0a6feeceae7424bccee950c"/>
-      <w:bookmarkStart w:id="113" w:name="_Toc241663742"/>
+      <w:bookmarkStart w:id="113" w:name="_Toc241665170"/>
       <w:r>
         <w:rPr>
           <w:rStyle w:val="SectionNumber"/>
@@ -28800,7 +28806,7 @@
         <w:pStyle w:val="Heading2"/>
       </w:pPr>
       <w:bookmarkStart w:id="114" w:name="likelihood-score-evidence-for-any-text"/>
-      <w:bookmarkStart w:id="115" w:name="_Toc241663743"/>
+      <w:bookmarkStart w:id="115" w:name="_Toc241665171"/>
       <w:bookmarkEnd w:id="112"/>
       <w:r>
         <w:rPr>
@@ -28978,7 +28984,7 @@
         <w:pStyle w:val="Heading1"/>
       </w:pPr>
       <w:bookmarkStart w:id="116" w:name="the-mathematics-and-statistics"/>
-      <w:bookmarkStart w:id="117" w:name="_Toc241663744"/>
+      <w:bookmarkStart w:id="117" w:name="_Toc241665172"/>
       <w:bookmarkEnd w:id="110"/>
       <w:bookmarkEnd w:id="114"/>
       <w:r>
@@ -29053,7 +29059,7 @@
         <w:pStyle w:val="Heading2"/>
       </w:pPr>
       <w:bookmarkStart w:id="118" w:name="likelihood-perplexity-and-bits-per-byte"/>
-      <w:bookmarkStart w:id="119" w:name="_Toc241663745"/>
+      <w:bookmarkStart w:id="119" w:name="_Toc241665173"/>
       <w:r>
         <w:rPr>
           <w:rStyle w:val="SectionNumber"/>
@@ -30567,7 +30573,7 @@
         <w:pStyle w:val="Heading2"/>
       </w:pPr>
       <w:bookmarkStart w:id="120" w:name="the-transformer-1"/>
-      <w:bookmarkStart w:id="121" w:name="_Toc241663746"/>
+      <w:bookmarkStart w:id="121" w:name="_Toc241665174"/>
       <w:bookmarkEnd w:id="118"/>
       <w:r>
         <w:rPr>
@@ -34160,7 +34166,7 @@
         <w:pStyle w:val="Heading2"/>
       </w:pPr>
       <w:bookmarkStart w:id="122" w:name="optimisation"/>
-      <w:bookmarkStart w:id="123" w:name="_Toc241663747"/>
+      <w:bookmarkStart w:id="123" w:name="_Toc241665175"/>
       <w:bookmarkEnd w:id="120"/>
       <w:r>
         <w:rPr>
@@ -37065,7 +37071,7 @@
         <w:pStyle w:val="Heading2"/>
       </w:pPr>
       <w:bookmarkStart w:id="124" w:name="scaling-laws-and-repeated-data"/>
-      <w:bookmarkStart w:id="125" w:name="_Toc241663748"/>
+      <w:bookmarkStart w:id="125" w:name="_Toc241665176"/>
       <w:bookmarkEnd w:id="122"/>
       <w:r>
         <w:rPr>
@@ -38200,7 +38206,7 @@
         <w:pStyle w:val="Heading2"/>
       </w:pPr>
       <w:bookmarkStart w:id="126" w:name="evaluation-statistics"/>
-      <w:bookmarkStart w:id="127" w:name="_Toc241663749"/>
+      <w:bookmarkStart w:id="127" w:name="_Toc241665177"/>
       <w:bookmarkEnd w:id="124"/>
       <w:r>
         <w:rPr>
@@ -40342,7 +40348,7 @@
         <w:pStyle w:val="Heading2"/>
       </w:pPr>
       <w:bookmarkStart w:id="128" w:name="post-training"/>
-      <w:bookmarkStart w:id="129" w:name="_Toc241663750"/>
+      <w:bookmarkStart w:id="129" w:name="_Toc241665178"/>
       <w:bookmarkEnd w:id="126"/>
       <w:r>
         <w:rPr>
@@ -43533,7 +43539,7 @@
         <w:pStyle w:val="Heading2"/>
       </w:pPr>
       <w:bookmarkStart w:id="130" w:name="generation-and-detection"/>
-      <w:bookmarkStart w:id="131" w:name="_Toc241663751"/>
+      <w:bookmarkStart w:id="131" w:name="_Toc241665179"/>
       <w:bookmarkEnd w:id="128"/>
       <w:r>
         <w:rPr>
@@ -45120,7 +45126,7 @@
         <w:pStyle w:val="Heading2"/>
       </w:pPr>
       <w:bookmarkStart w:id="132" w:name="data-statistics"/>
-      <w:bookmarkStart w:id="133" w:name="_Toc241663752"/>
+      <w:bookmarkStart w:id="133" w:name="_Toc241665180"/>
       <w:bookmarkEnd w:id="130"/>
       <w:r>
         <w:rPr>
@@ -45734,7 +45740,7 @@
         <w:pStyle w:val="Heading1"/>
       </w:pPr>
       <w:bookmarkStart w:id="134" w:name="the-laptop-gpu-throttle"/>
-      <w:bookmarkStart w:id="135" w:name="_Toc241663753"/>
+      <w:bookmarkStart w:id="135" w:name="_Toc241665181"/>
       <w:bookmarkEnd w:id="116"/>
       <w:bookmarkEnd w:id="132"/>
       <w:r>
@@ -45754,7 +45760,7 @@
         <w:pStyle w:val="Heading2"/>
       </w:pPr>
       <w:bookmarkStart w:id="136" w:name="what-was-measured"/>
-      <w:bookmarkStart w:id="137" w:name="_Toc241663754"/>
+      <w:bookmarkStart w:id="137" w:name="_Toc241665182"/>
       <w:r>
         <w:rPr>
           <w:rStyle w:val="SectionNumber"/>
@@ -45999,7 +46005,7 @@
         <w:pStyle w:val="Heading2"/>
       </w:pPr>
       <w:bookmarkStart w:id="138" w:name="likely-causes"/>
-      <w:bookmarkStart w:id="139" w:name="_Toc241663755"/>
+      <w:bookmarkStart w:id="139" w:name="_Toc241665183"/>
       <w:bookmarkEnd w:id="136"/>
       <w:r>
         <w:rPr>
@@ -46157,7 +46163,7 @@
         <w:pStyle w:val="Heading2"/>
       </w:pPr>
       <w:bookmarkStart w:id="140" w:name="what-to-try-in-order"/>
-      <w:bookmarkStart w:id="141" w:name="_Toc241663756"/>
+      <w:bookmarkStart w:id="141" w:name="_Toc241665184"/>
       <w:bookmarkEnd w:id="138"/>
       <w:r>
         <w:rPr>
@@ -46542,7 +46548,7 @@
         <w:pStyle w:val="Heading1"/>
       </w:pPr>
       <w:bookmarkStart w:id="142" w:name="scaling-up"/>
-      <w:bookmarkStart w:id="143" w:name="_Toc241663757"/>
+      <w:bookmarkStart w:id="143" w:name="_Toc241665185"/>
       <w:bookmarkEnd w:id="134"/>
       <w:bookmarkEnd w:id="140"/>
       <w:r>
@@ -46562,7 +46568,7 @@
         <w:pStyle w:val="Heading2"/>
       </w:pPr>
       <w:bookmarkStart w:id="144" w:name="X60c251acf6cc087f15a89907a3ae63c867638c5"/>
-      <w:bookmarkStart w:id="145" w:name="_Toc241663758"/>
+      <w:bookmarkStart w:id="145" w:name="_Toc241665186"/>
       <w:r>
         <w:rPr>
           <w:rStyle w:val="SectionNumber"/>
@@ -47232,7 +47238,7 @@
         <w:pStyle w:val="Heading2"/>
       </w:pPr>
       <w:bookmarkStart w:id="146" w:name="renting-an-h100-lambda-cloud"/>
-      <w:bookmarkStart w:id="147" w:name="_Toc241663759"/>
+      <w:bookmarkStart w:id="147" w:name="_Toc241665187"/>
       <w:bookmarkEnd w:id="144"/>
       <w:r>
         <w:rPr>
@@ -47958,7 +47964,7 @@
         <w:pStyle w:val="Heading2"/>
       </w:pPr>
       <w:bookmarkStart w:id="148" w:name="a-1b-model-from-scratch"/>
-      <w:bookmarkStart w:id="149" w:name="_Toc241663760"/>
+      <w:bookmarkStart w:id="149" w:name="_Toc241665188"/>
       <w:bookmarkEnd w:id="146"/>
       <w:r>
         <w:rPr>
@@ -48455,7 +48461,7 @@
         <w:pStyle w:val="Heading2"/>
       </w:pPr>
       <w:bookmarkStart w:id="150" w:name="is-1b-enough-for-a-specialised-field"/>
-      <w:bookmarkStart w:id="151" w:name="_Toc241663761"/>
+      <w:bookmarkStart w:id="151" w:name="_Toc241665189"/>
       <w:bookmarkEnd w:id="148"/>
       <w:r>
         <w:rPr>
@@ -48609,7 +48615,7 @@
         <w:pStyle w:val="Heading2"/>
       </w:pPr>
       <w:bookmarkStart w:id="152" w:name="X30c0ff3366ed0f880f1b78628a446bbd6327d7e"/>
-      <w:bookmarkStart w:id="153" w:name="_Toc241663762"/>
+      <w:bookmarkStart w:id="153" w:name="_Toc241665190"/>
       <w:bookmarkEnd w:id="150"/>
       <w:r>
         <w:rPr>
@@ -48919,7 +48925,7 @@
         <w:pStyle w:val="Heading2"/>
       </w:pPr>
       <w:bookmarkStart w:id="154" w:name="the-mac-studio-plan-from-guide.md"/>
-      <w:bookmarkStart w:id="155" w:name="_Toc241663763"/>
+      <w:bookmarkStart w:id="155" w:name="_Toc241665191"/>
       <w:bookmarkEnd w:id="152"/>
       <w:r>
         <w:rPr>
@@ -52066,7 +52072,7 @@
         <w:pStyle w:val="Heading1"/>
       </w:pPr>
       <w:bookmarkStart w:id="162" w:name="techniques-roadmap"/>
-      <w:bookmarkStart w:id="163" w:name="_Toc241663764"/>
+      <w:bookmarkStart w:id="163" w:name="_Toc241665192"/>
       <w:bookmarkEnd w:id="142"/>
       <w:bookmarkEnd w:id="154"/>
       <w:bookmarkEnd w:id="161"/>
@@ -52125,7 +52131,7 @@
         <w:pStyle w:val="Heading2"/>
       </w:pPr>
       <w:bookmarkStart w:id="164" w:name="done-on-29-september"/>
-      <w:bookmarkStart w:id="165" w:name="_Toc241663765"/>
+      <w:bookmarkStart w:id="165" w:name="_Toc241665193"/>
       <w:r>
         <w:rPr>
           <w:rStyle w:val="SectionNumber"/>
@@ -52566,7 +52572,7 @@
         <w:pStyle w:val="Heading2"/>
       </w:pPr>
       <w:bookmarkStart w:id="166" w:name="recommended-next-in-order"/>
-      <w:bookmarkStart w:id="167" w:name="_Toc241663766"/>
+      <w:bookmarkStart w:id="167" w:name="_Toc241665194"/>
       <w:bookmarkEnd w:id="164"/>
       <w:r>
         <w:rPr>
@@ -53919,7 +53925,7 @@
         <w:pStyle w:val="Heading2"/>
       </w:pPr>
       <w:bookmarkStart w:id="168" w:name="later-or-at-larger-scale"/>
-      <w:bookmarkStart w:id="169" w:name="_Toc241663767"/>
+      <w:bookmarkStart w:id="169" w:name="_Toc241665195"/>
       <w:bookmarkEnd w:id="166"/>
       <w:r>
         <w:rPr>
@@ -54149,7 +54155,7 @@
         <w:pStyle w:val="Heading1"/>
       </w:pPr>
       <w:bookmarkStart w:id="170" w:name="tools-safety-and-naming"/>
-      <w:bookmarkStart w:id="171" w:name="_Toc241663768"/>
+      <w:bookmarkStart w:id="171" w:name="_Toc241665196"/>
       <w:bookmarkEnd w:id="162"/>
       <w:bookmarkEnd w:id="168"/>
       <w:r>
@@ -54169,7 +54175,7 @@
         <w:pStyle w:val="Heading2"/>
       </w:pPr>
       <w:bookmarkStart w:id="172" w:name="other-training-frameworks"/>
-      <w:bookmarkStart w:id="173" w:name="_Toc241663769"/>
+      <w:bookmarkStart w:id="173" w:name="_Toc241665197"/>
       <w:r>
         <w:rPr>
           <w:rStyle w:val="SectionNumber"/>
@@ -54810,7 +54816,7 @@
         <w:pStyle w:val="Heading2"/>
       </w:pPr>
       <w:bookmarkStart w:id="174" w:name="safety-rules-built-into-the-scripts"/>
-      <w:bookmarkStart w:id="175" w:name="_Toc241663770"/>
+      <w:bookmarkStart w:id="175" w:name="_Toc241665198"/>
       <w:bookmarkEnd w:id="172"/>
       <w:r>
         <w:rPr>
@@ -55078,7 +55084,7 @@
         <w:pStyle w:val="Heading2"/>
       </w:pPr>
       <w:bookmarkStart w:id="176" w:name="a-name-for-the-model"/>
-      <w:bookmarkStart w:id="177" w:name="_Toc241663771"/>
+      <w:bookmarkStart w:id="177" w:name="_Toc241665199"/>
       <w:bookmarkEnd w:id="174"/>
       <w:r>
         <w:rPr>
@@ -55208,7 +55214,7 @@
         <w:pStyle w:val="Heading1"/>
       </w:pPr>
       <w:bookmarkStart w:id="178" w:name="glossary"/>
-      <w:bookmarkStart w:id="179" w:name="_Toc241663772"/>
+      <w:bookmarkStart w:id="179" w:name="_Toc241665200"/>
       <w:bookmarkEnd w:id="170"/>
       <w:bookmarkEnd w:id="176"/>
       <w:r>
@@ -56819,7 +56825,7 @@
         <w:pStyle w:val="Heading1"/>
       </w:pPr>
       <w:bookmarkStart w:id="180" w:name="reading-list-and-references"/>
-      <w:bookmarkStart w:id="181" w:name="_Toc241663773"/>
+      <w:bookmarkStart w:id="181" w:name="_Toc241665201"/>
       <w:bookmarkEnd w:id="178"/>
       <w:r>
         <w:t>Reading list and references</w:t>
@@ -57203,7 +57209,7 @@
   <w:abstractNum w:abstractNumId="0" w15:restartNumberingAfterBreak="0">
     <w:nsid w:val="0000A990"/>
     <w:multiLevelType w:val="multilevel"/>
-    <w:tmpl w:val="98825A88"/>
+    <w:tmpl w:val="AE48A792"/>
     <w:lvl w:ilvl="0">
       <w:numFmt w:val="bullet"/>
       <w:lvlText w:val=" "/>
@@ -57280,7 +57286,7 @@
   <w:abstractNum w:abstractNumId="1" w15:restartNumberingAfterBreak="0">
     <w:nsid w:val="0000A991"/>
     <w:multiLevelType w:val="multilevel"/>
-    <w:tmpl w:val="DE260284"/>
+    <w:tmpl w:val="B0005F34"/>
     <w:lvl w:ilvl="0">
       <w:numFmt w:val="bullet"/>
       <w:lvlText w:val=""/>
@@ -57384,7 +57390,7 @@
   <w:abstractNum w:abstractNumId="2" w15:restartNumberingAfterBreak="0">
     <w:nsid w:val="00A99411"/>
     <w:multiLevelType w:val="multilevel"/>
-    <w:tmpl w:val="5E509F34"/>
+    <w:tmpl w:val="B6683C24"/>
     <w:lvl w:ilvl="0">
       <w:start w:val="1"/>
       <w:numFmt w:val="decimal"/>
@@ -57467,25 +57473,25 @@
       </w:pPr>
     </w:lvl>
   </w:abstractNum>
-  <w:num w:numId="1" w16cid:durableId="722212784">
+  <w:num w:numId="1" w16cid:durableId="147787751">
     <w:abstractNumId w:val="0"/>
   </w:num>
-  <w:num w:numId="2" w16cid:durableId="949894241">
+  <w:num w:numId="2" w16cid:durableId="1569730649">
     <w:abstractNumId w:val="1"/>
   </w:num>
-  <w:num w:numId="3" w16cid:durableId="768626374">
+  <w:num w:numId="3" w16cid:durableId="582187073">
     <w:abstractNumId w:val="1"/>
   </w:num>
-  <w:num w:numId="4" w16cid:durableId="1476944775">
+  <w:num w:numId="4" w16cid:durableId="1663123228">
     <w:abstractNumId w:val="1"/>
   </w:num>
-  <w:num w:numId="5" w16cid:durableId="599918358">
+  <w:num w:numId="5" w16cid:durableId="1422724650">
     <w:abstractNumId w:val="1"/>
   </w:num>
-  <w:num w:numId="6" w16cid:durableId="282351320">
+  <w:num w:numId="6" w16cid:durableId="1876114827">
     <w:abstractNumId w:val="1"/>
   </w:num>
-  <w:num w:numId="7" w16cid:durableId="337854593">
+  <w:num w:numId="7" w16cid:durableId="204679238">
     <w:abstractNumId w:val="2"/>
     <w:lvlOverride w:ilvl="0">
       <w:startOverride w:val="1"/>
@@ -57515,19 +57521,19 @@
       <w:startOverride w:val="1"/>
     </w:lvlOverride>
   </w:num>
-  <w:num w:numId="8" w16cid:durableId="1103451068">
+  <w:num w:numId="8" w16cid:durableId="466314022">
     <w:abstractNumId w:val="1"/>
   </w:num>
-  <w:num w:numId="9" w16cid:durableId="1909143049">
+  <w:num w:numId="9" w16cid:durableId="1588690649">
     <w:abstractNumId w:val="1"/>
   </w:num>
-  <w:num w:numId="10" w16cid:durableId="1674406013">
+  <w:num w:numId="10" w16cid:durableId="870917418">
     <w:abstractNumId w:val="1"/>
   </w:num>
-  <w:num w:numId="11" w16cid:durableId="476651099">
+  <w:num w:numId="11" w16cid:durableId="524754708">
     <w:abstractNumId w:val="1"/>
   </w:num>
-  <w:num w:numId="12" w16cid:durableId="639069384">
+  <w:num w:numId="12" w16cid:durableId="2052151041">
     <w:abstractNumId w:val="2"/>
     <w:lvlOverride w:ilvl="0">
       <w:startOverride w:val="1"/>
@@ -57557,43 +57563,43 @@
       <w:startOverride w:val="1"/>
     </w:lvlOverride>
   </w:num>
-  <w:num w:numId="13" w16cid:durableId="902764073">
+  <w:num w:numId="13" w16cid:durableId="426729990">
     <w:abstractNumId w:val="1"/>
   </w:num>
-  <w:num w:numId="14" w16cid:durableId="1337343038">
+  <w:num w:numId="14" w16cid:durableId="1205869590">
     <w:abstractNumId w:val="1"/>
   </w:num>
-  <w:num w:numId="15" w16cid:durableId="951980946">
+  <w:num w:numId="15" w16cid:durableId="629673209">
     <w:abstractNumId w:val="1"/>
   </w:num>
-  <w:num w:numId="16" w16cid:durableId="1146901073">
+  <w:num w:numId="16" w16cid:durableId="1362243803">
     <w:abstractNumId w:val="1"/>
   </w:num>
-  <w:num w:numId="17" w16cid:durableId="915866020">
+  <w:num w:numId="17" w16cid:durableId="866910652">
     <w:abstractNumId w:val="1"/>
   </w:num>
-  <w:num w:numId="18" w16cid:durableId="1565992148">
+  <w:num w:numId="18" w16cid:durableId="1862816455">
     <w:abstractNumId w:val="1"/>
   </w:num>
-  <w:num w:numId="19" w16cid:durableId="329719487">
+  <w:num w:numId="19" w16cid:durableId="670178941">
     <w:abstractNumId w:val="1"/>
   </w:num>
-  <w:num w:numId="20" w16cid:durableId="1550610266">
+  <w:num w:numId="20" w16cid:durableId="591087155">
     <w:abstractNumId w:val="1"/>
   </w:num>
-  <w:num w:numId="21" w16cid:durableId="1794715177">
+  <w:num w:numId="21" w16cid:durableId="1019503123">
     <w:abstractNumId w:val="1"/>
   </w:num>
-  <w:num w:numId="22" w16cid:durableId="734161917">
+  <w:num w:numId="22" w16cid:durableId="1428840672">
     <w:abstractNumId w:val="1"/>
   </w:num>
-  <w:num w:numId="23" w16cid:durableId="2047949990">
+  <w:num w:numId="23" w16cid:durableId="851457990">
     <w:abstractNumId w:val="1"/>
   </w:num>
-  <w:num w:numId="24" w16cid:durableId="434374887">
+  <w:num w:numId="24" w16cid:durableId="1557856913">
     <w:abstractNumId w:val="1"/>
   </w:num>
-  <w:num w:numId="25" w16cid:durableId="906719737">
+  <w:num w:numId="25" w16cid:durableId="433091214">
     <w:abstractNumId w:val="2"/>
     <w:lvlOverride w:ilvl="0">
       <w:startOverride w:val="1"/>
@@ -57623,7 +57629,7 @@
       <w:startOverride w:val="1"/>
     </w:lvlOverride>
   </w:num>
-  <w:num w:numId="26" w16cid:durableId="1878854145">
+  <w:num w:numId="26" w16cid:durableId="1698191994">
     <w:abstractNumId w:val="2"/>
     <w:lvlOverride w:ilvl="0">
       <w:startOverride w:val="1"/>
@@ -57653,16 +57659,16 @@
       <w:startOverride w:val="1"/>
     </w:lvlOverride>
   </w:num>
-  <w:num w:numId="27" w16cid:durableId="421609517">
+  <w:num w:numId="27" w16cid:durableId="1561985895">
     <w:abstractNumId w:val="1"/>
   </w:num>
-  <w:num w:numId="28" w16cid:durableId="1763643203">
+  <w:num w:numId="28" w16cid:durableId="246380588">
     <w:abstractNumId w:val="1"/>
   </w:num>
-  <w:num w:numId="29" w16cid:durableId="756176018">
+  <w:num w:numId="29" w16cid:durableId="461533570">
     <w:abstractNumId w:val="1"/>
   </w:num>
-  <w:num w:numId="30" w16cid:durableId="99841781">
+  <w:num w:numId="30" w16cid:durableId="64380115">
     <w:abstractNumId w:val="2"/>
     <w:lvlOverride w:ilvl="0">
       <w:startOverride w:val="1"/>
@@ -57692,7 +57698,7 @@
       <w:startOverride w:val="1"/>
     </w:lvlOverride>
   </w:num>
-  <w:num w:numId="31" w16cid:durableId="1448112893">
+  <w:num w:numId="31" w16cid:durableId="856819604">
     <w:abstractNumId w:val="2"/>
     <w:lvlOverride w:ilvl="0">
       <w:startOverride w:val="1"/>
@@ -57722,16 +57728,16 @@
       <w:startOverride w:val="1"/>
     </w:lvlOverride>
   </w:num>
-  <w:num w:numId="32" w16cid:durableId="434324356">
+  <w:num w:numId="32" w16cid:durableId="777406468">
     <w:abstractNumId w:val="1"/>
   </w:num>
-  <w:num w:numId="33" w16cid:durableId="1250387552">
+  <w:num w:numId="33" w16cid:durableId="959458944">
     <w:abstractNumId w:val="1"/>
   </w:num>
-  <w:num w:numId="34" w16cid:durableId="2123766652">
+  <w:num w:numId="34" w16cid:durableId="1974098130">
     <w:abstractNumId w:val="1"/>
   </w:num>
-  <w:num w:numId="35" w16cid:durableId="483088578">
+  <w:num w:numId="35" w16cid:durableId="697197764">
     <w:abstractNumId w:val="2"/>
     <w:lvlOverride w:ilvl="0">
       <w:startOverride w:val="1"/>
@@ -57761,25 +57767,25 @@
       <w:startOverride w:val="1"/>
     </w:lvlOverride>
   </w:num>
-  <w:num w:numId="36" w16cid:durableId="554123108">
+  <w:num w:numId="36" w16cid:durableId="1078744843">
     <w:abstractNumId w:val="1"/>
   </w:num>
-  <w:num w:numId="37" w16cid:durableId="849375351">
+  <w:num w:numId="37" w16cid:durableId="312301517">
     <w:abstractNumId w:val="1"/>
   </w:num>
-  <w:num w:numId="38" w16cid:durableId="1201893626">
+  <w:num w:numId="38" w16cid:durableId="2043437804">
     <w:abstractNumId w:val="1"/>
   </w:num>
-  <w:num w:numId="39" w16cid:durableId="2123719422">
+  <w:num w:numId="39" w16cid:durableId="664164797">
     <w:abstractNumId w:val="1"/>
   </w:num>
-  <w:num w:numId="40" w16cid:durableId="955332235">
+  <w:num w:numId="40" w16cid:durableId="1322585558">
     <w:abstractNumId w:val="1"/>
   </w:num>
-  <w:num w:numId="41" w16cid:durableId="1241715207">
+  <w:num w:numId="41" w16cid:durableId="509949653">
     <w:abstractNumId w:val="1"/>
   </w:num>
-  <w:num w:numId="42" w16cid:durableId="1075323348">
+  <w:num w:numId="42" w16cid:durableId="1476676048">
     <w:abstractNumId w:val="2"/>
     <w:lvlOverride w:ilvl="0">
       <w:startOverride w:val="1"/>
@@ -57809,10 +57815,10 @@
       <w:startOverride w:val="1"/>
     </w:lvlOverride>
   </w:num>
-  <w:num w:numId="43" w16cid:durableId="1787431623">
+  <w:num w:numId="43" w16cid:durableId="604310623">
     <w:abstractNumId w:val="1"/>
   </w:num>
-  <w:num w:numId="44" w16cid:durableId="71700457">
+  <w:num w:numId="44" w16cid:durableId="1688023026">
     <w:abstractNumId w:val="2"/>
     <w:lvlOverride w:ilvl="0">
       <w:startOverride w:val="1"/>
@@ -57842,10 +57848,10 @@
       <w:startOverride w:val="1"/>
     </w:lvlOverride>
   </w:num>
-  <w:num w:numId="45" w16cid:durableId="355079586">
+  <w:num w:numId="45" w16cid:durableId="854803856">
     <w:abstractNumId w:val="1"/>
   </w:num>
-  <w:num w:numId="46" w16cid:durableId="222835727">
+  <w:num w:numId="46" w16cid:durableId="760830341">
     <w:abstractNumId w:val="2"/>
     <w:lvlOverride w:ilvl="0">
       <w:startOverride w:val="1"/>
@@ -57875,19 +57881,19 @@
       <w:startOverride w:val="1"/>
     </w:lvlOverride>
   </w:num>
-  <w:num w:numId="47" w16cid:durableId="589705485">
+  <w:num w:numId="47" w16cid:durableId="1128814626">
     <w:abstractNumId w:val="1"/>
   </w:num>
-  <w:num w:numId="48" w16cid:durableId="636452336">
+  <w:num w:numId="48" w16cid:durableId="828785560">
     <w:abstractNumId w:val="1"/>
   </w:num>
-  <w:num w:numId="49" w16cid:durableId="701244986">
+  <w:num w:numId="49" w16cid:durableId="1518159013">
     <w:abstractNumId w:val="1"/>
   </w:num>
-  <w:num w:numId="50" w16cid:durableId="1416588120">
+  <w:num w:numId="50" w16cid:durableId="491021524">
     <w:abstractNumId w:val="1"/>
   </w:num>
-  <w:num w:numId="51" w16cid:durableId="2092853899">
+  <w:num w:numId="51" w16cid:durableId="181087531">
     <w:abstractNumId w:val="2"/>
     <w:lvlOverride w:ilvl="0">
       <w:startOverride w:val="1"/>
@@ -57917,19 +57923,19 @@
       <w:startOverride w:val="1"/>
     </w:lvlOverride>
   </w:num>
-  <w:num w:numId="52" w16cid:durableId="1091854067">
+  <w:num w:numId="52" w16cid:durableId="1950771290">
     <w:abstractNumId w:val="1"/>
   </w:num>
-  <w:num w:numId="53" w16cid:durableId="2033726091">
+  <w:num w:numId="53" w16cid:durableId="1234241762">
     <w:abstractNumId w:val="1"/>
   </w:num>
-  <w:num w:numId="54" w16cid:durableId="45186167">
+  <w:num w:numId="54" w16cid:durableId="23755892">
     <w:abstractNumId w:val="1"/>
   </w:num>
-  <w:num w:numId="55" w16cid:durableId="1479179976">
+  <w:num w:numId="55" w16cid:durableId="709459455">
     <w:abstractNumId w:val="1"/>
   </w:num>
-  <w:num w:numId="56" w16cid:durableId="995837377">
+  <w:num w:numId="56" w16cid:durableId="1911042566">
     <w:abstractNumId w:val="2"/>
     <w:lvlOverride w:ilvl="0">
       <w:startOverride w:val="1"/>
@@ -57959,19 +57965,19 @@
       <w:startOverride w:val="1"/>
     </w:lvlOverride>
   </w:num>
-  <w:num w:numId="57" w16cid:durableId="1930117480">
+  <w:num w:numId="57" w16cid:durableId="1407267200">
     <w:abstractNumId w:val="1"/>
   </w:num>
-  <w:num w:numId="58" w16cid:durableId="2111123682">
+  <w:num w:numId="58" w16cid:durableId="872961623">
     <w:abstractNumId w:val="1"/>
   </w:num>
-  <w:num w:numId="59" w16cid:durableId="955529706">
+  <w:num w:numId="59" w16cid:durableId="1080325501">
     <w:abstractNumId w:val="1"/>
   </w:num>
-  <w:num w:numId="60" w16cid:durableId="1021975173">
+  <w:num w:numId="60" w16cid:durableId="534927758">
     <w:abstractNumId w:val="1"/>
   </w:num>
-  <w:num w:numId="61" w16cid:durableId="63377930">
+  <w:num w:numId="61" w16cid:durableId="779302439">
     <w:abstractNumId w:val="2"/>
     <w:lvlOverride w:ilvl="0">
       <w:startOverride w:val="1"/>
@@ -58001,28 +58007,28 @@
       <w:startOverride w:val="1"/>
     </w:lvlOverride>
   </w:num>
-  <w:num w:numId="62" w16cid:durableId="960306963">
+  <w:num w:numId="62" w16cid:durableId="1238593380">
     <w:abstractNumId w:val="1"/>
   </w:num>
-  <w:num w:numId="63" w16cid:durableId="1047756703">
+  <w:num w:numId="63" w16cid:durableId="494495878">
     <w:abstractNumId w:val="1"/>
   </w:num>
-  <w:num w:numId="64" w16cid:durableId="127627792">
+  <w:num w:numId="64" w16cid:durableId="2049141173">
     <w:abstractNumId w:val="1"/>
   </w:num>
-  <w:num w:numId="65" w16cid:durableId="739865452">
+  <w:num w:numId="65" w16cid:durableId="367075342">
     <w:abstractNumId w:val="1"/>
   </w:num>
-  <w:num w:numId="66" w16cid:durableId="1917283659">
+  <w:num w:numId="66" w16cid:durableId="1901667280">
     <w:abstractNumId w:val="1"/>
   </w:num>
-  <w:num w:numId="67" w16cid:durableId="303316649">
+  <w:num w:numId="67" w16cid:durableId="2118255996">
     <w:abstractNumId w:val="1"/>
   </w:num>
-  <w:num w:numId="68" w16cid:durableId="218901103">
+  <w:num w:numId="68" w16cid:durableId="1592547524">
     <w:abstractNumId w:val="1"/>
   </w:num>
-  <w:num w:numId="69" w16cid:durableId="2060124633">
+  <w:num w:numId="69" w16cid:durableId="552737363">
     <w:abstractNumId w:val="2"/>
     <w:lvlOverride w:ilvl="0">
       <w:startOverride w:val="1"/>
@@ -58052,16 +58058,16 @@
       <w:startOverride w:val="1"/>
     </w:lvlOverride>
   </w:num>
-  <w:num w:numId="70" w16cid:durableId="422339555">
+  <w:num w:numId="70" w16cid:durableId="1745486860">
     <w:abstractNumId w:val="1"/>
   </w:num>
-  <w:num w:numId="71" w16cid:durableId="103118625">
+  <w:num w:numId="71" w16cid:durableId="713507188">
     <w:abstractNumId w:val="1"/>
   </w:num>
-  <w:num w:numId="72" w16cid:durableId="1679429636">
+  <w:num w:numId="72" w16cid:durableId="2061778908">
     <w:abstractNumId w:val="1"/>
   </w:num>
-  <w:num w:numId="73" w16cid:durableId="351299806">
+  <w:num w:numId="73" w16cid:durableId="550578391">
     <w:abstractNumId w:val="2"/>
     <w:lvlOverride w:ilvl="0">
       <w:startOverride w:val="1"/>
@@ -58091,16 +58097,16 @@
       <w:startOverride w:val="1"/>
     </w:lvlOverride>
   </w:num>
-  <w:num w:numId="74" w16cid:durableId="721562831">
+  <w:num w:numId="74" w16cid:durableId="939995999">
     <w:abstractNumId w:val="1"/>
   </w:num>
-  <w:num w:numId="75" w16cid:durableId="1067150751">
+  <w:num w:numId="75" w16cid:durableId="1733120598">
     <w:abstractNumId w:val="1"/>
   </w:num>
-  <w:num w:numId="76" w16cid:durableId="1422489071">
+  <w:num w:numId="76" w16cid:durableId="628977550">
     <w:abstractNumId w:val="1"/>
   </w:num>
-  <w:num w:numId="77" w16cid:durableId="72509280">
+  <w:num w:numId="77" w16cid:durableId="547882115">
     <w:abstractNumId w:val="2"/>
     <w:lvlOverride w:ilvl="0">
       <w:startOverride w:val="1"/>
@@ -58130,13 +58136,13 @@
       <w:startOverride w:val="1"/>
     </w:lvlOverride>
   </w:num>
-  <w:num w:numId="78" w16cid:durableId="1399134007">
+  <w:num w:numId="78" w16cid:durableId="471677833">
     <w:abstractNumId w:val="1"/>
   </w:num>
-  <w:num w:numId="79" w16cid:durableId="1469980846">
+  <w:num w:numId="79" w16cid:durableId="598563010">
     <w:abstractNumId w:val="1"/>
   </w:num>
-  <w:num w:numId="80" w16cid:durableId="1365137739">
+  <w:num w:numId="80" w16cid:durableId="1337920868">
     <w:abstractNumId w:val="2"/>
     <w:lvlOverride w:ilvl="0">
       <w:startOverride w:val="1"/>
@@ -58166,31 +58172,31 @@
       <w:startOverride w:val="1"/>
     </w:lvlOverride>
   </w:num>
-  <w:num w:numId="81" w16cid:durableId="1767379647">
+  <w:num w:numId="81" w16cid:durableId="1613433391">
     <w:abstractNumId w:val="1"/>
   </w:num>
-  <w:num w:numId="82" w16cid:durableId="2057469652">
+  <w:num w:numId="82" w16cid:durableId="1800299712">
     <w:abstractNumId w:val="1"/>
   </w:num>
-  <w:num w:numId="83" w16cid:durableId="1319579349">
+  <w:num w:numId="83" w16cid:durableId="1675303220">
     <w:abstractNumId w:val="1"/>
   </w:num>
-  <w:num w:numId="84" w16cid:durableId="16350795">
+  <w:num w:numId="84" w16cid:durableId="420571134">
     <w:abstractNumId w:val="1"/>
   </w:num>
-  <w:num w:numId="85" w16cid:durableId="332756378">
+  <w:num w:numId="85" w16cid:durableId="193888209">
     <w:abstractNumId w:val="1"/>
   </w:num>
-  <w:num w:numId="86" w16cid:durableId="316803930">
+  <w:num w:numId="86" w16cid:durableId="324087406">
     <w:abstractNumId w:val="1"/>
   </w:num>
-  <w:num w:numId="87" w16cid:durableId="1974942367">
+  <w:num w:numId="87" w16cid:durableId="975988269">
     <w:abstractNumId w:val="1"/>
   </w:num>
-  <w:num w:numId="88" w16cid:durableId="1191533007">
+  <w:num w:numId="88" w16cid:durableId="168059763">
     <w:abstractNumId w:val="1"/>
   </w:num>
-  <w:num w:numId="89" w16cid:durableId="312028559">
+  <w:num w:numId="89" w16cid:durableId="1621453040">
     <w:abstractNumId w:val="2"/>
     <w:lvlOverride w:ilvl="0">
       <w:startOverride w:val="1"/>
@@ -58220,16 +58226,16 @@
       <w:startOverride w:val="1"/>
     </w:lvlOverride>
   </w:num>
-  <w:num w:numId="90" w16cid:durableId="1531719369">
+  <w:num w:numId="90" w16cid:durableId="891774752">
     <w:abstractNumId w:val="1"/>
   </w:num>
-  <w:num w:numId="91" w16cid:durableId="865093174">
+  <w:num w:numId="91" w16cid:durableId="168759926">
     <w:abstractNumId w:val="1"/>
   </w:num>
-  <w:num w:numId="92" w16cid:durableId="568882696">
+  <w:num w:numId="92" w16cid:durableId="423722260">
     <w:abstractNumId w:val="1"/>
   </w:num>
-  <w:num w:numId="93" w16cid:durableId="1513304280">
+  <w:num w:numId="93" w16cid:durableId="2101949164">
     <w:abstractNumId w:val="2"/>
     <w:lvlOverride w:ilvl="0">
       <w:startOverride w:val="1"/>
@@ -58259,10 +58265,10 @@
       <w:startOverride w:val="1"/>
     </w:lvlOverride>
   </w:num>
-  <w:num w:numId="94" w16cid:durableId="72047863">
+  <w:num w:numId="94" w16cid:durableId="536116606">
     <w:abstractNumId w:val="1"/>
   </w:num>
-  <w:num w:numId="95" w16cid:durableId="70471936">
+  <w:num w:numId="95" w16cid:durableId="45878726">
     <w:abstractNumId w:val="2"/>
     <w:lvlOverride w:ilvl="0">
       <w:startOverride w:val="1"/>
@@ -58292,10 +58298,10 @@
       <w:startOverride w:val="1"/>
     </w:lvlOverride>
   </w:num>
-  <w:num w:numId="96" w16cid:durableId="298540647">
+  <w:num w:numId="96" w16cid:durableId="842471984">
     <w:abstractNumId w:val="1"/>
   </w:num>
-  <w:num w:numId="97" w16cid:durableId="1052848670">
+  <w:num w:numId="97" w16cid:durableId="1009218093">
     <w:abstractNumId w:val="2"/>
     <w:lvlOverride w:ilvl="0">
       <w:startOverride w:val="1"/>
@@ -58325,10 +58331,10 @@
       <w:startOverride w:val="1"/>
     </w:lvlOverride>
   </w:num>
-  <w:num w:numId="98" w16cid:durableId="524297432">
+  <w:num w:numId="98" w16cid:durableId="463232780">
     <w:abstractNumId w:val="1"/>
   </w:num>
-  <w:num w:numId="99" w16cid:durableId="1368411485">
+  <w:num w:numId="99" w16cid:durableId="860164348">
     <w:abstractNumId w:val="2"/>
     <w:lvlOverride w:ilvl="0">
       <w:startOverride w:val="1"/>
@@ -58358,13 +58364,13 @@
       <w:startOverride w:val="1"/>
     </w:lvlOverride>
   </w:num>
-  <w:num w:numId="100" w16cid:durableId="554776161">
+  <w:num w:numId="100" w16cid:durableId="201675219">
     <w:abstractNumId w:val="1"/>
   </w:num>
-  <w:num w:numId="101" w16cid:durableId="2074502486">
+  <w:num w:numId="101" w16cid:durableId="1491553849">
     <w:abstractNumId w:val="1"/>
   </w:num>
-  <w:num w:numId="102" w16cid:durableId="1536649556">
+  <w:num w:numId="102" w16cid:durableId="909772828">
     <w:abstractNumId w:val="2"/>
     <w:lvlOverride w:ilvl="0">
       <w:startOverride w:val="1"/>
@@ -58394,34 +58400,34 @@
       <w:startOverride w:val="1"/>
     </w:lvlOverride>
   </w:num>
-  <w:num w:numId="103" w16cid:durableId="2088913496">
+  <w:num w:numId="103" w16cid:durableId="1067847421">
     <w:abstractNumId w:val="1"/>
   </w:num>
-  <w:num w:numId="104" w16cid:durableId="341783752">
+  <w:num w:numId="104" w16cid:durableId="38407997">
     <w:abstractNumId w:val="1"/>
   </w:num>
-  <w:num w:numId="105" w16cid:durableId="287053185">
+  <w:num w:numId="105" w16cid:durableId="170266879">
     <w:abstractNumId w:val="1"/>
   </w:num>
-  <w:num w:numId="106" w16cid:durableId="1642688055">
+  <w:num w:numId="106" w16cid:durableId="1482312776">
     <w:abstractNumId w:val="1"/>
   </w:num>
-  <w:num w:numId="107" w16cid:durableId="1523208191">
+  <w:num w:numId="107" w16cid:durableId="1557473395">
     <w:abstractNumId w:val="1"/>
   </w:num>
-  <w:num w:numId="108" w16cid:durableId="156500764">
+  <w:num w:numId="108" w16cid:durableId="243035552">
     <w:abstractNumId w:val="1"/>
   </w:num>
-  <w:num w:numId="109" w16cid:durableId="1895849034">
+  <w:num w:numId="109" w16cid:durableId="245000431">
     <w:abstractNumId w:val="1"/>
   </w:num>
-  <w:num w:numId="110" w16cid:durableId="653725539">
+  <w:num w:numId="110" w16cid:durableId="1967924032">
     <w:abstractNumId w:val="1"/>
   </w:num>
-  <w:num w:numId="111" w16cid:durableId="1349523483">
+  <w:num w:numId="111" w16cid:durableId="1003823915">
     <w:abstractNumId w:val="1"/>
   </w:num>
-  <w:num w:numId="112" w16cid:durableId="919488380">
+  <w:num w:numId="112" w16cid:durableId="1244752927">
     <w:abstractNumId w:val="2"/>
     <w:lvlOverride w:ilvl="0">
       <w:startOverride w:val="1"/>
@@ -58451,13 +58457,13 @@
       <w:startOverride w:val="1"/>
     </w:lvlOverride>
   </w:num>
-  <w:num w:numId="113" w16cid:durableId="1669211088">
+  <w:num w:numId="113" w16cid:durableId="1559704505">
     <w:abstractNumId w:val="1"/>
   </w:num>
-  <w:num w:numId="114" w16cid:durableId="159085895">
+  <w:num w:numId="114" w16cid:durableId="2131586129">
     <w:abstractNumId w:val="1"/>
   </w:num>
-  <w:num w:numId="115" w16cid:durableId="1974672602">
+  <w:num w:numId="115" w16cid:durableId="479034200">
     <w:abstractNumId w:val="2"/>
     <w:lvlOverride w:ilvl="0">
       <w:startOverride w:val="1"/>
@@ -58487,7 +58493,7 @@
       <w:startOverride w:val="1"/>
     </w:lvlOverride>
   </w:num>
-  <w:num w:numId="116" w16cid:durableId="245308128">
+  <w:num w:numId="116" w16cid:durableId="1894000771">
     <w:abstractNumId w:val="2"/>
     <w:lvlOverride w:ilvl="0">
       <w:startOverride w:val="1"/>
@@ -58517,7 +58523,7 @@
       <w:startOverride w:val="1"/>
     </w:lvlOverride>
   </w:num>
-  <w:num w:numId="117" w16cid:durableId="799809384">
+  <w:num w:numId="117" w16cid:durableId="994992561">
     <w:abstractNumId w:val="2"/>
     <w:lvlOverride w:ilvl="0">
       <w:startOverride w:val="1"/>
@@ -58547,16 +58553,16 @@
       <w:startOverride w:val="1"/>
     </w:lvlOverride>
   </w:num>
-  <w:num w:numId="118" w16cid:durableId="1823692480">
+  <w:num w:numId="118" w16cid:durableId="788476800">
     <w:abstractNumId w:val="1"/>
   </w:num>
-  <w:num w:numId="119" w16cid:durableId="1860969485">
+  <w:num w:numId="119" w16cid:durableId="1902255612">
     <w:abstractNumId w:val="1"/>
   </w:num>
-  <w:num w:numId="120" w16cid:durableId="575744307">
+  <w:num w:numId="120" w16cid:durableId="304820161">
     <w:abstractNumId w:val="1"/>
   </w:num>
-  <w:num w:numId="121" w16cid:durableId="2121950325">
+  <w:num w:numId="121" w16cid:durableId="1813404439">
     <w:abstractNumId w:val="2"/>
     <w:lvlOverride w:ilvl="0">
       <w:startOverride w:val="1"/>
@@ -58586,28 +58592,28 @@
       <w:startOverride w:val="1"/>
     </w:lvlOverride>
   </w:num>
-  <w:num w:numId="122" w16cid:durableId="1095200730">
+  <w:num w:numId="122" w16cid:durableId="1291083473">
     <w:abstractNumId w:val="1"/>
   </w:num>
-  <w:num w:numId="123" w16cid:durableId="149560906">
+  <w:num w:numId="123" w16cid:durableId="572857693">
     <w:abstractNumId w:val="1"/>
   </w:num>
-  <w:num w:numId="124" w16cid:durableId="1142162502">
+  <w:num w:numId="124" w16cid:durableId="349262035">
     <w:abstractNumId w:val="1"/>
   </w:num>
-  <w:num w:numId="125" w16cid:durableId="774791096">
+  <w:num w:numId="125" w16cid:durableId="45952532">
     <w:abstractNumId w:val="1"/>
   </w:num>
-  <w:num w:numId="126" w16cid:durableId="412747675">
+  <w:num w:numId="126" w16cid:durableId="1256983328">
     <w:abstractNumId w:val="1"/>
   </w:num>
-  <w:num w:numId="127" w16cid:durableId="2103867064">
+  <w:num w:numId="127" w16cid:durableId="1695613375">
     <w:abstractNumId w:val="1"/>
   </w:num>
-  <w:num w:numId="128" w16cid:durableId="1879851953">
+  <w:num w:numId="128" w16cid:durableId="1071125376">
     <w:abstractNumId w:val="1"/>
   </w:num>
-  <w:num w:numId="129" w16cid:durableId="569731850">
+  <w:num w:numId="129" w16cid:durableId="228152266">
     <w:abstractNumId w:val="2"/>
     <w:lvlOverride w:ilvl="0">
       <w:startOverride w:val="1"/>
@@ -58637,7 +58643,7 @@
       <w:startOverride w:val="1"/>
     </w:lvlOverride>
   </w:num>
-  <w:num w:numId="130" w16cid:durableId="1601375433">
+  <w:num w:numId="130" w16cid:durableId="1244415016">
     <w:abstractNumId w:val="1"/>
   </w:num>
   <w:numIdMacAtCleanup w:val="130"/>
@@ -59904,7 +59910,7 @@
     <w:next w:val="Normal"/>
     <w:autoRedefine/>
     <w:uiPriority w:val="39"/>
-    <w:rsid w:val="00395E25"/>
+    <w:rsid w:val="00254D2B"/>
   </w:style>
   <w:style w:type="paragraph" w:styleId="TOC2">
     <w:name w:val="toc 2"/>
@@ -59912,7 +59918,7 @@
     <w:next w:val="Normal"/>
     <w:autoRedefine/>
     <w:uiPriority w:val="39"/>
-    <w:rsid w:val="00395E25"/>
+    <w:rsid w:val="00254D2B"/>
     <w:pPr>
       <w:ind w:left="210"/>
     </w:pPr>
@@ -59924,7 +59930,7 @@
     <w:autoRedefine/>
     <w:uiPriority w:val="39"/>
     <w:unhideWhenUsed/>
-    <w:rsid w:val="00395E25"/>
+    <w:rsid w:val="00254D2B"/>
     <w:pPr>
       <w:spacing w:line="278" w:lineRule="auto"/>
       <w:ind w:left="480"/>
@@ -59944,7 +59950,7 @@
     <w:autoRedefine/>
     <w:uiPriority w:val="39"/>
     <w:unhideWhenUsed/>
-    <w:rsid w:val="00395E25"/>
+    <w:rsid w:val="00254D2B"/>
     <w:pPr>
       <w:spacing w:line="278" w:lineRule="auto"/>
       <w:ind w:left="720"/>
@@ -59964,7 +59970,7 @@
     <w:autoRedefine/>
     <w:uiPriority w:val="39"/>
     <w:unhideWhenUsed/>
-    <w:rsid w:val="00395E25"/>
+    <w:rsid w:val="00254D2B"/>
     <w:pPr>
       <w:spacing w:line="278" w:lineRule="auto"/>
       <w:ind w:left="960"/>
@@ -59984,7 +59990,7 @@
     <w:autoRedefine/>
     <w:uiPriority w:val="39"/>
     <w:unhideWhenUsed/>
-    <w:rsid w:val="00395E25"/>
+    <w:rsid w:val="00254D2B"/>
     <w:pPr>
       <w:spacing w:line="278" w:lineRule="auto"/>
       <w:ind w:left="1200"/>
@@ -60004,7 +60010,7 @@
     <w:autoRedefine/>
     <w:uiPriority w:val="39"/>
     <w:unhideWhenUsed/>
-    <w:rsid w:val="00395E25"/>
+    <w:rsid w:val="00254D2B"/>
     <w:pPr>
       <w:spacing w:line="278" w:lineRule="auto"/>
       <w:ind w:left="1440"/>
@@ -60024,7 +60030,7 @@
     <w:autoRedefine/>
     <w:uiPriority w:val="39"/>
     <w:unhideWhenUsed/>
-    <w:rsid w:val="00395E25"/>
+    <w:rsid w:val="00254D2B"/>
     <w:pPr>
       <w:spacing w:line="278" w:lineRule="auto"/>
       <w:ind w:left="1680"/>
@@ -60044,7 +60050,7 @@
     <w:autoRedefine/>
     <w:uiPriority w:val="39"/>
     <w:unhideWhenUsed/>
-    <w:rsid w:val="00395E25"/>
+    <w:rsid w:val="00254D2B"/>
     <w:pPr>
       <w:spacing w:line="278" w:lineRule="auto"/>
       <w:ind w:left="1920"/>
@@ -60063,7 +60069,7 @@
     <w:uiPriority w:val="99"/>
     <w:semiHidden/>
     <w:unhideWhenUsed/>
-    <w:rsid w:val="00395E25"/>
+    <w:rsid w:val="00254D2B"/>
     <w:rPr>
       <w:color w:val="605E5C"/>
       <w:shd w:val="clear" w:color="auto" w:fill="E1DFDD"/>

</xml_diff>

<commit_message>
Prefilter: split keyword patterns into groups of at most 200 terms
With 2,385 terms one RE2 alternation held 2,104 terms, outgrew RE2's
fast automaton memory and fell back to a far slower matcher: 0.22 MB/s on
Wikipedia text (the full build's Wikipedia step would have taken about 8
hours). Split into 16 patterns of at most 200 terms: 14.4 MB/s with
identical counts (terms within a group never overlap, so the per-group
sum is unchanged); still no under-counts on every term in nine
spellings.
</commit_message>
<xml_diff>
--- a/tinyGPT_learning_guide.docx
+++ b/tinyGPT_learning_guide.docx
@@ -14523,7 +14523,7 @@
         <w:t xml:space="preserve"> </w:t>
       </w:r>
       <w:r>
-        <w:t xml:space="preserve">separate patterns (still five for the 2,385 terms). On 100,000 FineWeb-Edu and peS2o documents it rejected none</w:t>
+        <w:t xml:space="preserve">separate groups (five for the 2,385 terms). On 100,000 FineWeb-Edu and peS2o documents it rejected none</w:t>
       </w:r>
       <w:r>
         <w:t xml:space="preserve"> </w:t>
@@ -14535,7 +14535,53 @@
         <w:t xml:space="preserve"> </w:t>
       </w:r>
       <w:r>
-        <w:t xml:space="preserve">capitals, punctuation around it; 21,438 test texts): the prefilter never counted fewer matches than the exact check.</w:t>
+        <w:t xml:space="preserve">capitals, punctuation around it; 21,465 test texts): the prefilter never counted fewer matches than the exact check.</w:t>
+      </w:r>
+    </w:p>
+    <w:p>
+      <w:pPr>
+        <w:pStyle w:val="Compact"/>
+        <w:numPr>
+          <w:ilvl w:val="0"/>
+          <w:numId w:val="1043"/>
+        </w:numPr>
+      </w:pPr>
+      <w:r>
+        <w:rPr>
+          <w:b/>
+          <w:bCs/>
+        </w:rPr>
+        <w:t xml:space="preserve">Pattern size matters:</w:t>
+      </w:r>
+      <w:r>
+        <w:t xml:space="preserve"> </w:t>
+      </w:r>
+      <w:r>
+        <w:t xml:space="preserve">each group is split into patterns of at most 200 terms (16 patterns for 2,385 terms).</w:t>
+      </w:r>
+      <w:r>
+        <w:t xml:space="preserve"> </w:t>
+      </w:r>
+      <w:r>
+        <w:t xml:space="preserve">One pattern of 2,104 terms outgrew the regular-expression engine’s fast memory and fell back to a far slower</w:t>
+      </w:r>
+      <w:r>
+        <w:t xml:space="preserve"> </w:t>
+      </w:r>
+      <w:r>
+        <w:t xml:space="preserve">method: 0.22 MB of Wikipedia text per second, against 14.4 MB/s for the 16 smaller patterns, with identical</w:t>
+      </w:r>
+      <w:r>
+        <w:t xml:space="preserve"> </w:t>
+      </w:r>
+      <w:r>
+        <w:t xml:space="preserve">counts. Before the split, growing the list from 608 to 2,385 terms had made the full build’s Wikipedia step about</w:t>
+      </w:r>
+      <w:r>
+        <w:t xml:space="preserve"> </w:t>
+      </w:r>
+      <w:r>
+        <w:t xml:space="preserve">25 times slower (an estimated 8 hours instead of minutes).</w:t>
       </w:r>
     </w:p>
     <w:p>

</xml_diff>

<commit_message>
data_prep: token distribution after tokenizing (printed, in report.md, token_counts.tsv)
Once the training tokens are written the build prints how the vocabulary is
used on the real data: the 30 most frequent pieces, how many pieces make up
50/90/99% of all tokens, never- and rarely-used pieces, the share by piece
type, the longest pieces, and the first 40 tokens of each source exactly as
the model sees them. The same goes into report.md; token_counts.tsv lists
every piece with its count. Bounded memory (64M tokens at a time; 40 s for
bio_all's 4.0B tokens); informational, so a failure never costs the dataset.
</commit_message>
<xml_diff>
--- a/tinyGPT_learning_guide.docx
+++ b/tinyGPT_learning_guide.docx
@@ -17812,6 +17812,75 @@
       </w:r>
       <w:r>
         <w:t xml:space="preserve">inside the dataset folder, per source and per reason.</w:t>
+      </w:r>
+    </w:p>
+    <w:p>
+      <w:pPr>
+        <w:pStyle w:val="BodyText"/>
+      </w:pPr>
+      <w:r>
+        <w:rPr>
+          <w:b/>
+          <w:bCs/>
+        </w:rPr>
+        <w:t xml:space="preserve">Token use:</w:t>
+      </w:r>
+      <w:r>
+        <w:t xml:space="preserve"> </w:t>
+      </w:r>
+      <w:r>
+        <w:t xml:space="preserve">once the training tokens are written, the build prints (and adds to</w:t>
+      </w:r>
+      <w:r>
+        <w:t xml:space="preserve"> </w:t>
+      </w:r>
+      <w:r>
+        <w:rPr>
+          <w:rStyle w:val="VerbatimChar"/>
+        </w:rPr>
+        <w:t xml:space="preserve">report.md</w:t>
+      </w:r>
+      <w:r>
+        <w:t xml:space="preserve">) how the vocabulary</w:t>
+      </w:r>
+      <w:r>
+        <w:t xml:space="preserve"> </w:t>
+      </w:r>
+      <w:r>
+        <w:t xml:space="preserve">is used on the real data: the 30 most frequent pieces, how many pieces make up 50%, 90% and 99% of all tokens, how</w:t>
+      </w:r>
+      <w:r>
+        <w:t xml:space="preserve"> </w:t>
+      </w:r>
+      <w:r>
+        <w:t xml:space="preserve">many are never or rarely used, the share by piece type, the longest pieces and the first 40 tokens of each source</w:t>
+      </w:r>
+      <w:r>
+        <w:t xml:space="preserve"> </w:t>
+      </w:r>
+      <w:r>
+        <w:t xml:space="preserve">exactly as the model sees them.</w:t>
+      </w:r>
+      <w:r>
+        <w:t xml:space="preserve"> </w:t>
+      </w:r>
+      <w:r>
+        <w:rPr>
+          <w:rStyle w:val="VerbatimChar"/>
+        </w:rPr>
+        <w:t xml:space="preserve">token_counts.tsv</w:t>
+      </w:r>
+      <w:r>
+        <w:t xml:space="preserve"> </w:t>
+      </w:r>
+      <w:r>
+        <w:t xml:space="preserve">lists every piece with its count. On bio_all: 170 pieces (1% of</w:t>
+      </w:r>
+      <w:r>
+        <w:t xml:space="preserve"> </w:t>
+      </w:r>
+      <w:r>
+        <w:t xml:space="preserve">the vocabulary) make up half of the 4.0B tokens, 13,579 make up 99%, and 143 are never used.</w:t>
       </w:r>
     </w:p>
     <w:p>

</xml_diff>

<commit_message>
data_prep: vocabulary size grows with the training text, no upper limit
auto_vocab_size: 4,096 pieces below 20M characters, then twice as many for
every ten times more text (16,384 below 2B, 32,768 below 20B, 65,536 below
200B, 131,072 ...). The old rule stopped at 16,384. For bio_all-sized data
(about 15B characters) the default is now 32,768. --vocab-size still
overrides it; token files already switch to uint32 above 65,535 pieces.
</commit_message>
<xml_diff>
--- a/tinyGPT_learning_guide.docx
+++ b/tinyGPT_learning_guide.docx
@@ -3813,13 +3813,16 @@
           <w:b/>
           <w:bCs/>
         </w:rPr>
-        <w:t xml:space="preserve">4,096, 8,192 or 16,384 pieces</w:t>
-      </w:r>
-      <w:r>
-        <w:t xml:space="preserve"> </w:t>
-      </w:r>
-      <w:r>
-        <w:t xml:space="preserve">(</w:t>
+        <w:t xml:space="preserve">4,096 pieces below 20M characters, then twice as many for every ten times more text</w:t>
+      </w:r>
+      <w:r>
+        <w:t xml:space="preserve"> </w:t>
+      </w:r>
+      <w:r>
+        <w:t xml:space="preserve">(16,384 below 2B characters, 32,768 below 20B, 65,536 below 200B, with no upper limit;</w:t>
+      </w:r>
+      <w:r>
+        <w:t xml:space="preserve"> </w:t>
       </w:r>
       <w:r>
         <w:rPr>

</xml_diff>

<commit_message>
data_prep: token use as a chart (token_summary.png) and one summary line instead of a long printout
Four panels: share of tokens carried by the N most frequent pieces (50/90/99%
marked), token share by piece type, the 20 most frequent pieces, characters
per token for each source. report.md shows the line and the picture;
token_counts.tsv still lists every piece.
</commit_message>
<xml_diff>
--- a/tinyGPT_learning_guide.docx
+++ b/tinyGPT_learning_guide.docx
@@ -17832,7 +17832,7 @@
         <w:t xml:space="preserve"> </w:t>
       </w:r>
       <w:r>
-        <w:t xml:space="preserve">once the training tokens are written, the build prints (and adds to</w:t>
+        <w:t xml:space="preserve">once the training tokens are written, the build prints a one-line summary and draws</w:t>
       </w:r>
       <w:r>
         <w:t xml:space="preserve"> </w:t>
@@ -17841,28 +17841,31 @@
         <w:rPr>
           <w:rStyle w:val="VerbatimChar"/>
         </w:rPr>
+        <w:t xml:space="preserve">token_summary.png</w:t>
+      </w:r>
+      <w:r>
+        <w:t xml:space="preserve"> </w:t>
+      </w:r>
+      <w:r>
+        <w:t xml:space="preserve">(also shown in</w:t>
+      </w:r>
+      <w:r>
+        <w:t xml:space="preserve"> </w:t>
+      </w:r>
+      <w:r>
+        <w:rPr>
+          <w:rStyle w:val="VerbatimChar"/>
+        </w:rPr>
         <w:t xml:space="preserve">report.md</w:t>
       </w:r>
       <w:r>
-        <w:t xml:space="preserve">) how the vocabulary</w:t>
-      </w:r>
-      <w:r>
-        <w:t xml:space="preserve"> </w:t>
-      </w:r>
-      <w:r>
-        <w:t xml:space="preserve">is used on the real data: the 30 most frequent pieces, how many pieces make up 50%, 90% and 99% of all tokens, how</w:t>
-      </w:r>
-      <w:r>
-        <w:t xml:space="preserve"> </w:t>
-      </w:r>
-      <w:r>
-        <w:t xml:space="preserve">many are never or rarely used, the share by piece type, the longest pieces and the first 40 tokens of each source</w:t>
-      </w:r>
-      <w:r>
-        <w:t xml:space="preserve"> </w:t>
-      </w:r>
-      <w:r>
-        <w:t xml:space="preserve">exactly as the model sees them.</w:t>
+        <w:t xml:space="preserve">): how many pieces carry 50%, 90% and 99% of the tokens, the</w:t>
+      </w:r>
+      <w:r>
+        <w:t xml:space="preserve"> </w:t>
+      </w:r>
+      <w:r>
+        <w:t xml:space="preserve">share of tokens by piece type, the most frequent pieces and characters per token for each source.</w:t>
       </w:r>
       <w:r>
         <w:t xml:space="preserve"> </w:t>
@@ -17877,13 +17880,7 @@
         <w:t xml:space="preserve"> </w:t>
       </w:r>
       <w:r>
-        <w:t xml:space="preserve">lists every piece with its count. On bio_all: 170 pieces (1% of</w:t>
-      </w:r>
-      <w:r>
-        <w:t xml:space="preserve"> </w:t>
-      </w:r>
-      <w:r>
-        <w:t xml:space="preserve">the vocabulary) make up half of the 4.0B tokens, 13,579 make up 99%, and 143 are never used.</w:t>
+        <w:t xml:space="preserve">lists every piece with its count.</w:t>
       </w:r>
     </w:p>
     <w:p>

</xml_diff>

<commit_message>
experiments table: one file, results/experiments.csv
record_experiment writes only <out_dir>/results/experiments.csv, with the home
folder shown as ~ in every value, and that file is what is pushed. A table
left directly in <out_dir> by older versions is moved there first. The
planner's measured-speed lookup and estimate_dataset read the new location
(with a fallback to the old one). The duplicate in the project folder was
removed after checking it was identical.
</commit_message>
<xml_diff>
--- a/tinyGPT_learning_guide.docx
+++ b/tinyGPT_learning_guide.docx
@@ -1308,7 +1308,7 @@
               <w:rPr>
                 <w:sz w:val="17"/>
               </w:rPr>
-              <w:t xml:space="preserve">experiments.csv</w:t>
+              <w:t xml:space="preserve">results/experiments.csv</w:t>
             </w:r>
           </w:p>
         </w:tc>
@@ -1323,7 +1323,7 @@
               <w:rPr>
                 <w:sz w:val="17"/>
               </w:rPr>
-              <w:t xml:space="preserve">A permanent table with one row per training run, benchmark, comparison or fine-tune; copied to GitHub as results/experiments.csv</w:t>
+              <w:t xml:space="preserve">A permanent table with one row per training run, benchmark, comparison or fine-tune; pushed to GitHub</w:t>
             </w:r>
           </w:p>
         </w:tc>
@@ -22955,10 +22955,13 @@
         <w:rPr>
           <w:rStyle w:val="VerbatimChar"/>
         </w:rPr>
-        <w:t xml:space="preserve">experiments.csv</w:t>
-      </w:r>
-      <w:r>
-        <w:t xml:space="preserve">, next to the checkpoints, gets one row for every training run (when it ends or is stopped),</w:t>
+        <w:t xml:space="preserve">results/experiments.csv</w:t>
+      </w:r>
+      <w:r>
+        <w:t xml:space="preserve"> </w:t>
+      </w:r>
+      <w:r>
+        <w:t xml:space="preserve">gets one row for every training run (when it ends or is stopped),</w:t>
       </w:r>
       <w:r>
         <w:t xml:space="preserve"> </w:t>
@@ -23148,28 +23151,13 @@
         <w:t xml:space="preserve"> </w:t>
       </w:r>
       <w:r>
-        <w:t xml:space="preserve">every new row also updates</w:t>
-      </w:r>
-      <w:r>
-        <w:t xml:space="preserve"> </w:t>
-      </w:r>
-      <w:r>
-        <w:rPr>
-          <w:rStyle w:val="VerbatimChar"/>
-        </w:rPr>
-        <w:t xml:space="preserve">results/experiments.csv</w:t>
-      </w:r>
-      <w:r>
-        <w:t xml:space="preserve"> </w:t>
-      </w:r>
-      <w:r>
-        <w:t xml:space="preserve">in the repository, with your home folder</w:t>
-      </w:r>
-      <w:r>
-        <w:t xml:space="preserve"> </w:t>
-      </w:r>
-      <w:r>
-        <w:t xml:space="preserve">shown as</w:t>
+        <w:t xml:space="preserve">it is the only copy, and every new row is pushed to the repository as it is; paths show your home</w:t>
+      </w:r>
+      <w:r>
+        <w:t xml:space="preserve"> </w:t>
+      </w:r>
+      <w:r>
+        <w:t xml:space="preserve">folder as</w:t>
       </w:r>
       <w:r>
         <w:t xml:space="preserve"> </w:t>

</xml_diff>

<commit_message>
Progress line: % done, latest validation, total tokens; no learning rate, whole-run time or next-val countdown
  ... step   4416/60000 |  7.4% | train 2.950 | val 3.121 @4400 | 6,182 tok/s | 43.73 s/step | 1,193,758,720 tokens | elapsed 0:12:53

The learning rate, whole-run time and ETA stay on the validation lines.
</commit_message>
<xml_diff>
--- a/tinyGPT_learning_guide.docx
+++ b/tinyGPT_learning_guide.docx
@@ -22108,13 +22108,19 @@
         <w:t xml:space="preserve"> </w:t>
       </w:r>
       <w:r>
-        <w:t xml:space="preserve">looks like a hang. It shows the training loss since the previous line, speed and time to the next validation; it</w:t>
-      </w:r>
-      <w:r>
-        <w:t xml:space="preserve"> </w:t>
-      </w:r>
-      <w:r>
-        <w:t xml:space="preserve">includes no validation. The run header explains this once, so the line itself stays short.</w:t>
+        <w:t xml:space="preserve">looks like a hang. It shows the share of the run done, the training loss since the previous line, the latest</w:t>
+      </w:r>
+      <w:r>
+        <w:t xml:space="preserve"> </w:t>
+      </w:r>
+      <w:r>
+        <w:t xml:space="preserve">validation loss with the step it was measured at (no new validation is run), speed, the total tokens seen and the</w:t>
+      </w:r>
+      <w:r>
+        <w:t xml:space="preserve"> </w:t>
+      </w:r>
+      <w:r>
+        <w:t xml:space="preserve">session’s time. The learning rate, whole-run time and ETA are on the validation lines.</w:t>
       </w:r>
     </w:p>
     <w:p>

</xml_diff>

<commit_message>
Progress line: time to the next validation at the end
</commit_message>
<xml_diff>
--- a/tinyGPT_learning_guide.docx
+++ b/tinyGPT_learning_guide.docx
@@ -22114,13 +22114,13 @@
         <w:t xml:space="preserve"> </w:t>
       </w:r>
       <w:r>
-        <w:t xml:space="preserve">validation loss with the step it was measured at (no new validation is run), speed, the total tokens seen and the</w:t>
-      </w:r>
-      <w:r>
-        <w:t xml:space="preserve"> </w:t>
-      </w:r>
-      <w:r>
-        <w:t xml:space="preserve">session’s time. The learning rate, whole-run time and ETA are on the validation lines.</w:t>
+        <w:t xml:space="preserve">validation loss with the step it was measured at (no new validation is run), speed, the total tokens seen, the</w:t>
+      </w:r>
+      <w:r>
+        <w:t xml:space="preserve"> </w:t>
+      </w:r>
+      <w:r>
+        <w:t xml:space="preserve">session’s time and the time to the next validation. The learning rate, whole-run time and ETA are on the validation lines.</w:t>
       </w:r>
     </w:p>
     <w:p>

</xml_diff>

<commit_message>
PMC selection with keywords.txt; gzip inputs in data_prep; skip GitHub wiki revisions
download_pmc.py --keywords: harvests title and abstract of every open-access
full-text MEDLINE paper once (resumable), then selects with the keyword list
(3 matches from 3 terms, title x3), ranked by density or citations.
data_prep.py and estimate_dataset.py read .md.gz/.txt.gz (same document id as
the uncompressed file). download_docs.py skips GitHub wiki revision, history
and compare pages. Docs and TODO updated.
</commit_message>
<xml_diff>
--- a/tinyGPT_learning_guide.docx
+++ b/tinyGPT_learning_guide.docx
@@ -14585,6 +14585,133 @@
         </w:numPr>
       </w:pPr>
       <w:r>
+        <w:rPr>
+          <w:b/>
+          <w:bCs/>
+        </w:rPr>
+        <w:t xml:space="preserve">Compression (27 October):</w:t>
+      </w:r>
+      <w:r>
+        <w:t xml:space="preserve"> </w:t>
+      </w:r>
+      <w:r>
+        <w:t xml:space="preserve">the text folders (all except</w:t>
+      </w:r>
+      <w:r>
+        <w:t xml:space="preserve"> </w:t>
+      </w:r>
+      <w:r>
+        <w:rPr>
+          <w:rStyle w:val="VerbatimChar"/>
+        </w:rPr>
+        <w:t xml:space="preserve">web</w:t>
+      </w:r>
+      <w:r>
+        <w:t xml:space="preserve">,</w:t>
+      </w:r>
+      <w:r>
+        <w:t xml:space="preserve"> </w:t>
+      </w:r>
+      <w:r>
+        <w:rPr>
+          <w:rStyle w:val="VerbatimChar"/>
+        </w:rPr>
+        <w:t xml:space="preserve">wikipedia</w:t>
+      </w:r>
+      <w:r>
+        <w:t xml:space="preserve"> </w:t>
+      </w:r>
+      <w:r>
+        <w:t xml:space="preserve">and</w:t>
+      </w:r>
+      <w:r>
+        <w:t xml:space="preserve"> </w:t>
+      </w:r>
+      <w:r>
+        <w:rPr>
+          <w:rStyle w:val="VerbatimChar"/>
+        </w:rPr>
+        <w:t xml:space="preserve">images</w:t>
+      </w:r>
+      <w:r>
+        <w:t xml:space="preserve">) use Windows’ built-in</w:t>
+      </w:r>
+      <w:r>
+        <w:t xml:space="preserve"> </w:t>
+      </w:r>
+      <w:r>
+        <w:t xml:space="preserve">NTFS compression, about half the space. Files read and write as usual and new files are compressed automatically.</w:t>
+      </w:r>
+      <w:r>
+        <w:t xml:space="preserve"> </w:t>
+      </w:r>
+      <w:r>
+        <w:t xml:space="preserve">data_prep.py and estimate_dataset.py also read gzip-compressed files (</w:t>
+      </w:r>
+      <w:r>
+        <w:rPr>
+          <w:rStyle w:val="VerbatimChar"/>
+        </w:rPr>
+        <w:t xml:space="preserve">.md.gz</w:t>
+      </w:r>
+      <w:r>
+        <w:t xml:space="preserve">,</w:t>
+      </w:r>
+      <w:r>
+        <w:t xml:space="preserve"> </w:t>
+      </w:r>
+      <w:r>
+        <w:rPr>
+          <w:rStyle w:val="VerbatimChar"/>
+        </w:rPr>
+        <w:t xml:space="preserve">.txt.gz</w:t>
+      </w:r>
+      <w:r>
+        <w:t xml:space="preserve">);</w:t>
+      </w:r>
+      <w:r>
+        <w:t xml:space="preserve"> </w:t>
+      </w:r>
+      <w:r>
+        <w:rPr>
+          <w:rStyle w:val="VerbatimChar"/>
+        </w:rPr>
+        <w:t xml:space="preserve">a.md.gz</w:t>
+      </w:r>
+      <w:r>
+        <w:t xml:space="preserve"> </w:t>
+      </w:r>
+      <w:r>
+        <w:t xml:space="preserve">gets the</w:t>
+      </w:r>
+      <w:r>
+        <w:t xml:space="preserve"> </w:t>
+      </w:r>
+      <w:r>
+        <w:t xml:space="preserve">same document id as</w:t>
+      </w:r>
+      <w:r>
+        <w:t xml:space="preserve"> </w:t>
+      </w:r>
+      <w:r>
+        <w:rPr>
+          <w:rStyle w:val="VerbatimChar"/>
+        </w:rPr>
+        <w:t xml:space="preserve">a.md</w:t>
+      </w:r>
+      <w:r>
+        <w:t xml:space="preserve">, so compressing a folder never changes the train/validation split.</w:t>
+      </w:r>
+    </w:p>
+    <w:p>
+      <w:pPr>
+        <w:pStyle w:val="Compact"/>
+        <w:numPr>
+          <w:ilvl w:val="0"/>
+          <w:numId w:val="1041"/>
+        </w:numPr>
+      </w:pPr>
+      <w:r>
         <w:t xml:space="preserve">Folders whose names start with</w:t>
       </w:r>
       <w:r>
@@ -19331,6 +19458,172 @@
         <w:t xml:space="preserve">before publishing a model trained on them.</w:t>
       </w:r>
     </w:p>
+    <w:p>
+      <w:pPr>
+        <w:pStyle w:val="FirstParagraph"/>
+      </w:pPr>
+      <w:r>
+        <w:rPr>
+          <w:b/>
+          <w:bCs/>
+        </w:rPr>
+        <w:t xml:space="preserve">Selecting with keywords.txt (since 27 October):</w:t>
+      </w:r>
+      <w:r>
+        <w:t xml:space="preserve"> </w:t>
+      </w:r>
+      <w:r>
+        <w:t xml:space="preserve">the fixed search above only finds papers that mention genetics</w:t>
+      </w:r>
+      <w:r>
+        <w:t xml:space="preserve"> </w:t>
+      </w:r>
+      <w:r>
+        <w:t xml:space="preserve">words. With</w:t>
+      </w:r>
+      <w:r>
+        <w:t xml:space="preserve"> </w:t>
+      </w:r>
+      <w:r>
+        <w:rPr>
+          <w:rStyle w:val="VerbatimChar"/>
+        </w:rPr>
+        <w:t xml:space="preserve">--keywords</w:t>
+      </w:r>
+      <w:r>
+        <w:t xml:space="preserve">, PMC papers are chosen the way arXiv and bioRxiv papers are:</w:t>
+      </w:r>
+    </w:p>
+    <w:p>
+      <w:pPr>
+        <w:pStyle w:val="SourceCode"/>
+      </w:pPr>
+      <w:r>
+        <w:rPr>
+          <w:rStyle w:val="VerbatimChar"/>
+        </w:rPr>
+        <w:t xml:space="preserve">python download_pmc.py --out $HOME\ai_training_data\pmc --keywords keywords.txt --max-papers 300000</w:t>
+      </w:r>
+    </w:p>
+    <w:p>
+      <w:pPr>
+        <w:pStyle w:val="Compact"/>
+        <w:numPr>
+          <w:ilvl w:val="0"/>
+          <w:numId w:val="1057"/>
+        </w:numPr>
+      </w:pPr>
+      <w:r>
+        <w:rPr>
+          <w:b/>
+          <w:bCs/>
+        </w:rPr>
+        <w:t xml:space="preserve">Harvest once:</w:t>
+      </w:r>
+      <w:r>
+        <w:t xml:space="preserve"> </w:t>
+      </w:r>
+      <w:r>
+        <w:t xml:space="preserve">title, abstract, year, citations and journal of every open-access, full-text MEDLINE paper</w:t>
+      </w:r>
+      <w:r>
+        <w:t xml:space="preserve"> </w:t>
+      </w:r>
+      <w:r>
+        <w:t xml:space="preserve">(about 7.9 million) go to</w:t>
+      </w:r>
+      <w:r>
+        <w:t xml:space="preserve"> </w:t>
+      </w:r>
+      <w:r>
+        <w:rPr>
+          <w:rStyle w:val="VerbatimChar"/>
+        </w:rPr>
+        <w:t xml:space="preserve">_pmc_meta\metadata</w:t>
+      </w:r>
+      <w:r>
+        <w:t xml:space="preserve">, about 170 papers a second (about 13 hours, a few GB). A rerun</w:t>
+      </w:r>
+      <w:r>
+        <w:t xml:space="preserve"> </w:t>
+      </w:r>
+      <w:r>
+        <w:t xml:space="preserve">continues where it stopped;</w:t>
+      </w:r>
+      <w:r>
+        <w:t xml:space="preserve"> </w:t>
+      </w:r>
+      <w:r>
+        <w:rPr>
+          <w:rStyle w:val="VerbatimChar"/>
+        </w:rPr>
+        <w:t xml:space="preserve">--refresh-metadata</w:t>
+      </w:r>
+      <w:r>
+        <w:t xml:space="preserve"> </w:t>
+      </w:r>
+      <w:r>
+        <w:t xml:space="preserve">harvests again for new papers.</w:t>
+      </w:r>
+    </w:p>
+    <w:p>
+      <w:pPr>
+        <w:pStyle w:val="Compact"/>
+        <w:numPr>
+          <w:ilvl w:val="0"/>
+          <w:numId w:val="1057"/>
+        </w:numPr>
+      </w:pPr>
+      <w:r>
+        <w:rPr>
+          <w:b/>
+          <w:bCs/>
+        </w:rPr>
+        <w:t xml:space="preserve">Select:</w:t>
+      </w:r>
+      <w:r>
+        <w:t xml:space="preserve"> </w:t>
+      </w:r>
+      <w:r>
+        <w:t xml:space="preserve">papers with 3 keyword matches from 3 different terms (the title counts 3 times), ranked by keyword</w:t>
+      </w:r>
+      <w:r>
+        <w:t xml:space="preserve"> </w:t>
+      </w:r>
+      <w:r>
+        <w:t xml:space="preserve">density (</w:t>
+      </w:r>
+      <w:r>
+        <w:rPr>
+          <w:rStyle w:val="VerbatimChar"/>
+        </w:rPr>
+        <w:t xml:space="preserve">--rank cited</w:t>
+      </w:r>
+      <w:r>
+        <w:t xml:space="preserve">: by citations); the best</w:t>
+      </w:r>
+      <w:r>
+        <w:t xml:space="preserve"> </w:t>
+      </w:r>
+      <w:r>
+        <w:rPr>
+          <w:rStyle w:val="VerbatimChar"/>
+        </w:rPr>
+        <w:t xml:space="preserve">--max-papers</w:t>
+      </w:r>
+      <w:r>
+        <w:t xml:space="preserve"> </w:t>
+      </w:r>
+      <w:r>
+        <w:t xml:space="preserve">are fetched. After a keyword edit, rerun: only the</w:t>
+      </w:r>
+      <w:r>
+        <w:t xml:space="preserve"> </w:t>
+      </w:r>
+      <w:r>
+        <w:t xml:space="preserve">selection is redone, in minutes. Papers already downloaded are skipped.</w:t>
+      </w:r>
+    </w:p>
     <w:bookmarkEnd w:id="51"/>
     <w:bookmarkStart w:id="52" w:name="Xfc3d086a28d050a6fd537126ae8e168cdb8bdcc"/>
     <w:p>
@@ -19410,7 +19703,7 @@
         <w:pStyle w:val="Compact"/>
         <w:numPr>
           <w:ilvl w:val="0"/>
-          <w:numId w:val="1057"/>
+          <w:numId w:val="1058"/>
         </w:numPr>
       </w:pPr>
       <w:r>
@@ -19429,7 +19722,7 @@
         <w:pStyle w:val="Compact"/>
         <w:numPr>
           <w:ilvl w:val="0"/>
-          <w:numId w:val="1057"/>
+          <w:numId w:val="1058"/>
         </w:numPr>
       </w:pPr>
       <w:r>
@@ -19448,7 +19741,7 @@
         <w:pStyle w:val="Compact"/>
         <w:numPr>
           <w:ilvl w:val="0"/>
-          <w:numId w:val="1057"/>
+          <w:numId w:val="1058"/>
         </w:numPr>
       </w:pPr>
       <w:r>
@@ -19548,7 +19841,7 @@
         <w:pStyle w:val="Compact"/>
         <w:numPr>
           <w:ilvl w:val="0"/>
-          <w:numId w:val="1058"/>
+          <w:numId w:val="1059"/>
         </w:numPr>
       </w:pPr>
       <w:r>
@@ -19618,7 +19911,7 @@
         <w:pStyle w:val="Compact"/>
         <w:numPr>
           <w:ilvl w:val="0"/>
-          <w:numId w:val="1058"/>
+          <w:numId w:val="1059"/>
         </w:numPr>
       </w:pPr>
       <w:r>
@@ -19646,7 +19939,7 @@
         <w:pStyle w:val="Compact"/>
         <w:numPr>
           <w:ilvl w:val="0"/>
-          <w:numId w:val="1058"/>
+          <w:numId w:val="1059"/>
         </w:numPr>
       </w:pPr>
       <w:r>
@@ -19713,7 +20006,7 @@
         <w:pStyle w:val="Compact"/>
         <w:numPr>
           <w:ilvl w:val="0"/>
-          <w:numId w:val="1058"/>
+          <w:numId w:val="1059"/>
         </w:numPr>
       </w:pPr>
       <w:r>
@@ -19735,7 +20028,7 @@
         <w:pStyle w:val="Compact"/>
         <w:numPr>
           <w:ilvl w:val="0"/>
-          <w:numId w:val="1058"/>
+          <w:numId w:val="1059"/>
         </w:numPr>
       </w:pPr>
       <w:r>
@@ -19799,7 +20092,7 @@
         <w:pStyle w:val="Compact"/>
         <w:numPr>
           <w:ilvl w:val="0"/>
-          <w:numId w:val="1058"/>
+          <w:numId w:val="1059"/>
         </w:numPr>
       </w:pPr>
       <w:r>
@@ -19881,7 +20174,7 @@
         <w:pStyle w:val="Compact"/>
         <w:numPr>
           <w:ilvl w:val="0"/>
-          <w:numId w:val="1058"/>
+          <w:numId w:val="1059"/>
         </w:numPr>
       </w:pPr>
       <w:r>
@@ -19924,7 +20217,7 @@
         <w:pStyle w:val="Compact"/>
         <w:numPr>
           <w:ilvl w:val="0"/>
-          <w:numId w:val="1058"/>
+          <w:numId w:val="1059"/>
         </w:numPr>
       </w:pPr>
       <w:r>
@@ -20000,7 +20293,7 @@
         <w:pStyle w:val="Compact"/>
         <w:numPr>
           <w:ilvl w:val="0"/>
-          <w:numId w:val="1059"/>
+          <w:numId w:val="1060"/>
         </w:numPr>
       </w:pPr>
       <w:r>
@@ -20058,7 +20351,7 @@
         <w:pStyle w:val="Compact"/>
         <w:numPr>
           <w:ilvl w:val="0"/>
-          <w:numId w:val="1059"/>
+          <w:numId w:val="1060"/>
         </w:numPr>
       </w:pPr>
       <w:r>
@@ -20092,7 +20385,7 @@
         <w:pStyle w:val="Compact"/>
         <w:numPr>
           <w:ilvl w:val="0"/>
-          <w:numId w:val="1059"/>
+          <w:numId w:val="1060"/>
         </w:numPr>
       </w:pPr>
       <w:r>
@@ -20138,7 +20431,7 @@
         <w:pStyle w:val="Compact"/>
         <w:numPr>
           <w:ilvl w:val="0"/>
-          <w:numId w:val="1060"/>
+          <w:numId w:val="1061"/>
         </w:numPr>
       </w:pPr>
       <w:r>
@@ -20182,7 +20475,7 @@
         <w:pStyle w:val="Compact"/>
         <w:numPr>
           <w:ilvl w:val="0"/>
-          <w:numId w:val="1060"/>
+          <w:numId w:val="1061"/>
         </w:numPr>
       </w:pPr>
       <w:r>
@@ -20244,7 +20537,7 @@
         <w:pStyle w:val="Compact"/>
         <w:numPr>
           <w:ilvl w:val="0"/>
-          <w:numId w:val="1060"/>
+          <w:numId w:val="1061"/>
         </w:numPr>
       </w:pPr>
       <w:r>
@@ -20301,7 +20594,7 @@
         <w:pStyle w:val="Compact"/>
         <w:numPr>
           <w:ilvl w:val="0"/>
-          <w:numId w:val="1060"/>
+          <w:numId w:val="1061"/>
         </w:numPr>
       </w:pPr>
       <w:r>
@@ -20356,7 +20649,7 @@
         <w:pStyle w:val="Compact"/>
         <w:numPr>
           <w:ilvl w:val="0"/>
-          <w:numId w:val="1060"/>
+          <w:numId w:val="1061"/>
         </w:numPr>
       </w:pPr>
       <w:r>
@@ -20456,7 +20749,7 @@
         <w:pStyle w:val="Compact"/>
         <w:numPr>
           <w:ilvl w:val="0"/>
-          <w:numId w:val="1060"/>
+          <w:numId w:val="1061"/>
         </w:numPr>
       </w:pPr>
       <w:r>
@@ -20568,7 +20861,7 @@
         <w:pStyle w:val="Compact"/>
         <w:numPr>
           <w:ilvl w:val="0"/>
-          <w:numId w:val="1061"/>
+          <w:numId w:val="1062"/>
         </w:numPr>
       </w:pPr>
       <w:r>
@@ -20596,7 +20889,7 @@
         <w:pStyle w:val="Compact"/>
         <w:numPr>
           <w:ilvl w:val="0"/>
-          <w:numId w:val="1061"/>
+          <w:numId w:val="1062"/>
         </w:numPr>
       </w:pPr>
       <w:r>
@@ -20639,7 +20932,7 @@
         <w:pStyle w:val="Compact"/>
         <w:numPr>
           <w:ilvl w:val="0"/>
-          <w:numId w:val="1061"/>
+          <w:numId w:val="1062"/>
         </w:numPr>
       </w:pPr>
       <w:r>
@@ -20667,7 +20960,7 @@
         <w:pStyle w:val="Compact"/>
         <w:numPr>
           <w:ilvl w:val="0"/>
-          <w:numId w:val="1061"/>
+          <w:numId w:val="1062"/>
         </w:numPr>
       </w:pPr>
       <w:r>
@@ -20719,7 +21012,7 @@
         <w:pStyle w:val="Compact"/>
         <w:numPr>
           <w:ilvl w:val="0"/>
-          <w:numId w:val="1061"/>
+          <w:numId w:val="1062"/>
         </w:numPr>
       </w:pPr>
       <w:r>
@@ -20867,7 +21160,7 @@
         <w:pStyle w:val="Compact"/>
         <w:numPr>
           <w:ilvl w:val="0"/>
-          <w:numId w:val="1062"/>
+          <w:numId w:val="1063"/>
         </w:numPr>
       </w:pPr>
       <w:r>
@@ -20919,7 +21212,7 @@
         <w:pStyle w:val="Compact"/>
         <w:numPr>
           <w:ilvl w:val="0"/>
-          <w:numId w:val="1062"/>
+          <w:numId w:val="1063"/>
         </w:numPr>
       </w:pPr>
       <w:r>
@@ -20953,7 +21246,7 @@
         <w:pStyle w:val="Compact"/>
         <w:numPr>
           <w:ilvl w:val="0"/>
-          <w:numId w:val="1062"/>
+          <w:numId w:val="1063"/>
         </w:numPr>
       </w:pPr>
       <w:r>
@@ -20981,7 +21274,7 @@
         <w:pStyle w:val="Compact"/>
         <w:numPr>
           <w:ilvl w:val="0"/>
-          <w:numId w:val="1062"/>
+          <w:numId w:val="1063"/>
         </w:numPr>
       </w:pPr>
       <w:r>
@@ -21024,7 +21317,7 @@
         <w:pStyle w:val="Compact"/>
         <w:numPr>
           <w:ilvl w:val="0"/>
-          <w:numId w:val="1062"/>
+          <w:numId w:val="1063"/>
         </w:numPr>
       </w:pPr>
       <w:r>
@@ -21061,7 +21354,7 @@
         <w:pStyle w:val="Compact"/>
         <w:numPr>
           <w:ilvl w:val="0"/>
-          <w:numId w:val="1062"/>
+          <w:numId w:val="1063"/>
         </w:numPr>
       </w:pPr>
       <w:r>
@@ -21101,7 +21394,7 @@
         <w:pStyle w:val="Compact"/>
         <w:numPr>
           <w:ilvl w:val="0"/>
-          <w:numId w:val="1062"/>
+          <w:numId w:val="1063"/>
         </w:numPr>
       </w:pPr>
       <w:r>
@@ -22126,7 +22419,7 @@
         <w:pStyle w:val="Compact"/>
         <w:numPr>
           <w:ilvl w:val="0"/>
-          <w:numId w:val="1063"/>
+          <w:numId w:val="1064"/>
         </w:numPr>
       </w:pPr>
       <w:r>
@@ -22166,7 +22459,7 @@
         <w:pStyle w:val="Compact"/>
         <w:numPr>
           <w:ilvl w:val="0"/>
-          <w:numId w:val="1063"/>
+          <w:numId w:val="1064"/>
         </w:numPr>
       </w:pPr>
       <w:r>
@@ -22194,7 +22487,7 @@
         <w:pStyle w:val="Compact"/>
         <w:numPr>
           <w:ilvl w:val="0"/>
-          <w:numId w:val="1063"/>
+          <w:numId w:val="1064"/>
         </w:numPr>
       </w:pPr>
       <w:r>
@@ -22251,7 +22544,7 @@
         <w:pStyle w:val="Compact"/>
         <w:numPr>
           <w:ilvl w:val="0"/>
-          <w:numId w:val="1063"/>
+          <w:numId w:val="1064"/>
         </w:numPr>
       </w:pPr>
       <w:r>
@@ -22267,7 +22560,7 @@
         <w:pStyle w:val="Compact"/>
         <w:numPr>
           <w:ilvl w:val="1"/>
-          <w:numId w:val="1064"/>
+          <w:numId w:val="1065"/>
         </w:numPr>
       </w:pPr>
       <w:r>
@@ -22279,7 +22572,7 @@
         <w:pStyle w:val="Compact"/>
         <w:numPr>
           <w:ilvl w:val="1"/>
-          <w:numId w:val="1064"/>
+          <w:numId w:val="1065"/>
         </w:numPr>
       </w:pPr>
       <w:r>
@@ -22335,7 +22628,7 @@
         <w:pStyle w:val="Compact"/>
         <w:numPr>
           <w:ilvl w:val="0"/>
-          <w:numId w:val="1063"/>
+          <w:numId w:val="1064"/>
         </w:numPr>
       </w:pPr>
       <w:r>
@@ -22351,7 +22644,7 @@
         <w:pStyle w:val="Compact"/>
         <w:numPr>
           <w:ilvl w:val="1"/>
-          <w:numId w:val="1065"/>
+          <w:numId w:val="1066"/>
         </w:numPr>
       </w:pPr>
       <w:r>
@@ -22363,7 +22656,7 @@
         <w:pStyle w:val="Compact"/>
         <w:numPr>
           <w:ilvl w:val="1"/>
-          <w:numId w:val="1065"/>
+          <w:numId w:val="1066"/>
         </w:numPr>
       </w:pPr>
       <w:r>
@@ -22375,7 +22668,7 @@
         <w:pStyle w:val="Compact"/>
         <w:numPr>
           <w:ilvl w:val="1"/>
-          <w:numId w:val="1065"/>
+          <w:numId w:val="1066"/>
         </w:numPr>
       </w:pPr>
       <w:r>
@@ -22387,7 +22680,7 @@
         <w:pStyle w:val="Compact"/>
         <w:numPr>
           <w:ilvl w:val="1"/>
-          <w:numId w:val="1065"/>
+          <w:numId w:val="1066"/>
         </w:numPr>
       </w:pPr>
       <w:r>
@@ -22447,7 +22740,7 @@
         <w:pStyle w:val="Compact"/>
         <w:numPr>
           <w:ilvl w:val="0"/>
-          <w:numId w:val="1066"/>
+          <w:numId w:val="1067"/>
         </w:numPr>
       </w:pPr>
       <w:r>
@@ -22481,7 +22774,7 @@
         <w:pStyle w:val="Compact"/>
         <w:numPr>
           <w:ilvl w:val="0"/>
-          <w:numId w:val="1066"/>
+          <w:numId w:val="1067"/>
         </w:numPr>
       </w:pPr>
       <w:r>
@@ -22515,31 +22808,31 @@
         <w:pStyle w:val="Compact"/>
         <w:numPr>
           <w:ilvl w:val="1"/>
+          <w:numId w:val="1068"/>
+        </w:numPr>
+      </w:pPr>
+      <w:r>
+        <w:t xml:space="preserve">Training starts with the projection only, then adds LoRA.</w:t>
+      </w:r>
+    </w:p>
+    <w:p>
+      <w:pPr>
+        <w:pStyle w:val="Compact"/>
+        <w:numPr>
+          <w:ilvl w:val="1"/>
+          <w:numId w:val="1068"/>
+        </w:numPr>
+      </w:pPr>
+      <w:r>
+        <w:t xml:space="preserve">It needs hundreds of thousands of image–caption pairs; PMC-OA figure–caption collections exist for biomedicine.</w:t>
+      </w:r>
+    </w:p>
+    <w:p>
+      <w:pPr>
+        <w:pStyle w:val="Compact"/>
+        <w:numPr>
+          <w:ilvl w:val="0"/>
           <w:numId w:val="1067"/>
-        </w:numPr>
-      </w:pPr>
-      <w:r>
-        <w:t xml:space="preserve">Training starts with the projection only, then adds LoRA.</w:t>
-      </w:r>
-    </w:p>
-    <w:p>
-      <w:pPr>
-        <w:pStyle w:val="Compact"/>
-        <w:numPr>
-          <w:ilvl w:val="1"/>
-          <w:numId w:val="1067"/>
-        </w:numPr>
-      </w:pPr>
-      <w:r>
-        <w:t xml:space="preserve">It needs hundreds of thousands of image–caption pairs; PMC-OA figure–caption collections exist for biomedicine.</w:t>
-      </w:r>
-    </w:p>
-    <w:p>
-      <w:pPr>
-        <w:pStyle w:val="Compact"/>
-        <w:numPr>
-          <w:ilvl w:val="0"/>
-          <w:numId w:val="1066"/>
         </w:numPr>
       </w:pPr>
       <w:r>
@@ -23086,7 +23379,7 @@
         <w:pStyle w:val="Compact"/>
         <w:numPr>
           <w:ilvl w:val="0"/>
-          <w:numId w:val="1068"/>
+          <w:numId w:val="1069"/>
         </w:numPr>
       </w:pPr>
       <w:r>
@@ -23117,7 +23410,7 @@
         <w:pStyle w:val="Compact"/>
         <w:numPr>
           <w:ilvl w:val="0"/>
-          <w:numId w:val="1068"/>
+          <w:numId w:val="1069"/>
         </w:numPr>
       </w:pPr>
       <w:r>
@@ -23157,7 +23450,7 @@
         <w:pStyle w:val="Compact"/>
         <w:numPr>
           <w:ilvl w:val="0"/>
-          <w:numId w:val="1068"/>
+          <w:numId w:val="1069"/>
         </w:numPr>
       </w:pPr>
       <w:r>
@@ -23212,7 +23505,7 @@
         <w:pStyle w:val="Compact"/>
         <w:numPr>
           <w:ilvl w:val="0"/>
-          <w:numId w:val="1068"/>
+          <w:numId w:val="1069"/>
         </w:numPr>
       </w:pPr>
       <w:r>
@@ -23310,7 +23603,7 @@
         <w:pStyle w:val="Compact"/>
         <w:numPr>
           <w:ilvl w:val="0"/>
-          <w:numId w:val="1069"/>
+          <w:numId w:val="1070"/>
         </w:numPr>
       </w:pPr>
       <w:r>
@@ -23347,79 +23640,79 @@
         <w:pStyle w:val="Compact"/>
         <w:numPr>
           <w:ilvl w:val="1"/>
+          <w:numId w:val="1071"/>
+        </w:numPr>
+      </w:pPr>
+      <w:r>
+        <w:t xml:space="preserve">the weights;</w:t>
+      </w:r>
+    </w:p>
+    <w:p>
+      <w:pPr>
+        <w:pStyle w:val="Compact"/>
+        <w:numPr>
+          <w:ilvl w:val="1"/>
+          <w:numId w:val="1071"/>
+        </w:numPr>
+      </w:pPr>
+      <w:r>
+        <w:t xml:space="preserve">Adam’s averages;</w:t>
+      </w:r>
+    </w:p>
+    <w:p>
+      <w:pPr>
+        <w:pStyle w:val="Compact"/>
+        <w:numPr>
+          <w:ilvl w:val="1"/>
+          <w:numId w:val="1071"/>
+        </w:numPr>
+      </w:pPr>
+      <w:r>
+        <w:t xml:space="preserve">the step number;</w:t>
+      </w:r>
+    </w:p>
+    <w:p>
+      <w:pPr>
+        <w:pStyle w:val="Compact"/>
+        <w:numPr>
+          <w:ilvl w:val="1"/>
+          <w:numId w:val="1071"/>
+        </w:numPr>
+      </w:pPr>
+      <w:r>
+        <w:t xml:space="preserve">the random-number states;</w:t>
+      </w:r>
+    </w:p>
+    <w:p>
+      <w:pPr>
+        <w:pStyle w:val="Compact"/>
+        <w:numPr>
+          <w:ilvl w:val="1"/>
+          <w:numId w:val="1071"/>
+        </w:numPr>
+      </w:pPr>
+      <w:r>
+        <w:t xml:space="preserve">the tokenizer;</w:t>
+      </w:r>
+    </w:p>
+    <w:p>
+      <w:pPr>
+        <w:pStyle w:val="Compact"/>
+        <w:numPr>
+          <w:ilvl w:val="1"/>
+          <w:numId w:val="1071"/>
+        </w:numPr>
+      </w:pPr>
+      <w:r>
+        <w:t xml:space="preserve">the settings.</w:t>
+      </w:r>
+    </w:p>
+    <w:p>
+      <w:pPr>
+        <w:pStyle w:val="Compact"/>
+        <w:numPr>
+          <w:ilvl w:val="0"/>
           <w:numId w:val="1070"/>
-        </w:numPr>
-      </w:pPr>
-      <w:r>
-        <w:t xml:space="preserve">the weights;</w:t>
-      </w:r>
-    </w:p>
-    <w:p>
-      <w:pPr>
-        <w:pStyle w:val="Compact"/>
-        <w:numPr>
-          <w:ilvl w:val="1"/>
-          <w:numId w:val="1070"/>
-        </w:numPr>
-      </w:pPr>
-      <w:r>
-        <w:t xml:space="preserve">Adam’s averages;</w:t>
-      </w:r>
-    </w:p>
-    <w:p>
-      <w:pPr>
-        <w:pStyle w:val="Compact"/>
-        <w:numPr>
-          <w:ilvl w:val="1"/>
-          <w:numId w:val="1070"/>
-        </w:numPr>
-      </w:pPr>
-      <w:r>
-        <w:t xml:space="preserve">the step number;</w:t>
-      </w:r>
-    </w:p>
-    <w:p>
-      <w:pPr>
-        <w:pStyle w:val="Compact"/>
-        <w:numPr>
-          <w:ilvl w:val="1"/>
-          <w:numId w:val="1070"/>
-        </w:numPr>
-      </w:pPr>
-      <w:r>
-        <w:t xml:space="preserve">the random-number states;</w:t>
-      </w:r>
-    </w:p>
-    <w:p>
-      <w:pPr>
-        <w:pStyle w:val="Compact"/>
-        <w:numPr>
-          <w:ilvl w:val="1"/>
-          <w:numId w:val="1070"/>
-        </w:numPr>
-      </w:pPr>
-      <w:r>
-        <w:t xml:space="preserve">the tokenizer;</w:t>
-      </w:r>
-    </w:p>
-    <w:p>
-      <w:pPr>
-        <w:pStyle w:val="Compact"/>
-        <w:numPr>
-          <w:ilvl w:val="1"/>
-          <w:numId w:val="1070"/>
-        </w:numPr>
-      </w:pPr>
-      <w:r>
-        <w:t xml:space="preserve">the settings.</w:t>
-      </w:r>
-    </w:p>
-    <w:p>
-      <w:pPr>
-        <w:pStyle w:val="Compact"/>
-        <w:numPr>
-          <w:ilvl w:val="0"/>
-          <w:numId w:val="1069"/>
         </w:numPr>
       </w:pPr>
       <w:r>
@@ -23441,7 +23734,7 @@
         <w:pStyle w:val="Compact"/>
         <w:numPr>
           <w:ilvl w:val="0"/>
-          <w:numId w:val="1069"/>
+          <w:numId w:val="1070"/>
         </w:numPr>
       </w:pPr>
       <w:r>
@@ -23468,7 +23761,7 @@
         <w:pStyle w:val="Compact"/>
         <w:numPr>
           <w:ilvl w:val="0"/>
-          <w:numId w:val="1069"/>
+          <w:numId w:val="1070"/>
         </w:numPr>
       </w:pPr>
       <w:r>
@@ -23502,7 +23795,7 @@
         <w:pStyle w:val="Compact"/>
         <w:numPr>
           <w:ilvl w:val="0"/>
-          <w:numId w:val="1069"/>
+          <w:numId w:val="1070"/>
         </w:numPr>
       </w:pPr>
       <w:r>
@@ -23551,7 +23844,7 @@
         <w:pStyle w:val="Compact"/>
         <w:numPr>
           <w:ilvl w:val="0"/>
-          <w:numId w:val="1069"/>
+          <w:numId w:val="1070"/>
         </w:numPr>
       </w:pPr>
       <w:r>
@@ -23611,7 +23904,7 @@
         <w:pStyle w:val="Compact"/>
         <w:numPr>
           <w:ilvl w:val="0"/>
-          <w:numId w:val="1069"/>
+          <w:numId w:val="1070"/>
         </w:numPr>
       </w:pPr>
       <w:r>
@@ -23641,7 +23934,7 @@
         <w:pStyle w:val="Compact"/>
         <w:numPr>
           <w:ilvl w:val="0"/>
-          <w:numId w:val="1069"/>
+          <w:numId w:val="1070"/>
         </w:numPr>
       </w:pPr>
       <w:r>
@@ -23705,7 +23998,7 @@
         <w:pStyle w:val="Compact"/>
         <w:numPr>
           <w:ilvl w:val="0"/>
-          <w:numId w:val="1069"/>
+          <w:numId w:val="1070"/>
         </w:numPr>
       </w:pPr>
       <w:r>
@@ -23794,7 +24087,7 @@
         <w:pStyle w:val="Compact"/>
         <w:numPr>
           <w:ilvl w:val="0"/>
-          <w:numId w:val="1071"/>
+          <w:numId w:val="1072"/>
         </w:numPr>
       </w:pPr>
       <w:r>
@@ -23911,7 +24204,7 @@
         <w:pStyle w:val="Compact"/>
         <w:numPr>
           <w:ilvl w:val="0"/>
-          <w:numId w:val="1071"/>
+          <w:numId w:val="1072"/>
         </w:numPr>
       </w:pPr>
       <w:r>
@@ -24065,7 +24358,7 @@
         <w:pStyle w:val="Compact"/>
         <w:numPr>
           <w:ilvl w:val="0"/>
-          <w:numId w:val="1072"/>
+          <w:numId w:val="1073"/>
         </w:numPr>
       </w:pPr>
       <w:r>
@@ -24123,7 +24416,7 @@
         <w:pStyle w:val="Compact"/>
         <w:numPr>
           <w:ilvl w:val="0"/>
-          <w:numId w:val="1072"/>
+          <w:numId w:val="1073"/>
         </w:numPr>
       </w:pPr>
       <w:r>
@@ -24178,7 +24471,7 @@
         <w:pStyle w:val="Compact"/>
         <w:numPr>
           <w:ilvl w:val="0"/>
-          <w:numId w:val="1072"/>
+          <w:numId w:val="1073"/>
         </w:numPr>
       </w:pPr>
       <w:r>
@@ -24227,7 +24520,7 @@
         <w:pStyle w:val="Compact"/>
         <w:numPr>
           <w:ilvl w:val="0"/>
-          <w:numId w:val="1072"/>
+          <w:numId w:val="1073"/>
         </w:numPr>
       </w:pPr>
       <w:r>
@@ -24267,7 +24560,7 @@
         <w:pStyle w:val="Compact"/>
         <w:numPr>
           <w:ilvl w:val="0"/>
-          <w:numId w:val="1072"/>
+          <w:numId w:val="1073"/>
         </w:numPr>
       </w:pPr>
       <w:r>
@@ -24422,7 +24715,7 @@
         <w:pStyle w:val="Compact"/>
         <w:numPr>
           <w:ilvl w:val="0"/>
-          <w:numId w:val="1073"/>
+          <w:numId w:val="1074"/>
         </w:numPr>
       </w:pPr>
       <w:r>
@@ -24450,7 +24743,7 @@
         <w:pStyle w:val="Compact"/>
         <w:numPr>
           <w:ilvl w:val="0"/>
-          <w:numId w:val="1073"/>
+          <w:numId w:val="1074"/>
         </w:numPr>
       </w:pPr>
       <w:r>
@@ -24487,7 +24780,7 @@
         <w:pStyle w:val="Compact"/>
         <w:numPr>
           <w:ilvl w:val="0"/>
-          <w:numId w:val="1073"/>
+          <w:numId w:val="1074"/>
         </w:numPr>
       </w:pPr>
       <w:r>
@@ -24530,7 +24823,7 @@
         <w:pStyle w:val="Compact"/>
         <w:numPr>
           <w:ilvl w:val="0"/>
-          <w:numId w:val="1073"/>
+          <w:numId w:val="1074"/>
         </w:numPr>
       </w:pPr>
       <w:r>
@@ -24624,7 +24917,7 @@
         <w:pStyle w:val="Compact"/>
         <w:numPr>
           <w:ilvl w:val="0"/>
-          <w:numId w:val="1073"/>
+          <w:numId w:val="1074"/>
         </w:numPr>
       </w:pPr>
       <w:r>
@@ -24917,7 +25210,7 @@
         <w:pStyle w:val="Compact"/>
         <w:numPr>
           <w:ilvl w:val="0"/>
-          <w:numId w:val="1074"/>
+          <w:numId w:val="1075"/>
         </w:numPr>
       </w:pPr>
       <w:r>
@@ -24939,7 +25232,7 @@
         <w:pStyle w:val="Compact"/>
         <w:numPr>
           <w:ilvl w:val="0"/>
-          <w:numId w:val="1074"/>
+          <w:numId w:val="1075"/>
         </w:numPr>
       </w:pPr>
       <w:r>
@@ -24961,7 +25254,7 @@
         <w:pStyle w:val="Compact"/>
         <w:numPr>
           <w:ilvl w:val="0"/>
-          <w:numId w:val="1074"/>
+          <w:numId w:val="1075"/>
         </w:numPr>
       </w:pPr>
       <w:r>
@@ -25192,7 +25485,7 @@
         <w:pStyle w:val="Compact"/>
         <w:numPr>
           <w:ilvl w:val="0"/>
-          <w:numId w:val="1075"/>
+          <w:numId w:val="1076"/>
         </w:numPr>
       </w:pPr>
       <w:r>
@@ -25244,7 +25537,7 @@
         <w:pStyle w:val="Compact"/>
         <w:numPr>
           <w:ilvl w:val="0"/>
-          <w:numId w:val="1075"/>
+          <w:numId w:val="1076"/>
         </w:numPr>
       </w:pPr>
       <w:r>
@@ -25268,7 +25561,7 @@
         <w:pStyle w:val="Compact"/>
         <w:numPr>
           <w:ilvl w:val="0"/>
-          <w:numId w:val="1075"/>
+          <w:numId w:val="1076"/>
         </w:numPr>
       </w:pPr>
       <w:r>
@@ -25292,59 +25585,11 @@
         <w:pStyle w:val="Compact"/>
         <w:numPr>
           <w:ilvl w:val="0"/>
-          <w:numId w:val="1076"/>
+          <w:numId w:val="1077"/>
         </w:numPr>
       </w:pPr>
       <w:r>
         <w:t xml:space="preserve">Four writers drafted the items. Every wrong answer is a near miss from the same class as the right one:</w:t>
-      </w:r>
-    </w:p>
-    <w:p>
-      <w:pPr>
-        <w:pStyle w:val="Compact"/>
-        <w:numPr>
-          <w:ilvl w:val="1"/>
-          <w:numId w:val="1077"/>
-        </w:numPr>
-      </w:pPr>
-      <w:r>
-        <w:t xml:space="preserve">statistics against other statistics, and cell types against neighbouring cell types;</w:t>
-      </w:r>
-    </w:p>
-    <w:p>
-      <w:pPr>
-        <w:pStyle w:val="Compact"/>
-        <w:numPr>
-          <w:ilvl w:val="1"/>
-          <w:numId w:val="1077"/>
-        </w:numPr>
-      </w:pPr>
-      <w:r>
-        <w:t xml:space="preserve">numbers against nearby numbers;</w:t>
-      </w:r>
-    </w:p>
-    <w:p>
-      <w:pPr>
-        <w:pStyle w:val="Compact"/>
-        <w:numPr>
-          <w:ilvl w:val="1"/>
-          <w:numId w:val="1077"/>
-        </w:numPr>
-      </w:pPr>
-      <w:r>
-        <w:t xml:space="preserve">directions against the other directions.</w:t>
-      </w:r>
-    </w:p>
-    <w:p>
-      <w:pPr>
-        <w:pStyle w:val="Compact"/>
-        <w:numPr>
-          <w:ilvl w:val="0"/>
-          <w:numId w:val="1076"/>
-        </w:numPr>
-      </w:pPr>
-      <w:r>
-        <w:t xml:space="preserve">Two independent reviewers checked all 336 items for:</w:t>
       </w:r>
     </w:p>
     <w:p>
@@ -25356,7 +25601,7 @@
         </w:numPr>
       </w:pPr>
       <w:r>
-        <w:t xml:space="preserve">wrong or disputable answers;</w:t>
+        <w:t xml:space="preserve">statistics against other statistics, and cell types against neighbouring cell types;</w:t>
       </w:r>
     </w:p>
     <w:p>
@@ -25368,7 +25613,7 @@
         </w:numPr>
       </w:pPr>
       <w:r>
-        <w:t xml:space="preserve">a second defensible option;</w:t>
+        <w:t xml:space="preserve">numbers against nearby numbers;</w:t>
       </w:r>
     </w:p>
     <w:p>
@@ -25380,6 +25625,54 @@
         </w:numPr>
       </w:pPr>
       <w:r>
+        <w:t xml:space="preserve">directions against the other directions.</w:t>
+      </w:r>
+    </w:p>
+    <w:p>
+      <w:pPr>
+        <w:pStyle w:val="Compact"/>
+        <w:numPr>
+          <w:ilvl w:val="0"/>
+          <w:numId w:val="1077"/>
+        </w:numPr>
+      </w:pPr>
+      <w:r>
+        <w:t xml:space="preserve">Two independent reviewers checked all 336 items for:</w:t>
+      </w:r>
+    </w:p>
+    <w:p>
+      <w:pPr>
+        <w:pStyle w:val="Compact"/>
+        <w:numPr>
+          <w:ilvl w:val="1"/>
+          <w:numId w:val="1079"/>
+        </w:numPr>
+      </w:pPr>
+      <w:r>
+        <w:t xml:space="preserve">wrong or disputable answers;</w:t>
+      </w:r>
+    </w:p>
+    <w:p>
+      <w:pPr>
+        <w:pStyle w:val="Compact"/>
+        <w:numPr>
+          <w:ilvl w:val="1"/>
+          <w:numId w:val="1079"/>
+        </w:numPr>
+      </w:pPr>
+      <w:r>
+        <w:t xml:space="preserve">a second defensible option;</w:t>
+      </w:r>
+    </w:p>
+    <w:p>
+      <w:pPr>
+        <w:pStyle w:val="Compact"/>
+        <w:numPr>
+          <w:ilvl w:val="1"/>
+          <w:numId w:val="1079"/>
+        </w:numPr>
+      </w:pPr>
+      <w:r>
         <w:t xml:space="preserve">grammar that gives the answer away;</w:t>
       </w:r>
     </w:p>
@@ -25388,7 +25681,7 @@
         <w:pStyle w:val="Compact"/>
         <w:numPr>
           <w:ilvl w:val="1"/>
-          <w:numId w:val="1078"/>
+          <w:numId w:val="1079"/>
         </w:numPr>
       </w:pPr>
       <w:r>
@@ -25412,7 +25705,7 @@
         <w:pStyle w:val="Compact"/>
         <w:numPr>
           <w:ilvl w:val="0"/>
-          <w:numId w:val="1076"/>
+          <w:numId w:val="1077"/>
         </w:numPr>
       </w:pPr>
       <w:r>
@@ -25455,7 +25748,7 @@
         <w:pStyle w:val="Compact"/>
         <w:numPr>
           <w:ilvl w:val="0"/>
-          <w:numId w:val="1079"/>
+          <w:numId w:val="1080"/>
         </w:numPr>
       </w:pPr>
       <w:r>
@@ -25489,7 +25782,7 @@
         <w:pStyle w:val="Compact"/>
         <w:numPr>
           <w:ilvl w:val="0"/>
-          <w:numId w:val="1079"/>
+          <w:numId w:val="1080"/>
         </w:numPr>
       </w:pPr>
       <w:r>
@@ -25529,7 +25822,7 @@
         <w:pStyle w:val="Compact"/>
         <w:numPr>
           <w:ilvl w:val="1"/>
-          <w:numId w:val="1080"/>
+          <w:numId w:val="1081"/>
         </w:numPr>
       </w:pPr>
       <w:r>
@@ -25556,7 +25849,7 @@
         <w:pStyle w:val="Compact"/>
         <w:numPr>
           <w:ilvl w:val="1"/>
-          <w:numId w:val="1080"/>
+          <w:numId w:val="1081"/>
         </w:numPr>
       </w:pPr>
       <w:r>
@@ -25568,7 +25861,7 @@
         <w:pStyle w:val="Compact"/>
         <w:numPr>
           <w:ilvl w:val="1"/>
-          <w:numId w:val="1080"/>
+          <w:numId w:val="1081"/>
         </w:numPr>
       </w:pPr>
       <w:r>
@@ -25580,7 +25873,7 @@
         <w:pStyle w:val="Compact"/>
         <w:numPr>
           <w:ilvl w:val="1"/>
-          <w:numId w:val="1080"/>
+          <w:numId w:val="1081"/>
         </w:numPr>
       </w:pPr>
       <w:r>
@@ -25604,7 +25897,7 @@
         <w:pStyle w:val="Compact"/>
         <w:numPr>
           <w:ilvl w:val="0"/>
-          <w:numId w:val="1079"/>
+          <w:numId w:val="1080"/>
         </w:numPr>
       </w:pPr>
       <w:r>
@@ -25714,7 +26007,7 @@
         <w:pStyle w:val="Compact"/>
         <w:numPr>
           <w:ilvl w:val="0"/>
-          <w:numId w:val="1081"/>
+          <w:numId w:val="1082"/>
         </w:numPr>
       </w:pPr>
       <w:r>
@@ -25790,7 +26083,7 @@
         <w:pStyle w:val="Compact"/>
         <w:numPr>
           <w:ilvl w:val="0"/>
-          <w:numId w:val="1081"/>
+          <w:numId w:val="1082"/>
         </w:numPr>
       </w:pPr>
       <w:r>
@@ -25812,7 +26105,7 @@
         <w:pStyle w:val="Compact"/>
         <w:numPr>
           <w:ilvl w:val="0"/>
-          <w:numId w:val="1081"/>
+          <w:numId w:val="1082"/>
         </w:numPr>
       </w:pPr>
       <w:r>
@@ -25834,7 +26127,7 @@
         <w:pStyle w:val="Compact"/>
         <w:numPr>
           <w:ilvl w:val="0"/>
-          <w:numId w:val="1081"/>
+          <w:numId w:val="1082"/>
         </w:numPr>
       </w:pPr>
       <w:r>
@@ -25862,7 +26155,7 @@
         <w:pStyle w:val="Compact"/>
         <w:numPr>
           <w:ilvl w:val="0"/>
-          <w:numId w:val="1081"/>
+          <w:numId w:val="1082"/>
         </w:numPr>
       </w:pPr>
       <w:r>
@@ -26259,7 +26552,7 @@
         <w:pStyle w:val="Compact"/>
         <w:numPr>
           <w:ilvl w:val="0"/>
-          <w:numId w:val="1082"/>
+          <w:numId w:val="1083"/>
         </w:numPr>
       </w:pPr>
       <w:r>
@@ -26281,7 +26574,7 @@
         <w:pStyle w:val="Compact"/>
         <w:numPr>
           <w:ilvl w:val="0"/>
-          <w:numId w:val="1082"/>
+          <w:numId w:val="1083"/>
         </w:numPr>
       </w:pPr>
       <w:r>
@@ -26309,7 +26602,7 @@
         <w:pStyle w:val="Compact"/>
         <w:numPr>
           <w:ilvl w:val="1"/>
-          <w:numId w:val="1083"/>
+          <w:numId w:val="1084"/>
         </w:numPr>
       </w:pPr>
       <m:oMath>
@@ -26383,7 +26676,7 @@
         <w:pStyle w:val="Compact"/>
         <w:numPr>
           <w:ilvl w:val="1"/>
-          <w:numId w:val="1083"/>
+          <w:numId w:val="1084"/>
         </w:numPr>
       </w:pPr>
       <m:oMath>
@@ -26430,7 +26723,7 @@
         <w:pStyle w:val="Compact"/>
         <w:numPr>
           <w:ilvl w:val="1"/>
-          <w:numId w:val="1083"/>
+          <w:numId w:val="1084"/>
         </w:numPr>
       </w:pPr>
       <m:oMath>
@@ -26533,7 +26826,7 @@
         <w:pStyle w:val="Compact"/>
         <w:numPr>
           <w:ilvl w:val="0"/>
-          <w:numId w:val="1082"/>
+          <w:numId w:val="1083"/>
         </w:numPr>
       </w:pPr>
       <w:r>
@@ -26609,7 +26902,7 @@
         <w:pStyle w:val="Compact"/>
         <w:numPr>
           <w:ilvl w:val="0"/>
-          <w:numId w:val="1084"/>
+          <w:numId w:val="1085"/>
         </w:numPr>
       </w:pPr>
       <w:r>
@@ -26621,7 +26914,7 @@
         <w:pStyle w:val="Compact"/>
         <w:numPr>
           <w:ilvl w:val="0"/>
-          <w:numId w:val="1084"/>
+          <w:numId w:val="1085"/>
         </w:numPr>
       </w:pPr>
       <w:r>
@@ -26633,7 +26926,7 @@
         <w:pStyle w:val="Compact"/>
         <w:numPr>
           <w:ilvl w:val="0"/>
-          <w:numId w:val="1084"/>
+          <w:numId w:val="1085"/>
         </w:numPr>
       </w:pPr>
       <w:r>
@@ -26693,7 +26986,7 @@
         <w:pStyle w:val="Compact"/>
         <w:numPr>
           <w:ilvl w:val="0"/>
-          <w:numId w:val="1085"/>
+          <w:numId w:val="1086"/>
         </w:numPr>
       </w:pPr>
       <w:r>
@@ -26705,7 +26998,7 @@
         <w:pStyle w:val="Compact"/>
         <w:numPr>
           <w:ilvl w:val="0"/>
-          <w:numId w:val="1085"/>
+          <w:numId w:val="1086"/>
         </w:numPr>
       </w:pPr>
       <w:r>
@@ -26717,7 +27010,7 @@
         <w:pStyle w:val="Compact"/>
         <w:numPr>
           <w:ilvl w:val="0"/>
-          <w:numId w:val="1085"/>
+          <w:numId w:val="1086"/>
         </w:numPr>
       </w:pPr>
       <w:r>
@@ -26837,7 +27130,7 @@
         <w:pStyle w:val="Compact"/>
         <w:numPr>
           <w:ilvl w:val="0"/>
-          <w:numId w:val="1086"/>
+          <w:numId w:val="1087"/>
         </w:numPr>
       </w:pPr>
       <w:r>
@@ -26865,7 +27158,7 @@
         <w:pStyle w:val="Compact"/>
         <w:numPr>
           <w:ilvl w:val="0"/>
-          <w:numId w:val="1086"/>
+          <w:numId w:val="1087"/>
         </w:numPr>
       </w:pPr>
       <w:r>
@@ -26899,7 +27192,7 @@
         <w:pStyle w:val="Compact"/>
         <w:numPr>
           <w:ilvl w:val="0"/>
-          <w:numId w:val="1086"/>
+          <w:numId w:val="1087"/>
         </w:numPr>
       </w:pPr>
       <w:r>
@@ -26954,7 +27247,7 @@
         <w:pStyle w:val="Compact"/>
         <w:numPr>
           <w:ilvl w:val="0"/>
-          <w:numId w:val="1086"/>
+          <w:numId w:val="1087"/>
         </w:numPr>
       </w:pPr>
       <w:r>
@@ -27042,7 +27335,7 @@
         <w:pStyle w:val="Compact"/>
         <w:numPr>
           <w:ilvl w:val="0"/>
-          <w:numId w:val="1086"/>
+          <w:numId w:val="1087"/>
         </w:numPr>
       </w:pPr>
       <w:r>
@@ -27076,7 +27369,7 @@
         <w:pStyle w:val="Compact"/>
         <w:numPr>
           <w:ilvl w:val="0"/>
-          <w:numId w:val="1086"/>
+          <w:numId w:val="1087"/>
         </w:numPr>
       </w:pPr>
       <w:r>
@@ -27104,7 +27397,7 @@
         <w:pStyle w:val="Compact"/>
         <w:numPr>
           <w:ilvl w:val="0"/>
-          <w:numId w:val="1086"/>
+          <w:numId w:val="1087"/>
         </w:numPr>
       </w:pPr>
       <w:r>
@@ -27159,7 +27452,7 @@
         <w:pStyle w:val="Compact"/>
         <w:numPr>
           <w:ilvl w:val="0"/>
-          <w:numId w:val="1086"/>
+          <w:numId w:val="1087"/>
         </w:numPr>
       </w:pPr>
       <w:r>
@@ -27198,7 +27491,7 @@
         <w:pStyle w:val="Compact"/>
         <w:numPr>
           <w:ilvl w:val="0"/>
-          <w:numId w:val="1087"/>
+          <w:numId w:val="1088"/>
         </w:numPr>
       </w:pPr>
       <w:r>
@@ -27210,7 +27503,7 @@
         <w:pStyle w:val="Compact"/>
         <w:numPr>
           <w:ilvl w:val="0"/>
-          <w:numId w:val="1087"/>
+          <w:numId w:val="1088"/>
         </w:numPr>
       </w:pPr>
       <w:r>
@@ -27222,7 +27515,7 @@
         <w:pStyle w:val="Compact"/>
         <w:numPr>
           <w:ilvl w:val="0"/>
-          <w:numId w:val="1087"/>
+          <w:numId w:val="1088"/>
         </w:numPr>
       </w:pPr>
       <w:r>
@@ -27234,7 +27527,7 @@
         <w:pStyle w:val="Compact"/>
         <w:numPr>
           <w:ilvl w:val="0"/>
-          <w:numId w:val="1087"/>
+          <w:numId w:val="1088"/>
         </w:numPr>
       </w:pPr>
       <w:r>
@@ -27246,7 +27539,7 @@
         <w:pStyle w:val="Compact"/>
         <w:numPr>
           <w:ilvl w:val="0"/>
-          <w:numId w:val="1087"/>
+          <w:numId w:val="1088"/>
         </w:numPr>
       </w:pPr>
       <w:r>
@@ -27258,7 +27551,7 @@
         <w:pStyle w:val="Compact"/>
         <w:numPr>
           <w:ilvl w:val="0"/>
-          <w:numId w:val="1087"/>
+          <w:numId w:val="1088"/>
         </w:numPr>
       </w:pPr>
       <w:r>
@@ -27270,7 +27563,7 @@
         <w:pStyle w:val="Compact"/>
         <w:numPr>
           <w:ilvl w:val="0"/>
-          <w:numId w:val="1087"/>
+          <w:numId w:val="1088"/>
         </w:numPr>
       </w:pPr>
       <w:r>
@@ -27282,7 +27575,7 @@
         <w:pStyle w:val="Compact"/>
         <w:numPr>
           <w:ilvl w:val="0"/>
-          <w:numId w:val="1087"/>
+          <w:numId w:val="1088"/>
         </w:numPr>
       </w:pPr>
       <w:r>
@@ -27329,7 +27622,7 @@
         <w:pStyle w:val="Compact"/>
         <w:numPr>
           <w:ilvl w:val="0"/>
-          <w:numId w:val="1088"/>
+          <w:numId w:val="1089"/>
         </w:numPr>
       </w:pPr>
       <w:r>
@@ -27356,7 +27649,7 @@
         <w:pStyle w:val="Compact"/>
         <w:numPr>
           <w:ilvl w:val="0"/>
-          <w:numId w:val="1088"/>
+          <w:numId w:val="1089"/>
         </w:numPr>
       </w:pPr>
       <w:r>
@@ -27377,7 +27670,7 @@
         <w:pStyle w:val="Compact"/>
         <w:numPr>
           <w:ilvl w:val="0"/>
-          <w:numId w:val="1088"/>
+          <w:numId w:val="1089"/>
         </w:numPr>
       </w:pPr>
       <w:r>
@@ -27450,7 +27743,7 @@
         <w:pStyle w:val="Compact"/>
         <w:numPr>
           <w:ilvl w:val="0"/>
-          <w:numId w:val="1089"/>
+          <w:numId w:val="1090"/>
         </w:numPr>
       </w:pPr>
       <w:r>
@@ -27462,7 +27755,7 @@
         <w:pStyle w:val="Compact"/>
         <w:numPr>
           <w:ilvl w:val="0"/>
-          <w:numId w:val="1089"/>
+          <w:numId w:val="1090"/>
         </w:numPr>
       </w:pPr>
       <w:r>
@@ -27474,7 +27767,7 @@
         <w:pStyle w:val="Compact"/>
         <w:numPr>
           <w:ilvl w:val="0"/>
-          <w:numId w:val="1089"/>
+          <w:numId w:val="1090"/>
         </w:numPr>
       </w:pPr>
       <w:r>
@@ -27486,7 +27779,7 @@
         <w:pStyle w:val="Compact"/>
         <w:numPr>
           <w:ilvl w:val="0"/>
-          <w:numId w:val="1089"/>
+          <w:numId w:val="1090"/>
         </w:numPr>
       </w:pPr>
       <w:r>
@@ -28136,7 +28429,7 @@
         <w:pStyle w:val="Compact"/>
         <w:numPr>
           <w:ilvl w:val="0"/>
-          <w:numId w:val="1090"/>
+          <w:numId w:val="1091"/>
         </w:numPr>
       </w:pPr>
       <w:r>
@@ -28163,7 +28456,7 @@
         <w:pStyle w:val="Compact"/>
         <w:numPr>
           <w:ilvl w:val="0"/>
-          <w:numId w:val="1090"/>
+          <w:numId w:val="1091"/>
         </w:numPr>
       </w:pPr>
       <w:r>
@@ -28175,7 +28468,7 @@
         <w:pStyle w:val="Compact"/>
         <w:numPr>
           <w:ilvl w:val="0"/>
-          <w:numId w:val="1090"/>
+          <w:numId w:val="1091"/>
         </w:numPr>
       </w:pPr>
       <w:r>
@@ -28835,7 +29128,7 @@
         <w:pStyle w:val="Compact"/>
         <w:numPr>
           <w:ilvl w:val="0"/>
-          <w:numId w:val="1091"/>
+          <w:numId w:val="1092"/>
         </w:numPr>
       </w:pPr>
       <w:r>
@@ -28854,7 +29147,7 @@
         <w:pStyle w:val="Compact"/>
         <w:numPr>
           <w:ilvl w:val="0"/>
-          <w:numId w:val="1091"/>
+          <w:numId w:val="1092"/>
         </w:numPr>
       </w:pPr>
       <w:r>
@@ -28866,7 +29159,7 @@
         <w:pStyle w:val="Compact"/>
         <w:numPr>
           <w:ilvl w:val="0"/>
-          <w:numId w:val="1091"/>
+          <w:numId w:val="1092"/>
         </w:numPr>
       </w:pPr>
       <w:r>
@@ -28904,7 +29197,7 @@
         <w:pStyle w:val="Compact"/>
         <w:numPr>
           <w:ilvl w:val="0"/>
-          <w:numId w:val="1091"/>
+          <w:numId w:val="1092"/>
         </w:numPr>
       </w:pPr>
       <w:r>
@@ -28959,7 +29252,7 @@
         <w:pStyle w:val="Compact"/>
         <w:numPr>
           <w:ilvl w:val="0"/>
-          <w:numId w:val="1091"/>
+          <w:numId w:val="1092"/>
         </w:numPr>
       </w:pPr>
       <w:r>
@@ -29002,7 +29295,7 @@
         <w:pStyle w:val="Compact"/>
         <w:numPr>
           <w:ilvl w:val="0"/>
-          <w:numId w:val="1091"/>
+          <w:numId w:val="1092"/>
         </w:numPr>
       </w:pPr>
       <w:r>
@@ -29048,7 +29341,7 @@
         <w:pStyle w:val="Compact"/>
         <w:numPr>
           <w:ilvl w:val="0"/>
-          <w:numId w:val="1091"/>
+          <w:numId w:val="1092"/>
         </w:numPr>
       </w:pPr>
       <w:r>
@@ -29112,7 +29405,7 @@
         <w:pStyle w:val="Compact"/>
         <w:numPr>
           <w:ilvl w:val="0"/>
-          <w:numId w:val="1092"/>
+          <w:numId w:val="1093"/>
         </w:numPr>
       </w:pPr>
       <w:r>
@@ -29124,7 +29417,7 @@
         <w:pStyle w:val="Compact"/>
         <w:numPr>
           <w:ilvl w:val="0"/>
-          <w:numId w:val="1092"/>
+          <w:numId w:val="1093"/>
         </w:numPr>
       </w:pPr>
       <w:r>
@@ -29136,7 +29429,7 @@
         <w:pStyle w:val="Compact"/>
         <w:numPr>
           <w:ilvl w:val="0"/>
-          <w:numId w:val="1092"/>
+          <w:numId w:val="1093"/>
         </w:numPr>
       </w:pPr>
       <w:r>
@@ -29259,7 +29552,7 @@
         <w:pStyle w:val="Compact"/>
         <w:numPr>
           <w:ilvl w:val="0"/>
-          <w:numId w:val="1093"/>
+          <w:numId w:val="1094"/>
         </w:numPr>
       </w:pPr>
       <w:r>
@@ -29277,7 +29570,7 @@
         <w:pStyle w:val="Compact"/>
         <w:numPr>
           <w:ilvl w:val="0"/>
-          <w:numId w:val="1093"/>
+          <w:numId w:val="1094"/>
         </w:numPr>
       </w:pPr>
       <w:r>
@@ -29298,7 +29591,7 @@
         <w:pStyle w:val="Compact"/>
         <w:numPr>
           <w:ilvl w:val="0"/>
-          <w:numId w:val="1093"/>
+          <w:numId w:val="1094"/>
         </w:numPr>
       </w:pPr>
       <w:r>
@@ -29424,7 +29717,7 @@
         <w:pStyle w:val="Compact"/>
         <w:numPr>
           <w:ilvl w:val="0"/>
-          <w:numId w:val="1094"/>
+          <w:numId w:val="1095"/>
         </w:numPr>
       </w:pPr>
       <w:r>
@@ -29497,7 +29790,7 @@
         <w:pStyle w:val="Compact"/>
         <w:numPr>
           <w:ilvl w:val="0"/>
-          <w:numId w:val="1094"/>
+          <w:numId w:val="1095"/>
         </w:numPr>
       </w:pPr>
       <w:r>
@@ -29519,7 +29812,7 @@
         <w:pStyle w:val="Compact"/>
         <w:numPr>
           <w:ilvl w:val="0"/>
-          <w:numId w:val="1094"/>
+          <w:numId w:val="1095"/>
         </w:numPr>
       </w:pPr>
       <w:r>
@@ -29589,7 +29882,7 @@
         <w:pStyle w:val="Compact"/>
         <w:numPr>
           <w:ilvl w:val="0"/>
-          <w:numId w:val="1094"/>
+          <w:numId w:val="1095"/>
         </w:numPr>
       </w:pPr>
       <w:r>
@@ -29648,7 +29941,7 @@
         <w:pStyle w:val="Compact"/>
         <w:numPr>
           <w:ilvl w:val="0"/>
-          <w:numId w:val="1095"/>
+          <w:numId w:val="1096"/>
         </w:numPr>
       </w:pPr>
       <w:r>
@@ -29664,7 +29957,7 @@
         <w:pStyle w:val="Compact"/>
         <w:numPr>
           <w:ilvl w:val="1"/>
-          <w:numId w:val="1096"/>
+          <w:numId w:val="1097"/>
         </w:numPr>
       </w:pPr>
       <w:r>
@@ -29676,7 +29969,7 @@
         <w:pStyle w:val="Compact"/>
         <w:numPr>
           <w:ilvl w:val="1"/>
-          <w:numId w:val="1096"/>
+          <w:numId w:val="1097"/>
         </w:numPr>
       </w:pPr>
       <w:r>
@@ -29688,7 +29981,7 @@
         <w:pStyle w:val="Compact"/>
         <w:numPr>
           <w:ilvl w:val="1"/>
-          <w:numId w:val="1096"/>
+          <w:numId w:val="1097"/>
         </w:numPr>
       </w:pPr>
       <m:oMath>
@@ -29717,19 +30010,19 @@
         <w:pStyle w:val="Compact"/>
         <w:numPr>
           <w:ilvl w:val="1"/>
+          <w:numId w:val="1097"/>
+        </w:numPr>
+      </w:pPr>
+      <w:r>
+        <w:t xml:space="preserve">R or Python functions checked by unit tests.</w:t>
+      </w:r>
+    </w:p>
+    <w:p>
+      <w:pPr>
+        <w:pStyle w:val="Compact"/>
+        <w:numPr>
+          <w:ilvl w:val="0"/>
           <w:numId w:val="1096"/>
-        </w:numPr>
-      </w:pPr>
-      <w:r>
-        <w:t xml:space="preserve">R or Python functions checked by unit tests.</w:t>
-      </w:r>
-    </w:p>
-    <w:p>
-      <w:pPr>
-        <w:pStyle w:val="Compact"/>
-        <w:numPr>
-          <w:ilvl w:val="0"/>
-          <w:numId w:val="1095"/>
         </w:numPr>
       </w:pPr>
       <w:r>
@@ -29751,7 +30044,7 @@
         <w:pStyle w:val="Compact"/>
         <w:numPr>
           <w:ilvl w:val="0"/>
-          <w:numId w:val="1095"/>
+          <w:numId w:val="1096"/>
         </w:numPr>
       </w:pPr>
       <w:r>
@@ -29779,7 +30072,7 @@
         <w:pStyle w:val="Compact"/>
         <w:numPr>
           <w:ilvl w:val="0"/>
-          <w:numId w:val="1095"/>
+          <w:numId w:val="1096"/>
         </w:numPr>
       </w:pPr>
       <w:r>
@@ -29832,7 +30125,7 @@
         <w:pStyle w:val="Compact"/>
         <w:numPr>
           <w:ilvl w:val="0"/>
-          <w:numId w:val="1097"/>
+          <w:numId w:val="1098"/>
         </w:numPr>
       </w:pPr>
       <w:r>
@@ -29876,7 +30169,7 @@
         <w:pStyle w:val="Compact"/>
         <w:numPr>
           <w:ilvl w:val="0"/>
-          <w:numId w:val="1097"/>
+          <w:numId w:val="1098"/>
         </w:numPr>
       </w:pPr>
       <w:r>
@@ -29898,7 +30191,7 @@
         <w:pStyle w:val="Compact"/>
         <w:numPr>
           <w:ilvl w:val="0"/>
-          <w:numId w:val="1097"/>
+          <w:numId w:val="1098"/>
         </w:numPr>
       </w:pPr>
       <w:r>
@@ -29991,7 +30284,7 @@
         <w:pStyle w:val="Compact"/>
         <w:numPr>
           <w:ilvl w:val="0"/>
-          <w:numId w:val="1098"/>
+          <w:numId w:val="1099"/>
         </w:numPr>
       </w:pPr>
       <w:r>
@@ -30025,7 +30318,7 @@
         <w:pStyle w:val="Compact"/>
         <w:numPr>
           <w:ilvl w:val="0"/>
-          <w:numId w:val="1098"/>
+          <w:numId w:val="1099"/>
         </w:numPr>
       </w:pPr>
       <w:r>
@@ -30062,7 +30355,7 @@
         <w:pStyle w:val="Compact"/>
         <w:numPr>
           <w:ilvl w:val="0"/>
-          <w:numId w:val="1098"/>
+          <w:numId w:val="1099"/>
         </w:numPr>
       </w:pPr>
       <w:r>
@@ -30099,7 +30392,7 @@
         <w:pStyle w:val="Compact"/>
         <w:numPr>
           <w:ilvl w:val="1"/>
-          <w:numId w:val="1099"/>
+          <w:numId w:val="1100"/>
         </w:numPr>
       </w:pPr>
       <w:r>
@@ -30111,7 +30404,7 @@
         <w:pStyle w:val="Compact"/>
         <w:numPr>
           <w:ilvl w:val="1"/>
-          <w:numId w:val="1099"/>
+          <w:numId w:val="1100"/>
         </w:numPr>
       </w:pPr>
       <w:r>
@@ -30123,7 +30416,7 @@
         <w:pStyle w:val="Compact"/>
         <w:numPr>
           <w:ilvl w:val="1"/>
-          <w:numId w:val="1099"/>
+          <w:numId w:val="1100"/>
         </w:numPr>
       </w:pPr>
       <w:r>
@@ -30215,7 +30508,7 @@
         <w:pStyle w:val="Compact"/>
         <w:numPr>
           <w:ilvl w:val="0"/>
-          <w:numId w:val="1100"/>
+          <w:numId w:val="1101"/>
         </w:numPr>
       </w:pPr>
       <w:r>
@@ -30227,7 +30520,7 @@
         <w:pStyle w:val="Compact"/>
         <w:numPr>
           <w:ilvl w:val="0"/>
-          <w:numId w:val="1100"/>
+          <w:numId w:val="1101"/>
         </w:numPr>
       </w:pPr>
       <w:r>
@@ -30239,7 +30532,7 @@
         <w:pStyle w:val="Compact"/>
         <w:numPr>
           <w:ilvl w:val="0"/>
-          <w:numId w:val="1100"/>
+          <w:numId w:val="1101"/>
         </w:numPr>
       </w:pPr>
       <w:r>
@@ -30286,7 +30579,7 @@
         <w:pStyle w:val="Compact"/>
         <w:numPr>
           <w:ilvl w:val="0"/>
-          <w:numId w:val="1101"/>
+          <w:numId w:val="1102"/>
         </w:numPr>
       </w:pPr>
       <w:r>
@@ -30298,7 +30591,7 @@
         <w:pStyle w:val="Compact"/>
         <w:numPr>
           <w:ilvl w:val="0"/>
-          <w:numId w:val="1101"/>
+          <w:numId w:val="1102"/>
         </w:numPr>
       </w:pPr>
       <w:r>
@@ -30326,7 +30619,7 @@
         <w:pStyle w:val="Compact"/>
         <w:numPr>
           <w:ilvl w:val="0"/>
-          <w:numId w:val="1101"/>
+          <w:numId w:val="1102"/>
         </w:numPr>
       </w:pPr>
       <w:r>
@@ -31057,7 +31350,7 @@
         <w:pStyle w:val="Compact"/>
         <w:numPr>
           <w:ilvl w:val="0"/>
-          <w:numId w:val="1102"/>
+          <w:numId w:val="1103"/>
         </w:numPr>
       </w:pPr>
       <w:r>
@@ -31186,7 +31479,7 @@
         <w:pStyle w:val="Compact"/>
         <w:numPr>
           <w:ilvl w:val="0"/>
-          <w:numId w:val="1102"/>
+          <w:numId w:val="1103"/>
         </w:numPr>
       </w:pPr>
       <w:r>
@@ -33786,7 +34079,7 @@
         <w:pStyle w:val="Compact"/>
         <w:numPr>
           <w:ilvl w:val="0"/>
-          <w:numId w:val="1103"/>
+          <w:numId w:val="1104"/>
         </w:numPr>
       </w:pPr>
       <w:r>
@@ -33941,7 +34234,7 @@
         <w:pStyle w:val="Compact"/>
         <w:numPr>
           <w:ilvl w:val="0"/>
-          <w:numId w:val="1103"/>
+          <w:numId w:val="1104"/>
         </w:numPr>
       </w:pPr>
       <w:r>
@@ -36522,7 +36815,7 @@
         <w:pStyle w:val="Compact"/>
         <w:numPr>
           <w:ilvl w:val="0"/>
-          <w:numId w:val="1104"/>
+          <w:numId w:val="1105"/>
         </w:numPr>
       </w:pPr>
       <w:r>
@@ -36689,7 +36982,7 @@
         <w:pStyle w:val="Compact"/>
         <w:numPr>
           <w:ilvl w:val="0"/>
-          <w:numId w:val="1104"/>
+          <w:numId w:val="1105"/>
         </w:numPr>
       </w:pPr>
       <w:r>
@@ -36772,7 +37065,7 @@
         <w:pStyle w:val="Compact"/>
         <w:numPr>
           <w:ilvl w:val="0"/>
-          <w:numId w:val="1104"/>
+          <w:numId w:val="1105"/>
         </w:numPr>
       </w:pPr>
       <w:r>
@@ -37003,7 +37296,7 @@
         <w:pStyle w:val="Compact"/>
         <w:numPr>
           <w:ilvl w:val="0"/>
-          <w:numId w:val="1105"/>
+          <w:numId w:val="1106"/>
         </w:numPr>
       </w:pPr>
       <w:r>
@@ -37086,7 +37379,7 @@
         <w:pStyle w:val="Compact"/>
         <w:numPr>
           <w:ilvl w:val="0"/>
-          <w:numId w:val="1105"/>
+          <w:numId w:val="1106"/>
         </w:numPr>
       </w:pPr>
       <w:r>
@@ -37148,7 +37441,7 @@
         <w:pStyle w:val="Compact"/>
         <w:numPr>
           <w:ilvl w:val="0"/>
-          <w:numId w:val="1106"/>
+          <w:numId w:val="1107"/>
         </w:numPr>
       </w:pPr>
       <w:r>
@@ -37160,7 +37453,7 @@
         <w:pStyle w:val="Compact"/>
         <w:numPr>
           <w:ilvl w:val="0"/>
-          <w:numId w:val="1106"/>
+          <w:numId w:val="1107"/>
         </w:numPr>
       </w:pPr>
       <w:r>
@@ -37172,7 +37465,7 @@
         <w:pStyle w:val="Compact"/>
         <w:numPr>
           <w:ilvl w:val="0"/>
-          <w:numId w:val="1106"/>
+          <w:numId w:val="1107"/>
         </w:numPr>
       </w:pPr>
       <w:r>
@@ -37528,7 +37821,7 @@
         <w:pStyle w:val="Compact"/>
         <w:numPr>
           <w:ilvl w:val="0"/>
-          <w:numId w:val="1107"/>
+          <w:numId w:val="1108"/>
         </w:numPr>
       </w:pPr>
       <w:r>
@@ -37576,7 +37869,7 @@
         <w:pStyle w:val="Compact"/>
         <w:numPr>
           <w:ilvl w:val="0"/>
-          <w:numId w:val="1107"/>
+          <w:numId w:val="1108"/>
         </w:numPr>
       </w:pPr>
       <w:r>
@@ -37588,7 +37881,7 @@
         <w:pStyle w:val="Compact"/>
         <w:numPr>
           <w:ilvl w:val="0"/>
-          <w:numId w:val="1107"/>
+          <w:numId w:val="1108"/>
         </w:numPr>
       </w:pPr>
       <w:r>
@@ -37733,7 +38026,7 @@
         <w:pStyle w:val="Compact"/>
         <w:numPr>
           <w:ilvl w:val="0"/>
-          <w:numId w:val="1107"/>
+          <w:numId w:val="1108"/>
         </w:numPr>
       </w:pPr>
       <w:r>
@@ -38485,7 +38778,7 @@
         <w:pStyle w:val="Compact"/>
         <w:numPr>
           <w:ilvl w:val="0"/>
-          <w:numId w:val="1108"/>
+          <w:numId w:val="1109"/>
         </w:numPr>
       </w:pPr>
       <w:r>
@@ -38497,7 +38790,7 @@
         <w:pStyle w:val="Compact"/>
         <w:numPr>
           <w:ilvl w:val="0"/>
-          <w:numId w:val="1108"/>
+          <w:numId w:val="1109"/>
         </w:numPr>
       </w:pPr>
       <w:r>
@@ -38509,7 +38802,7 @@
         <w:pStyle w:val="Compact"/>
         <w:numPr>
           <w:ilvl w:val="0"/>
-          <w:numId w:val="1108"/>
+          <w:numId w:val="1109"/>
         </w:numPr>
       </w:pPr>
       <w:r>
@@ -42998,7 +43291,7 @@
         <w:pStyle w:val="Compact"/>
         <w:numPr>
           <w:ilvl w:val="0"/>
-          <w:numId w:val="1109"/>
+          <w:numId w:val="1110"/>
         </w:numPr>
       </w:pPr>
       <w:r>
@@ -43026,7 +43319,7 @@
         <w:pStyle w:val="Compact"/>
         <w:numPr>
           <w:ilvl w:val="0"/>
-          <w:numId w:val="1109"/>
+          <w:numId w:val="1110"/>
         </w:numPr>
       </w:pPr>
       <w:r>
@@ -43048,7 +43341,7 @@
         <w:pStyle w:val="Compact"/>
         <w:numPr>
           <w:ilvl w:val="1"/>
-          <w:numId w:val="1110"/>
+          <w:numId w:val="1111"/>
         </w:numPr>
       </w:pPr>
       <w:r>
@@ -43060,7 +43353,7 @@
         <w:pStyle w:val="Compact"/>
         <w:numPr>
           <w:ilvl w:val="1"/>
-          <w:numId w:val="1110"/>
+          <w:numId w:val="1111"/>
         </w:numPr>
       </w:pPr>
       <w:r>
@@ -43105,7 +43398,7 @@
         <w:pStyle w:val="Compact"/>
         <w:numPr>
           <w:ilvl w:val="0"/>
-          <w:numId w:val="1111"/>
+          <w:numId w:val="1112"/>
         </w:numPr>
       </w:pPr>
       <w:r>
@@ -43121,49 +43414,49 @@
         <w:pStyle w:val="Compact"/>
         <w:numPr>
           <w:ilvl w:val="1"/>
+          <w:numId w:val="1113"/>
+        </w:numPr>
+      </w:pPr>
+      <w:r>
+        <w:t xml:space="preserve">Running from a USB-C (Power Delivery) charger, or from any adapter below the laptop’s rating, makes the firmware</w:t>
+      </w:r>
+      <w:r>
+        <w:t xml:space="preserve"> </w:t>
+      </w:r>
+      <w:r>
+        <w:t xml:space="preserve">cap the dedicated GPU.</w:t>
+      </w:r>
+    </w:p>
+    <w:p>
+      <w:pPr>
+        <w:pStyle w:val="Compact"/>
+        <w:numPr>
+          <w:ilvl w:val="1"/>
+          <w:numId w:val="1113"/>
+        </w:numPr>
+      </w:pPr>
+      <w:r>
+        <w:t xml:space="preserve">A USB-C dock or monitor that also supplies power can do the same.</w:t>
+      </w:r>
+    </w:p>
+    <w:p>
+      <w:pPr>
+        <w:pStyle w:val="Compact"/>
+        <w:numPr>
+          <w:ilvl w:val="1"/>
+          <w:numId w:val="1113"/>
+        </w:numPr>
+      </w:pPr>
+      <w:r>
+        <w:t xml:space="preserve">This is the leading suspect.</w:t>
+      </w:r>
+    </w:p>
+    <w:p>
+      <w:pPr>
+        <w:pStyle w:val="Compact"/>
+        <w:numPr>
+          <w:ilvl w:val="0"/>
           <w:numId w:val="1112"/>
-        </w:numPr>
-      </w:pPr>
-      <w:r>
-        <w:t xml:space="preserve">Running from a USB-C (Power Delivery) charger, or from any adapter below the laptop’s rating, makes the firmware</w:t>
-      </w:r>
-      <w:r>
-        <w:t xml:space="preserve"> </w:t>
-      </w:r>
-      <w:r>
-        <w:t xml:space="preserve">cap the dedicated GPU.</w:t>
-      </w:r>
-    </w:p>
-    <w:p>
-      <w:pPr>
-        <w:pStyle w:val="Compact"/>
-        <w:numPr>
-          <w:ilvl w:val="1"/>
-          <w:numId w:val="1112"/>
-        </w:numPr>
-      </w:pPr>
-      <w:r>
-        <w:t xml:space="preserve">A USB-C dock or monitor that also supplies power can do the same.</w:t>
-      </w:r>
-    </w:p>
-    <w:p>
-      <w:pPr>
-        <w:pStyle w:val="Compact"/>
-        <w:numPr>
-          <w:ilvl w:val="1"/>
-          <w:numId w:val="1112"/>
-        </w:numPr>
-      </w:pPr>
-      <w:r>
-        <w:t xml:space="preserve">This is the leading suspect.</w:t>
-      </w:r>
-    </w:p>
-    <w:p>
-      <w:pPr>
-        <w:pStyle w:val="Compact"/>
-        <w:numPr>
-          <w:ilvl w:val="0"/>
-          <w:numId w:val="1111"/>
         </w:numPr>
       </w:pPr>
       <w:r>
@@ -43185,7 +43478,7 @@
         <w:pStyle w:val="Compact"/>
         <w:numPr>
           <w:ilvl w:val="0"/>
-          <w:numId w:val="1111"/>
+          <w:numId w:val="1112"/>
         </w:numPr>
       </w:pPr>
       <w:r>
@@ -43213,7 +43506,7 @@
         <w:pStyle w:val="Compact"/>
         <w:numPr>
           <w:ilvl w:val="0"/>
-          <w:numId w:val="1111"/>
+          <w:numId w:val="1112"/>
         </w:numPr>
       </w:pPr>
       <w:r>
@@ -43235,7 +43528,7 @@
         <w:pStyle w:val="Compact"/>
         <w:numPr>
           <w:ilvl w:val="0"/>
-          <w:numId w:val="1111"/>
+          <w:numId w:val="1112"/>
         </w:numPr>
       </w:pPr>
       <w:r>
@@ -43302,7 +43595,7 @@
         <w:pStyle w:val="Compact"/>
         <w:numPr>
           <w:ilvl w:val="0"/>
-          <w:numId w:val="1113"/>
+          <w:numId w:val="1114"/>
         </w:numPr>
       </w:pPr>
       <w:r>
@@ -43348,7 +43641,7 @@
         <w:pStyle w:val="Compact"/>
         <w:numPr>
           <w:ilvl w:val="1"/>
-          <w:numId w:val="1114"/>
+          <w:numId w:val="1115"/>
         </w:numPr>
       </w:pPr>
       <w:r>
@@ -43376,7 +43669,7 @@
         <w:pStyle w:val="Compact"/>
         <w:numPr>
           <w:ilvl w:val="1"/>
-          <w:numId w:val="1114"/>
+          <w:numId w:val="1115"/>
         </w:numPr>
       </w:pPr>
       <w:r>
@@ -43398,7 +43691,7 @@
         <w:pStyle w:val="Compact"/>
         <w:numPr>
           <w:ilvl w:val="0"/>
-          <w:numId w:val="1113"/>
+          <w:numId w:val="1114"/>
         </w:numPr>
       </w:pPr>
       <w:r>
@@ -43426,7 +43719,7 @@
         <w:pStyle w:val="Compact"/>
         <w:numPr>
           <w:ilvl w:val="0"/>
-          <w:numId w:val="1113"/>
+          <w:numId w:val="1114"/>
         </w:numPr>
       </w:pPr>
       <w:r>
@@ -43442,7 +43735,7 @@
         <w:pStyle w:val="Compact"/>
         <w:numPr>
           <w:ilvl w:val="1"/>
-          <w:numId w:val="1115"/>
+          <w:numId w:val="1116"/>
         </w:numPr>
       </w:pPr>
       <w:r>
@@ -43454,7 +43747,7 @@
         <w:pStyle w:val="Compact"/>
         <w:numPr>
           <w:ilvl w:val="1"/>
-          <w:numId w:val="1115"/>
+          <w:numId w:val="1116"/>
         </w:numPr>
       </w:pPr>
       <w:r>
@@ -43466,7 +43759,7 @@
         <w:pStyle w:val="Compact"/>
         <w:numPr>
           <w:ilvl w:val="1"/>
-          <w:numId w:val="1115"/>
+          <w:numId w:val="1116"/>
         </w:numPr>
       </w:pPr>
       <w:r>
@@ -43478,7 +43771,7 @@
         <w:pStyle w:val="Compact"/>
         <w:numPr>
           <w:ilvl w:val="1"/>
-          <w:numId w:val="1115"/>
+          <w:numId w:val="1116"/>
         </w:numPr>
       </w:pPr>
       <w:r>
@@ -43514,7 +43807,7 @@
         <w:pStyle w:val="Compact"/>
         <w:numPr>
           <w:ilvl w:val="0"/>
-          <w:numId w:val="1113"/>
+          <w:numId w:val="1114"/>
         </w:numPr>
       </w:pPr>
       <w:r>
@@ -43530,7 +43823,7 @@
         <w:pStyle w:val="Compact"/>
         <w:numPr>
           <w:ilvl w:val="1"/>
-          <w:numId w:val="1116"/>
+          <w:numId w:val="1117"/>
         </w:numPr>
       </w:pPr>
       <w:r>
@@ -43542,7 +43835,7 @@
         <w:pStyle w:val="Compact"/>
         <w:numPr>
           <w:ilvl w:val="1"/>
-          <w:numId w:val="1116"/>
+          <w:numId w:val="1117"/>
         </w:numPr>
       </w:pPr>
       <w:r>
@@ -43563,7 +43856,7 @@
         <w:pStyle w:val="Compact"/>
         <w:numPr>
           <w:ilvl w:val="0"/>
-          <w:numId w:val="1113"/>
+          <w:numId w:val="1114"/>
         </w:numPr>
       </w:pPr>
       <w:r>
@@ -43585,7 +43878,7 @@
         <w:pStyle w:val="Compact"/>
         <w:numPr>
           <w:ilvl w:val="1"/>
-          <w:numId w:val="1117"/>
+          <w:numId w:val="1118"/>
         </w:numPr>
       </w:pPr>
       <w:r>
@@ -43597,7 +43890,7 @@
         <w:pStyle w:val="Compact"/>
         <w:numPr>
           <w:ilvl w:val="1"/>
-          <w:numId w:val="1117"/>
+          <w:numId w:val="1118"/>
         </w:numPr>
       </w:pPr>
       <w:r>
@@ -43609,7 +43902,7 @@
         <w:pStyle w:val="Compact"/>
         <w:numPr>
           <w:ilvl w:val="1"/>
-          <w:numId w:val="1117"/>
+          <w:numId w:val="1118"/>
         </w:numPr>
       </w:pPr>
       <w:r>
@@ -43621,7 +43914,7 @@
         <w:pStyle w:val="Compact"/>
         <w:numPr>
           <w:ilvl w:val="1"/>
-          <w:numId w:val="1117"/>
+          <w:numId w:val="1118"/>
         </w:numPr>
       </w:pPr>
       <w:r>
@@ -43657,7 +43950,7 @@
         <w:pStyle w:val="Compact"/>
         <w:numPr>
           <w:ilvl w:val="0"/>
-          <w:numId w:val="1113"/>
+          <w:numId w:val="1114"/>
         </w:numPr>
       </w:pPr>
       <w:r>
@@ -43709,7 +44002,7 @@
         <w:pStyle w:val="Compact"/>
         <w:numPr>
           <w:ilvl w:val="0"/>
-          <w:numId w:val="1113"/>
+          <w:numId w:val="1114"/>
         </w:numPr>
       </w:pPr>
       <w:r>
@@ -43731,7 +44024,7 @@
         <w:pStyle w:val="Compact"/>
         <w:numPr>
           <w:ilvl w:val="0"/>
-          <w:numId w:val="1113"/>
+          <w:numId w:val="1114"/>
         </w:numPr>
       </w:pPr>
       <w:r>
@@ -44451,7 +44744,7 @@
         <w:pStyle w:val="Compact"/>
         <w:numPr>
           <w:ilvl w:val="0"/>
-          <w:numId w:val="1118"/>
+          <w:numId w:val="1119"/>
         </w:numPr>
       </w:pPr>
       <w:r>
@@ -44486,7 +44779,7 @@
         <w:pStyle w:val="Compact"/>
         <w:numPr>
           <w:ilvl w:val="0"/>
-          <w:numId w:val="1118"/>
+          <w:numId w:val="1119"/>
         </w:numPr>
       </w:pPr>
       <w:r>
@@ -44521,7 +44814,7 @@
         <w:pStyle w:val="Compact"/>
         <w:numPr>
           <w:ilvl w:val="0"/>
-          <w:numId w:val="1118"/>
+          <w:numId w:val="1119"/>
         </w:numPr>
       </w:pPr>
       <w:r>
@@ -44545,7 +44838,7 @@
         <w:pStyle w:val="Compact"/>
         <w:numPr>
           <w:ilvl w:val="0"/>
-          <w:numId w:val="1119"/>
+          <w:numId w:val="1120"/>
         </w:numPr>
       </w:pPr>
       <w:r>
@@ -44567,7 +44860,7 @@
         <w:pStyle w:val="Compact"/>
         <w:numPr>
           <w:ilvl w:val="0"/>
-          <w:numId w:val="1119"/>
+          <w:numId w:val="1120"/>
         </w:numPr>
       </w:pPr>
       <w:r>
@@ -44666,7 +44959,7 @@
         <w:pStyle w:val="Compact"/>
         <w:numPr>
           <w:ilvl w:val="0"/>
-          <w:numId w:val="1119"/>
+          <w:numId w:val="1120"/>
         </w:numPr>
       </w:pPr>
       <w:r>
@@ -44765,7 +45058,7 @@
         <w:pStyle w:val="Compact"/>
         <w:numPr>
           <w:ilvl w:val="0"/>
-          <w:numId w:val="1119"/>
+          <w:numId w:val="1120"/>
         </w:numPr>
       </w:pPr>
       <w:r>
@@ -44948,7 +45241,7 @@
         <w:pStyle w:val="Compact"/>
         <w:numPr>
           <w:ilvl w:val="0"/>
-          <w:numId w:val="1120"/>
+          <w:numId w:val="1121"/>
         </w:numPr>
       </w:pPr>
       <w:r>
@@ -44960,7 +45253,7 @@
         <w:pStyle w:val="Compact"/>
         <w:numPr>
           <w:ilvl w:val="0"/>
-          <w:numId w:val="1120"/>
+          <w:numId w:val="1121"/>
         </w:numPr>
       </w:pPr>
       <w:r>
@@ -45002,7 +45295,7 @@
         <w:pStyle w:val="Compact"/>
         <w:numPr>
           <w:ilvl w:val="0"/>
-          <w:numId w:val="1120"/>
+          <w:numId w:val="1121"/>
         </w:numPr>
       </w:pPr>
       <w:r>
@@ -45014,7 +45307,7 @@
         <w:pStyle w:val="Compact"/>
         <w:numPr>
           <w:ilvl w:val="0"/>
-          <w:numId w:val="1120"/>
+          <w:numId w:val="1121"/>
         </w:numPr>
       </w:pPr>
       <w:r>
@@ -45038,7 +45331,7 @@
         <w:pStyle w:val="Compact"/>
         <w:numPr>
           <w:ilvl w:val="0"/>
-          <w:numId w:val="1120"/>
+          <w:numId w:val="1121"/>
         </w:numPr>
       </w:pPr>
       <w:r>
@@ -45050,7 +45343,7 @@
         <w:pStyle w:val="Compact"/>
         <w:numPr>
           <w:ilvl w:val="0"/>
-          <w:numId w:val="1120"/>
+          <w:numId w:val="1121"/>
         </w:numPr>
       </w:pPr>
       <w:r>
@@ -45505,7 +45798,7 @@
         <w:pStyle w:val="Compact"/>
         <w:numPr>
           <w:ilvl w:val="0"/>
-          <w:numId w:val="1121"/>
+          <w:numId w:val="1122"/>
         </w:numPr>
       </w:pPr>
       <w:r>
@@ -45527,7 +45820,7 @@
         <w:pStyle w:val="Compact"/>
         <w:numPr>
           <w:ilvl w:val="0"/>
-          <w:numId w:val="1121"/>
+          <w:numId w:val="1122"/>
         </w:numPr>
       </w:pPr>
       <w:r>
@@ -45555,7 +45848,7 @@
         <w:pStyle w:val="Compact"/>
         <w:numPr>
           <w:ilvl w:val="0"/>
-          <w:numId w:val="1121"/>
+          <w:numId w:val="1122"/>
         </w:numPr>
       </w:pPr>
       <w:r>
@@ -45583,7 +45876,7 @@
         <w:pStyle w:val="Compact"/>
         <w:numPr>
           <w:ilvl w:val="0"/>
-          <w:numId w:val="1121"/>
+          <w:numId w:val="1122"/>
         </w:numPr>
       </w:pPr>
       <w:r>
@@ -45623,7 +45916,7 @@
         <w:pStyle w:val="Compact"/>
         <w:numPr>
           <w:ilvl w:val="0"/>
-          <w:numId w:val="1122"/>
+          <w:numId w:val="1123"/>
         </w:numPr>
       </w:pPr>
       <w:r>
@@ -45635,7 +45928,7 @@
         <w:pStyle w:val="Compact"/>
         <w:numPr>
           <w:ilvl w:val="0"/>
-          <w:numId w:val="1122"/>
+          <w:numId w:val="1123"/>
         </w:numPr>
       </w:pPr>
       <w:r>
@@ -45653,7 +45946,7 @@
         <w:pStyle w:val="Compact"/>
         <w:numPr>
           <w:ilvl w:val="0"/>
-          <w:numId w:val="1122"/>
+          <w:numId w:val="1123"/>
         </w:numPr>
       </w:pPr>
       <w:r>
@@ -45711,7 +46004,7 @@
         <w:pStyle w:val="Compact"/>
         <w:numPr>
           <w:ilvl w:val="0"/>
-          <w:numId w:val="1123"/>
+          <w:numId w:val="1124"/>
         </w:numPr>
       </w:pPr>
       <w:r>
@@ -45739,7 +46032,7 @@
         <w:pStyle w:val="Compact"/>
         <w:numPr>
           <w:ilvl w:val="0"/>
-          <w:numId w:val="1123"/>
+          <w:numId w:val="1124"/>
         </w:numPr>
       </w:pPr>
       <w:r>
@@ -45767,43 +46060,43 @@
         <w:pStyle w:val="Compact"/>
         <w:numPr>
           <w:ilvl w:val="1"/>
+          <w:numId w:val="1125"/>
+        </w:numPr>
+      </w:pPr>
+      <w:r>
+        <w:t xml:space="preserve">use the open model’s tokenizer instead of yours;</w:t>
+      </w:r>
+    </w:p>
+    <w:p>
+      <w:pPr>
+        <w:pStyle w:val="Compact"/>
+        <w:numPr>
+          <w:ilvl w:val="1"/>
+          <w:numId w:val="1125"/>
+        </w:numPr>
+      </w:pPr>
+      <w:r>
+        <w:t xml:space="preserve">match its RoPE settings (for example base 500,000 with scaling);</w:t>
+      </w:r>
+    </w:p>
+    <w:p>
+      <w:pPr>
+        <w:pStyle w:val="Compact"/>
+        <w:numPr>
+          <w:ilvl w:val="1"/>
+          <w:numId w:val="1125"/>
+        </w:numPr>
+      </w:pPr>
+      <w:r>
+        <w:t xml:space="preserve">handle details such as Qwen’s attention biases.</w:t>
+      </w:r>
+    </w:p>
+    <w:p>
+      <w:pPr>
+        <w:pStyle w:val="Compact"/>
+        <w:numPr>
+          <w:ilvl w:val="0"/>
           <w:numId w:val="1124"/>
-        </w:numPr>
-      </w:pPr>
-      <w:r>
-        <w:t xml:space="preserve">use the open model’s tokenizer instead of yours;</w:t>
-      </w:r>
-    </w:p>
-    <w:p>
-      <w:pPr>
-        <w:pStyle w:val="Compact"/>
-        <w:numPr>
-          <w:ilvl w:val="1"/>
-          <w:numId w:val="1124"/>
-        </w:numPr>
-      </w:pPr>
-      <w:r>
-        <w:t xml:space="preserve">match its RoPE settings (for example base 500,000 with scaling);</w:t>
-      </w:r>
-    </w:p>
-    <w:p>
-      <w:pPr>
-        <w:pStyle w:val="Compact"/>
-        <w:numPr>
-          <w:ilvl w:val="1"/>
-          <w:numId w:val="1124"/>
-        </w:numPr>
-      </w:pPr>
-      <w:r>
-        <w:t xml:space="preserve">handle details such as Qwen’s attention biases.</w:t>
-      </w:r>
-    </w:p>
-    <w:p>
-      <w:pPr>
-        <w:pStyle w:val="Compact"/>
-        <w:numPr>
-          <w:ilvl w:val="0"/>
-          <w:numId w:val="1123"/>
         </w:numPr>
       </w:pPr>
       <w:r>
@@ -45846,7 +46139,7 @@
         <w:pStyle w:val="Compact"/>
         <w:numPr>
           <w:ilvl w:val="0"/>
-          <w:numId w:val="1123"/>
+          <w:numId w:val="1124"/>
         </w:numPr>
       </w:pPr>
       <w:r>
@@ -45868,7 +46161,7 @@
         <w:pStyle w:val="Compact"/>
         <w:numPr>
           <w:ilvl w:val="1"/>
-          <w:numId w:val="1125"/>
+          <w:numId w:val="1126"/>
         </w:numPr>
       </w:pPr>
       <w:r>
@@ -45880,7 +46173,7 @@
         <w:pStyle w:val="Compact"/>
         <w:numPr>
           <w:ilvl w:val="1"/>
-          <w:numId w:val="1125"/>
+          <w:numId w:val="1126"/>
         </w:numPr>
       </w:pPr>
       <w:r>
@@ -45892,7 +46185,7 @@
         <w:pStyle w:val="Compact"/>
         <w:numPr>
           <w:ilvl w:val="1"/>
-          <w:numId w:val="1125"/>
+          <w:numId w:val="1126"/>
         </w:numPr>
       </w:pPr>
       <w:r>
@@ -45904,7 +46197,7 @@
         <w:pStyle w:val="Compact"/>
         <w:numPr>
           <w:ilvl w:val="1"/>
-          <w:numId w:val="1125"/>
+          <w:numId w:val="1126"/>
         </w:numPr>
       </w:pPr>
       <w:r>
@@ -45916,7 +46209,7 @@
         <w:pStyle w:val="Compact"/>
         <w:numPr>
           <w:ilvl w:val="0"/>
-          <w:numId w:val="1123"/>
+          <w:numId w:val="1124"/>
         </w:numPr>
       </w:pPr>
       <w:r>
@@ -45932,7 +46225,7 @@
         <w:pStyle w:val="Compact"/>
         <w:numPr>
           <w:ilvl w:val="1"/>
-          <w:numId w:val="1126"/>
+          <w:numId w:val="1127"/>
         </w:numPr>
       </w:pPr>
       <w:r>
@@ -45944,7 +46237,7 @@
         <w:pStyle w:val="Compact"/>
         <w:numPr>
           <w:ilvl w:val="1"/>
-          <w:numId w:val="1126"/>
+          <w:numId w:val="1127"/>
         </w:numPr>
       </w:pPr>
       <w:r>
@@ -45956,7 +46249,7 @@
         <w:pStyle w:val="Compact"/>
         <w:numPr>
           <w:ilvl w:val="0"/>
-          <w:numId w:val="1123"/>
+          <w:numId w:val="1124"/>
         </w:numPr>
       </w:pPr>
       <w:r>
@@ -46079,7 +46372,7 @@
         <w:pStyle w:val="Compact"/>
         <w:numPr>
           <w:ilvl w:val="0"/>
-          <w:numId w:val="1127"/>
+          <w:numId w:val="1128"/>
         </w:numPr>
       </w:pPr>
       <w:r>
@@ -46107,7 +46400,7 @@
         <w:pStyle w:val="Compact"/>
         <w:numPr>
           <w:ilvl w:val="0"/>
-          <w:numId w:val="1127"/>
+          <w:numId w:val="1128"/>
         </w:numPr>
       </w:pPr>
       <w:r>
@@ -46129,7 +46422,7 @@
         <w:pStyle w:val="Compact"/>
         <w:numPr>
           <w:ilvl w:val="0"/>
-          <w:numId w:val="1127"/>
+          <w:numId w:val="1128"/>
         </w:numPr>
       </w:pPr>
       <w:r>
@@ -46151,7 +46444,7 @@
         <w:pStyle w:val="Compact"/>
         <w:numPr>
           <w:ilvl w:val="0"/>
-          <w:numId w:val="1127"/>
+          <w:numId w:val="1128"/>
         </w:numPr>
       </w:pPr>
       <w:r>
@@ -46482,7 +46775,7 @@
         <w:pStyle w:val="Compact"/>
         <w:numPr>
           <w:ilvl w:val="0"/>
-          <w:numId w:val="1128"/>
+          <w:numId w:val="1129"/>
         </w:numPr>
       </w:pPr>
       <w:r>
@@ -46494,7 +46787,7 @@
         <w:pStyle w:val="Compact"/>
         <w:numPr>
           <w:ilvl w:val="0"/>
-          <w:numId w:val="1128"/>
+          <w:numId w:val="1129"/>
         </w:numPr>
       </w:pPr>
       <w:r>
@@ -46532,7 +46825,7 @@
         <w:pStyle w:val="Compact"/>
         <w:numPr>
           <w:ilvl w:val="0"/>
-          <w:numId w:val="1128"/>
+          <w:numId w:val="1129"/>
         </w:numPr>
       </w:pPr>
       <w:r>
@@ -47862,7 +48155,7 @@
         <w:pStyle w:val="Compact"/>
         <w:numPr>
           <w:ilvl w:val="0"/>
-          <w:numId w:val="1129"/>
+          <w:numId w:val="1130"/>
         </w:numPr>
       </w:pPr>
       <w:r>
@@ -47907,7 +48200,7 @@
         <w:pStyle w:val="Compact"/>
         <w:numPr>
           <w:ilvl w:val="0"/>
-          <w:numId w:val="1129"/>
+          <w:numId w:val="1130"/>
         </w:numPr>
       </w:pPr>
       <w:r>
@@ -47931,7 +48224,7 @@
         <w:pStyle w:val="Compact"/>
         <w:numPr>
           <w:ilvl w:val="0"/>
-          <w:numId w:val="1129"/>
+          <w:numId w:val="1130"/>
         </w:numPr>
       </w:pPr>
       <w:r>
@@ -47989,7 +48282,7 @@
         <w:pStyle w:val="Compact"/>
         <w:numPr>
           <w:ilvl w:val="0"/>
-          <w:numId w:val="1130"/>
+          <w:numId w:val="1131"/>
         </w:numPr>
       </w:pPr>
       <w:r>
@@ -48001,7 +48294,7 @@
         <w:pStyle w:val="Compact"/>
         <w:numPr>
           <w:ilvl w:val="0"/>
-          <w:numId w:val="1130"/>
+          <w:numId w:val="1131"/>
         </w:numPr>
       </w:pPr>
       <w:r>
@@ -48032,131 +48325,11 @@
         <w:pStyle w:val="Compact"/>
         <w:numPr>
           <w:ilvl w:val="1"/>
-          <w:numId w:val="1131"/>
+          <w:numId w:val="1132"/>
         </w:numPr>
       </w:pPr>
       <w:r>
         <w:t xml:space="preserve">40 proofreading tasks;</w:t>
-      </w:r>
-    </w:p>
-    <w:p>
-      <w:pPr>
-        <w:pStyle w:val="Compact"/>
-        <w:numPr>
-          <w:ilvl w:val="1"/>
-          <w:numId w:val="1131"/>
-        </w:numPr>
-      </w:pPr>
-      <w:r>
-        <w:t xml:space="preserve">20 drafting tasks;</w:t>
-      </w:r>
-    </w:p>
-    <w:p>
-      <w:pPr>
-        <w:pStyle w:val="Compact"/>
-        <w:numPr>
-          <w:ilvl w:val="1"/>
-          <w:numId w:val="1131"/>
-        </w:numPr>
-      </w:pPr>
-      <w:r>
-        <w:t xml:space="preserve">30 analysis tasks with known answers;</w:t>
-      </w:r>
-    </w:p>
-    <w:p>
-      <w:pPr>
-        <w:pStyle w:val="Compact"/>
-        <w:numPr>
-          <w:ilvl w:val="1"/>
-          <w:numId w:val="1131"/>
-        </w:numPr>
-      </w:pPr>
-      <w:r>
-        <w:t xml:space="preserve">20 knowledge questions with citations;</w:t>
-      </w:r>
-    </w:p>
-    <w:p>
-      <w:pPr>
-        <w:pStyle w:val="Compact"/>
-        <w:numPr>
-          <w:ilvl w:val="1"/>
-          <w:numId w:val="1131"/>
-        </w:numPr>
-      </w:pPr>
-      <w:r>
-        <w:t xml:space="preserve">10</w:t>
-      </w:r>
-      <w:r>
-        <w:t xml:space="preserve"> </w:t>
-      </w:r>
-      <w:r>
-        <w:t xml:space="preserve">“trap”</w:t>
-      </w:r>
-      <w:r>
-        <w:t xml:space="preserve"> </w:t>
-      </w:r>
-      <w:r>
-        <w:t xml:space="preserve">paragraphs hiding a statistical error.</w:t>
-      </w:r>
-    </w:p>
-    <w:p>
-      <w:pPr>
-        <w:pStyle w:val="Compact"/>
-        <w:numPr>
-          <w:ilvl w:val="0"/>
-          <w:numId w:val="1130"/>
-        </w:numPr>
-      </w:pPr>
-      <w:r>
-        <w:t xml:space="preserve">Shortlist base models: run the evaluation set on 3–5 open models through OpenRouter, for a few pounds. Don’t send</w:t>
-      </w:r>
-      <w:r>
-        <w:t xml:space="preserve"> </w:t>
-      </w:r>
-      <w:r>
-        <w:t xml:space="preserve">private data.</w:t>
-      </w:r>
-    </w:p>
-    <w:p>
-      <w:pPr>
-        <w:pStyle w:val="Compact"/>
-        <w:numPr>
-          <w:ilvl w:val="0"/>
-          <w:numId w:val="1130"/>
-        </w:numPr>
-      </w:pPr>
-      <w:r>
-        <w:t xml:space="preserve">Collect papers legally: open access first, then the text-and-data-mining routes for paywalled journals.</w:t>
-      </w:r>
-    </w:p>
-    <w:p>
-      <w:pPr>
-        <w:pStyle w:val="Compact"/>
-        <w:numPr>
-          <w:ilvl w:val="0"/>
-          <w:numId w:val="1130"/>
-        </w:numPr>
-      </w:pPr>
-      <w:r>
-        <w:t xml:space="preserve">Convert them to clean text. Publisher XML (JATS) is cleanest. Remove references and page furniture, and</w:t>
-      </w:r>
-      <w:r>
-        <w:t xml:space="preserve"> </w:t>
-      </w:r>
-      <w:r>
-        <w:t xml:space="preserve">deduplicate.</w:t>
-      </w:r>
-    </w:p>
-    <w:p>
-      <w:pPr>
-        <w:pStyle w:val="Compact"/>
-        <w:numPr>
-          <w:ilvl w:val="0"/>
-          <w:numId w:val="1130"/>
-        </w:numPr>
-      </w:pPr>
-      <w:r>
-        <w:t xml:space="preserve">Build three training sets:</w:t>
       </w:r>
     </w:p>
     <w:p>
@@ -48168,6 +48341,126 @@
         </w:numPr>
       </w:pPr>
       <w:r>
+        <w:t xml:space="preserve">20 drafting tasks;</w:t>
+      </w:r>
+    </w:p>
+    <w:p>
+      <w:pPr>
+        <w:pStyle w:val="Compact"/>
+        <w:numPr>
+          <w:ilvl w:val="1"/>
+          <w:numId w:val="1132"/>
+        </w:numPr>
+      </w:pPr>
+      <w:r>
+        <w:t xml:space="preserve">30 analysis tasks with known answers;</w:t>
+      </w:r>
+    </w:p>
+    <w:p>
+      <w:pPr>
+        <w:pStyle w:val="Compact"/>
+        <w:numPr>
+          <w:ilvl w:val="1"/>
+          <w:numId w:val="1132"/>
+        </w:numPr>
+      </w:pPr>
+      <w:r>
+        <w:t xml:space="preserve">20 knowledge questions with citations;</w:t>
+      </w:r>
+    </w:p>
+    <w:p>
+      <w:pPr>
+        <w:pStyle w:val="Compact"/>
+        <w:numPr>
+          <w:ilvl w:val="1"/>
+          <w:numId w:val="1132"/>
+        </w:numPr>
+      </w:pPr>
+      <w:r>
+        <w:t xml:space="preserve">10</w:t>
+      </w:r>
+      <w:r>
+        <w:t xml:space="preserve"> </w:t>
+      </w:r>
+      <w:r>
+        <w:t xml:space="preserve">“trap”</w:t>
+      </w:r>
+      <w:r>
+        <w:t xml:space="preserve"> </w:t>
+      </w:r>
+      <w:r>
+        <w:t xml:space="preserve">paragraphs hiding a statistical error.</w:t>
+      </w:r>
+    </w:p>
+    <w:p>
+      <w:pPr>
+        <w:pStyle w:val="Compact"/>
+        <w:numPr>
+          <w:ilvl w:val="0"/>
+          <w:numId w:val="1131"/>
+        </w:numPr>
+      </w:pPr>
+      <w:r>
+        <w:t xml:space="preserve">Shortlist base models: run the evaluation set on 3–5 open models through OpenRouter, for a few pounds. Don’t send</w:t>
+      </w:r>
+      <w:r>
+        <w:t xml:space="preserve"> </w:t>
+      </w:r>
+      <w:r>
+        <w:t xml:space="preserve">private data.</w:t>
+      </w:r>
+    </w:p>
+    <w:p>
+      <w:pPr>
+        <w:pStyle w:val="Compact"/>
+        <w:numPr>
+          <w:ilvl w:val="0"/>
+          <w:numId w:val="1131"/>
+        </w:numPr>
+      </w:pPr>
+      <w:r>
+        <w:t xml:space="preserve">Collect papers legally: open access first, then the text-and-data-mining routes for paywalled journals.</w:t>
+      </w:r>
+    </w:p>
+    <w:p>
+      <w:pPr>
+        <w:pStyle w:val="Compact"/>
+        <w:numPr>
+          <w:ilvl w:val="0"/>
+          <w:numId w:val="1131"/>
+        </w:numPr>
+      </w:pPr>
+      <w:r>
+        <w:t xml:space="preserve">Convert them to clean text. Publisher XML (JATS) is cleanest. Remove references and page furniture, and</w:t>
+      </w:r>
+      <w:r>
+        <w:t xml:space="preserve"> </w:t>
+      </w:r>
+      <w:r>
+        <w:t xml:space="preserve">deduplicate.</w:t>
+      </w:r>
+    </w:p>
+    <w:p>
+      <w:pPr>
+        <w:pStyle w:val="Compact"/>
+        <w:numPr>
+          <w:ilvl w:val="0"/>
+          <w:numId w:val="1131"/>
+        </w:numPr>
+      </w:pPr>
+      <w:r>
+        <w:t xml:space="preserve">Build three training sets:</w:t>
+      </w:r>
+    </w:p>
+    <w:p>
+      <w:pPr>
+        <w:pStyle w:val="Compact"/>
+        <w:numPr>
+          <w:ilvl w:val="1"/>
+          <w:numId w:val="1133"/>
+        </w:numPr>
+      </w:pPr>
+      <w:r>
         <w:rPr>
           <w:b/>
           <w:bCs/>
@@ -48186,7 +48479,7 @@
         <w:pStyle w:val="Compact"/>
         <w:numPr>
           <w:ilvl w:val="1"/>
-          <w:numId w:val="1132"/>
+          <w:numId w:val="1133"/>
         </w:numPr>
       </w:pPr>
       <w:r>
@@ -48221,7 +48514,7 @@
         <w:pStyle w:val="Compact"/>
         <w:numPr>
           <w:ilvl w:val="1"/>
-          <w:numId w:val="1132"/>
+          <w:numId w:val="1133"/>
         </w:numPr>
       </w:pPr>
       <w:r>
@@ -48267,7 +48560,7 @@
         <w:pStyle w:val="Compact"/>
         <w:numPr>
           <w:ilvl w:val="0"/>
-          <w:numId w:val="1133"/>
+          <w:numId w:val="1134"/>
         </w:numPr>
       </w:pPr>
       <w:r>
@@ -48279,7 +48572,7 @@
         <w:pStyle w:val="Compact"/>
         <w:numPr>
           <w:ilvl w:val="0"/>
-          <w:numId w:val="1133"/>
+          <w:numId w:val="1134"/>
         </w:numPr>
       </w:pPr>
       <w:r>
@@ -48291,7 +48584,7 @@
         <w:pStyle w:val="Compact"/>
         <w:numPr>
           <w:ilvl w:val="0"/>
-          <w:numId w:val="1133"/>
+          <w:numId w:val="1134"/>
         </w:numPr>
       </w:pPr>
       <w:r>
@@ -48303,7 +48596,7 @@
         <w:pStyle w:val="Compact"/>
         <w:numPr>
           <w:ilvl w:val="0"/>
-          <w:numId w:val="1133"/>
+          <w:numId w:val="1134"/>
         </w:numPr>
       </w:pPr>
       <w:r>
@@ -48315,7 +48608,7 @@
         <w:pStyle w:val="Compact"/>
         <w:numPr>
           <w:ilvl w:val="0"/>
-          <w:numId w:val="1133"/>
+          <w:numId w:val="1134"/>
         </w:numPr>
       </w:pPr>
       <w:r>
@@ -48339,7 +48632,7 @@
         <w:pStyle w:val="Compact"/>
         <w:numPr>
           <w:ilvl w:val="0"/>
-          <w:numId w:val="1134"/>
+          <w:numId w:val="1135"/>
         </w:numPr>
       </w:pPr>
       <w:r>
@@ -48351,7 +48644,7 @@
         <w:pStyle w:val="Compact"/>
         <w:numPr>
           <w:ilvl w:val="0"/>
-          <w:numId w:val="1134"/>
+          <w:numId w:val="1135"/>
         </w:numPr>
       </w:pPr>
       <w:r>
@@ -48363,7 +48656,7 @@
         <w:pStyle w:val="Compact"/>
         <w:numPr>
           <w:ilvl w:val="0"/>
-          <w:numId w:val="1134"/>
+          <w:numId w:val="1135"/>
         </w:numPr>
       </w:pPr>
       <w:r>
@@ -48386,7 +48679,7 @@
       <w:pPr>
         <w:numPr>
           <w:ilvl w:val="0"/>
-          <w:numId w:val="1135"/>
+          <w:numId w:val="1136"/>
         </w:numPr>
       </w:pPr>
       <w:r>
@@ -48448,7 +48741,7 @@
       <w:pPr>
         <w:numPr>
           <w:ilvl w:val="0"/>
-          <w:numId w:val="1135"/>
+          <w:numId w:val="1136"/>
         </w:numPr>
       </w:pPr>
       <w:r>
@@ -48459,7 +48752,7 @@
       <w:pPr>
         <w:numPr>
           <w:ilvl w:val="0"/>
-          <w:numId w:val="1135"/>
+          <w:numId w:val="1136"/>
         </w:numPr>
       </w:pPr>
       <w:r>
@@ -48470,7 +48763,7 @@
       <w:pPr>
         <w:numPr>
           <w:ilvl w:val="0"/>
-          <w:numId w:val="1135"/>
+          <w:numId w:val="1136"/>
         </w:numPr>
       </w:pPr>
       <w:r>
@@ -48481,7 +48774,7 @@
       <w:pPr>
         <w:numPr>
           <w:ilvl w:val="0"/>
-          <w:numId w:val="1135"/>
+          <w:numId w:val="1136"/>
         </w:numPr>
       </w:pPr>
       <w:r>
@@ -48505,7 +48798,7 @@
         <w:pStyle w:val="Compact"/>
         <w:numPr>
           <w:ilvl w:val="0"/>
-          <w:numId w:val="1136"/>
+          <w:numId w:val="1137"/>
         </w:numPr>
       </w:pPr>
       <w:r>
@@ -48517,7 +48810,7 @@
         <w:pStyle w:val="Compact"/>
         <w:numPr>
           <w:ilvl w:val="0"/>
-          <w:numId w:val="1136"/>
+          <w:numId w:val="1137"/>
         </w:numPr>
       </w:pPr>
       <w:r>
@@ -48529,7 +48822,7 @@
         <w:pStyle w:val="Compact"/>
         <w:numPr>
           <w:ilvl w:val="0"/>
-          <w:numId w:val="1136"/>
+          <w:numId w:val="1137"/>
         </w:numPr>
       </w:pPr>
       <w:r>
@@ -48541,7 +48834,7 @@
         <w:pStyle w:val="Compact"/>
         <w:numPr>
           <w:ilvl w:val="0"/>
-          <w:numId w:val="1136"/>
+          <w:numId w:val="1137"/>
         </w:numPr>
       </w:pPr>
       <w:r>
@@ -48572,7 +48865,7 @@
         <w:pStyle w:val="Compact"/>
         <w:numPr>
           <w:ilvl w:val="0"/>
-          <w:numId w:val="1137"/>
+          <w:numId w:val="1138"/>
         </w:numPr>
       </w:pPr>
       <w:r>
@@ -48588,37 +48881,37 @@
         <w:pStyle w:val="Compact"/>
         <w:numPr>
           <w:ilvl w:val="1"/>
+          <w:numId w:val="1139"/>
+        </w:numPr>
+      </w:pPr>
+      <w:r>
+        <w:t xml:space="preserve">Open-weight models (Apache 2.0 or MIT for Qwen, DeepSeek, GLM and gpt-oss; check each licence) can be kept and</w:t>
+      </w:r>
+      <w:r>
+        <w:t xml:space="preserve"> </w:t>
+      </w:r>
+      <w:r>
+        <w:t xml:space="preserve">modified.</w:t>
+      </w:r>
+    </w:p>
+    <w:p>
+      <w:pPr>
+        <w:pStyle w:val="Compact"/>
+        <w:numPr>
+          <w:ilvl w:val="1"/>
+          <w:numId w:val="1139"/>
+        </w:numPr>
+      </w:pPr>
+      <w:r>
+        <w:t xml:space="preserve">Your adapter is a file you download. Once you delete the cloud storage, the provider keeps nothing.</w:t>
+      </w:r>
+    </w:p>
+    <w:p>
+      <w:pPr>
+        <w:pStyle w:val="Compact"/>
+        <w:numPr>
+          <w:ilvl w:val="0"/>
           <w:numId w:val="1138"/>
-        </w:numPr>
-      </w:pPr>
-      <w:r>
-        <w:t xml:space="preserve">Open-weight models (Apache 2.0 or MIT for Qwen, DeepSeek, GLM and gpt-oss; check each licence) can be kept and</w:t>
-      </w:r>
-      <w:r>
-        <w:t xml:space="preserve"> </w:t>
-      </w:r>
-      <w:r>
-        <w:t xml:space="preserve">modified.</w:t>
-      </w:r>
-    </w:p>
-    <w:p>
-      <w:pPr>
-        <w:pStyle w:val="Compact"/>
-        <w:numPr>
-          <w:ilvl w:val="1"/>
-          <w:numId w:val="1138"/>
-        </w:numPr>
-      </w:pPr>
-      <w:r>
-        <w:t xml:space="preserve">Your adapter is a file you download. Once you delete the cloud storage, the provider keeps nothing.</w:t>
-      </w:r>
-    </w:p>
-    <w:p>
-      <w:pPr>
-        <w:pStyle w:val="Compact"/>
-        <w:numPr>
-          <w:ilvl w:val="0"/>
-          <w:numId w:val="1137"/>
         </w:numPr>
       </w:pPr>
       <w:r>
@@ -48634,7 +48927,7 @@
         <w:pStyle w:val="Compact"/>
         <w:numPr>
           <w:ilvl w:val="1"/>
-          <w:numId w:val="1139"/>
+          <w:numId w:val="1140"/>
         </w:numPr>
       </w:pPr>
       <w:r>
@@ -48646,7 +48939,7 @@
         <w:pStyle w:val="Compact"/>
         <w:numPr>
           <w:ilvl w:val="1"/>
-          <w:numId w:val="1139"/>
+          <w:numId w:val="1140"/>
         </w:numPr>
       </w:pPr>
       <w:r>
@@ -48658,7 +48951,7 @@
         <w:pStyle w:val="Compact"/>
         <w:numPr>
           <w:ilvl w:val="1"/>
-          <w:numId w:val="1139"/>
+          <w:numId w:val="1140"/>
         </w:numPr>
       </w:pPr>
       <w:r>
@@ -48670,7 +48963,7 @@
         <w:pStyle w:val="Compact"/>
         <w:numPr>
           <w:ilvl w:val="1"/>
-          <w:numId w:val="1139"/>
+          <w:numId w:val="1140"/>
         </w:numPr>
       </w:pPr>
       <w:r>
@@ -48682,7 +48975,7 @@
         <w:pStyle w:val="Compact"/>
         <w:numPr>
           <w:ilvl w:val="1"/>
-          <w:numId w:val="1139"/>
+          <w:numId w:val="1140"/>
         </w:numPr>
       </w:pPr>
       <w:r>
@@ -48694,7 +48987,7 @@
         <w:pStyle w:val="Compact"/>
         <w:numPr>
           <w:ilvl w:val="0"/>
-          <w:numId w:val="1137"/>
+          <w:numId w:val="1138"/>
         </w:numPr>
       </w:pPr>
       <w:r>
@@ -48716,7 +49009,7 @@
         <w:pStyle w:val="Compact"/>
         <w:numPr>
           <w:ilvl w:val="0"/>
-          <w:numId w:val="1137"/>
+          <w:numId w:val="1138"/>
         </w:numPr>
       </w:pPr>
       <w:r>
@@ -48769,7 +49062,7 @@
         <w:pStyle w:val="Compact"/>
         <w:numPr>
           <w:ilvl w:val="0"/>
-          <w:numId w:val="1140"/>
+          <w:numId w:val="1141"/>
         </w:numPr>
       </w:pPr>
       <w:r>
@@ -48797,7 +49090,7 @@
         <w:pStyle w:val="Compact"/>
         <w:numPr>
           <w:ilvl w:val="0"/>
-          <w:numId w:val="1140"/>
+          <w:numId w:val="1141"/>
         </w:numPr>
       </w:pPr>
       <w:r>
@@ -48819,7 +49112,7 @@
         <w:pStyle w:val="Compact"/>
         <w:numPr>
           <w:ilvl w:val="0"/>
-          <w:numId w:val="1140"/>
+          <w:numId w:val="1141"/>
         </w:numPr>
       </w:pPr>
       <w:r>
@@ -51034,7 +51327,7 @@
         <w:pStyle w:val="Compact"/>
         <w:numPr>
           <w:ilvl w:val="0"/>
-          <w:numId w:val="1141"/>
+          <w:numId w:val="1142"/>
         </w:numPr>
       </w:pPr>
       <w:r>
@@ -51062,7 +51355,7 @@
         <w:pStyle w:val="Compact"/>
         <w:numPr>
           <w:ilvl w:val="0"/>
-          <w:numId w:val="1141"/>
+          <w:numId w:val="1142"/>
         </w:numPr>
       </w:pPr>
       <w:r>
@@ -51084,7 +51377,7 @@
         <w:pStyle w:val="Compact"/>
         <w:numPr>
           <w:ilvl w:val="0"/>
-          <w:numId w:val="1141"/>
+          <w:numId w:val="1142"/>
         </w:numPr>
       </w:pPr>
       <w:r>
@@ -51106,7 +51399,7 @@
         <w:pStyle w:val="Compact"/>
         <w:numPr>
           <w:ilvl w:val="0"/>
-          <w:numId w:val="1141"/>
+          <w:numId w:val="1142"/>
         </w:numPr>
       </w:pPr>
       <w:r>
@@ -51143,7 +51436,7 @@
         <w:pStyle w:val="Compact"/>
         <w:numPr>
           <w:ilvl w:val="0"/>
-          <w:numId w:val="1141"/>
+          <w:numId w:val="1142"/>
         </w:numPr>
       </w:pPr>
       <w:r>
@@ -51165,7 +51458,7 @@
         <w:pStyle w:val="Compact"/>
         <w:numPr>
           <w:ilvl w:val="0"/>
-          <w:numId w:val="1141"/>
+          <w:numId w:val="1142"/>
         </w:numPr>
       </w:pPr>
       <w:r>
@@ -51233,7 +51526,7 @@
         <w:pStyle w:val="Compact"/>
         <w:numPr>
           <w:ilvl w:val="0"/>
-          <w:numId w:val="1142"/>
+          <w:numId w:val="1143"/>
         </w:numPr>
       </w:pPr>
       <w:r>
@@ -51245,7 +51538,7 @@
         <w:pStyle w:val="Compact"/>
         <w:numPr>
           <w:ilvl w:val="0"/>
-          <w:numId w:val="1142"/>
+          <w:numId w:val="1143"/>
         </w:numPr>
       </w:pPr>
       <w:r>
@@ -51257,7 +51550,7 @@
         <w:pStyle w:val="Compact"/>
         <w:numPr>
           <w:ilvl w:val="0"/>
-          <w:numId w:val="1142"/>
+          <w:numId w:val="1143"/>
         </w:numPr>
       </w:pPr>
       <w:r>
@@ -51269,7 +51562,7 @@
         <w:pStyle w:val="Compact"/>
         <w:numPr>
           <w:ilvl w:val="0"/>
-          <w:numId w:val="1142"/>
+          <w:numId w:val="1143"/>
         </w:numPr>
       </w:pPr>
       <w:r>
@@ -51911,7 +52204,7 @@
         <w:pStyle w:val="Compact"/>
         <w:numPr>
           <w:ilvl w:val="0"/>
-          <w:numId w:val="1143"/>
+          <w:numId w:val="1144"/>
         </w:numPr>
       </w:pPr>
       <w:r>
@@ -51960,46 +52253,46 @@
         <w:pStyle w:val="Compact"/>
         <w:numPr>
           <w:ilvl w:val="1"/>
+          <w:numId w:val="1145"/>
+        </w:numPr>
+      </w:pPr>
+      <w:r>
+        <w:t xml:space="preserve">CVE-2025-32434 showed that</w:t>
+      </w:r>
+      <w:r>
+        <w:t xml:space="preserve"> </w:t>
+      </w:r>
+      <w:r>
+        <w:rPr>
+          <w:rStyle w:val="VerbatimChar"/>
+        </w:rPr>
+        <w:t xml:space="preserve">weights_only=True</w:t>
+      </w:r>
+      <w:r>
+        <w:t xml:space="preserve"> </w:t>
+      </w:r>
+      <w:r>
+        <w:t xml:space="preserve">can be bypassed in PyTorch before 2.6. PyTorch 2.10 is</w:t>
+      </w:r>
+      <w:r>
+        <w:t xml:space="preserve"> </w:t>
+      </w:r>
+      <w:r>
+        <w:t xml:space="preserve">installed here, so this is closed; on another machine with an older PyTorch, load only checkpoints you made</w:t>
+      </w:r>
+      <w:r>
+        <w:t xml:space="preserve"> </w:t>
+      </w:r>
+      <w:r>
+        <w:t xml:space="preserve">yourself.</w:t>
+      </w:r>
+    </w:p>
+    <w:p>
+      <w:pPr>
+        <w:pStyle w:val="Compact"/>
+        <w:numPr>
+          <w:ilvl w:val="0"/>
           <w:numId w:val="1144"/>
-        </w:numPr>
-      </w:pPr>
-      <w:r>
-        <w:t xml:space="preserve">CVE-2025-32434 showed that</w:t>
-      </w:r>
-      <w:r>
-        <w:t xml:space="preserve"> </w:t>
-      </w:r>
-      <w:r>
-        <w:rPr>
-          <w:rStyle w:val="VerbatimChar"/>
-        </w:rPr>
-        <w:t xml:space="preserve">weights_only=True</w:t>
-      </w:r>
-      <w:r>
-        <w:t xml:space="preserve"> </w:t>
-      </w:r>
-      <w:r>
-        <w:t xml:space="preserve">can be bypassed in PyTorch before 2.6. PyTorch 2.10 is</w:t>
-      </w:r>
-      <w:r>
-        <w:t xml:space="preserve"> </w:t>
-      </w:r>
-      <w:r>
-        <w:t xml:space="preserve">installed here, so this is closed; on another machine with an older PyTorch, load only checkpoints you made</w:t>
-      </w:r>
-      <w:r>
-        <w:t xml:space="preserve"> </w:t>
-      </w:r>
-      <w:r>
-        <w:t xml:space="preserve">yourself.</w:t>
-      </w:r>
-    </w:p>
-    <w:p>
-      <w:pPr>
-        <w:pStyle w:val="Compact"/>
-        <w:numPr>
-          <w:ilvl w:val="0"/>
-          <w:numId w:val="1143"/>
         </w:numPr>
       </w:pPr>
       <w:r>
@@ -52015,7 +52308,7 @@
         <w:pStyle w:val="Compact"/>
         <w:numPr>
           <w:ilvl w:val="1"/>
-          <w:numId w:val="1145"/>
+          <w:numId w:val="1146"/>
         </w:numPr>
       </w:pPr>
       <w:r>
@@ -52042,7 +52335,7 @@
         <w:pStyle w:val="Compact"/>
         <w:numPr>
           <w:ilvl w:val="1"/>
-          <w:numId w:val="1145"/>
+          <w:numId w:val="1146"/>
         </w:numPr>
       </w:pPr>
       <w:r>
@@ -52054,7 +52347,7 @@
         <w:pStyle w:val="Compact"/>
         <w:numPr>
           <w:ilvl w:val="1"/>
-          <w:numId w:val="1145"/>
+          <w:numId w:val="1146"/>
         </w:numPr>
       </w:pPr>
       <w:r>
@@ -52084,7 +52377,7 @@
         <w:pStyle w:val="Compact"/>
         <w:numPr>
           <w:ilvl w:val="1"/>
-          <w:numId w:val="1145"/>
+          <w:numId w:val="1146"/>
         </w:numPr>
       </w:pPr>
       <w:r>
@@ -52108,7 +52401,7 @@
         <w:pStyle w:val="Compact"/>
         <w:numPr>
           <w:ilvl w:val="1"/>
-          <w:numId w:val="1145"/>
+          <w:numId w:val="1146"/>
         </w:numPr>
       </w:pPr>
       <w:r>
@@ -52120,7 +52413,7 @@
         <w:pStyle w:val="Compact"/>
         <w:numPr>
           <w:ilvl w:val="0"/>
-          <w:numId w:val="1143"/>
+          <w:numId w:val="1144"/>
         </w:numPr>
       </w:pPr>
       <w:r>
@@ -52148,7 +52441,7 @@
         <w:pStyle w:val="Compact"/>
         <w:numPr>
           <w:ilvl w:val="0"/>
-          <w:numId w:val="1143"/>
+          <w:numId w:val="1144"/>
         </w:numPr>
       </w:pPr>
       <w:r>
@@ -52188,7 +52481,7 @@
         <w:pStyle w:val="Compact"/>
         <w:numPr>
           <w:ilvl w:val="0"/>
-          <w:numId w:val="1143"/>
+          <w:numId w:val="1144"/>
         </w:numPr>
       </w:pPr>
       <w:r>
@@ -52237,7 +52530,7 @@
         <w:pStyle w:val="Compact"/>
         <w:numPr>
           <w:ilvl w:val="0"/>
-          <w:numId w:val="1143"/>
+          <w:numId w:val="1144"/>
         </w:numPr>
       </w:pPr>
       <w:r>
@@ -52277,7 +52570,7 @@
         <w:pStyle w:val="Compact"/>
         <w:numPr>
           <w:ilvl w:val="0"/>
-          <w:numId w:val="1143"/>
+          <w:numId w:val="1144"/>
         </w:numPr>
       </w:pPr>
       <w:r>
@@ -52353,7 +52646,7 @@
         <w:pStyle w:val="Compact"/>
         <w:numPr>
           <w:ilvl w:val="0"/>
-          <w:numId w:val="1146"/>
+          <w:numId w:val="1147"/>
         </w:numPr>
       </w:pPr>
       <w:r>
@@ -52384,7 +52677,7 @@
         <w:pStyle w:val="Compact"/>
         <w:numPr>
           <w:ilvl w:val="0"/>
-          <w:numId w:val="1146"/>
+          <w:numId w:val="1147"/>
         </w:numPr>
       </w:pPr>
       <w:r>
@@ -52403,7 +52696,7 @@
         <w:pStyle w:val="Compact"/>
         <w:numPr>
           <w:ilvl w:val="0"/>
-          <w:numId w:val="1146"/>
+          <w:numId w:val="1147"/>
         </w:numPr>
       </w:pPr>
       <w:r>
@@ -52422,7 +52715,7 @@
         <w:pStyle w:val="Compact"/>
         <w:numPr>
           <w:ilvl w:val="0"/>
-          <w:numId w:val="1146"/>
+          <w:numId w:val="1147"/>
         </w:numPr>
       </w:pPr>
       <w:r>
@@ -53966,7 +54259,7 @@
         <w:pStyle w:val="Compact"/>
         <w:numPr>
           <w:ilvl w:val="0"/>
-          <w:numId w:val="1147"/>
+          <w:numId w:val="1148"/>
         </w:numPr>
       </w:pPr>
       <w:r>
@@ -53991,7 +54284,7 @@
         <w:pStyle w:val="Compact"/>
         <w:numPr>
           <w:ilvl w:val="0"/>
-          <w:numId w:val="1147"/>
+          <w:numId w:val="1148"/>
         </w:numPr>
       </w:pPr>
       <w:r>
@@ -54049,7 +54342,7 @@
         <w:pStyle w:val="Compact"/>
         <w:numPr>
           <w:ilvl w:val="0"/>
-          <w:numId w:val="1147"/>
+          <w:numId w:val="1148"/>
         </w:numPr>
       </w:pPr>
       <w:r>
@@ -54077,7 +54370,7 @@
         <w:pStyle w:val="Compact"/>
         <w:numPr>
           <w:ilvl w:val="0"/>
-          <w:numId w:val="1147"/>
+          <w:numId w:val="1148"/>
         </w:numPr>
       </w:pPr>
       <w:r>
@@ -54132,7 +54425,7 @@
         <w:pStyle w:val="Compact"/>
         <w:numPr>
           <w:ilvl w:val="0"/>
-          <w:numId w:val="1148"/>
+          <w:numId w:val="1149"/>
         </w:numPr>
       </w:pPr>
       <w:r>
@@ -54144,7 +54437,7 @@
         <w:pStyle w:val="Compact"/>
         <w:numPr>
           <w:ilvl w:val="0"/>
-          <w:numId w:val="1148"/>
+          <w:numId w:val="1149"/>
         </w:numPr>
       </w:pPr>
       <w:r>
@@ -54168,7 +54461,7 @@
         <w:pStyle w:val="Compact"/>
         <w:numPr>
           <w:ilvl w:val="0"/>
-          <w:numId w:val="1148"/>
+          <w:numId w:val="1149"/>
         </w:numPr>
       </w:pPr>
       <w:r>
@@ -54186,7 +54479,7 @@
         <w:pStyle w:val="Compact"/>
         <w:numPr>
           <w:ilvl w:val="0"/>
-          <w:numId w:val="1148"/>
+          <w:numId w:val="1149"/>
         </w:numPr>
       </w:pPr>
       <w:r>
@@ -54204,7 +54497,7 @@
         <w:pStyle w:val="Compact"/>
         <w:numPr>
           <w:ilvl w:val="0"/>
-          <w:numId w:val="1148"/>
+          <w:numId w:val="1149"/>
         </w:numPr>
       </w:pPr>
       <w:r>
@@ -54216,7 +54509,7 @@
         <w:pStyle w:val="Compact"/>
         <w:numPr>
           <w:ilvl w:val="0"/>
-          <w:numId w:val="1148"/>
+          <w:numId w:val="1149"/>
         </w:numPr>
       </w:pPr>
       <w:r>
@@ -54228,7 +54521,7 @@
         <w:pStyle w:val="Compact"/>
         <w:numPr>
           <w:ilvl w:val="0"/>
-          <w:numId w:val="1148"/>
+          <w:numId w:val="1149"/>
         </w:numPr>
       </w:pPr>
       <w:r>
@@ -54240,7 +54533,7 @@
         <w:pStyle w:val="Compact"/>
         <w:numPr>
           <w:ilvl w:val="0"/>
-          <w:numId w:val="1148"/>
+          <w:numId w:val="1149"/>
         </w:numPr>
       </w:pPr>
       <w:r>
@@ -54252,7 +54545,7 @@
         <w:pStyle w:val="Compact"/>
         <w:numPr>
           <w:ilvl w:val="0"/>
-          <w:numId w:val="1148"/>
+          <w:numId w:val="1149"/>
         </w:numPr>
       </w:pPr>
       <w:r>
@@ -54270,7 +54563,7 @@
         <w:pStyle w:val="Compact"/>
         <w:numPr>
           <w:ilvl w:val="0"/>
-          <w:numId w:val="1148"/>
+          <w:numId w:val="1149"/>
         </w:numPr>
       </w:pPr>
       <w:r>
@@ -54282,7 +54575,7 @@
         <w:pStyle w:val="Compact"/>
         <w:numPr>
           <w:ilvl w:val="0"/>
-          <w:numId w:val="1148"/>
+          <w:numId w:val="1149"/>
         </w:numPr>
       </w:pPr>
       <w:r>
@@ -54300,7 +54593,7 @@
         <w:pStyle w:val="Compact"/>
         <w:numPr>
           <w:ilvl w:val="0"/>
-          <w:numId w:val="1148"/>
+          <w:numId w:val="1149"/>
         </w:numPr>
       </w:pPr>
       <w:r>
@@ -54312,7 +54605,7 @@
         <w:pStyle w:val="Compact"/>
         <w:numPr>
           <w:ilvl w:val="0"/>
-          <w:numId w:val="1148"/>
+          <w:numId w:val="1149"/>
         </w:numPr>
       </w:pPr>
       <w:r>
@@ -54324,7 +54617,7 @@
         <w:pStyle w:val="Compact"/>
         <w:numPr>
           <w:ilvl w:val="0"/>
-          <w:numId w:val="1148"/>
+          <w:numId w:val="1149"/>
         </w:numPr>
       </w:pPr>
       <w:r>
@@ -54336,7 +54629,7 @@
         <w:pStyle w:val="Compact"/>
         <w:numPr>
           <w:ilvl w:val="0"/>
-          <w:numId w:val="1148"/>
+          <w:numId w:val="1149"/>
         </w:numPr>
       </w:pPr>
       <w:r>
@@ -54348,7 +54641,7 @@
         <w:pStyle w:val="Compact"/>
         <w:numPr>
           <w:ilvl w:val="0"/>
-          <w:numId w:val="1148"/>
+          <w:numId w:val="1149"/>
         </w:numPr>
       </w:pPr>
       <w:r>
@@ -54366,7 +54659,7 @@
         <w:pStyle w:val="Compact"/>
         <w:numPr>
           <w:ilvl w:val="0"/>
-          <w:numId w:val="1148"/>
+          <w:numId w:val="1149"/>
         </w:numPr>
       </w:pPr>
       <w:r>
@@ -54378,7 +54671,7 @@
         <w:pStyle w:val="Compact"/>
         <w:numPr>
           <w:ilvl w:val="0"/>
-          <w:numId w:val="1148"/>
+          <w:numId w:val="1149"/>
         </w:numPr>
       </w:pPr>
       <w:r>
@@ -54396,7 +54689,7 @@
         <w:pStyle w:val="Compact"/>
         <w:numPr>
           <w:ilvl w:val="0"/>
-          <w:numId w:val="1148"/>
+          <w:numId w:val="1149"/>
         </w:numPr>
       </w:pPr>
       <w:r>
@@ -54408,7 +54701,7 @@
         <w:pStyle w:val="Compact"/>
         <w:numPr>
           <w:ilvl w:val="0"/>
-          <w:numId w:val="1148"/>
+          <w:numId w:val="1149"/>
         </w:numPr>
       </w:pPr>
       <w:r>
@@ -55137,6 +55430,9 @@
     <w:abstractNumId w:val="991"/>
   </w:num>
   <w:num w:numId="1057">
+    <w:abstractNumId w:val="991"/>
+  </w:num>
+  <w:num w:numId="1058">
     <w:abstractNumId w:val="99411"/>
     <w:lvlOverride w:ilvl="0">
       <w:startOverride w:val="1"/>
@@ -55166,10 +55462,10 @@
       <w:startOverride w:val="1"/>
     </w:lvlOverride>
   </w:num>
-  <w:num w:numId="1058">
+  <w:num w:numId="1059">
     <w:abstractNumId w:val="991"/>
   </w:num>
-  <w:num w:numId="1059">
+  <w:num w:numId="1060">
     <w:abstractNumId w:val="99411"/>
     <w:lvlOverride w:ilvl="0">
       <w:startOverride w:val="1"/>
@@ -55199,9 +55495,6 @@
       <w:startOverride w:val="1"/>
     </w:lvlOverride>
   </w:num>
-  <w:num w:numId="1060">
-    <w:abstractNumId w:val="991"/>
-  </w:num>
   <w:num w:numId="1061">
     <w:abstractNumId w:val="991"/>
   </w:num>
@@ -55218,6 +55511,9 @@
     <w:abstractNumId w:val="991"/>
   </w:num>
   <w:num w:numId="1066">
+    <w:abstractNumId w:val="991"/>
+  </w:num>
+  <w:num w:numId="1067">
     <w:abstractNumId w:val="99411"/>
     <w:lvlOverride w:ilvl="0">
       <w:startOverride w:val="1"/>
@@ -55247,9 +55543,6 @@
       <w:startOverride w:val="1"/>
     </w:lvlOverride>
   </w:num>
-  <w:num w:numId="1067">
-    <w:abstractNumId w:val="991"/>
-  </w:num>
   <w:num w:numId="1068">
     <w:abstractNumId w:val="991"/>
   </w:num>
@@ -55260,6 +55553,9 @@
     <w:abstractNumId w:val="991"/>
   </w:num>
   <w:num w:numId="1071">
+    <w:abstractNumId w:val="991"/>
+  </w:num>
+  <w:num w:numId="1072">
     <w:abstractNumId w:val="99411"/>
     <w:lvlOverride w:ilvl="0">
       <w:startOverride w:val="1"/>
@@ -55289,9 +55585,6 @@
       <w:startOverride w:val="1"/>
     </w:lvlOverride>
   </w:num>
-  <w:num w:numId="1072">
-    <w:abstractNumId w:val="991"/>
-  </w:num>
   <w:num w:numId="1073">
     <w:abstractNumId w:val="991"/>
   </w:num>
@@ -55302,6 +55595,9 @@
     <w:abstractNumId w:val="991"/>
   </w:num>
   <w:num w:numId="1076">
+    <w:abstractNumId w:val="991"/>
+  </w:num>
+  <w:num w:numId="1077">
     <w:abstractNumId w:val="99411"/>
     <w:lvlOverride w:ilvl="0">
       <w:startOverride w:val="1"/>
@@ -55331,9 +55627,6 @@
       <w:startOverride w:val="1"/>
     </w:lvlOverride>
   </w:num>
-  <w:num w:numId="1077">
-    <w:abstractNumId w:val="991"/>
-  </w:num>
   <w:num w:numId="1078">
     <w:abstractNumId w:val="991"/>
   </w:num>
@@ -55353,6 +55646,9 @@
     <w:abstractNumId w:val="991"/>
   </w:num>
   <w:num w:numId="1084">
+    <w:abstractNumId w:val="991"/>
+  </w:num>
+  <w:num w:numId="1085">
     <w:abstractNumId w:val="99411"/>
     <w:lvlOverride w:ilvl="0">
       <w:startOverride w:val="1"/>
@@ -55382,9 +55678,6 @@
       <w:startOverride w:val="1"/>
     </w:lvlOverride>
   </w:num>
-  <w:num w:numId="1085">
-    <w:abstractNumId w:val="991"/>
-  </w:num>
   <w:num w:numId="1086">
     <w:abstractNumId w:val="991"/>
   </w:num>
@@ -55398,6 +55691,9 @@
     <w:abstractNumId w:val="991"/>
   </w:num>
   <w:num w:numId="1090">
+    <w:abstractNumId w:val="991"/>
+  </w:num>
+  <w:num w:numId="1091">
     <w:abstractNumId w:val="99411"/>
     <w:lvlOverride w:ilvl="0">
       <w:startOverride w:val="1"/>
@@ -55427,9 +55723,6 @@
       <w:startOverride w:val="1"/>
     </w:lvlOverride>
   </w:num>
-  <w:num w:numId="1091">
-    <w:abstractNumId w:val="991"/>
-  </w:num>
   <w:num w:numId="1092">
     <w:abstractNumId w:val="991"/>
   </w:num>
@@ -55440,6 +55733,9 @@
     <w:abstractNumId w:val="991"/>
   </w:num>
   <w:num w:numId="1095">
+    <w:abstractNumId w:val="991"/>
+  </w:num>
+  <w:num w:numId="1096">
     <w:abstractNumId w:val="99411"/>
     <w:lvlOverride w:ilvl="0">
       <w:startOverride w:val="1"/>
@@ -55469,13 +55765,13 @@
       <w:startOverride w:val="1"/>
     </w:lvlOverride>
   </w:num>
-  <w:num w:numId="1096">
-    <w:abstractNumId w:val="991"/>
-  </w:num>
   <w:num w:numId="1097">
     <w:abstractNumId w:val="991"/>
   </w:num>
   <w:num w:numId="1098">
+    <w:abstractNumId w:val="991"/>
+  </w:num>
+  <w:num w:numId="1099">
     <w:abstractNumId w:val="99411"/>
     <w:lvlOverride w:ilvl="0">
       <w:startOverride w:val="1"/>
@@ -55505,9 +55801,6 @@
       <w:startOverride w:val="1"/>
     </w:lvlOverride>
   </w:num>
-  <w:num w:numId="1099">
-    <w:abstractNumId w:val="991"/>
-  </w:num>
   <w:num w:numId="1100">
     <w:abstractNumId w:val="991"/>
   </w:num>
@@ -55530,6 +55823,9 @@
     <w:abstractNumId w:val="991"/>
   </w:num>
   <w:num w:numId="1107">
+    <w:abstractNumId w:val="991"/>
+  </w:num>
+  <w:num w:numId="1108">
     <w:abstractNumId w:val="99411"/>
     <w:lvlOverride w:ilvl="0">
       <w:startOverride w:val="1"/>
@@ -55559,9 +55855,6 @@
       <w:startOverride w:val="1"/>
     </w:lvlOverride>
   </w:num>
-  <w:num w:numId="1108">
-    <w:abstractNumId w:val="991"/>
-  </w:num>
   <w:num w:numId="1109">
     <w:abstractNumId w:val="991"/>
   </w:num>
@@ -55569,6 +55862,9 @@
     <w:abstractNumId w:val="991"/>
   </w:num>
   <w:num w:numId="1111">
+    <w:abstractNumId w:val="991"/>
+  </w:num>
+  <w:num w:numId="1112">
     <w:abstractNumId w:val="99411"/>
     <w:lvlOverride w:ilvl="0">
       <w:startOverride w:val="1"/>
@@ -55598,10 +55894,10 @@
       <w:startOverride w:val="1"/>
     </w:lvlOverride>
   </w:num>
-  <w:num w:numId="1112">
+  <w:num w:numId="1113">
     <w:abstractNumId w:val="991"/>
   </w:num>
-  <w:num w:numId="1113">
+  <w:num w:numId="1114">
     <w:abstractNumId w:val="99411"/>
     <w:lvlOverride w:ilvl="0">
       <w:startOverride w:val="1"/>
@@ -55631,10 +55927,10 @@
       <w:startOverride w:val="1"/>
     </w:lvlOverride>
   </w:num>
-  <w:num w:numId="1114">
+  <w:num w:numId="1115">
     <w:abstractNumId w:val="991"/>
   </w:num>
-  <w:num w:numId="1115">
+  <w:num w:numId="1116">
     <w:abstractNumId w:val="99411"/>
     <w:lvlOverride w:ilvl="0">
       <w:startOverride w:val="1"/>
@@ -55664,10 +55960,10 @@
       <w:startOverride w:val="1"/>
     </w:lvlOverride>
   </w:num>
-  <w:num w:numId="1116">
+  <w:num w:numId="1117">
     <w:abstractNumId w:val="991"/>
   </w:num>
-  <w:num w:numId="1117">
+  <w:num w:numId="1118">
     <w:abstractNumId w:val="99411"/>
     <w:lvlOverride w:ilvl="0">
       <w:startOverride w:val="1"/>
@@ -55697,13 +55993,13 @@
       <w:startOverride w:val="1"/>
     </w:lvlOverride>
   </w:num>
-  <w:num w:numId="1118">
-    <w:abstractNumId w:val="991"/>
-  </w:num>
   <w:num w:numId="1119">
     <w:abstractNumId w:val="991"/>
   </w:num>
   <w:num w:numId="1120">
+    <w:abstractNumId w:val="991"/>
+  </w:num>
+  <w:num w:numId="1121">
     <w:abstractNumId w:val="99411"/>
     <w:lvlOverride w:ilvl="0">
       <w:startOverride w:val="1"/>
@@ -55733,9 +56029,6 @@
       <w:startOverride w:val="1"/>
     </w:lvlOverride>
   </w:num>
-  <w:num w:numId="1121">
-    <w:abstractNumId w:val="991"/>
-  </w:num>
   <w:num w:numId="1122">
     <w:abstractNumId w:val="991"/>
   </w:num>
@@ -55761,6 +56054,9 @@
     <w:abstractNumId w:val="991"/>
   </w:num>
   <w:num w:numId="1130">
+    <w:abstractNumId w:val="991"/>
+  </w:num>
+  <w:num w:numId="1131">
     <w:abstractNumId w:val="99411"/>
     <w:lvlOverride w:ilvl="0">
       <w:startOverride w:val="1"/>
@@ -55790,41 +56086,11 @@
       <w:startOverride w:val="1"/>
     </w:lvlOverride>
   </w:num>
-  <w:num w:numId="1131">
-    <w:abstractNumId w:val="991"/>
-  </w:num>
   <w:num w:numId="1132">
     <w:abstractNumId w:val="991"/>
   </w:num>
   <w:num w:numId="1133">
-    <w:abstractNumId w:val="99411"/>
-    <w:lvlOverride w:ilvl="0">
-      <w:startOverride w:val="1"/>
-    </w:lvlOverride>
-    <w:lvlOverride w:ilvl="1">
-      <w:startOverride w:val="1"/>
-    </w:lvlOverride>
-    <w:lvlOverride w:ilvl="2">
-      <w:startOverride w:val="1"/>
-    </w:lvlOverride>
-    <w:lvlOverride w:ilvl="3">
-      <w:startOverride w:val="1"/>
-    </w:lvlOverride>
-    <w:lvlOverride w:ilvl="4">
-      <w:startOverride w:val="1"/>
-    </w:lvlOverride>
-    <w:lvlOverride w:ilvl="5">
-      <w:startOverride w:val="1"/>
-    </w:lvlOverride>
-    <w:lvlOverride w:ilvl="6">
-      <w:startOverride w:val="1"/>
-    </w:lvlOverride>
-    <w:lvlOverride w:ilvl="7">
-      <w:startOverride w:val="1"/>
-    </w:lvlOverride>
-    <w:lvlOverride w:ilvl="8">
-      <w:startOverride w:val="1"/>
-    </w:lvlOverride>
+    <w:abstractNumId w:val="991"/>
   </w:num>
   <w:num w:numId="1134">
     <w:abstractNumId w:val="99411"/>
@@ -55887,15 +56153,6 @@
     </w:lvlOverride>
   </w:num>
   <w:num w:numId="1136">
-    <w:abstractNumId w:val="991"/>
-  </w:num>
-  <w:num w:numId="1137">
-    <w:abstractNumId w:val="991"/>
-  </w:num>
-  <w:num w:numId="1138">
-    <w:abstractNumId w:val="991"/>
-  </w:num>
-  <w:num w:numId="1139">
     <w:abstractNumId w:val="99411"/>
     <w:lvlOverride w:ilvl="0">
       <w:startOverride w:val="1"/>
@@ -55925,28 +56182,16 @@
       <w:startOverride w:val="1"/>
     </w:lvlOverride>
   </w:num>
-  <w:num w:numId="1140">
+  <w:num w:numId="1137">
     <w:abstractNumId w:val="991"/>
   </w:num>
-  <w:num w:numId="1141">
+  <w:num w:numId="1138">
     <w:abstractNumId w:val="991"/>
   </w:num>
-  <w:num w:numId="1142">
+  <w:num w:numId="1139">
     <w:abstractNumId w:val="991"/>
   </w:num>
-  <w:num w:numId="1143">
-    <w:abstractNumId w:val="991"/>
-  </w:num>
-  <w:num w:numId="1144">
-    <w:abstractNumId w:val="991"/>
-  </w:num>
-  <w:num w:numId="1145">
-    <w:abstractNumId w:val="991"/>
-  </w:num>
-  <w:num w:numId="1146">
-    <w:abstractNumId w:val="991"/>
-  </w:num>
-  <w:num w:numId="1147">
+  <w:num w:numId="1140">
     <w:abstractNumId w:val="99411"/>
     <w:lvlOverride w:ilvl="0">
       <w:startOverride w:val="1"/>
@@ -55976,7 +56221,58 @@
       <w:startOverride w:val="1"/>
     </w:lvlOverride>
   </w:num>
+  <w:num w:numId="1141">
+    <w:abstractNumId w:val="991"/>
+  </w:num>
+  <w:num w:numId="1142">
+    <w:abstractNumId w:val="991"/>
+  </w:num>
+  <w:num w:numId="1143">
+    <w:abstractNumId w:val="991"/>
+  </w:num>
+  <w:num w:numId="1144">
+    <w:abstractNumId w:val="991"/>
+  </w:num>
+  <w:num w:numId="1145">
+    <w:abstractNumId w:val="991"/>
+  </w:num>
+  <w:num w:numId="1146">
+    <w:abstractNumId w:val="991"/>
+  </w:num>
+  <w:num w:numId="1147">
+    <w:abstractNumId w:val="991"/>
+  </w:num>
   <w:num w:numId="1148">
+    <w:abstractNumId w:val="99411"/>
+    <w:lvlOverride w:ilvl="0">
+      <w:startOverride w:val="1"/>
+    </w:lvlOverride>
+    <w:lvlOverride w:ilvl="1">
+      <w:startOverride w:val="1"/>
+    </w:lvlOverride>
+    <w:lvlOverride w:ilvl="2">
+      <w:startOverride w:val="1"/>
+    </w:lvlOverride>
+    <w:lvlOverride w:ilvl="3">
+      <w:startOverride w:val="1"/>
+    </w:lvlOverride>
+    <w:lvlOverride w:ilvl="4">
+      <w:startOverride w:val="1"/>
+    </w:lvlOverride>
+    <w:lvlOverride w:ilvl="5">
+      <w:startOverride w:val="1"/>
+    </w:lvlOverride>
+    <w:lvlOverride w:ilvl="6">
+      <w:startOverride w:val="1"/>
+    </w:lvlOverride>
+    <w:lvlOverride w:ilvl="7">
+      <w:startOverride w:val="1"/>
+    </w:lvlOverride>
+    <w:lvlOverride w:ilvl="8">
+      <w:startOverride w:val="1"/>
+    </w:lvlOverride>
+  </w:num>
+  <w:num w:numId="1149">
     <w:abstractNumId w:val="991"/>
   </w:num>
 </w:numbering>

</xml_diff>